<commit_message>
Documentacion TFM: memoria, guia de redaccion, sesiones
</commit_message>
<xml_diff>
--- a/CARPETA COMPARTIDA TUTOR/15MUIN E2 MOYA MARIN SERGIO.docx
+++ b/CARPETA COMPARTIDA TUTOR/15MUIN E2 MOYA MARIN SERGIO.docx
@@ -6208,21 +6208,7 @@
           <w:rFonts w:ascii="Arial" w:eastAsia="Times New Roman" w:hAnsi="Arial"/>
           <w:lang w:eastAsia="es-ES"/>
         </w:rPr>
-        <w:t>A diferencia de enfoques académicos generalistas que priorizan la maximiz</w:t>
-      </w:r>
-      <w:r>
-        <w:rPr>
-          <w:rFonts w:ascii="Arial" w:eastAsia="Times New Roman" w:hAnsi="Arial"/>
-          <w:lang w:eastAsia="es-ES"/>
-        </w:rPr>
-        <w:t>a</w:t>
-      </w:r>
-      <w:r>
-        <w:rPr>
-          <w:rFonts w:ascii="Arial" w:eastAsia="Times New Roman" w:hAnsi="Arial"/>
-          <w:lang w:eastAsia="es-ES"/>
-        </w:rPr>
-        <w:t xml:space="preserve">ción de métricas teóricas en entornos estáticos, este estudio adopta y extiende el marco de trabajo "Fraud Detection Handbook" desarrollado por el Grupo de Machine Learning de la </w:t>
+        <w:t xml:space="preserve">A diferencia de enfoques académicos generalistas que priorizan la maximización de métricas teóricas en entornos estáticos, este estudio adopta y extiende el marco de trabajo "Fraud Detection Handbook" desarrollado por el Grupo de Machine Learning de la </w:t>
       </w:r>
       <w:r>
         <w:rPr>
@@ -6464,14 +6450,7 @@
           <w:rFonts w:ascii="Arial" w:eastAsia="Times New Roman" w:hAnsi="Arial"/>
           <w:lang w:eastAsia="es-ES"/>
         </w:rPr>
-        <w:t>n</w:t>
-      </w:r>
-      <w:r>
-        <w:rPr>
-          <w:rFonts w:ascii="Arial" w:eastAsia="Times New Roman" w:hAnsi="Arial"/>
-          <w:lang w:eastAsia="es-ES"/>
-        </w:rPr>
-        <w:t xml:space="preserve">umerosos estudios reportan métricas de rendimiento cercanas a la perfección, como AUC-ROC superiores al 0.99 (Abdulghani et al., 2021; Sadgali et al., 2021; Ileberi et al., 2021). </w:t>
+        <w:t xml:space="preserve">numerosos estudios reportan métricas de rendimiento cercanas a la perfección, como AUC-ROC superiores al 0.99 (Abdulghani et al., 2021; Sadgali et al., 2021; Ileberi et al., 2021). </w:t>
       </w:r>
     </w:p>
     <w:p>
@@ -9852,6 +9831,166 @@
       </w:pPr>
       <w:r>
         <w:t>Desarrollo de Experimentos Tentativos</w:t>
+      </w:r>
+    </w:p>
+    <w:p>
+      <w:pPr>
+        <w:suppressAutoHyphens w:val="0"/>
+        <w:spacing w:before="100" w:beforeAutospacing="1" w:after="100" w:afterAutospacing="1" w:line="240" w:lineRule="auto"/>
+        <w:jc w:val="left"/>
+        <w:rPr>
+          <w:rFonts w:ascii="Arial" w:eastAsia="Times New Roman" w:hAnsi="Arial"/>
+          <w:lang w:eastAsia="es-ES"/>
+        </w:rPr>
+      </w:pPr>
+      <w:r>
+        <w:rPr>
+          <w:rFonts w:ascii="Arial" w:eastAsia="Times New Roman" w:hAnsi="Arial"/>
+          <w:lang w:eastAsia="es-ES"/>
+        </w:rPr>
+        <w:t>Una vez definidos los fundamentos metodológicos, las métricas de evaluación orientadas a negocio y el entorno de ejecución controlada, la fase empírica de este Trabajo Fin de Máster se articula a través de una secuencia estratégica de experimentos.</w:t>
+      </w:r>
+    </w:p>
+    <w:p>
+      <w:pPr>
+        <w:suppressAutoHyphens w:val="0"/>
+        <w:spacing w:before="100" w:beforeAutospacing="1" w:after="100" w:afterAutospacing="1" w:line="240" w:lineRule="auto"/>
+        <w:jc w:val="left"/>
+        <w:rPr>
+          <w:rFonts w:ascii="Arial" w:eastAsia="Times New Roman" w:hAnsi="Arial"/>
+          <w:lang w:eastAsia="es-ES"/>
+        </w:rPr>
+      </w:pPr>
+      <w:r>
+        <w:rPr>
+          <w:rFonts w:ascii="Arial" w:eastAsia="Times New Roman" w:hAnsi="Arial"/>
+          <w:lang w:eastAsia="es-ES"/>
+        </w:rPr>
+        <w:t xml:space="preserve">El diseño experimental no se concibe como una mera iteración de algoritmos en busca del mejor resultado numérico, sino como un proceso progresivo orientado a validar tres dimensiones críticas del sistema de detección propuesto: su </w:t>
+      </w:r>
+      <w:r>
+        <w:rPr>
+          <w:rFonts w:ascii="Arial" w:eastAsia="Times New Roman" w:hAnsi="Arial"/>
+          <w:b/>
+          <w:bCs/>
+          <w:lang w:eastAsia="es-ES"/>
+        </w:rPr>
+        <w:t>eficacia técnica</w:t>
+      </w:r>
+      <w:r>
+        <w:rPr>
+          <w:rFonts w:ascii="Arial" w:eastAsia="Times New Roman" w:hAnsi="Arial"/>
+          <w:lang w:eastAsia="es-ES"/>
+        </w:rPr>
+        <w:t xml:space="preserve"> </w:t>
+      </w:r>
+      <w:r>
+        <w:rPr>
+          <w:rFonts w:ascii="Arial" w:eastAsia="Times New Roman" w:hAnsi="Arial"/>
+          <w:lang w:eastAsia="es-ES"/>
+        </w:rPr>
+        <w:lastRenderedPageBreak/>
+        <w:t xml:space="preserve">(selección de la arquitectura óptima), su </w:t>
+      </w:r>
+      <w:r>
+        <w:rPr>
+          <w:rFonts w:ascii="Arial" w:eastAsia="Times New Roman" w:hAnsi="Arial"/>
+          <w:b/>
+          <w:bCs/>
+          <w:lang w:eastAsia="es-ES"/>
+        </w:rPr>
+        <w:t>integridad metodológica</w:t>
+      </w:r>
+      <w:r>
+        <w:rPr>
+          <w:rFonts w:ascii="Arial" w:eastAsia="Times New Roman" w:hAnsi="Arial"/>
+          <w:lang w:eastAsia="es-ES"/>
+        </w:rPr>
+        <w:t xml:space="preserve"> (auditoría de fugas de información) y su </w:t>
+      </w:r>
+      <w:r>
+        <w:rPr>
+          <w:rFonts w:ascii="Arial" w:eastAsia="Times New Roman" w:hAnsi="Arial"/>
+          <w:b/>
+          <w:bCs/>
+          <w:lang w:eastAsia="es-ES"/>
+        </w:rPr>
+        <w:t>viabilidad operativa</w:t>
+      </w:r>
+      <w:r>
+        <w:rPr>
+          <w:rFonts w:ascii="Arial" w:eastAsia="Times New Roman" w:hAnsi="Arial"/>
+          <w:lang w:eastAsia="es-ES"/>
+        </w:rPr>
+        <w:t xml:space="preserve"> (capacidad de explicación).</w:t>
+      </w:r>
+    </w:p>
+    <w:p>
+      <w:pPr>
+        <w:suppressAutoHyphens w:val="0"/>
+        <w:spacing w:before="100" w:beforeAutospacing="1" w:after="100" w:afterAutospacing="1" w:line="240" w:lineRule="auto"/>
+        <w:jc w:val="left"/>
+        <w:rPr>
+          <w:rFonts w:ascii="Arial" w:eastAsia="Times New Roman" w:hAnsi="Arial"/>
+          <w:lang w:eastAsia="es-ES"/>
+        </w:rPr>
+      </w:pPr>
+      <w:r>
+        <w:rPr>
+          <w:rFonts w:ascii="Arial" w:eastAsia="Times New Roman" w:hAnsi="Arial"/>
+          <w:lang w:eastAsia="es-ES"/>
+        </w:rPr>
+        <w:t>Es imperativo, no obstante, establecer una cota de validez sobre el alcance de estos ensayos. Si bien el uso del generador de transacciones de la ULB garantiza la reproducibilidad y ofrece una "verdad fundamental" (</w:t>
+      </w:r>
+      <w:r>
+        <w:rPr>
+          <w:rFonts w:ascii="Arial" w:eastAsia="Times New Roman" w:hAnsi="Arial"/>
+          <w:i/>
+          <w:iCs/>
+          <w:lang w:eastAsia="es-ES"/>
+        </w:rPr>
+        <w:t>ground truth</w:t>
+      </w:r>
+      <w:r>
+        <w:rPr>
+          <w:rFonts w:ascii="Arial" w:eastAsia="Times New Roman" w:hAnsi="Arial"/>
+          <w:lang w:eastAsia="es-ES"/>
+        </w:rPr>
+        <w:t>) libre de la ambigüedad de etiquetado inherente a los datos bancarios reales, este escenario conlleva una necesaria idealización. A diferencia de un ecosistema financiero vivo, caracterizado por la naturaleza adversaria y cambiante de los patrones de ataque (</w:t>
+      </w:r>
+      <w:r>
+        <w:rPr>
+          <w:rFonts w:ascii="Arial" w:eastAsia="Times New Roman" w:hAnsi="Arial"/>
+          <w:i/>
+          <w:iCs/>
+          <w:lang w:eastAsia="es-ES"/>
+        </w:rPr>
+        <w:t>concept drift</w:t>
+      </w:r>
+      <w:r>
+        <w:rPr>
+          <w:rFonts w:ascii="Arial" w:eastAsia="Times New Roman" w:hAnsi="Arial"/>
+          <w:lang w:eastAsia="es-ES"/>
+        </w:rPr>
+        <w:t>) y la presencia de ruido operativo impredecible, los datos simulados presentan un comportamiento estocástico pero acotado.</w:t>
+      </w:r>
+    </w:p>
+    <w:p>
+      <w:pPr>
+        <w:suppressAutoHyphens w:val="0"/>
+        <w:spacing w:before="100" w:beforeAutospacing="1" w:after="100" w:afterAutospacing="1" w:line="240" w:lineRule="auto"/>
+        <w:jc w:val="left"/>
+        <w:rPr>
+          <w:rFonts w:ascii="Arial" w:eastAsia="Times New Roman" w:hAnsi="Arial"/>
+          <w:lang w:eastAsia="es-ES"/>
+        </w:rPr>
+      </w:pPr>
+      <w:r>
+        <w:rPr>
+          <w:rFonts w:ascii="Arial" w:eastAsia="Times New Roman" w:hAnsi="Arial"/>
+          <w:lang w:eastAsia="es-ES"/>
+        </w:rPr>
+        <w:t>En consecuencia, la investigación se estructura en tres escenarios experimentales, cada uno diseñado para aislar y responder a una pregunta de investigación específica, asegurando que el modelo final no solo sea preciso, sino robusto ante el sesgo temporal y transparente para la toma de decisiones.</w:t>
       </w:r>
     </w:p>
     <w:p>
@@ -19889,6 +20028,15 @@
 </file>
 
 <file path=customXml/item1.xml><?xml version="1.0" encoding="utf-8"?>
+<?mso-contentType ?>
+<FormTemplates xmlns="http://schemas.microsoft.com/sharepoint/v3/contenttype/forms">
+  <Display>DocumentLibraryForm</Display>
+  <Edit>DocumentLibraryForm</Edit>
+  <New>DocumentLibraryForm</New>
+</FormTemplates>
+</file>
+
+<file path=customXml/item2.xml><?xml version="1.0" encoding="utf-8"?>
 <p:properties xmlns:p="http://schemas.microsoft.com/office/2006/metadata/properties" xmlns:xsi="http://www.w3.org/2001/XMLSchema-instance" xmlns:pc="http://schemas.microsoft.com/office/infopath/2007/PartnerControls">
   <documentManagement>
     <GDDescripcion xmlns="ef848eef-985f-4e5f-af94-9b10d2c40a72" xsi:nil="true"/>
@@ -19916,20 +20064,7 @@
 </p:properties>
 </file>
 
-<file path=customXml/item2.xml><?xml version="1.0" encoding="utf-8"?>
-<?mso-contentType ?>
-<FormTemplates xmlns="http://schemas.microsoft.com/sharepoint/v3/contenttype/forms">
-  <Display>DocumentLibraryForm</Display>
-  <Edit>DocumentLibraryForm</Edit>
-  <New>DocumentLibraryForm</New>
-</FormTemplates>
-</file>
-
 <file path=customXml/item3.xml><?xml version="1.0" encoding="utf-8"?>
-<b:Sources xmlns:b="http://schemas.openxmlformats.org/officeDocument/2006/bibliography" xmlns="http://schemas.openxmlformats.org/officeDocument/2006/bibliography" SelectedStyle="\APASixthEditionOfficeOnline.xsl" StyleName="APA" Version="6"/>
-</file>
-
-<file path=customXml/item4.xml><?xml version="1.0" encoding="utf-8"?>
 <ct:contentTypeSchema xmlns:ct="http://schemas.microsoft.com/office/2006/metadata/contentType" xmlns:ma="http://schemas.microsoft.com/office/2006/metadata/properties/metaAttributes" ct:_="" ma:_="" ma:contentTypeName="VIU" ma:contentTypeID="0x0101001F78872F1579B14E90DA3A6EEDE63FFE0018510EEED1C50C49AD0F3D3BCEAAFC3C" ma:contentTypeVersion="26" ma:contentTypeDescription="" ma:contentTypeScope="" ma:versionID="d0b27130e95aaa99b0c356f807fd553b">
   <xsd:schema xmlns:xsd="http://www.w3.org/2001/XMLSchema" xmlns:xs="http://www.w3.org/2001/XMLSchema" xmlns:p="http://schemas.microsoft.com/office/2006/metadata/properties" xmlns:ns2="ef848eef-985f-4e5f-af94-9b10d2c40a72" xmlns:ns3="17bdaf06-e97e-4c95-a053-70575cfc447b" targetNamespace="http://schemas.microsoft.com/office/2006/metadata/properties" ma:root="true" ma:fieldsID="15aeb2f0f67f5185a412b0c5958713dc" ns2:_="" ns3:_="">
     <xsd:import namespace="ef848eef-985f-4e5f-af94-9b10d2c40a72"/>
@@ -20373,7 +20508,19 @@
 </ct:contentTypeSchema>
 </file>
 
+<file path=customXml/item4.xml><?xml version="1.0" encoding="utf-8"?>
+<b:Sources xmlns:b="http://schemas.openxmlformats.org/officeDocument/2006/bibliography" xmlns="http://schemas.openxmlformats.org/officeDocument/2006/bibliography" SelectedStyle="\APASixthEditionOfficeOnline.xsl" StyleName="APA" Version="6"/>
+</file>
+
 <file path=customXml/itemProps1.xml><?xml version="1.0" encoding="utf-8"?>
+<ds:datastoreItem xmlns:ds="http://schemas.openxmlformats.org/officeDocument/2006/customXml" ds:itemID="{D2E34552-30F1-4197-AD08-9874EE871786}">
+  <ds:schemaRefs>
+    <ds:schemaRef ds:uri="http://schemas.microsoft.com/sharepoint/v3/contenttype/forms"/>
+  </ds:schemaRefs>
+</ds:datastoreItem>
+</file>
+
+<file path=customXml/itemProps2.xml><?xml version="1.0" encoding="utf-8"?>
 <ds:datastoreItem xmlns:ds="http://schemas.openxmlformats.org/officeDocument/2006/customXml" ds:itemID="{07A964DA-14FF-4E77-85C4-CF3717E496CA}">
   <ds:schemaRefs>
     <ds:schemaRef ds:uri="http://schemas.microsoft.com/office/2006/metadata/properties"/>
@@ -20384,23 +20531,7 @@
 </ds:datastoreItem>
 </file>
 
-<file path=customXml/itemProps2.xml><?xml version="1.0" encoding="utf-8"?>
-<ds:datastoreItem xmlns:ds="http://schemas.openxmlformats.org/officeDocument/2006/customXml" ds:itemID="{D2E34552-30F1-4197-AD08-9874EE871786}">
-  <ds:schemaRefs>
-    <ds:schemaRef ds:uri="http://schemas.microsoft.com/sharepoint/v3/contenttype/forms"/>
-  </ds:schemaRefs>
-</ds:datastoreItem>
-</file>
-
 <file path=customXml/itemProps3.xml><?xml version="1.0" encoding="utf-8"?>
-<ds:datastoreItem xmlns:ds="http://schemas.openxmlformats.org/officeDocument/2006/customXml" ds:itemID="{D63F4731-4595-44D5-887D-AE208B5F9D7E}">
-  <ds:schemaRefs>
-    <ds:schemaRef ds:uri="http://schemas.openxmlformats.org/officeDocument/2006/bibliography"/>
-  </ds:schemaRefs>
-</ds:datastoreItem>
-</file>
-
-<file path=customXml/itemProps4.xml><?xml version="1.0" encoding="utf-8"?>
 <ds:datastoreItem xmlns:ds="http://schemas.openxmlformats.org/officeDocument/2006/customXml" ds:itemID="{3E57E9A8-5303-411D-9422-2A748018A89F}">
   <ds:schemaRefs>
     <ds:schemaRef ds:uri="http://schemas.microsoft.com/office/2006/metadata/contentType"/>
@@ -20417,4 +20548,12 @@
     <ds:schemaRef ds:uri="http://schemas.microsoft.com/internal/obd"/>
   </ds:schemaRefs>
 </ds:datastoreItem>
+</file>
+
+<file path=customXml/itemProps4.xml><?xml version="1.0" encoding="utf-8"?>
+<ds:datastoreItem xmlns:ds="http://schemas.openxmlformats.org/officeDocument/2006/customXml" ds:itemID="{D63F4731-4595-44D5-887D-AE208B5F9D7E}">
+  <ds:schemaRefs>
+    <ds:schemaRef ds:uri="http://schemas.openxmlformats.org/officeDocument/2006/bibliography"/>
+  </ds:schemaRefs>
+</ds:datastoreItem>
 </file>
</xml_diff>

<commit_message>
Sync: progreso guardado 2026-02-23 17:01
</commit_message>
<xml_diff>
--- a/CARPETA COMPARTIDA TUTOR/15MUIN E2 MOYA MARIN SERGIO.docx
+++ b/CARPETA COMPARTIDA TUTOR/15MUIN E2 MOYA MARIN SERGIO.docx
@@ -3079,21 +3079,7 @@
                 <w:rStyle w:val="Hipervnculo"/>
                 <w:noProof/>
               </w:rPr>
-              <w:t>Desa</w:t>
-            </w:r>
-            <w:r>
-              <w:rPr>
-                <w:rStyle w:val="Hipervnculo"/>
-                <w:noProof/>
-              </w:rPr>
-              <w:t>r</w:t>
-            </w:r>
-            <w:r>
-              <w:rPr>
-                <w:rStyle w:val="Hipervnculo"/>
-                <w:noProof/>
-              </w:rPr>
-              <w:t>rollo de Experimentos Tentativos</w:t>
+              <w:t>Desarrollo de Experimentos Tentativos</w:t>
             </w:r>
             <w:r>
               <w:rPr>
@@ -3814,74 +3800,6 @@
         </w:p>
       </w:sdtContent>
     </w:sdt>
-    <w:p>
-      <w:pPr>
-        <w:shd w:val="clear" w:color="auto" w:fill="E5B8B7"/>
-        <w:rPr>
-          <w:i/>
-        </w:rPr>
-      </w:pPr>
-      <w:r>
-        <w:rPr>
-          <w:i/>
-        </w:rPr>
-        <w:t>¡¡¡INFORMATIVO!!! (quitar)</w:t>
-      </w:r>
-    </w:p>
-    <w:p>
-      <w:pPr>
-        <w:shd w:val="clear" w:color="auto" w:fill="E5B8B7" w:themeFill="accent2" w:themeFillTint="66"/>
-        <w:rPr>
-          <w:i/>
-        </w:rPr>
-      </w:pPr>
-      <w:r>
-        <w:rPr>
-          <w:i/>
-        </w:rPr>
-        <w:t xml:space="preserve">*Actualizar tabla de contenidos </w:t>
-      </w:r>
-    </w:p>
-    <w:p>
-      <w:pPr>
-        <w:shd w:val="clear" w:color="auto" w:fill="E5B8B7" w:themeFill="accent2" w:themeFillTint="66"/>
-        <w:rPr>
-          <w:i/>
-        </w:rPr>
-      </w:pPr>
-      <w:r>
-        <w:rPr>
-          <w:i/>
-        </w:rPr>
-        <w:t>*Hacer uso de salto de página para los nuevos apartados.</w:t>
-      </w:r>
-    </w:p>
-    <w:p>
-      <w:pPr>
-        <w:shd w:val="clear" w:color="auto" w:fill="E5B8B7" w:themeFill="accent2" w:themeFillTint="66"/>
-        <w:rPr>
-          <w:i/>
-        </w:rPr>
-      </w:pPr>
-      <w:r>
-        <w:rPr>
-          <w:i/>
-        </w:rPr>
-        <w:t>*Hac</w:t>
-      </w:r>
-      <w:r>
-        <w:rPr>
-          <w:i/>
-        </w:rPr>
-        <w:t>er uso de los estilos definidos en las instrucciones</w:t>
-      </w:r>
-      <w:r>
-        <w:rPr>
-          <w:i/>
-        </w:rPr>
-        <w:t>.</w:t>
-      </w:r>
-    </w:p>
     <w:p>
       <w:pPr>
         <w:pStyle w:val="Ttulo"/>
@@ -10927,13 +10845,7 @@
         <w:pStyle w:val="Ttulo3"/>
       </w:pPr>
       <w:r>
-        <w:t>Definición del Modelo de Referencia</w:t>
-      </w:r>
-      <w:r>
-        <w:t xml:space="preserve"> </w:t>
-      </w:r>
-      <w:r>
-        <w:t>(Baseline)</w:t>
+        <w:t>Definición del Modelo de Referencia (Baseline)</w:t>
       </w:r>
     </w:p>
     <w:p>
@@ -10957,16 +10869,7 @@
           <w:sz w:val="28"/>
           <w:szCs w:val="28"/>
         </w:rPr>
-        <w:t>Objetiv</w:t>
-      </w:r>
-      <w:r>
-        <w:rPr>
-          <w:b/>
-          <w:bCs/>
-          <w:sz w:val="28"/>
-          <w:szCs w:val="28"/>
-        </w:rPr>
-        <w:t>o</w:t>
+        <w:t>Objetivo</w:t>
       </w:r>
     </w:p>
     <w:p>
@@ -11951,14 +11854,7 @@
           <w:rFonts w:ascii="Arial" w:hAnsi="Arial"/>
           <w:lang w:eastAsia="es-ES"/>
         </w:rPr>
-        <w:t>nalterado</w:t>
-      </w:r>
-      <w:r>
-        <w:rPr>
-          <w:rFonts w:ascii="Arial" w:hAnsi="Arial"/>
-          <w:lang w:eastAsia="es-ES"/>
-        </w:rPr>
-        <w:t xml:space="preserve"> </w:t>
+        <w:t xml:space="preserve">nalterado </w:t>
       </w:r>
       <w:r>
         <w:rPr>
@@ -21754,6 +21650,7 @@
   <w:style w:type="character" w:default="1" w:styleId="Fuentedeprrafopredeter">
     <w:name w:val="Default Paragraph Font"/>
     <w:uiPriority w:val="1"/>
+    <w:semiHidden/>
     <w:unhideWhenUsed/>
   </w:style>
   <w:style w:type="table" w:default="1" w:styleId="Tablanormal">
@@ -23092,6 +22989,15 @@
 </file>
 
 <file path=customXml/item1.xml><?xml version="1.0" encoding="utf-8"?>
+<?mso-contentType ?>
+<FormTemplates xmlns="http://schemas.microsoft.com/sharepoint/v3/contenttype/forms">
+  <Display>DocumentLibraryForm</Display>
+  <Edit>DocumentLibraryForm</Edit>
+  <New>DocumentLibraryForm</New>
+</FormTemplates>
+</file>
+
+<file path=customXml/item2.xml><?xml version="1.0" encoding="utf-8"?>
 <p:properties xmlns:p="http://schemas.microsoft.com/office/2006/metadata/properties" xmlns:xsi="http://www.w3.org/2001/XMLSchema-instance" xmlns:pc="http://schemas.microsoft.com/office/infopath/2007/PartnerControls">
   <documentManagement>
     <GDDescripcion xmlns="ef848eef-985f-4e5f-af94-9b10d2c40a72" xsi:nil="true"/>
@@ -23119,20 +23025,7 @@
 </p:properties>
 </file>
 
-<file path=customXml/item2.xml><?xml version="1.0" encoding="utf-8"?>
-<?mso-contentType ?>
-<FormTemplates xmlns="http://schemas.microsoft.com/sharepoint/v3/contenttype/forms">
-  <Display>DocumentLibraryForm</Display>
-  <Edit>DocumentLibraryForm</Edit>
-  <New>DocumentLibraryForm</New>
-</FormTemplates>
-</file>
-
 <file path=customXml/item3.xml><?xml version="1.0" encoding="utf-8"?>
-<b:Sources xmlns:b="http://schemas.openxmlformats.org/officeDocument/2006/bibliography" xmlns="http://schemas.openxmlformats.org/officeDocument/2006/bibliography" SelectedStyle="\APASixthEditionOfficeOnline.xsl" StyleName="APA" Version="6"/>
-</file>
-
-<file path=customXml/item4.xml><?xml version="1.0" encoding="utf-8"?>
 <ct:contentTypeSchema xmlns:ct="http://schemas.microsoft.com/office/2006/metadata/contentType" xmlns:ma="http://schemas.microsoft.com/office/2006/metadata/properties/metaAttributes" ct:_="" ma:_="" ma:contentTypeName="VIU" ma:contentTypeID="0x0101001F78872F1579B14E90DA3A6EEDE63FFE0018510EEED1C50C49AD0F3D3BCEAAFC3C" ma:contentTypeVersion="26" ma:contentTypeDescription="" ma:contentTypeScope="" ma:versionID="d0b27130e95aaa99b0c356f807fd553b">
   <xsd:schema xmlns:xsd="http://www.w3.org/2001/XMLSchema" xmlns:xs="http://www.w3.org/2001/XMLSchema" xmlns:p="http://schemas.microsoft.com/office/2006/metadata/properties" xmlns:ns2="ef848eef-985f-4e5f-af94-9b10d2c40a72" xmlns:ns3="17bdaf06-e97e-4c95-a053-70575cfc447b" targetNamespace="http://schemas.microsoft.com/office/2006/metadata/properties" ma:root="true" ma:fieldsID="15aeb2f0f67f5185a412b0c5958713dc" ns2:_="" ns3:_="">
     <xsd:import namespace="ef848eef-985f-4e5f-af94-9b10d2c40a72"/>
@@ -23576,7 +23469,19 @@
 </ct:contentTypeSchema>
 </file>
 
+<file path=customXml/item4.xml><?xml version="1.0" encoding="utf-8"?>
+<b:Sources xmlns:b="http://schemas.openxmlformats.org/officeDocument/2006/bibliography" xmlns="http://schemas.openxmlformats.org/officeDocument/2006/bibliography" SelectedStyle="\APASixthEditionOfficeOnline.xsl" StyleName="APA" Version="6"/>
+</file>
+
 <file path=customXml/itemProps1.xml><?xml version="1.0" encoding="utf-8"?>
+<ds:datastoreItem xmlns:ds="http://schemas.openxmlformats.org/officeDocument/2006/customXml" ds:itemID="{D2E34552-30F1-4197-AD08-9874EE871786}">
+  <ds:schemaRefs>
+    <ds:schemaRef ds:uri="http://schemas.microsoft.com/sharepoint/v3/contenttype/forms"/>
+  </ds:schemaRefs>
+</ds:datastoreItem>
+</file>
+
+<file path=customXml/itemProps2.xml><?xml version="1.0" encoding="utf-8"?>
 <ds:datastoreItem xmlns:ds="http://schemas.openxmlformats.org/officeDocument/2006/customXml" ds:itemID="{07A964DA-14FF-4E77-85C4-CF3717E496CA}">
   <ds:schemaRefs>
     <ds:schemaRef ds:uri="http://schemas.microsoft.com/office/2006/metadata/properties"/>
@@ -23587,23 +23492,7 @@
 </ds:datastoreItem>
 </file>
 
-<file path=customXml/itemProps2.xml><?xml version="1.0" encoding="utf-8"?>
-<ds:datastoreItem xmlns:ds="http://schemas.openxmlformats.org/officeDocument/2006/customXml" ds:itemID="{D2E34552-30F1-4197-AD08-9874EE871786}">
-  <ds:schemaRefs>
-    <ds:schemaRef ds:uri="http://schemas.microsoft.com/sharepoint/v3/contenttype/forms"/>
-  </ds:schemaRefs>
-</ds:datastoreItem>
-</file>
-
 <file path=customXml/itemProps3.xml><?xml version="1.0" encoding="utf-8"?>
-<ds:datastoreItem xmlns:ds="http://schemas.openxmlformats.org/officeDocument/2006/customXml" ds:itemID="{D63F4731-4595-44D5-887D-AE208B5F9D7E}">
-  <ds:schemaRefs>
-    <ds:schemaRef ds:uri="http://schemas.openxmlformats.org/officeDocument/2006/bibliography"/>
-  </ds:schemaRefs>
-</ds:datastoreItem>
-</file>
-
-<file path=customXml/itemProps4.xml><?xml version="1.0" encoding="utf-8"?>
 <ds:datastoreItem xmlns:ds="http://schemas.openxmlformats.org/officeDocument/2006/customXml" ds:itemID="{3E57E9A8-5303-411D-9422-2A748018A89F}">
   <ds:schemaRefs>
     <ds:schemaRef ds:uri="http://schemas.microsoft.com/office/2006/metadata/contentType"/>
@@ -23620,4 +23509,12 @@
     <ds:schemaRef ds:uri="http://schemas.microsoft.com/internal/obd"/>
   </ds:schemaRefs>
 </ds:datastoreItem>
+</file>
+
+<file path=customXml/itemProps4.xml><?xml version="1.0" encoding="utf-8"?>
+<ds:datastoreItem xmlns:ds="http://schemas.openxmlformats.org/officeDocument/2006/customXml" ds:itemID="{D63F4731-4595-44D5-887D-AE208B5F9D7E}">
+  <ds:schemaRefs>
+    <ds:schemaRef ds:uri="http://schemas.openxmlformats.org/officeDocument/2006/bibliography"/>
+  </ds:schemaRefs>
+</ds:datastoreItem>
 </file>
</xml_diff>

<commit_message>
Sync: progreso guardado 2026-02-23 17:04
</commit_message>
<xml_diff>
--- a/CARPETA COMPARTIDA TUTOR/15MUIN E2 MOYA MARIN SERGIO.docx
+++ b/CARPETA COMPARTIDA TUTOR/15MUIN E2 MOYA MARIN SERGIO.docx
@@ -518,7 +518,7 @@
             </w:rPr>
             <w:fldChar w:fldCharType="separate"/>
           </w:r>
-          <w:hyperlink w:anchor="_Toc222422780" w:history="1">
+          <w:hyperlink w:anchor="_Toc222758565" w:history="1">
             <w:r>
               <w:rPr>
                 <w:rStyle w:val="Hipervnculo"/>
@@ -548,7 +548,7 @@
                 <w:noProof/>
                 <w:webHidden/>
               </w:rPr>
-              <w:instrText xml:space="preserve"> PAGEREF _Toc222422780 \h </w:instrText>
+              <w:instrText xml:space="preserve"> PAGEREF _Toc222758565 \h </w:instrText>
             </w:r>
             <w:r>
               <w:rPr>
@@ -595,7 +595,7 @@
               <w14:ligatures w14:val="standardContextual"/>
             </w:rPr>
           </w:pPr>
-          <w:hyperlink w:anchor="_Toc222422781" w:history="1">
+          <w:hyperlink w:anchor="_Toc222758566" w:history="1">
             <w:r>
               <w:rPr>
                 <w:rStyle w:val="Hipervnculo"/>
@@ -624,7 +624,7 @@
                 <w:noProof/>
                 <w:webHidden/>
               </w:rPr>
-              <w:instrText xml:space="preserve"> PAGEREF _Toc222422781 \h </w:instrText>
+              <w:instrText xml:space="preserve"> PAGEREF _Toc222758566 \h </w:instrText>
             </w:r>
             <w:r>
               <w:rPr>
@@ -672,7 +672,7 @@
               <w14:ligatures w14:val="standardContextual"/>
             </w:rPr>
           </w:pPr>
-          <w:hyperlink w:anchor="_Toc222422782" w:history="1">
+          <w:hyperlink w:anchor="_Toc222758567" w:history="1">
             <w:r>
               <w:rPr>
                 <w:rStyle w:val="Hipervnculo"/>
@@ -726,7 +726,7 @@
                 <w:noProof/>
                 <w:webHidden/>
               </w:rPr>
-              <w:instrText xml:space="preserve"> PAGEREF _Toc222422782 \h </w:instrText>
+              <w:instrText xml:space="preserve"> PAGEREF _Toc222758567 \h </w:instrText>
             </w:r>
             <w:r>
               <w:rPr>
@@ -774,7 +774,7 @@
               <w14:ligatures w14:val="standardContextual"/>
             </w:rPr>
           </w:pPr>
-          <w:hyperlink w:anchor="_Toc222422783" w:history="1">
+          <w:hyperlink w:anchor="_Toc222758568" w:history="1">
             <w:r>
               <w:rPr>
                 <w:rStyle w:val="Hipervnculo"/>
@@ -820,7 +820,7 @@
                 <w:noProof/>
                 <w:webHidden/>
               </w:rPr>
-              <w:instrText xml:space="preserve"> PAGEREF _Toc222422783 \h </w:instrText>
+              <w:instrText xml:space="preserve"> PAGEREF _Toc222758568 \h </w:instrText>
             </w:r>
             <w:r>
               <w:rPr>
@@ -868,7 +868,7 @@
               <w14:ligatures w14:val="standardContextual"/>
             </w:rPr>
           </w:pPr>
-          <w:hyperlink w:anchor="_Toc222422784" w:history="1">
+          <w:hyperlink w:anchor="_Toc222758569" w:history="1">
             <w:r>
               <w:rPr>
                 <w:rStyle w:val="Hipervnculo"/>
@@ -914,7 +914,7 @@
                 <w:noProof/>
                 <w:webHidden/>
               </w:rPr>
-              <w:instrText xml:space="preserve"> PAGEREF _Toc222422784 \h </w:instrText>
+              <w:instrText xml:space="preserve"> PAGEREF _Toc222758569 \h </w:instrText>
             </w:r>
             <w:r>
               <w:rPr>
@@ -962,7 +962,7 @@
               <w14:ligatures w14:val="standardContextual"/>
             </w:rPr>
           </w:pPr>
-          <w:hyperlink w:anchor="_Toc222422785" w:history="1">
+          <w:hyperlink w:anchor="_Toc222758570" w:history="1">
             <w:r>
               <w:rPr>
                 <w:rStyle w:val="Hipervnculo"/>
@@ -1008,7 +1008,7 @@
                 <w:noProof/>
                 <w:webHidden/>
               </w:rPr>
-              <w:instrText xml:space="preserve"> PAGEREF _Toc222422785 \h </w:instrText>
+              <w:instrText xml:space="preserve"> PAGEREF _Toc222758570 \h </w:instrText>
             </w:r>
             <w:r>
               <w:rPr>
@@ -1056,7 +1056,7 @@
               <w14:ligatures w14:val="standardContextual"/>
             </w:rPr>
           </w:pPr>
-          <w:hyperlink w:anchor="_Toc222422786" w:history="1">
+          <w:hyperlink w:anchor="_Toc222758571" w:history="1">
             <w:r>
               <w:rPr>
                 <w:rStyle w:val="Hipervnculo"/>
@@ -1102,7 +1102,7 @@
                 <w:noProof/>
                 <w:webHidden/>
               </w:rPr>
-              <w:instrText xml:space="preserve"> PAGEREF _Toc222422786 \h </w:instrText>
+              <w:instrText xml:space="preserve"> PAGEREF _Toc222758571 \h </w:instrText>
             </w:r>
             <w:r>
               <w:rPr>
@@ -1150,7 +1150,7 @@
               <w14:ligatures w14:val="standardContextual"/>
             </w:rPr>
           </w:pPr>
-          <w:hyperlink w:anchor="_Toc222422787" w:history="1">
+          <w:hyperlink w:anchor="_Toc222758572" w:history="1">
             <w:r>
               <w:rPr>
                 <w:rStyle w:val="Hipervnculo"/>
@@ -1196,7 +1196,7 @@
                 <w:noProof/>
                 <w:webHidden/>
               </w:rPr>
-              <w:instrText xml:space="preserve"> PAGEREF _Toc222422787 \h </w:instrText>
+              <w:instrText xml:space="preserve"> PAGEREF _Toc222758572 \h </w:instrText>
             </w:r>
             <w:r>
               <w:rPr>
@@ -1244,7 +1244,7 @@
               <w14:ligatures w14:val="standardContextual"/>
             </w:rPr>
           </w:pPr>
-          <w:hyperlink w:anchor="_Toc222422788" w:history="1">
+          <w:hyperlink w:anchor="_Toc222758573" w:history="1">
             <w:r>
               <w:rPr>
                 <w:rStyle w:val="Hipervnculo"/>
@@ -1290,7 +1290,7 @@
                 <w:noProof/>
                 <w:webHidden/>
               </w:rPr>
-              <w:instrText xml:space="preserve"> PAGEREF _Toc222422788 \h </w:instrText>
+              <w:instrText xml:space="preserve"> PAGEREF _Toc222758573 \h </w:instrText>
             </w:r>
             <w:r>
               <w:rPr>
@@ -1338,7 +1338,7 @@
               <w14:ligatures w14:val="standardContextual"/>
             </w:rPr>
           </w:pPr>
-          <w:hyperlink w:anchor="_Toc222422789" w:history="1">
+          <w:hyperlink w:anchor="_Toc222758574" w:history="1">
             <w:r>
               <w:rPr>
                 <w:rStyle w:val="Hipervnculo"/>
@@ -1390,7 +1390,7 @@
                 <w:noProof/>
                 <w:webHidden/>
               </w:rPr>
-              <w:instrText xml:space="preserve"> PAGEREF _Toc222422789 \h </w:instrText>
+              <w:instrText xml:space="preserve"> PAGEREF _Toc222758574 \h </w:instrText>
             </w:r>
             <w:r>
               <w:rPr>
@@ -1438,7 +1438,7 @@
               <w14:ligatures w14:val="standardContextual"/>
             </w:rPr>
           </w:pPr>
-          <w:hyperlink w:anchor="_Toc222422790" w:history="1">
+          <w:hyperlink w:anchor="_Toc222758575" w:history="1">
             <w:r>
               <w:rPr>
                 <w:rStyle w:val="Hipervnculo"/>
@@ -1484,7 +1484,7 @@
                 <w:noProof/>
                 <w:webHidden/>
               </w:rPr>
-              <w:instrText xml:space="preserve"> PAGEREF _Toc222422790 \h </w:instrText>
+              <w:instrText xml:space="preserve"> PAGEREF _Toc222758575 \h </w:instrText>
             </w:r>
             <w:r>
               <w:rPr>
@@ -1532,7 +1532,7 @@
               <w14:ligatures w14:val="standardContextual"/>
             </w:rPr>
           </w:pPr>
-          <w:hyperlink w:anchor="_Toc222422791" w:history="1">
+          <w:hyperlink w:anchor="_Toc222758576" w:history="1">
             <w:r>
               <w:rPr>
                 <w:rStyle w:val="Hipervnculo"/>
@@ -1578,7 +1578,7 @@
                 <w:noProof/>
                 <w:webHidden/>
               </w:rPr>
-              <w:instrText xml:space="preserve"> PAGEREF _Toc222422791 \h </w:instrText>
+              <w:instrText xml:space="preserve"> PAGEREF _Toc222758576 \h </w:instrText>
             </w:r>
             <w:r>
               <w:rPr>
@@ -1626,7 +1626,7 @@
               <w14:ligatures w14:val="standardContextual"/>
             </w:rPr>
           </w:pPr>
-          <w:hyperlink w:anchor="_Toc222422792" w:history="1">
+          <w:hyperlink w:anchor="_Toc222758577" w:history="1">
             <w:r>
               <w:rPr>
                 <w:rStyle w:val="Hipervnculo"/>
@@ -1672,7 +1672,7 @@
                 <w:noProof/>
                 <w:webHidden/>
               </w:rPr>
-              <w:instrText xml:space="preserve"> PAGEREF _Toc222422792 \h </w:instrText>
+              <w:instrText xml:space="preserve"> PAGEREF _Toc222758577 \h </w:instrText>
             </w:r>
             <w:r>
               <w:rPr>
@@ -1720,7 +1720,7 @@
               <w14:ligatures w14:val="standardContextual"/>
             </w:rPr>
           </w:pPr>
-          <w:hyperlink w:anchor="_Toc222422793" w:history="1">
+          <w:hyperlink w:anchor="_Toc222758578" w:history="1">
             <w:r>
               <w:rPr>
                 <w:rStyle w:val="Hipervnculo"/>
@@ -1766,7 +1766,7 @@
                 <w:noProof/>
                 <w:webHidden/>
               </w:rPr>
-              <w:instrText xml:space="preserve"> PAGEREF _Toc222422793 \h </w:instrText>
+              <w:instrText xml:space="preserve"> PAGEREF _Toc222758578 \h </w:instrText>
             </w:r>
             <w:r>
               <w:rPr>
@@ -1814,7 +1814,7 @@
               <w14:ligatures w14:val="standardContextual"/>
             </w:rPr>
           </w:pPr>
-          <w:hyperlink w:anchor="_Toc222422794" w:history="1">
+          <w:hyperlink w:anchor="_Toc222758579" w:history="1">
             <w:r>
               <w:rPr>
                 <w:rStyle w:val="Hipervnculo"/>
@@ -1866,7 +1866,7 @@
                 <w:noProof/>
                 <w:webHidden/>
               </w:rPr>
-              <w:instrText xml:space="preserve"> PAGEREF _Toc222422794 \h </w:instrText>
+              <w:instrText xml:space="preserve"> PAGEREF _Toc222758579 \h </w:instrText>
             </w:r>
             <w:r>
               <w:rPr>
@@ -1914,7 +1914,7 @@
               <w14:ligatures w14:val="standardContextual"/>
             </w:rPr>
           </w:pPr>
-          <w:hyperlink w:anchor="_Toc222422795" w:history="1">
+          <w:hyperlink w:anchor="_Toc222758580" w:history="1">
             <w:r>
               <w:rPr>
                 <w:rStyle w:val="Hipervnculo"/>
@@ -1962,7 +1962,7 @@
                 <w:noProof/>
                 <w:webHidden/>
               </w:rPr>
-              <w:instrText xml:space="preserve"> PAGEREF _Toc222422795 \h </w:instrText>
+              <w:instrText xml:space="preserve"> PAGEREF _Toc222758580 \h </w:instrText>
             </w:r>
             <w:r>
               <w:rPr>
@@ -2010,7 +2010,7 @@
               <w14:ligatures w14:val="standardContextual"/>
             </w:rPr>
           </w:pPr>
-          <w:hyperlink w:anchor="_Toc222422796" w:history="1">
+          <w:hyperlink w:anchor="_Toc222758581" w:history="1">
             <w:r>
               <w:rPr>
                 <w:rStyle w:val="Hipervnculo"/>
@@ -2058,7 +2058,7 @@
                 <w:noProof/>
                 <w:webHidden/>
               </w:rPr>
-              <w:instrText xml:space="preserve"> PAGEREF _Toc222422796 \h </w:instrText>
+              <w:instrText xml:space="preserve"> PAGEREF _Toc222758581 \h </w:instrText>
             </w:r>
             <w:r>
               <w:rPr>
@@ -2106,7 +2106,7 @@
               <w14:ligatures w14:val="standardContextual"/>
             </w:rPr>
           </w:pPr>
-          <w:hyperlink w:anchor="_Toc222422797" w:history="1">
+          <w:hyperlink w:anchor="_Toc222758582" w:history="1">
             <w:r>
               <w:rPr>
                 <w:rStyle w:val="Hipervnculo"/>
@@ -2154,7 +2154,7 @@
                 <w:noProof/>
                 <w:webHidden/>
               </w:rPr>
-              <w:instrText xml:space="preserve"> PAGEREF _Toc222422797 \h </w:instrText>
+              <w:instrText xml:space="preserve"> PAGEREF _Toc222758582 \h </w:instrText>
             </w:r>
             <w:r>
               <w:rPr>
@@ -2202,7 +2202,7 @@
               <w14:ligatures w14:val="standardContextual"/>
             </w:rPr>
           </w:pPr>
-          <w:hyperlink w:anchor="_Toc222422798" w:history="1">
+          <w:hyperlink w:anchor="_Toc222758583" w:history="1">
             <w:r>
               <w:rPr>
                 <w:rStyle w:val="Hipervnculo"/>
@@ -2248,7 +2248,7 @@
                 <w:noProof/>
                 <w:webHidden/>
               </w:rPr>
-              <w:instrText xml:space="preserve"> PAGEREF _Toc222422798 \h </w:instrText>
+              <w:instrText xml:space="preserve"> PAGEREF _Toc222758583 \h </w:instrText>
             </w:r>
             <w:r>
               <w:rPr>
@@ -2296,7 +2296,7 @@
               <w14:ligatures w14:val="standardContextual"/>
             </w:rPr>
           </w:pPr>
-          <w:hyperlink w:anchor="_Toc222422799" w:history="1">
+          <w:hyperlink w:anchor="_Toc222758584" w:history="1">
             <w:r>
               <w:rPr>
                 <w:rStyle w:val="Hipervnculo"/>
@@ -2344,7 +2344,7 @@
                 <w:noProof/>
                 <w:webHidden/>
               </w:rPr>
-              <w:instrText xml:space="preserve"> PAGEREF _Toc222422799 \h </w:instrText>
+              <w:instrText xml:space="preserve"> PAGEREF _Toc222758584 \h </w:instrText>
             </w:r>
             <w:r>
               <w:rPr>
@@ -2392,7 +2392,7 @@
               <w14:ligatures w14:val="standardContextual"/>
             </w:rPr>
           </w:pPr>
-          <w:hyperlink w:anchor="_Toc222422800" w:history="1">
+          <w:hyperlink w:anchor="_Toc222758585" w:history="1">
             <w:r>
               <w:rPr>
                 <w:rStyle w:val="Hipervnculo"/>
@@ -2440,7 +2440,7 @@
                 <w:noProof/>
                 <w:webHidden/>
               </w:rPr>
-              <w:instrText xml:space="preserve"> PAGEREF _Toc222422800 \h </w:instrText>
+              <w:instrText xml:space="preserve"> PAGEREF _Toc222758585 \h </w:instrText>
             </w:r>
             <w:r>
               <w:rPr>
@@ -2488,7 +2488,7 @@
               <w14:ligatures w14:val="standardContextual"/>
             </w:rPr>
           </w:pPr>
-          <w:hyperlink w:anchor="_Toc222422801" w:history="1">
+          <w:hyperlink w:anchor="_Toc222758586" w:history="1">
             <w:r>
               <w:rPr>
                 <w:rStyle w:val="Hipervnculo"/>
@@ -2536,7 +2536,7 @@
                 <w:noProof/>
                 <w:webHidden/>
               </w:rPr>
-              <w:instrText xml:space="preserve"> PAGEREF _Toc222422801 \h </w:instrText>
+              <w:instrText xml:space="preserve"> PAGEREF _Toc222758586 \h </w:instrText>
             </w:r>
             <w:r>
               <w:rPr>
@@ -2584,7 +2584,7 @@
               <w14:ligatures w14:val="standardContextual"/>
             </w:rPr>
           </w:pPr>
-          <w:hyperlink w:anchor="_Toc222422802" w:history="1">
+          <w:hyperlink w:anchor="_Toc222758587" w:history="1">
             <w:r>
               <w:rPr>
                 <w:rStyle w:val="Hipervnculo"/>
@@ -2630,7 +2630,7 @@
                 <w:noProof/>
                 <w:webHidden/>
               </w:rPr>
-              <w:instrText xml:space="preserve"> PAGEREF _Toc222422802 \h </w:instrText>
+              <w:instrText xml:space="preserve"> PAGEREF _Toc222758587 \h </w:instrText>
             </w:r>
             <w:r>
               <w:rPr>
@@ -2678,7 +2678,7 @@
               <w14:ligatures w14:val="standardContextual"/>
             </w:rPr>
           </w:pPr>
-          <w:hyperlink w:anchor="_Toc222422803" w:history="1">
+          <w:hyperlink w:anchor="_Toc222758588" w:history="1">
             <w:r>
               <w:rPr>
                 <w:rStyle w:val="Hipervnculo"/>
@@ -2724,7 +2724,7 @@
                 <w:noProof/>
                 <w:webHidden/>
               </w:rPr>
-              <w:instrText xml:space="preserve"> PAGEREF _Toc222422803 \h </w:instrText>
+              <w:instrText xml:space="preserve"> PAGEREF _Toc222758588 \h </w:instrText>
             </w:r>
             <w:r>
               <w:rPr>
@@ -2772,7 +2772,7 @@
               <w14:ligatures w14:val="standardContextual"/>
             </w:rPr>
           </w:pPr>
-          <w:hyperlink w:anchor="_Toc222422804" w:history="1">
+          <w:hyperlink w:anchor="_Toc222758589" w:history="1">
             <w:r>
               <w:rPr>
                 <w:rStyle w:val="Hipervnculo"/>
@@ -2818,7 +2818,7 @@
                 <w:noProof/>
                 <w:webHidden/>
               </w:rPr>
-              <w:instrText xml:space="preserve"> PAGEREF _Toc222422804 \h </w:instrText>
+              <w:instrText xml:space="preserve"> PAGEREF _Toc222758589 \h </w:instrText>
             </w:r>
             <w:r>
               <w:rPr>
@@ -2866,7 +2866,7 @@
               <w14:ligatures w14:val="standardContextual"/>
             </w:rPr>
           </w:pPr>
-          <w:hyperlink w:anchor="_Toc222422805" w:history="1">
+          <w:hyperlink w:anchor="_Toc222758590" w:history="1">
             <w:r>
               <w:rPr>
                 <w:rStyle w:val="Hipervnculo"/>
@@ -2912,7 +2912,7 @@
                 <w:noProof/>
                 <w:webHidden/>
               </w:rPr>
-              <w:instrText xml:space="preserve"> PAGEREF _Toc222422805 \h </w:instrText>
+              <w:instrText xml:space="preserve"> PAGEREF _Toc222758590 \h </w:instrText>
             </w:r>
             <w:r>
               <w:rPr>
@@ -2960,7 +2960,7 @@
               <w14:ligatures w14:val="standardContextual"/>
             </w:rPr>
           </w:pPr>
-          <w:hyperlink w:anchor="_Toc222422806" w:history="1">
+          <w:hyperlink w:anchor="_Toc222758591" w:history="1">
             <w:r>
               <w:rPr>
                 <w:rStyle w:val="Hipervnculo"/>
@@ -3006,7 +3006,7 @@
                 <w:noProof/>
                 <w:webHidden/>
               </w:rPr>
-              <w:instrText xml:space="preserve"> PAGEREF _Toc222422806 \h </w:instrText>
+              <w:instrText xml:space="preserve"> PAGEREF _Toc222758591 \h </w:instrText>
             </w:r>
             <w:r>
               <w:rPr>
@@ -3054,7 +3054,7 @@
               <w14:ligatures w14:val="standardContextual"/>
             </w:rPr>
           </w:pPr>
-          <w:hyperlink w:anchor="_Toc222422807" w:history="1">
+          <w:hyperlink w:anchor="_Toc222758592" w:history="1">
             <w:r>
               <w:rPr>
                 <w:rStyle w:val="Hipervnculo"/>
@@ -3100,7 +3100,7 @@
                 <w:noProof/>
                 <w:webHidden/>
               </w:rPr>
-              <w:instrText xml:space="preserve"> PAGEREF _Toc222422807 \h </w:instrText>
+              <w:instrText xml:space="preserve"> PAGEREF _Toc222758592 \h </w:instrText>
             </w:r>
             <w:r>
               <w:rPr>
@@ -3121,6 +3121,1004 @@
                 <w:webHidden/>
               </w:rPr>
               <w:t>27</w:t>
+            </w:r>
+            <w:r>
+              <w:rPr>
+                <w:noProof/>
+                <w:webHidden/>
+              </w:rPr>
+              <w:fldChar w:fldCharType="end"/>
+            </w:r>
+          </w:hyperlink>
+        </w:p>
+        <w:p>
+          <w:pPr>
+            <w:pStyle w:val="TDC3"/>
+            <w:tabs>
+              <w:tab w:val="left" w:pos="1200"/>
+              <w:tab w:val="right" w:leader="dot" w:pos="8494"/>
+            </w:tabs>
+            <w:rPr>
+              <w:rFonts w:asciiTheme="minorHAnsi" w:eastAsiaTheme="minorEastAsia" w:hAnsiTheme="minorHAnsi" w:cstheme="minorBidi"/>
+              <w:noProof/>
+              <w:kern w:val="2"/>
+              <w:sz w:val="24"/>
+              <w:szCs w:val="24"/>
+              <w:lang w:eastAsia="es-ES"/>
+              <w14:ligatures w14:val="standardContextual"/>
+            </w:rPr>
+          </w:pPr>
+          <w:hyperlink w:anchor="_Toc222758593" w:history="1">
+            <w:r>
+              <w:rPr>
+                <w:rStyle w:val="Hipervnculo"/>
+                <w:noProof/>
+              </w:rPr>
+              <w:t>3.4.1</w:t>
+            </w:r>
+            <w:r>
+              <w:rPr>
+                <w:rFonts w:asciiTheme="minorHAnsi" w:eastAsiaTheme="minorEastAsia" w:hAnsiTheme="minorHAnsi" w:cstheme="minorBidi"/>
+                <w:noProof/>
+                <w:kern w:val="2"/>
+                <w:sz w:val="24"/>
+                <w:szCs w:val="24"/>
+                <w:lang w:eastAsia="es-ES"/>
+                <w14:ligatures w14:val="standardContextual"/>
+              </w:rPr>
+              <w:tab/>
+            </w:r>
+            <w:r>
+              <w:rPr>
+                <w:rStyle w:val="Hipervnculo"/>
+                <w:noProof/>
+              </w:rPr>
+              <w:t>Definición del Modelo de Referencia (Baseline)</w:t>
+            </w:r>
+            <w:r>
+              <w:rPr>
+                <w:noProof/>
+                <w:webHidden/>
+              </w:rPr>
+              <w:tab/>
+            </w:r>
+            <w:r>
+              <w:rPr>
+                <w:noProof/>
+                <w:webHidden/>
+              </w:rPr>
+              <w:fldChar w:fldCharType="begin"/>
+            </w:r>
+            <w:r>
+              <w:rPr>
+                <w:noProof/>
+                <w:webHidden/>
+              </w:rPr>
+              <w:instrText xml:space="preserve"> PAGEREF _Toc222758593 \h </w:instrText>
+            </w:r>
+            <w:r>
+              <w:rPr>
+                <w:noProof/>
+                <w:webHidden/>
+              </w:rPr>
+            </w:r>
+            <w:r>
+              <w:rPr>
+                <w:noProof/>
+                <w:webHidden/>
+              </w:rPr>
+              <w:fldChar w:fldCharType="separate"/>
+            </w:r>
+            <w:r>
+              <w:rPr>
+                <w:noProof/>
+                <w:webHidden/>
+              </w:rPr>
+              <w:t>28</w:t>
+            </w:r>
+            <w:r>
+              <w:rPr>
+                <w:noProof/>
+                <w:webHidden/>
+              </w:rPr>
+              <w:fldChar w:fldCharType="end"/>
+            </w:r>
+          </w:hyperlink>
+        </w:p>
+        <w:p>
+          <w:pPr>
+            <w:pStyle w:val="TDC3"/>
+            <w:tabs>
+              <w:tab w:val="right" w:leader="dot" w:pos="8494"/>
+            </w:tabs>
+            <w:rPr>
+              <w:rFonts w:asciiTheme="minorHAnsi" w:eastAsiaTheme="minorEastAsia" w:hAnsiTheme="minorHAnsi" w:cstheme="minorBidi"/>
+              <w:noProof/>
+              <w:kern w:val="2"/>
+              <w:sz w:val="24"/>
+              <w:szCs w:val="24"/>
+              <w:lang w:eastAsia="es-ES"/>
+              <w14:ligatures w14:val="standardContextual"/>
+            </w:rPr>
+          </w:pPr>
+          <w:hyperlink w:anchor="_Toc222758594" w:history="1">
+            <w:r>
+              <w:rPr>
+                <w:rStyle w:val="Hipervnculo"/>
+                <w:b/>
+                <w:bCs/>
+                <w:noProof/>
+              </w:rPr>
+              <w:t>Objetivo</w:t>
+            </w:r>
+            <w:r>
+              <w:rPr>
+                <w:noProof/>
+                <w:webHidden/>
+              </w:rPr>
+              <w:tab/>
+            </w:r>
+            <w:r>
+              <w:rPr>
+                <w:noProof/>
+                <w:webHidden/>
+              </w:rPr>
+              <w:fldChar w:fldCharType="begin"/>
+            </w:r>
+            <w:r>
+              <w:rPr>
+                <w:noProof/>
+                <w:webHidden/>
+              </w:rPr>
+              <w:instrText xml:space="preserve"> PAGEREF _Toc222758594 \h </w:instrText>
+            </w:r>
+            <w:r>
+              <w:rPr>
+                <w:noProof/>
+                <w:webHidden/>
+              </w:rPr>
+            </w:r>
+            <w:r>
+              <w:rPr>
+                <w:noProof/>
+                <w:webHidden/>
+              </w:rPr>
+              <w:fldChar w:fldCharType="separate"/>
+            </w:r>
+            <w:r>
+              <w:rPr>
+                <w:noProof/>
+                <w:webHidden/>
+              </w:rPr>
+              <w:t>28</w:t>
+            </w:r>
+            <w:r>
+              <w:rPr>
+                <w:noProof/>
+                <w:webHidden/>
+              </w:rPr>
+              <w:fldChar w:fldCharType="end"/>
+            </w:r>
+          </w:hyperlink>
+        </w:p>
+        <w:p>
+          <w:pPr>
+            <w:pStyle w:val="TDC3"/>
+            <w:tabs>
+              <w:tab w:val="right" w:leader="dot" w:pos="8494"/>
+            </w:tabs>
+            <w:rPr>
+              <w:rFonts w:asciiTheme="minorHAnsi" w:eastAsiaTheme="minorEastAsia" w:hAnsiTheme="minorHAnsi" w:cstheme="minorBidi"/>
+              <w:noProof/>
+              <w:kern w:val="2"/>
+              <w:sz w:val="24"/>
+              <w:szCs w:val="24"/>
+              <w:lang w:eastAsia="es-ES"/>
+              <w14:ligatures w14:val="standardContextual"/>
+            </w:rPr>
+          </w:pPr>
+          <w:hyperlink w:anchor="_Toc222758595" w:history="1">
+            <w:r>
+              <w:rPr>
+                <w:rStyle w:val="Hipervnculo"/>
+                <w:b/>
+                <w:bCs/>
+                <w:noProof/>
+              </w:rPr>
+              <w:t>Configuración Experimental</w:t>
+            </w:r>
+            <w:r>
+              <w:rPr>
+                <w:noProof/>
+                <w:webHidden/>
+              </w:rPr>
+              <w:tab/>
+            </w:r>
+            <w:r>
+              <w:rPr>
+                <w:noProof/>
+                <w:webHidden/>
+              </w:rPr>
+              <w:fldChar w:fldCharType="begin"/>
+            </w:r>
+            <w:r>
+              <w:rPr>
+                <w:noProof/>
+                <w:webHidden/>
+              </w:rPr>
+              <w:instrText xml:space="preserve"> PAGEREF _Toc222758595 \h </w:instrText>
+            </w:r>
+            <w:r>
+              <w:rPr>
+                <w:noProof/>
+                <w:webHidden/>
+              </w:rPr>
+            </w:r>
+            <w:r>
+              <w:rPr>
+                <w:noProof/>
+                <w:webHidden/>
+              </w:rPr>
+              <w:fldChar w:fldCharType="separate"/>
+            </w:r>
+            <w:r>
+              <w:rPr>
+                <w:noProof/>
+                <w:webHidden/>
+              </w:rPr>
+              <w:t>29</w:t>
+            </w:r>
+            <w:r>
+              <w:rPr>
+                <w:noProof/>
+                <w:webHidden/>
+              </w:rPr>
+              <w:fldChar w:fldCharType="end"/>
+            </w:r>
+          </w:hyperlink>
+        </w:p>
+        <w:p>
+          <w:pPr>
+            <w:pStyle w:val="TDC3"/>
+            <w:tabs>
+              <w:tab w:val="right" w:leader="dot" w:pos="8494"/>
+            </w:tabs>
+            <w:rPr>
+              <w:rFonts w:asciiTheme="minorHAnsi" w:eastAsiaTheme="minorEastAsia" w:hAnsiTheme="minorHAnsi" w:cstheme="minorBidi"/>
+              <w:noProof/>
+              <w:kern w:val="2"/>
+              <w:sz w:val="24"/>
+              <w:szCs w:val="24"/>
+              <w:lang w:eastAsia="es-ES"/>
+              <w14:ligatures w14:val="standardContextual"/>
+            </w:rPr>
+          </w:pPr>
+          <w:hyperlink w:anchor="_Toc222758596" w:history="1">
+            <w:r>
+              <w:rPr>
+                <w:rStyle w:val="Hipervnculo"/>
+                <w:b/>
+                <w:bCs/>
+                <w:noProof/>
+              </w:rPr>
+              <w:t>Hipótesis de Trabajo</w:t>
+            </w:r>
+            <w:r>
+              <w:rPr>
+                <w:noProof/>
+                <w:webHidden/>
+              </w:rPr>
+              <w:tab/>
+            </w:r>
+            <w:r>
+              <w:rPr>
+                <w:noProof/>
+                <w:webHidden/>
+              </w:rPr>
+              <w:fldChar w:fldCharType="begin"/>
+            </w:r>
+            <w:r>
+              <w:rPr>
+                <w:noProof/>
+                <w:webHidden/>
+              </w:rPr>
+              <w:instrText xml:space="preserve"> PAGEREF _Toc222758596 \h </w:instrText>
+            </w:r>
+            <w:r>
+              <w:rPr>
+                <w:noProof/>
+                <w:webHidden/>
+              </w:rPr>
+            </w:r>
+            <w:r>
+              <w:rPr>
+                <w:noProof/>
+                <w:webHidden/>
+              </w:rPr>
+              <w:fldChar w:fldCharType="separate"/>
+            </w:r>
+            <w:r>
+              <w:rPr>
+                <w:noProof/>
+                <w:webHidden/>
+              </w:rPr>
+              <w:t>29</w:t>
+            </w:r>
+            <w:r>
+              <w:rPr>
+                <w:noProof/>
+                <w:webHidden/>
+              </w:rPr>
+              <w:fldChar w:fldCharType="end"/>
+            </w:r>
+          </w:hyperlink>
+        </w:p>
+        <w:p>
+          <w:pPr>
+            <w:pStyle w:val="TDC3"/>
+            <w:tabs>
+              <w:tab w:val="left" w:pos="1200"/>
+              <w:tab w:val="right" w:leader="dot" w:pos="8494"/>
+            </w:tabs>
+            <w:rPr>
+              <w:rFonts w:asciiTheme="minorHAnsi" w:eastAsiaTheme="minorEastAsia" w:hAnsiTheme="minorHAnsi" w:cstheme="minorBidi"/>
+              <w:noProof/>
+              <w:kern w:val="2"/>
+              <w:sz w:val="24"/>
+              <w:szCs w:val="24"/>
+              <w:lang w:eastAsia="es-ES"/>
+              <w14:ligatures w14:val="standardContextual"/>
+            </w:rPr>
+          </w:pPr>
+          <w:hyperlink w:anchor="_Toc222758597" w:history="1">
+            <w:r>
+              <w:rPr>
+                <w:rStyle w:val="Hipervnculo"/>
+                <w:noProof/>
+              </w:rPr>
+              <w:t>3.4.2</w:t>
+            </w:r>
+            <w:r>
+              <w:rPr>
+                <w:rFonts w:asciiTheme="minorHAnsi" w:eastAsiaTheme="minorEastAsia" w:hAnsiTheme="minorHAnsi" w:cstheme="minorBidi"/>
+                <w:noProof/>
+                <w:kern w:val="2"/>
+                <w:sz w:val="24"/>
+                <w:szCs w:val="24"/>
+                <w:lang w:eastAsia="es-ES"/>
+                <w14:ligatures w14:val="standardContextual"/>
+              </w:rPr>
+              <w:tab/>
+            </w:r>
+            <w:r>
+              <w:rPr>
+                <w:rStyle w:val="Hipervnculo"/>
+                <w:noProof/>
+              </w:rPr>
+              <w:t>Validación de Integridad Metodológica (</w:t>
+            </w:r>
+            <w:r>
+              <w:rPr>
+                <w:rStyle w:val="Hipervnculo"/>
+                <w:i/>
+                <w:iCs/>
+                <w:noProof/>
+              </w:rPr>
+              <w:t>Test Anti-Leakage</w:t>
+            </w:r>
+            <w:r>
+              <w:rPr>
+                <w:rStyle w:val="Hipervnculo"/>
+                <w:noProof/>
+              </w:rPr>
+              <w:t>)</w:t>
+            </w:r>
+            <w:r>
+              <w:rPr>
+                <w:noProof/>
+                <w:webHidden/>
+              </w:rPr>
+              <w:tab/>
+            </w:r>
+            <w:r>
+              <w:rPr>
+                <w:noProof/>
+                <w:webHidden/>
+              </w:rPr>
+              <w:fldChar w:fldCharType="begin"/>
+            </w:r>
+            <w:r>
+              <w:rPr>
+                <w:noProof/>
+                <w:webHidden/>
+              </w:rPr>
+              <w:instrText xml:space="preserve"> PAGEREF _Toc222758597 \h </w:instrText>
+            </w:r>
+            <w:r>
+              <w:rPr>
+                <w:noProof/>
+                <w:webHidden/>
+              </w:rPr>
+            </w:r>
+            <w:r>
+              <w:rPr>
+                <w:noProof/>
+                <w:webHidden/>
+              </w:rPr>
+              <w:fldChar w:fldCharType="separate"/>
+            </w:r>
+            <w:r>
+              <w:rPr>
+                <w:noProof/>
+                <w:webHidden/>
+              </w:rPr>
+              <w:t>30</w:t>
+            </w:r>
+            <w:r>
+              <w:rPr>
+                <w:noProof/>
+                <w:webHidden/>
+              </w:rPr>
+              <w:fldChar w:fldCharType="end"/>
+            </w:r>
+          </w:hyperlink>
+        </w:p>
+        <w:p>
+          <w:pPr>
+            <w:pStyle w:val="TDC3"/>
+            <w:tabs>
+              <w:tab w:val="right" w:leader="dot" w:pos="8494"/>
+            </w:tabs>
+            <w:rPr>
+              <w:rFonts w:asciiTheme="minorHAnsi" w:eastAsiaTheme="minorEastAsia" w:hAnsiTheme="minorHAnsi" w:cstheme="minorBidi"/>
+              <w:noProof/>
+              <w:kern w:val="2"/>
+              <w:sz w:val="24"/>
+              <w:szCs w:val="24"/>
+              <w:lang w:eastAsia="es-ES"/>
+              <w14:ligatures w14:val="standardContextual"/>
+            </w:rPr>
+          </w:pPr>
+          <w:hyperlink w:anchor="_Toc222758598" w:history="1">
+            <w:r>
+              <w:rPr>
+                <w:rStyle w:val="Hipervnculo"/>
+                <w:b/>
+                <w:bCs/>
+                <w:noProof/>
+              </w:rPr>
+              <w:t>Objetivo</w:t>
+            </w:r>
+            <w:r>
+              <w:rPr>
+                <w:noProof/>
+                <w:webHidden/>
+              </w:rPr>
+              <w:tab/>
+            </w:r>
+            <w:r>
+              <w:rPr>
+                <w:noProof/>
+                <w:webHidden/>
+              </w:rPr>
+              <w:fldChar w:fldCharType="begin"/>
+            </w:r>
+            <w:r>
+              <w:rPr>
+                <w:noProof/>
+                <w:webHidden/>
+              </w:rPr>
+              <w:instrText xml:space="preserve"> PAGEREF _Toc222758598 \h </w:instrText>
+            </w:r>
+            <w:r>
+              <w:rPr>
+                <w:noProof/>
+                <w:webHidden/>
+              </w:rPr>
+            </w:r>
+            <w:r>
+              <w:rPr>
+                <w:noProof/>
+                <w:webHidden/>
+              </w:rPr>
+              <w:fldChar w:fldCharType="separate"/>
+            </w:r>
+            <w:r>
+              <w:rPr>
+                <w:noProof/>
+                <w:webHidden/>
+              </w:rPr>
+              <w:t>30</w:t>
+            </w:r>
+            <w:r>
+              <w:rPr>
+                <w:noProof/>
+                <w:webHidden/>
+              </w:rPr>
+              <w:fldChar w:fldCharType="end"/>
+            </w:r>
+          </w:hyperlink>
+        </w:p>
+        <w:p>
+          <w:pPr>
+            <w:pStyle w:val="TDC3"/>
+            <w:tabs>
+              <w:tab w:val="right" w:leader="dot" w:pos="8494"/>
+            </w:tabs>
+            <w:rPr>
+              <w:rFonts w:asciiTheme="minorHAnsi" w:eastAsiaTheme="minorEastAsia" w:hAnsiTheme="minorHAnsi" w:cstheme="minorBidi"/>
+              <w:noProof/>
+              <w:kern w:val="2"/>
+              <w:sz w:val="24"/>
+              <w:szCs w:val="24"/>
+              <w:lang w:eastAsia="es-ES"/>
+              <w14:ligatures w14:val="standardContextual"/>
+            </w:rPr>
+          </w:pPr>
+          <w:hyperlink w:anchor="_Toc222758599" w:history="1">
+            <w:r>
+              <w:rPr>
+                <w:rStyle w:val="Hipervnculo"/>
+                <w:b/>
+                <w:bCs/>
+                <w:noProof/>
+              </w:rPr>
+              <w:t>Configuración Experimental</w:t>
+            </w:r>
+            <w:r>
+              <w:rPr>
+                <w:noProof/>
+                <w:webHidden/>
+              </w:rPr>
+              <w:tab/>
+            </w:r>
+            <w:r>
+              <w:rPr>
+                <w:noProof/>
+                <w:webHidden/>
+              </w:rPr>
+              <w:fldChar w:fldCharType="begin"/>
+            </w:r>
+            <w:r>
+              <w:rPr>
+                <w:noProof/>
+                <w:webHidden/>
+              </w:rPr>
+              <w:instrText xml:space="preserve"> PAGEREF _Toc222758599 \h </w:instrText>
+            </w:r>
+            <w:r>
+              <w:rPr>
+                <w:noProof/>
+                <w:webHidden/>
+              </w:rPr>
+            </w:r>
+            <w:r>
+              <w:rPr>
+                <w:noProof/>
+                <w:webHidden/>
+              </w:rPr>
+              <w:fldChar w:fldCharType="separate"/>
+            </w:r>
+            <w:r>
+              <w:rPr>
+                <w:noProof/>
+                <w:webHidden/>
+              </w:rPr>
+              <w:t>30</w:t>
+            </w:r>
+            <w:r>
+              <w:rPr>
+                <w:noProof/>
+                <w:webHidden/>
+              </w:rPr>
+              <w:fldChar w:fldCharType="end"/>
+            </w:r>
+          </w:hyperlink>
+        </w:p>
+        <w:p>
+          <w:pPr>
+            <w:pStyle w:val="TDC3"/>
+            <w:tabs>
+              <w:tab w:val="right" w:leader="dot" w:pos="8494"/>
+            </w:tabs>
+            <w:rPr>
+              <w:rFonts w:asciiTheme="minorHAnsi" w:eastAsiaTheme="minorEastAsia" w:hAnsiTheme="minorHAnsi" w:cstheme="minorBidi"/>
+              <w:noProof/>
+              <w:kern w:val="2"/>
+              <w:sz w:val="24"/>
+              <w:szCs w:val="24"/>
+              <w:lang w:eastAsia="es-ES"/>
+              <w14:ligatures w14:val="standardContextual"/>
+            </w:rPr>
+          </w:pPr>
+          <w:hyperlink w:anchor="_Toc222758600" w:history="1">
+            <w:r>
+              <w:rPr>
+                <w:rStyle w:val="Hipervnculo"/>
+                <w:b/>
+                <w:bCs/>
+                <w:noProof/>
+              </w:rPr>
+              <w:t>Hipótesis de Trabajo</w:t>
+            </w:r>
+            <w:r>
+              <w:rPr>
+                <w:noProof/>
+                <w:webHidden/>
+              </w:rPr>
+              <w:tab/>
+            </w:r>
+            <w:r>
+              <w:rPr>
+                <w:noProof/>
+                <w:webHidden/>
+              </w:rPr>
+              <w:fldChar w:fldCharType="begin"/>
+            </w:r>
+            <w:r>
+              <w:rPr>
+                <w:noProof/>
+                <w:webHidden/>
+              </w:rPr>
+              <w:instrText xml:space="preserve"> PAGEREF _Toc222758600 \h </w:instrText>
+            </w:r>
+            <w:r>
+              <w:rPr>
+                <w:noProof/>
+                <w:webHidden/>
+              </w:rPr>
+            </w:r>
+            <w:r>
+              <w:rPr>
+                <w:noProof/>
+                <w:webHidden/>
+              </w:rPr>
+              <w:fldChar w:fldCharType="separate"/>
+            </w:r>
+            <w:r>
+              <w:rPr>
+                <w:noProof/>
+                <w:webHidden/>
+              </w:rPr>
+              <w:t>30</w:t>
+            </w:r>
+            <w:r>
+              <w:rPr>
+                <w:noProof/>
+                <w:webHidden/>
+              </w:rPr>
+              <w:fldChar w:fldCharType="end"/>
+            </w:r>
+          </w:hyperlink>
+        </w:p>
+        <w:p>
+          <w:pPr>
+            <w:pStyle w:val="TDC3"/>
+            <w:tabs>
+              <w:tab w:val="left" w:pos="1200"/>
+              <w:tab w:val="right" w:leader="dot" w:pos="8494"/>
+            </w:tabs>
+            <w:rPr>
+              <w:rFonts w:asciiTheme="minorHAnsi" w:eastAsiaTheme="minorEastAsia" w:hAnsiTheme="minorHAnsi" w:cstheme="minorBidi"/>
+              <w:noProof/>
+              <w:kern w:val="2"/>
+              <w:sz w:val="24"/>
+              <w:szCs w:val="24"/>
+              <w:lang w:eastAsia="es-ES"/>
+              <w14:ligatures w14:val="standardContextual"/>
+            </w:rPr>
+          </w:pPr>
+          <w:hyperlink w:anchor="_Toc222758601" w:history="1">
+            <w:r>
+              <w:rPr>
+                <w:rStyle w:val="Hipervnculo"/>
+                <w:noProof/>
+              </w:rPr>
+              <w:t>3.4.3</w:t>
+            </w:r>
+            <w:r>
+              <w:rPr>
+                <w:rFonts w:asciiTheme="minorHAnsi" w:eastAsiaTheme="minorEastAsia" w:hAnsiTheme="minorHAnsi" w:cstheme="minorBidi"/>
+                <w:noProof/>
+                <w:kern w:val="2"/>
+                <w:sz w:val="24"/>
+                <w:szCs w:val="24"/>
+                <w:lang w:eastAsia="es-ES"/>
+                <w14:ligatures w14:val="standardContextual"/>
+              </w:rPr>
+              <w:tab/>
+            </w:r>
+            <w:r>
+              <w:rPr>
+                <w:rStyle w:val="Hipervnculo"/>
+                <w:noProof/>
+              </w:rPr>
+              <w:t>Análisis de Interpretabilidad Algorítmica (</w:t>
+            </w:r>
+            <w:r>
+              <w:rPr>
+                <w:rStyle w:val="Hipervnculo"/>
+                <w:i/>
+                <w:iCs/>
+                <w:noProof/>
+              </w:rPr>
+              <w:t>Explainable AI</w:t>
+            </w:r>
+            <w:r>
+              <w:rPr>
+                <w:rStyle w:val="Hipervnculo"/>
+                <w:noProof/>
+              </w:rPr>
+              <w:t>)</w:t>
+            </w:r>
+            <w:r>
+              <w:rPr>
+                <w:noProof/>
+                <w:webHidden/>
+              </w:rPr>
+              <w:tab/>
+            </w:r>
+            <w:r>
+              <w:rPr>
+                <w:noProof/>
+                <w:webHidden/>
+              </w:rPr>
+              <w:fldChar w:fldCharType="begin"/>
+            </w:r>
+            <w:r>
+              <w:rPr>
+                <w:noProof/>
+                <w:webHidden/>
+              </w:rPr>
+              <w:instrText xml:space="preserve"> PAGEREF _Toc222758601 \h </w:instrText>
+            </w:r>
+            <w:r>
+              <w:rPr>
+                <w:noProof/>
+                <w:webHidden/>
+              </w:rPr>
+            </w:r>
+            <w:r>
+              <w:rPr>
+                <w:noProof/>
+                <w:webHidden/>
+              </w:rPr>
+              <w:fldChar w:fldCharType="separate"/>
+            </w:r>
+            <w:r>
+              <w:rPr>
+                <w:noProof/>
+                <w:webHidden/>
+              </w:rPr>
+              <w:t>31</w:t>
+            </w:r>
+            <w:r>
+              <w:rPr>
+                <w:noProof/>
+                <w:webHidden/>
+              </w:rPr>
+              <w:fldChar w:fldCharType="end"/>
+            </w:r>
+          </w:hyperlink>
+        </w:p>
+        <w:p>
+          <w:pPr>
+            <w:pStyle w:val="TDC3"/>
+            <w:tabs>
+              <w:tab w:val="right" w:leader="dot" w:pos="8494"/>
+            </w:tabs>
+            <w:rPr>
+              <w:rFonts w:asciiTheme="minorHAnsi" w:eastAsiaTheme="minorEastAsia" w:hAnsiTheme="minorHAnsi" w:cstheme="minorBidi"/>
+              <w:noProof/>
+              <w:kern w:val="2"/>
+              <w:sz w:val="24"/>
+              <w:szCs w:val="24"/>
+              <w:lang w:eastAsia="es-ES"/>
+              <w14:ligatures w14:val="standardContextual"/>
+            </w:rPr>
+          </w:pPr>
+          <w:hyperlink w:anchor="_Toc222758602" w:history="1">
+            <w:r>
+              <w:rPr>
+                <w:rStyle w:val="Hipervnculo"/>
+                <w:b/>
+                <w:bCs/>
+                <w:noProof/>
+              </w:rPr>
+              <w:t>Objetivo</w:t>
+            </w:r>
+            <w:r>
+              <w:rPr>
+                <w:noProof/>
+                <w:webHidden/>
+              </w:rPr>
+              <w:tab/>
+            </w:r>
+            <w:r>
+              <w:rPr>
+                <w:noProof/>
+                <w:webHidden/>
+              </w:rPr>
+              <w:fldChar w:fldCharType="begin"/>
+            </w:r>
+            <w:r>
+              <w:rPr>
+                <w:noProof/>
+                <w:webHidden/>
+              </w:rPr>
+              <w:instrText xml:space="preserve"> PAGEREF _Toc222758602 \h </w:instrText>
+            </w:r>
+            <w:r>
+              <w:rPr>
+                <w:noProof/>
+                <w:webHidden/>
+              </w:rPr>
+            </w:r>
+            <w:r>
+              <w:rPr>
+                <w:noProof/>
+                <w:webHidden/>
+              </w:rPr>
+              <w:fldChar w:fldCharType="separate"/>
+            </w:r>
+            <w:r>
+              <w:rPr>
+                <w:noProof/>
+                <w:webHidden/>
+              </w:rPr>
+              <w:t>31</w:t>
+            </w:r>
+            <w:r>
+              <w:rPr>
+                <w:noProof/>
+                <w:webHidden/>
+              </w:rPr>
+              <w:fldChar w:fldCharType="end"/>
+            </w:r>
+          </w:hyperlink>
+        </w:p>
+        <w:p>
+          <w:pPr>
+            <w:pStyle w:val="TDC3"/>
+            <w:tabs>
+              <w:tab w:val="right" w:leader="dot" w:pos="8494"/>
+            </w:tabs>
+            <w:rPr>
+              <w:rFonts w:asciiTheme="minorHAnsi" w:eastAsiaTheme="minorEastAsia" w:hAnsiTheme="minorHAnsi" w:cstheme="minorBidi"/>
+              <w:noProof/>
+              <w:kern w:val="2"/>
+              <w:sz w:val="24"/>
+              <w:szCs w:val="24"/>
+              <w:lang w:eastAsia="es-ES"/>
+              <w14:ligatures w14:val="standardContextual"/>
+            </w:rPr>
+          </w:pPr>
+          <w:hyperlink w:anchor="_Toc222758603" w:history="1">
+            <w:r>
+              <w:rPr>
+                <w:rStyle w:val="Hipervnculo"/>
+                <w:b/>
+                <w:bCs/>
+                <w:noProof/>
+              </w:rPr>
+              <w:t>Configuración Experimental</w:t>
+            </w:r>
+            <w:r>
+              <w:rPr>
+                <w:noProof/>
+                <w:webHidden/>
+              </w:rPr>
+              <w:tab/>
+            </w:r>
+            <w:r>
+              <w:rPr>
+                <w:noProof/>
+                <w:webHidden/>
+              </w:rPr>
+              <w:fldChar w:fldCharType="begin"/>
+            </w:r>
+            <w:r>
+              <w:rPr>
+                <w:noProof/>
+                <w:webHidden/>
+              </w:rPr>
+              <w:instrText xml:space="preserve"> PAGEREF _Toc222758603 \h </w:instrText>
+            </w:r>
+            <w:r>
+              <w:rPr>
+                <w:noProof/>
+                <w:webHidden/>
+              </w:rPr>
+            </w:r>
+            <w:r>
+              <w:rPr>
+                <w:noProof/>
+                <w:webHidden/>
+              </w:rPr>
+              <w:fldChar w:fldCharType="separate"/>
+            </w:r>
+            <w:r>
+              <w:rPr>
+                <w:noProof/>
+                <w:webHidden/>
+              </w:rPr>
+              <w:t>31</w:t>
+            </w:r>
+            <w:r>
+              <w:rPr>
+                <w:noProof/>
+                <w:webHidden/>
+              </w:rPr>
+              <w:fldChar w:fldCharType="end"/>
+            </w:r>
+          </w:hyperlink>
+        </w:p>
+        <w:p>
+          <w:pPr>
+            <w:pStyle w:val="TDC3"/>
+            <w:tabs>
+              <w:tab w:val="right" w:leader="dot" w:pos="8494"/>
+            </w:tabs>
+            <w:rPr>
+              <w:rFonts w:asciiTheme="minorHAnsi" w:eastAsiaTheme="minorEastAsia" w:hAnsiTheme="minorHAnsi" w:cstheme="minorBidi"/>
+              <w:noProof/>
+              <w:kern w:val="2"/>
+              <w:sz w:val="24"/>
+              <w:szCs w:val="24"/>
+              <w:lang w:eastAsia="es-ES"/>
+              <w14:ligatures w14:val="standardContextual"/>
+            </w:rPr>
+          </w:pPr>
+          <w:hyperlink w:anchor="_Toc222758604" w:history="1">
+            <w:r>
+              <w:rPr>
+                <w:rStyle w:val="Hipervnculo"/>
+                <w:b/>
+                <w:bCs/>
+                <w:noProof/>
+              </w:rPr>
+              <w:t>Hipótesis de Trabajo</w:t>
+            </w:r>
+            <w:r>
+              <w:rPr>
+                <w:noProof/>
+                <w:webHidden/>
+              </w:rPr>
+              <w:tab/>
+            </w:r>
+            <w:r>
+              <w:rPr>
+                <w:noProof/>
+                <w:webHidden/>
+              </w:rPr>
+              <w:fldChar w:fldCharType="begin"/>
+            </w:r>
+            <w:r>
+              <w:rPr>
+                <w:noProof/>
+                <w:webHidden/>
+              </w:rPr>
+              <w:instrText xml:space="preserve"> PAGEREF _Toc222758604 \h </w:instrText>
+            </w:r>
+            <w:r>
+              <w:rPr>
+                <w:noProof/>
+                <w:webHidden/>
+              </w:rPr>
+            </w:r>
+            <w:r>
+              <w:rPr>
+                <w:noProof/>
+                <w:webHidden/>
+              </w:rPr>
+              <w:fldChar w:fldCharType="separate"/>
+            </w:r>
+            <w:r>
+              <w:rPr>
+                <w:noProof/>
+                <w:webHidden/>
+              </w:rPr>
+              <w:t>32</w:t>
             </w:r>
             <w:r>
               <w:rPr>
@@ -3148,7 +4146,7 @@
               <w14:ligatures w14:val="standardContextual"/>
             </w:rPr>
           </w:pPr>
-          <w:hyperlink w:anchor="_Toc222422808" w:history="1">
+          <w:hyperlink w:anchor="_Toc222758605" w:history="1">
             <w:r>
               <w:rPr>
                 <w:rStyle w:val="Hipervnculo"/>
@@ -3200,7 +4198,7 @@
                 <w:noProof/>
                 <w:webHidden/>
               </w:rPr>
-              <w:instrText xml:space="preserve"> PAGEREF _Toc222422808 \h </w:instrText>
+              <w:instrText xml:space="preserve"> PAGEREF _Toc222758605 \h </w:instrText>
             </w:r>
             <w:r>
               <w:rPr>
@@ -3220,7 +4218,7 @@
                 <w:noProof/>
                 <w:webHidden/>
               </w:rPr>
-              <w:t>29</w:t>
+              <w:t>33</w:t>
             </w:r>
             <w:r>
               <w:rPr>
@@ -3248,7 +4246,7 @@
               <w14:ligatures w14:val="standardContextual"/>
             </w:rPr>
           </w:pPr>
-          <w:hyperlink w:anchor="_Toc222422809" w:history="1">
+          <w:hyperlink w:anchor="_Toc222758606" w:history="1">
             <w:r>
               <w:rPr>
                 <w:rStyle w:val="Hipervnculo"/>
@@ -3294,7 +4292,7 @@
                 <w:noProof/>
                 <w:webHidden/>
               </w:rPr>
-              <w:instrText xml:space="preserve"> PAGEREF _Toc222422809 \h </w:instrText>
+              <w:instrText xml:space="preserve"> PAGEREF _Toc222758606 \h </w:instrText>
             </w:r>
             <w:r>
               <w:rPr>
@@ -3314,7 +4312,7 @@
                 <w:noProof/>
                 <w:webHidden/>
               </w:rPr>
-              <w:t>29</w:t>
+              <w:t>33</w:t>
             </w:r>
             <w:r>
               <w:rPr>
@@ -3342,7 +4340,7 @@
               <w14:ligatures w14:val="standardContextual"/>
             </w:rPr>
           </w:pPr>
-          <w:hyperlink w:anchor="_Toc222422810" w:history="1">
+          <w:hyperlink w:anchor="_Toc222758607" w:history="1">
             <w:r>
               <w:rPr>
                 <w:rStyle w:val="Hipervnculo"/>
@@ -3388,7 +4386,7 @@
                 <w:noProof/>
                 <w:webHidden/>
               </w:rPr>
-              <w:instrText xml:space="preserve"> PAGEREF _Toc222422810 \h </w:instrText>
+              <w:instrText xml:space="preserve"> PAGEREF _Toc222758607 \h </w:instrText>
             </w:r>
             <w:r>
               <w:rPr>
@@ -3408,7 +4406,7 @@
                 <w:noProof/>
                 <w:webHidden/>
               </w:rPr>
-              <w:t>29</w:t>
+              <w:t>33</w:t>
             </w:r>
             <w:r>
               <w:rPr>
@@ -3436,7 +4434,7 @@
               <w14:ligatures w14:val="standardContextual"/>
             </w:rPr>
           </w:pPr>
-          <w:hyperlink w:anchor="_Toc222422811" w:history="1">
+          <w:hyperlink w:anchor="_Toc222758608" w:history="1">
             <w:r>
               <w:rPr>
                 <w:rStyle w:val="Hipervnculo"/>
@@ -3482,7 +4480,7 @@
                 <w:noProof/>
                 <w:webHidden/>
               </w:rPr>
-              <w:instrText xml:space="preserve"> PAGEREF _Toc222422811 \h </w:instrText>
+              <w:instrText xml:space="preserve"> PAGEREF _Toc222758608 \h </w:instrText>
             </w:r>
             <w:r>
               <w:rPr>
@@ -3502,7 +4500,7 @@
                 <w:noProof/>
                 <w:webHidden/>
               </w:rPr>
-              <w:t>30</w:t>
+              <w:t>34</w:t>
             </w:r>
             <w:r>
               <w:rPr>
@@ -3530,7 +4528,7 @@
               <w14:ligatures w14:val="standardContextual"/>
             </w:rPr>
           </w:pPr>
-          <w:hyperlink w:anchor="_Toc222422812" w:history="1">
+          <w:hyperlink w:anchor="_Toc222758609" w:history="1">
             <w:r>
               <w:rPr>
                 <w:rStyle w:val="Hipervnculo"/>
@@ -3580,7 +4578,7 @@
                 <w:noProof/>
                 <w:webHidden/>
               </w:rPr>
-              <w:instrText xml:space="preserve"> PAGEREF _Toc222422812 \h </w:instrText>
+              <w:instrText xml:space="preserve"> PAGEREF _Toc222758609 \h </w:instrText>
             </w:r>
             <w:r>
               <w:rPr>
@@ -3600,7 +4598,7 @@
                 <w:noProof/>
                 <w:webHidden/>
               </w:rPr>
-              <w:t>32</w:t>
+              <w:t>36</w:t>
             </w:r>
             <w:r>
               <w:rPr>
@@ -3628,7 +4626,7 @@
               <w14:ligatures w14:val="standardContextual"/>
             </w:rPr>
           </w:pPr>
-          <w:hyperlink w:anchor="_Toc222422813" w:history="1">
+          <w:hyperlink w:anchor="_Toc222758610" w:history="1">
             <w:r>
               <w:rPr>
                 <w:rStyle w:val="Hipervnculo"/>
@@ -3678,7 +4676,7 @@
                 <w:noProof/>
                 <w:webHidden/>
               </w:rPr>
-              <w:instrText xml:space="preserve"> PAGEREF _Toc222422813 \h </w:instrText>
+              <w:instrText xml:space="preserve"> PAGEREF _Toc222758610 \h </w:instrText>
             </w:r>
             <w:r>
               <w:rPr>
@@ -3698,7 +4696,7 @@
                 <w:noProof/>
                 <w:webHidden/>
               </w:rPr>
-              <w:t>33</w:t>
+              <w:t>37</w:t>
             </w:r>
             <w:r>
               <w:rPr>
@@ -3725,7 +4723,7 @@
               <w14:ligatures w14:val="standardContextual"/>
             </w:rPr>
           </w:pPr>
-          <w:hyperlink w:anchor="_Toc222422814" w:history="1">
+          <w:hyperlink w:anchor="_Toc222758611" w:history="1">
             <w:r>
               <w:rPr>
                 <w:rStyle w:val="Hipervnculo"/>
@@ -3753,7 +4751,7 @@
                 <w:noProof/>
                 <w:webHidden/>
               </w:rPr>
-              <w:instrText xml:space="preserve"> PAGEREF _Toc222422814 \h </w:instrText>
+              <w:instrText xml:space="preserve"> PAGEREF _Toc222758611 \h </w:instrText>
             </w:r>
             <w:r>
               <w:rPr>
@@ -3773,7 +4771,7 @@
                 <w:noProof/>
                 <w:webHidden/>
               </w:rPr>
-              <w:t>34</w:t>
+              <w:t>38</w:t>
             </w:r>
             <w:r>
               <w:rPr>
@@ -4013,7 +5011,7 @@
         </w:rPr>
       </w:pPr>
       <w:bookmarkStart w:id="0" w:name="_Toc10030870"/>
-      <w:bookmarkStart w:id="1" w:name="_Toc222422780"/>
+      <w:bookmarkStart w:id="1" w:name="_Toc222758565"/>
       <w:bookmarkEnd w:id="0"/>
       <w:r>
         <w:rPr>
@@ -4134,7 +5132,7 @@
           <w:sz w:val="36"/>
         </w:rPr>
       </w:pPr>
-      <w:bookmarkStart w:id="2" w:name="_Toc222422781"/>
+      <w:bookmarkStart w:id="2" w:name="_Toc222758566"/>
       <w:r>
         <w:rPr>
           <w:rFonts w:ascii="Arial" w:hAnsi="Arial"/>
@@ -4249,7 +5247,7 @@
         </w:rPr>
       </w:pPr>
       <w:bookmarkStart w:id="3" w:name="_Toc10030871"/>
-      <w:bookmarkStart w:id="4" w:name="_Toc222422782"/>
+      <w:bookmarkStart w:id="4" w:name="_Toc222758567"/>
       <w:bookmarkEnd w:id="3"/>
       <w:commentRangeStart w:id="5"/>
       <w:commentRangeStart w:id="6"/>
@@ -4326,7 +5324,7 @@
       <w:pPr>
         <w:pStyle w:val="Ttulo2"/>
       </w:pPr>
-      <w:bookmarkStart w:id="7" w:name="_Toc222422783"/>
+      <w:bookmarkStart w:id="7" w:name="_Toc222758568"/>
       <w:commentRangeStart w:id="8"/>
       <w:commentRangeStart w:id="9"/>
       <w:r>
@@ -4464,7 +5462,7 @@
       <w:pPr>
         <w:pStyle w:val="Ttulo2"/>
       </w:pPr>
-      <w:bookmarkStart w:id="10" w:name="_Toc222422784"/>
+      <w:bookmarkStart w:id="10" w:name="_Toc222758569"/>
       <w:r>
         <w:t>La Brecha entre Precisión y Explicabilidad</w:t>
       </w:r>
@@ -4550,7 +5548,7 @@
       <w:pPr>
         <w:pStyle w:val="Ttulo2"/>
       </w:pPr>
-      <w:bookmarkStart w:id="11" w:name="_Toc222422785"/>
+      <w:bookmarkStart w:id="11" w:name="_Toc222758570"/>
       <w:r>
         <w:t>Justificación y Enfoque Metodológico</w:t>
       </w:r>
@@ -4656,7 +5654,7 @@
       <w:pPr>
         <w:pStyle w:val="Ttulo2"/>
       </w:pPr>
-      <w:bookmarkStart w:id="12" w:name="_Toc222422786"/>
+      <w:bookmarkStart w:id="12" w:name="_Toc222758571"/>
       <w:r>
         <w:t>Objetivos del Estudio</w:t>
       </w:r>
@@ -4810,7 +5808,7 @@
       <w:pPr>
         <w:pStyle w:val="Ttulo2"/>
       </w:pPr>
-      <w:bookmarkStart w:id="13" w:name="_Toc222422787"/>
+      <w:bookmarkStart w:id="13" w:name="_Toc222758572"/>
       <w:r>
         <w:lastRenderedPageBreak/>
         <w:t>Limitaciones y Riesgos del Enfoque</w:t>
@@ -5294,7 +6292,7 @@
       <w:pPr>
         <w:pStyle w:val="Ttulo2"/>
       </w:pPr>
-      <w:bookmarkStart w:id="15" w:name="_Toc222422788"/>
+      <w:bookmarkStart w:id="15" w:name="_Toc222758573"/>
       <w:r>
         <w:t>Contribuciones Principales del Trabajo</w:t>
       </w:r>
@@ -5712,7 +6710,7 @@
           <w:bCs/>
         </w:rPr>
       </w:pPr>
-      <w:bookmarkStart w:id="16" w:name="_Toc222422789"/>
+      <w:bookmarkStart w:id="16" w:name="_Toc222758574"/>
       <w:r>
         <w:rPr>
           <w:rFonts w:ascii="Arial" w:hAnsi="Arial"/>
@@ -5798,7 +6796,7 @@
       <w:pPr>
         <w:pStyle w:val="Ttulo2"/>
       </w:pPr>
-      <w:bookmarkStart w:id="17" w:name="_Toc222422790"/>
+      <w:bookmarkStart w:id="17" w:name="_Toc222758575"/>
       <w:r>
         <w:t>Naturaleza del Problema: Desbalance Extremo y Concept Drift</w:t>
       </w:r>
@@ -5880,7 +6878,7 @@
       <w:pPr>
         <w:pStyle w:val="Ttulo2"/>
       </w:pPr>
-      <w:bookmarkStart w:id="18" w:name="_Toc222422791"/>
+      <w:bookmarkStart w:id="18" w:name="_Toc222758576"/>
       <w:r>
         <w:t>Paradigmas de Aprendizaje: Clasificación Supervisada vs. Detección de Anomalías</w:t>
       </w:r>
@@ -6085,7 +7083,7 @@
       <w:pPr>
         <w:pStyle w:val="Ttulo2"/>
       </w:pPr>
-      <w:bookmarkStart w:id="19" w:name="_Toc222422792"/>
+      <w:bookmarkStart w:id="19" w:name="_Toc222758577"/>
       <w:commentRangeStart w:id="20"/>
       <w:r>
         <w:t>La Problemática de la Validación y el Data Leakage</w:t>
@@ -6378,7 +7376,7 @@
       <w:pPr>
         <w:pStyle w:val="Ttulo2"/>
       </w:pPr>
-      <w:bookmarkStart w:id="21" w:name="_Toc222422793"/>
+      <w:bookmarkStart w:id="21" w:name="_Toc222758578"/>
       <w:r>
         <w:t>Inteligencia Artificial Explicable (XAI): Superando la Caja Negra</w:t>
       </w:r>
@@ -6740,7 +7738,7 @@
           <w:bCs/>
         </w:rPr>
       </w:pPr>
-      <w:bookmarkStart w:id="22" w:name="_Toc222422794"/>
+      <w:bookmarkStart w:id="22" w:name="_Toc222758579"/>
       <w:commentRangeStart w:id="23"/>
       <w:commentRangeStart w:id="24"/>
       <w:r>
@@ -6975,7 +7973,7 @@
           <w:rFonts w:ascii="Arial" w:hAnsi="Arial"/>
         </w:rPr>
       </w:pPr>
-      <w:bookmarkStart w:id="25" w:name="_Toc222422795"/>
+      <w:bookmarkStart w:id="25" w:name="_Toc222758580"/>
       <w:r>
         <w:rPr>
           <w:rFonts w:ascii="Arial" w:hAnsi="Arial"/>
@@ -7025,7 +8023,7 @@
           <w:rFonts w:ascii="Arial" w:hAnsi="Arial"/>
         </w:rPr>
       </w:pPr>
-      <w:bookmarkStart w:id="26" w:name="_Toc222422796"/>
+      <w:bookmarkStart w:id="26" w:name="_Toc222758581"/>
       <w:r>
         <w:rPr>
           <w:rFonts w:ascii="Arial" w:hAnsi="Arial"/>
@@ -7138,7 +8136,7 @@
           <w:rFonts w:ascii="Arial" w:hAnsi="Arial"/>
         </w:rPr>
       </w:pPr>
-      <w:bookmarkStart w:id="27" w:name="_Toc222422797"/>
+      <w:bookmarkStart w:id="27" w:name="_Toc222758582"/>
       <w:r>
         <w:rPr>
           <w:rFonts w:ascii="Arial" w:hAnsi="Arial"/>
@@ -7592,7 +8590,7 @@
         <w:pStyle w:val="Ttulo3"/>
         <w:ind w:left="0" w:firstLine="0"/>
       </w:pPr>
-      <w:bookmarkStart w:id="28" w:name="_Toc222422798"/>
+      <w:bookmarkStart w:id="28" w:name="_Toc222758583"/>
       <w:r>
         <w:t>Estrategia de Validación</w:t>
       </w:r>
@@ -7889,7 +8887,7 @@
           <w:sz w:val="36"/>
         </w:rPr>
       </w:pPr>
-      <w:bookmarkStart w:id="30" w:name="_Toc222422799"/>
+      <w:bookmarkStart w:id="30" w:name="_Toc222758584"/>
       <w:r>
         <w:rPr>
           <w:rFonts w:ascii="Arial" w:hAnsi="Arial"/>
@@ -8149,7 +9147,7 @@
           <w:rFonts w:ascii="Arial" w:hAnsi="Arial"/>
         </w:rPr>
       </w:pPr>
-      <w:bookmarkStart w:id="31" w:name="_Toc222422800"/>
+      <w:bookmarkStart w:id="31" w:name="_Toc222758585"/>
       <w:r>
         <w:rPr>
           <w:rFonts w:ascii="Arial" w:hAnsi="Arial"/>
@@ -8509,7 +9507,7 @@
           <w:rFonts w:ascii="Arial" w:hAnsi="Arial"/>
         </w:rPr>
       </w:pPr>
-      <w:bookmarkStart w:id="32" w:name="_Toc222422801"/>
+      <w:bookmarkStart w:id="32" w:name="_Toc222758586"/>
       <w:r>
         <w:rPr>
           <w:rFonts w:ascii="Arial" w:hAnsi="Arial"/>
@@ -9012,7 +10010,7 @@
       <w:pPr>
         <w:pStyle w:val="Ttulo3"/>
       </w:pPr>
-      <w:bookmarkStart w:id="33" w:name="_Toc222422802"/>
+      <w:bookmarkStart w:id="33" w:name="_Toc222758587"/>
       <w:r>
         <w:t>Incorporación de Explicabilidad (XAI)</w:t>
       </w:r>
@@ -9325,7 +10323,7 @@
         <w:pStyle w:val="Ttulo2"/>
         <w:spacing w:line="240" w:lineRule="auto"/>
       </w:pPr>
-      <w:bookmarkStart w:id="34" w:name="_Toc222422803"/>
+      <w:bookmarkStart w:id="34" w:name="_Toc222758588"/>
       <w:r>
         <w:t>Diseño Experimental</w:t>
       </w:r>
@@ -9349,7 +10347,7 @@
       <w:pPr>
         <w:pStyle w:val="Ttulo3"/>
       </w:pPr>
-      <w:bookmarkStart w:id="35" w:name="_Toc222422804"/>
+      <w:bookmarkStart w:id="35" w:name="_Toc222758589"/>
       <w:r>
         <w:t>Descripción del Conjunto de Datos</w:t>
       </w:r>
@@ -9558,7 +10556,7 @@
       <w:pPr>
         <w:pStyle w:val="Ttulo3"/>
       </w:pPr>
-      <w:bookmarkStart w:id="36" w:name="_Toc222422805"/>
+      <w:bookmarkStart w:id="36" w:name="_Toc222758590"/>
       <w:r>
         <w:t>Configuración del Entorno de Ejecución</w:t>
       </w:r>
@@ -9860,7 +10858,7 @@
       <w:pPr>
         <w:pStyle w:val="Ttulo3"/>
       </w:pPr>
-      <w:bookmarkStart w:id="37" w:name="_Toc222422806"/>
+      <w:bookmarkStart w:id="37" w:name="_Toc222758591"/>
       <w:r>
         <w:lastRenderedPageBreak/>
         <w:t>Definición de Métricas de Evaluación</w:t>
@@ -10453,7 +11451,7 @@
         <w:pStyle w:val="Ttulo2"/>
         <w:spacing w:line="240" w:lineRule="auto"/>
       </w:pPr>
-      <w:bookmarkStart w:id="38" w:name="_Toc222422807"/>
+      <w:bookmarkStart w:id="38" w:name="_Toc222758592"/>
       <w:r>
         <w:t>Desarrollo de Experimentos Tentativos</w:t>
       </w:r>
@@ -10844,9 +11842,11 @@
       <w:pPr>
         <w:pStyle w:val="Ttulo3"/>
       </w:pPr>
+      <w:bookmarkStart w:id="39" w:name="_Toc222758593"/>
       <w:r>
         <w:t>Definición del Modelo de Referencia (Baseline)</w:t>
       </w:r>
+      <w:bookmarkEnd w:id="39"/>
     </w:p>
     <w:p>
       <w:pPr>
@@ -10862,6 +11862,7 @@
           <w:szCs w:val="28"/>
         </w:rPr>
       </w:pPr>
+      <w:bookmarkStart w:id="40" w:name="_Toc222758594"/>
       <w:r>
         <w:rPr>
           <w:b/>
@@ -10871,6 +11872,7 @@
         </w:rPr>
         <w:t>Objetivo</w:t>
       </w:r>
+      <w:bookmarkEnd w:id="40"/>
     </w:p>
     <w:p>
       <w:pPr>
@@ -10973,6 +11975,7 @@
           <w:szCs w:val="28"/>
         </w:rPr>
       </w:pPr>
+      <w:bookmarkStart w:id="41" w:name="_Toc222758595"/>
       <w:r>
         <w:rPr>
           <w:b/>
@@ -10983,6 +11986,7 @@
         <w:lastRenderedPageBreak/>
         <w:t>Configuración Experimental</w:t>
       </w:r>
+      <w:bookmarkEnd w:id="41"/>
     </w:p>
     <w:p>
       <w:pPr>
@@ -11316,6 +12320,7 @@
           <w:szCs w:val="28"/>
         </w:rPr>
       </w:pPr>
+      <w:bookmarkStart w:id="42" w:name="_Toc222758596"/>
       <w:r>
         <w:rPr>
           <w:b/>
@@ -11325,6 +12330,7 @@
         </w:rPr>
         <w:t>Hipótesis de Trabajo</w:t>
       </w:r>
+      <w:bookmarkEnd w:id="42"/>
     </w:p>
     <w:p>
       <w:pPr>
@@ -11426,6 +12432,7 @@
       <w:pPr>
         <w:pStyle w:val="Ttulo3"/>
       </w:pPr>
+      <w:bookmarkStart w:id="43" w:name="_Toc222758597"/>
       <w:r>
         <w:lastRenderedPageBreak/>
         <w:t>Validación de Integridad Metodológica (</w:t>
@@ -11440,6 +12447,7 @@
       <w:r>
         <w:t>)</w:t>
       </w:r>
+      <w:bookmarkEnd w:id="43"/>
     </w:p>
     <w:p>
       <w:pPr>
@@ -11455,6 +12463,7 @@
           <w:szCs w:val="28"/>
         </w:rPr>
       </w:pPr>
+      <w:bookmarkStart w:id="44" w:name="_Toc222758598"/>
       <w:r>
         <w:rPr>
           <w:b/>
@@ -11464,6 +12473,7 @@
         </w:rPr>
         <w:t>Objetivo</w:t>
       </w:r>
+      <w:bookmarkEnd w:id="44"/>
     </w:p>
     <w:p>
       <w:pPr>
@@ -11511,6 +12521,7 @@
           <w:szCs w:val="28"/>
         </w:rPr>
       </w:pPr>
+      <w:bookmarkStart w:id="45" w:name="_Toc222758599"/>
       <w:r>
         <w:rPr>
           <w:b/>
@@ -11520,6 +12531,7 @@
         </w:rPr>
         <w:t>Configuración Experimental</w:t>
       </w:r>
+      <w:bookmarkEnd w:id="45"/>
     </w:p>
     <w:p>
       <w:pPr>
@@ -11878,6 +12890,7 @@
           <w:szCs w:val="28"/>
         </w:rPr>
       </w:pPr>
+      <w:bookmarkStart w:id="46" w:name="_Toc222758600"/>
       <w:r>
         <w:rPr>
           <w:b/>
@@ -11887,6 +12900,7 @@
         </w:rPr>
         <w:t>Hipótesis de Trabajo</w:t>
       </w:r>
+      <w:bookmarkEnd w:id="46"/>
     </w:p>
     <w:p>
       <w:pPr>
@@ -11981,6 +12995,7 @@
       <w:pPr>
         <w:pStyle w:val="Ttulo3"/>
       </w:pPr>
+      <w:bookmarkStart w:id="47" w:name="_Toc222758601"/>
       <w:r>
         <w:t>Análisis de Interpretabilidad Algorítmica (</w:t>
       </w:r>
@@ -11994,6 +13009,7 @@
       <w:r>
         <w:t>)</w:t>
       </w:r>
+      <w:bookmarkEnd w:id="47"/>
     </w:p>
     <w:p>
       <w:pPr>
@@ -12009,6 +13025,7 @@
           <w:szCs w:val="28"/>
         </w:rPr>
       </w:pPr>
+      <w:bookmarkStart w:id="48" w:name="_Toc222758602"/>
       <w:r>
         <w:rPr>
           <w:b/>
@@ -12018,6 +13035,7 @@
         </w:rPr>
         <w:t>Objetivo</w:t>
       </w:r>
+      <w:bookmarkEnd w:id="48"/>
     </w:p>
     <w:p>
       <w:pPr>
@@ -12049,6 +13067,7 @@
           <w:szCs w:val="28"/>
         </w:rPr>
       </w:pPr>
+      <w:bookmarkStart w:id="49" w:name="_Toc222758603"/>
       <w:r>
         <w:rPr>
           <w:b/>
@@ -12058,6 +13077,7 @@
         </w:rPr>
         <w:t>Configuración Experimental</w:t>
       </w:r>
+      <w:bookmarkEnd w:id="49"/>
     </w:p>
     <w:p>
       <w:pPr>
@@ -12327,6 +13347,7 @@
           <w:szCs w:val="28"/>
         </w:rPr>
       </w:pPr>
+      <w:bookmarkStart w:id="50" w:name="_Toc222758604"/>
       <w:r>
         <w:rPr>
           <w:b/>
@@ -12337,6 +13358,7 @@
         <w:lastRenderedPageBreak/>
         <w:t>Hipótesis de Trabajo</w:t>
       </w:r>
+      <w:bookmarkEnd w:id="50"/>
     </w:p>
     <w:p>
       <w:pPr>
@@ -12424,8 +13446,8 @@
           <w:bCs/>
         </w:rPr>
       </w:pPr>
-      <w:bookmarkStart w:id="39" w:name="_Toc222422808"/>
-      <w:commentRangeStart w:id="40"/>
+      <w:bookmarkStart w:id="51" w:name="_Toc222758605"/>
+      <w:commentRangeStart w:id="52"/>
       <w:r>
         <w:rPr>
           <w:rFonts w:ascii="Arial" w:hAnsi="Arial"/>
@@ -12443,8 +13465,8 @@
         </w:rPr>
         <w:t xml:space="preserve"> y Análisis de Resultados.</w:t>
       </w:r>
-      <w:bookmarkEnd w:id="39"/>
-      <w:commentRangeEnd w:id="40"/>
+      <w:bookmarkEnd w:id="51"/>
+      <w:commentRangeEnd w:id="52"/>
       <w:r>
         <w:rPr>
           <w:rStyle w:val="Refdecomentario"/>
@@ -12454,7 +13476,7 @@
           <w:sz w:val="44"/>
           <w:szCs w:val="36"/>
         </w:rPr>
-        <w:commentReference w:id="40"/>
+        <w:commentReference w:id="52"/>
       </w:r>
     </w:p>
     <w:p>
@@ -12530,11 +13552,11 @@
       <w:pPr>
         <w:pStyle w:val="Ttulo2"/>
       </w:pPr>
-      <w:bookmarkStart w:id="41" w:name="_Toc222422809"/>
+      <w:bookmarkStart w:id="53" w:name="_Toc222758606"/>
       <w:r>
         <w:t>Selección de Métricas: Más allá de la Exactitud</w:t>
       </w:r>
-      <w:bookmarkEnd w:id="41"/>
+      <w:bookmarkEnd w:id="53"/>
     </w:p>
     <w:p>
       <w:pPr>
@@ -12682,11 +13704,11 @@
       <w:pPr>
         <w:pStyle w:val="Ttulo2"/>
       </w:pPr>
-      <w:bookmarkStart w:id="42" w:name="_Toc222422810"/>
+      <w:bookmarkStart w:id="54" w:name="_Toc222758607"/>
       <w:r>
         <w:t>Análisis del Baseline y Comparativa de Modelos</w:t>
       </w:r>
-      <w:bookmarkEnd w:id="42"/>
+      <w:bookmarkEnd w:id="54"/>
     </w:p>
     <w:p>
       <w:pPr>
@@ -12873,11 +13895,11 @@
       <w:pPr>
         <w:pStyle w:val="Ttulo2"/>
       </w:pPr>
-      <w:bookmarkStart w:id="43" w:name="_Toc222422811"/>
+      <w:bookmarkStart w:id="55" w:name="_Toc222758608"/>
       <w:r>
         <w:t>Impacto de la Validación Prequential (Prevención de Fugas)</w:t>
       </w:r>
-      <w:bookmarkEnd w:id="43"/>
+      <w:bookmarkEnd w:id="55"/>
     </w:p>
     <w:p>
       <w:pPr>
@@ -13038,91 +14060,6 @@
         </w:rPr>
         <w:t xml:space="preserve"> con fugas), representan una estimación honesta y reproducible del valor que el sistema aportaría en producción.</w:t>
       </w:r>
-    </w:p>
-    <w:p>
-      <w:pPr>
-        <w:rPr>
-          <w:rFonts w:ascii="Arial" w:hAnsi="Arial"/>
-        </w:rPr>
-      </w:pPr>
-      <w:r>
-        <w:rPr>
-          <w:rFonts w:ascii="Arial" w:hAnsi="Arial"/>
-        </w:rPr>
-        <w:t>NOTAS</w:t>
-      </w:r>
-    </w:p>
-    <w:p>
-      <w:pPr>
-        <w:rPr>
-          <w:rFonts w:ascii="Arial" w:hAnsi="Arial"/>
-        </w:rPr>
-      </w:pPr>
-      <w:r>
-        <w:rPr>
-          <w:rFonts w:ascii="Arial" w:hAnsi="Arial"/>
-        </w:rPr>
-        <w:lastRenderedPageBreak/>
-        <w:t>Almacenamiento de resultados para no eliminar resultados mejores, gestión de versiones con cambios aislados</w:t>
-      </w:r>
-    </w:p>
-    <w:p>
-      <w:pPr>
-        <w:rPr>
-          <w:rFonts w:ascii="Arial" w:hAnsi="Arial"/>
-        </w:rPr>
-      </w:pPr>
-      <w:r>
-        <w:rPr>
-          <w:rFonts w:ascii="Arial" w:hAnsi="Arial"/>
-        </w:rPr>
-        <w:t xml:space="preserve">Planificación para el </w:t>
-      </w:r>
-      <w:r>
-        <w:rPr>
-          <w:rFonts w:ascii="Arial" w:hAnsi="Arial"/>
-        </w:rPr>
-        <w:t>25, lo vemos el 27</w:t>
-      </w:r>
-      <w:r>
-        <w:rPr>
-          <w:rFonts w:ascii="Arial" w:hAnsi="Arial"/>
-        </w:rPr>
-        <w:t xml:space="preserve"> </w:t>
-      </w:r>
-      <w:r>
-        <w:rPr>
-          <w:rFonts w:ascii="Arial" w:hAnsi="Arial"/>
-        </w:rPr>
-        <w:sym w:font="Wingdings" w:char="F0E0"/>
-      </w:r>
-      <w:r>
-        <w:rPr>
-          <w:rFonts w:ascii="Arial" w:hAnsi="Arial"/>
-        </w:rPr>
-        <w:t xml:space="preserve"> carta dant</w:t>
-      </w:r>
-      <w:r>
-        <w:rPr>
-          <w:rFonts w:ascii="Arial" w:hAnsi="Arial"/>
-        </w:rPr>
-        <w:t>, llegar a la entrega con resultados el 23/02, experimentos A, C y D v1</w:t>
-      </w:r>
-    </w:p>
-    <w:p>
-      <w:pPr>
-        <w:rPr>
-          <w:rFonts w:ascii="Arial" w:hAnsi="Arial"/>
-        </w:rPr>
-      </w:pPr>
-    </w:p>
-    <w:p>
-      <w:pPr>
-        <w:rPr>
-          <w:rFonts w:ascii="Arial" w:hAnsi="Arial"/>
-          <w:lang w:val="en-US"/>
-        </w:rPr>
-      </w:pPr>
     </w:p>
     <w:p>
       <w:pPr>
@@ -13152,7 +14089,7 @@
           <w:lang w:val="en-GB"/>
         </w:rPr>
       </w:pPr>
-      <w:bookmarkStart w:id="44" w:name="_Toc222422812"/>
+      <w:bookmarkStart w:id="56" w:name="_Toc222758609"/>
       <w:r>
         <w:rPr>
           <w:rFonts w:ascii="Arial" w:hAnsi="Arial"/>
@@ -13161,7 +14098,7 @@
         <w:lastRenderedPageBreak/>
         <w:t>Conclusiones</w:t>
       </w:r>
-      <w:bookmarkEnd w:id="44"/>
+      <w:bookmarkEnd w:id="56"/>
     </w:p>
     <w:p>
       <w:pPr>
@@ -13200,7 +14137,7 @@
           <w:lang w:val="en-GB"/>
         </w:rPr>
       </w:pPr>
-      <w:bookmarkStart w:id="45" w:name="_Toc222422813"/>
+      <w:bookmarkStart w:id="57" w:name="_Toc222758610"/>
       <w:r>
         <w:rPr>
           <w:rFonts w:ascii="Arial" w:hAnsi="Arial"/>
@@ -13209,7 +14146,7 @@
         <w:lastRenderedPageBreak/>
         <w:t>Referencias</w:t>
       </w:r>
-      <w:bookmarkEnd w:id="45"/>
+      <w:bookmarkEnd w:id="57"/>
       <w:r>
         <w:rPr>
           <w:rFonts w:ascii="Arial" w:hAnsi="Arial"/>
@@ -13447,7 +14384,7 @@
           <w:szCs w:val="36"/>
         </w:rPr>
       </w:pPr>
-      <w:bookmarkStart w:id="46" w:name="_Toc222422814"/>
+      <w:bookmarkStart w:id="58" w:name="_Toc222758611"/>
       <w:r>
         <w:rPr>
           <w:rFonts w:ascii="Arial" w:hAnsi="Arial"/>
@@ -13457,7 +14394,7 @@
         <w:lastRenderedPageBreak/>
         <w:t>Anexos</w:t>
       </w:r>
-      <w:bookmarkEnd w:id="46"/>
+      <w:bookmarkEnd w:id="58"/>
     </w:p>
     <w:p>
       <w:pPr>
@@ -13646,7 +14583,7 @@
       </w:r>
     </w:p>
   </w:comment>
-  <w:comment w:id="40" w:author="Sergio Moya Marín" w:date="2026-01-22T19:56:00Z" w:initials="SM">
+  <w:comment w:id="52" w:author="Sergio Moya Marín" w:date="2026-01-22T19:56:00Z" w:initials="SM">
     <w:p>
       <w:pPr>
         <w:pStyle w:val="Textocomentario"/>

</xml_diff>

<commit_message>
Sync: progreso guardado 2026-02-25 03:02
</commit_message>
<xml_diff>
--- a/CARPETA COMPARTIDA TUTOR/15MUIN E2 MOYA MARIN SERGIO.docx
+++ b/CARPETA COMPARTIDA TUTOR/15MUIN E2 MOYA MARIN SERGIO.docx
@@ -13289,7 +13289,7 @@
         <w:pStyle w:val="Ttulo2"/>
       </w:pPr>
       <w:r>
-        <w:t>Resultados del Experimento A: Definición del Modelo de Referencia</w:t>
+        <w:t>Definición del Modelo de Referencia</w:t>
       </w:r>
     </w:p>
     <w:p>
@@ -13397,7 +13397,6 @@
           <w:b/>
           <w:bCs/>
         </w:rPr>
-        <w:lastRenderedPageBreak/>
         <w:drawing>
           <wp:inline distT="0" distB="0" distL="0" distR="0" wp14:anchorId="72623332" wp14:editId="55798100">
             <wp:extent cx="5400040" cy="1537335"/>
@@ -13446,7 +13445,14 @@
         <w:rPr>
           <w:rFonts w:ascii="Arial" w:hAnsi="Arial"/>
         </w:rPr>
-        <w:t xml:space="preserve">Como ilustran los datos de la matriz de confusión agregada para el mejor modelo (XGBoost), de un total de 1.591 fraudes reales presentes en el conjunto de evaluación, el algoritmo detectó correctamente 982 (Verdaderos Positivos), pero dejó escapar 609 transacciones fraudulentas (Falsos Negativos). Esto se traduce en un </w:t>
+        <w:t xml:space="preserve">Como ilustran los datos de la matriz de confusión agregada para el mejor modelo (XGBoost), de un total de 1.591 fraudes reales presentes en el conjunto de evaluación, </w:t>
+      </w:r>
+      <w:r>
+        <w:rPr>
+          <w:rFonts w:ascii="Arial" w:hAnsi="Arial"/>
+        </w:rPr>
+        <w:lastRenderedPageBreak/>
+        <w:t xml:space="preserve">el algoritmo detectó correctamente 982 (Verdaderos Positivos), pero dejó escapar 609 transacciones fraudulentas (Falsos Negativos). Esto se traduce en un </w:t>
       </w:r>
       <w:r>
         <w:rPr>
@@ -14261,7 +14267,6 @@
           <w:rFonts w:ascii="Arial" w:eastAsia="Times New Roman" w:hAnsi="Arial"/>
           <w:lang w:eastAsia="es-ES"/>
         </w:rPr>
-        <w:lastRenderedPageBreak/>
         <w:t xml:space="preserve">Por su parte, los modelos basados en ensamblajes de árboles demostraron una clara superioridad. </w:t>
       </w:r>
       <w:r>
@@ -14334,6 +14339,7 @@
         <w:pStyle w:val="Ttulo3"/>
       </w:pPr>
       <w:r>
+        <w:lastRenderedPageBreak/>
         <w:t>Selección y Justificación del Modelo Base</w:t>
       </w:r>
     </w:p>
@@ -14629,7 +14635,6 @@
           <w:rFonts w:ascii="Arial" w:eastAsia="Times New Roman" w:hAnsi="Arial"/>
           <w:lang w:eastAsia="es-ES"/>
         </w:rPr>
-        <w:lastRenderedPageBreak/>
         <w:t>Establecida esta línea base y seleccionado XGBoost como algoritmo principal, en el siguiente apartado se someterá a este modelo a un análisis de integridad metodológica para evaluar el impacto de las fugas de información.</w:t>
       </w:r>
     </w:p>
@@ -14694,7 +14699,15 @@
           <w:rFonts w:ascii="Arial" w:hAnsi="Arial"/>
           <w:lang w:eastAsia="es-ES"/>
         </w:rPr>
-        <w:t>): la partición aleatoria del tiempo y la aplicación global de técnicas de escalado y sobremuestreo sintético (SMOTE).</w:t>
+        <w:t xml:space="preserve">): la partición aleatoria del </w:t>
+      </w:r>
+      <w:r>
+        <w:rPr>
+          <w:rFonts w:ascii="Arial" w:hAnsi="Arial"/>
+          <w:lang w:eastAsia="es-ES"/>
+        </w:rPr>
+        <w:lastRenderedPageBreak/>
+        <w:t>tiempo y la aplicación global de técnicas de escalado y sobremuestreo sintético (SMOTE).</w:t>
       </w:r>
     </w:p>
     <w:p>
@@ -14870,15 +14883,7 @@
           <w:rFonts w:ascii="Arial" w:hAnsi="Arial"/>
           <w:lang w:eastAsia="es-ES"/>
         </w:rPr>
-        <w:t xml:space="preserve">Privados de la fuga de información, el rendimiento real y honesto de los algoritmos sufrió una penalización drástica. La Regresión Logística descendió a un AUPRC de 0.5830, Random Forest se situó en 0.6115 y XGBoost alcanzó un 0.6163. Esta degradación refleja la verdadera capacidad de generalización de los modelos ante vectores de fraude </w:t>
-      </w:r>
-      <w:r>
-        <w:rPr>
-          <w:rFonts w:ascii="Arial" w:hAnsi="Arial"/>
-          <w:lang w:eastAsia="es-ES"/>
-        </w:rPr>
-        <w:lastRenderedPageBreak/>
-        <w:t>inéditos, subrayando la extrema dificultad del problema una vez eliminado el espejismo metodológico.</w:t>
+        <w:t>Privados de la fuga de información, el rendimiento real y honesto de los algoritmos sufrió una penalización drástica. La Regresión Logística descendió a un AUPRC de 0.5830, Random Forest se situó en 0.6115 y XGBoost alcanzó un 0.6163. Esta degradación refleja la verdadera capacidad de generalización de los modelos ante vectores de fraude inéditos, subrayando la extrema dificultad del problema una vez eliminado el espejismo metodológico.</w:t>
       </w:r>
     </w:p>
     <w:p>
@@ -14957,6 +14962,7 @@
           <w:bCs/>
           <w:lang w:eastAsia="es-ES"/>
         </w:rPr>
+        <w:lastRenderedPageBreak/>
         <w:drawing>
           <wp:inline distT="0" distB="0" distL="0" distR="0" wp14:anchorId="3C611D66" wp14:editId="0179EA9D">
             <wp:extent cx="5400040" cy="1786890"/>
@@ -15629,15 +15635,7 @@
           <w:rFonts w:ascii="Arial" w:hAnsi="Arial"/>
           <w:lang w:eastAsia="es-ES"/>
         </w:rPr>
-        <w:t xml:space="preserve"> (Leak_scaler) no produjo inflación; de hecho, generó un impacto microscópicamente negativo (entre -0.001 y -0.004 en el AUPRC). Esto </w:t>
-      </w:r>
-      <w:r>
-        <w:rPr>
-          <w:rFonts w:ascii="Arial" w:hAnsi="Arial"/>
-          <w:lang w:eastAsia="es-ES"/>
-        </w:rPr>
-        <w:lastRenderedPageBreak/>
-        <w:t xml:space="preserve">descarta el preprocesamiento de varianza como una fuente de </w:t>
+        <w:t xml:space="preserve"> (Leak_scaler) no produjo inflación; de hecho, generó un impacto microscópicamente negativo (entre -0.001 y -0.004 en el AUPRC). Esto descarta el preprocesamiento de varianza como una fuente de </w:t>
       </w:r>
       <w:r>
         <w:rPr>
@@ -15727,7 +15725,15 @@
           <w:rFonts w:ascii="Arial" w:hAnsi="Arial"/>
           <w:lang w:eastAsia="es-ES"/>
         </w:rPr>
-        <w:t xml:space="preserve"> La inyección de datos sintéticos sobre el conjunto global de transacciones antes de su división demostró ser catastrófica para la validez del estudio. Su impacto afectó de manera desigual según la arquitectura: mientras que el modelo lineal experimentó una ligera inflación (+0.007), los algoritmos no lineales sufrieron un severo sobreajuste a los datos replicados, incrementando su AUPRC en +0.130 (XGBoost) y un masivo +0.292 (Random Forest).</w:t>
+        <w:t xml:space="preserve"> La inyección de datos sintéticos sobre el conjunto global de transacciones antes de su división demostró ser catastrófica para la validez del estudio. Su impacto afectó de manera desigual </w:t>
+      </w:r>
+      <w:r>
+        <w:rPr>
+          <w:rFonts w:ascii="Arial" w:hAnsi="Arial"/>
+          <w:lang w:eastAsia="es-ES"/>
+        </w:rPr>
+        <w:lastRenderedPageBreak/>
+        <w:t>según la arquitectura: mientras que el modelo lineal experimentó una ligera inflación (+0.007), los algoritmos no lineales sufrieron un severo sobreajuste a los datos replicados, incrementando su AUPRC en +0.130 (XGBoost) y un masivo +0.292 (Random Forest).</w:t>
       </w:r>
     </w:p>
     <w:p>
@@ -15763,10 +15769,6 @@
     <w:p>
       <w:pPr>
         <w:pStyle w:val="Ttulo2"/>
-        <w:rPr>
-          <w:rFonts w:ascii="Times New Roman" w:hAnsi="Times New Roman" w:cs="Times New Roman"/>
-          <w:sz w:val="36"/>
-        </w:rPr>
       </w:pPr>
       <w:r>
         <w:t>Interpretabilidad Algorítmica (XAI)</w:t>
@@ -15948,7 +15950,6 @@
                 <w:color w:val="auto"/>
                 <w:lang w:eastAsia="es-ES"/>
               </w:rPr>
-              <w:lastRenderedPageBreak/>
               <w:t>Ranking</w:t>
             </w:r>
           </w:p>
@@ -16303,6 +16304,7 @@
                 <w:color w:val="auto"/>
                 <w:lang w:eastAsia="es-ES"/>
               </w:rPr>
+              <w:lastRenderedPageBreak/>
               <w:t>4</w:t>
             </w:r>
           </w:p>
@@ -16533,7 +16535,6 @@
         <w:pStyle w:val="Ttulo3"/>
       </w:pPr>
       <w:r>
-        <w:lastRenderedPageBreak/>
         <w:t>Direccionalidad del Riesgo Algorítmico (SHAP)</w:t>
       </w:r>
     </w:p>
@@ -16598,7 +16599,15 @@
           <w:rFonts w:ascii="Arial" w:hAnsi="Arial"/>
           <w:lang w:eastAsia="es-ES"/>
         </w:rPr>
-        <w:t>) prioriza los nodos superiores asociados al riesgo del terminal, el impacto marginal exacto por predicción individual (SHAP) está dominado por el comportamiento del usuario. Variables como CUSTOMER_ID_AVG_AMOUNT_30DAY_WINDOW y TX_AMOUNT registraron los mayores impactos marginales (1.29 y 0.79, respectivamente), indicando que las desviaciones abruptas del patrón de gasto habitual del titular son el detonante final que inclina la balanza probabilística de cada transacción.</w:t>
+        <w:t xml:space="preserve">) prioriza los nodos superiores asociados al riesgo del terminal, el impacto marginal exacto por predicción individual (SHAP) está dominado por el comportamiento del usuario. Variables como CUSTOMER_ID_AVG_AMOUNT_30DAY_WINDOW y </w:t>
+      </w:r>
+      <w:r>
+        <w:rPr>
+          <w:rFonts w:ascii="Arial" w:hAnsi="Arial"/>
+          <w:lang w:eastAsia="es-ES"/>
+        </w:rPr>
+        <w:lastRenderedPageBreak/>
+        <w:t>TX_AMOUNT registraron los mayores impactos marginales (1.29 y 0.79, respectivamente), indicando que las desviaciones abruptas del patrón de gasto habitual del titular son el detonante final que inclina la balanza probabilística de cada transacción.</w:t>
       </w:r>
     </w:p>
     <w:p>
@@ -16687,7 +16696,6 @@
         <w:pStyle w:val="Ttulo3"/>
       </w:pPr>
       <w:r>
-        <w:lastRenderedPageBreak/>
         <w:t>Auditoría Forense a Nivel de Transacción (Fuerza Local)</w:t>
       </w:r>
     </w:p>
@@ -16768,6 +16776,7 @@
           <w:bCs/>
           <w:lang w:eastAsia="es-ES"/>
         </w:rPr>
+        <w:lastRenderedPageBreak/>
         <w:drawing>
           <wp:inline distT="0" distB="0" distL="0" distR="0" wp14:anchorId="3A168B00" wp14:editId="06908E83">
             <wp:extent cx="5400040" cy="1550670"/>
@@ -16909,7 +16918,6 @@
         <w:rPr>
           <w:rFonts w:ascii="Arial" w:hAnsi="Arial"/>
         </w:rPr>
-        <w:lastRenderedPageBreak/>
         <w:br w:type="page"/>
       </w:r>
     </w:p>
@@ -26381,6 +26389,9 @@
   </w:num>
   <w:num w:numId="133" w16cid:durableId="985356075">
     <w:abstractNumId w:val="59"/>
+  </w:num>
+  <w:num w:numId="134" w16cid:durableId="1475180571">
+    <w:abstractNumId w:val="2"/>
   </w:num>
 </w:numbering>
 </file>

</xml_diff>

<commit_message>
Sync: progreso guardado 2026-03-04 20:09
</commit_message>
<xml_diff>
--- a/CARPETA COMPARTIDA TUTOR/15MUIN E2 MOYA MARIN SERGIO.docx
+++ b/CARPETA COMPARTIDA TUTOR/15MUIN E2 MOYA MARIN SERGIO.docx
@@ -14131,13 +14131,7 @@
         <w:rPr>
           <w:rFonts w:ascii="Arial" w:hAnsi="Arial"/>
         </w:rPr>
-        <w:t>En este capítulo se presentan y analizan los hallazgos empíricos obtenidos tras la ejecución de los ensayos definidos en el diseño experimental. El análisis trasciende la mera exposición de métricas de rendimiento para centrarse en la validación de las hipótesis planteadas: la demostración empírica de la "Paradoja de la Exactitud", la cuantificación del impacto de las fugas de información en la literatura científica y la validación de la interpretabilidad financiera de los modelos de "caja negra". Los resultados se presentan siguiendo una progresión lógica que va desde el establecimiento de un rendimiento base hasta la auditoría forense y explicabilidad del algoritmo seleccionado.</w:t>
-      </w:r>
-      <w:r>
-        <w:rPr>
-          <w:rFonts w:ascii="Arial" w:hAnsi="Arial"/>
-        </w:rPr>
-        <w:t xml:space="preserve"> </w:t>
+        <w:t xml:space="preserve">En este capítulo se presentan y analizan los hallazgos empíricos obtenidos tras la ejecución de los ensayos definidos en el diseño experimental. El análisis trasciende la mera exposición de métricas de rendimiento para centrarse en la validación de las hipótesis planteadas: la demostración empírica de la "Paradoja de la Exactitud", la cuantificación del impacto de las fugas de información en la literatura científica y la validación de la interpretabilidad financiera de los modelos de "caja negra". Los resultados se presentan siguiendo una progresión lógica que va desde el establecimiento de un rendimiento base hasta la auditoría forense y explicabilidad del algoritmo seleccionado. </w:t>
       </w:r>
     </w:p>
     <w:p>
@@ -14264,6 +14258,7 @@
           <w:rFonts w:ascii="Arial" w:hAnsi="Arial"/>
           <w:b/>
           <w:bCs/>
+          <w:noProof/>
         </w:rPr>
         <w:drawing>
           <wp:inline distT="0" distB="0" distL="0" distR="0" wp14:anchorId="72623332" wp14:editId="55798100">
@@ -15264,6 +15259,7 @@
           <w:rFonts w:ascii="Arial" w:eastAsia="Times New Roman" w:hAnsi="Arial"/>
           <w:b/>
           <w:bCs/>
+          <w:noProof/>
           <w:lang w:eastAsia="es-ES"/>
         </w:rPr>
         <w:drawing>
@@ -15512,58 +15508,742 @@
     </w:p>
     <w:p>
       <w:pPr>
-        <w:pStyle w:val="Ttulo2"/>
-      </w:pPr>
-      <w:bookmarkStart w:id="57" w:name="_Toc222931140"/>
-      <w:r>
-        <w:t>Impacto de la Fuga de Datos (</w:t>
-      </w:r>
-      <w:r>
-        <w:rPr>
+        <w:pStyle w:val="Ttulo3"/>
+      </w:pPr>
+      <w:r>
+        <w:t>Refinamiento del Modelo Base: Estrategia de Submuestreo (Undersampling)</w:t>
+      </w:r>
+    </w:p>
+    <w:p>
+      <w:pPr>
+        <w:suppressAutoHyphens w:val="0"/>
+        <w:spacing w:before="100" w:beforeAutospacing="1" w:after="100" w:afterAutospacing="1" w:line="240" w:lineRule="auto"/>
+        <w:jc w:val="left"/>
+        <w:rPr>
+          <w:rFonts w:ascii="Arial" w:eastAsia="Times New Roman" w:hAnsi="Arial"/>
+          <w:lang w:eastAsia="es-ES"/>
+        </w:rPr>
+      </w:pPr>
+      <w:r>
+        <w:rPr>
+          <w:rFonts w:ascii="Arial" w:eastAsia="Times New Roman" w:hAnsi="Arial"/>
+          <w:lang w:eastAsia="es-ES"/>
+        </w:rPr>
+        <w:t xml:space="preserve">A pesar de seleccionar XGBoost como el modelo de referencia más robusto, el entrenamiento sobre la distribución natural (con un ratio de desbalance aproximado de 118 transacciones legítimas por cada fraude) conlleva ineficiencias computacionales y </w:t>
+      </w:r>
+      <w:r>
+        <w:rPr>
+          <w:rFonts w:ascii="Arial" w:eastAsia="Times New Roman" w:hAnsi="Arial"/>
+          <w:lang w:eastAsia="es-ES"/>
+        </w:rPr>
+        <w:lastRenderedPageBreak/>
+        <w:t>un sesgo inherente hacia la clase mayoritaria. Para evaluar si la simplificación del espacio de datos mejora la sensibilidad del algoritmo sin recurrir a técnicas de generación sintética complejas, se implementó una variante de submuestreo controlado sobre el conjunto de entrenamiento.</w:t>
+      </w:r>
+    </w:p>
+    <w:p>
+      <w:pPr>
+        <w:suppressAutoHyphens w:val="0"/>
+        <w:spacing w:before="100" w:beforeAutospacing="1" w:after="100" w:afterAutospacing="1" w:line="240" w:lineRule="auto"/>
+        <w:jc w:val="left"/>
+        <w:rPr>
+          <w:rFonts w:ascii="Arial" w:eastAsia="Times New Roman" w:hAnsi="Arial"/>
+          <w:lang w:eastAsia="es-ES"/>
+        </w:rPr>
+      </w:pPr>
+      <w:r>
+        <w:rPr>
+          <w:rFonts w:ascii="Arial" w:eastAsia="Times New Roman" w:hAnsi="Arial"/>
+          <w:lang w:eastAsia="es-ES"/>
+        </w:rPr>
+        <w:t>Manteniendo intacto el conjunto de prueba para garantizar una evaluación honesta, se limitó la presencia de la clase mayoritaria en los pliegues de entrenamiento, evaluando tres escenarios de reducción de asimetría: ratios de 10:1, 5:1 y un balanceo estricto de 1:1.</w:t>
+      </w:r>
+    </w:p>
+    <w:tbl>
+      <w:tblPr>
+        <w:tblStyle w:val="Tabladelista4-nfasis6"/>
+        <w:tblW w:w="9498" w:type="dxa"/>
+        <w:tblInd w:w="-572" w:type="dxa"/>
+        <w:tblLook w:val="04A0" w:firstRow="1" w:lastRow="0" w:firstColumn="1" w:lastColumn="0" w:noHBand="0" w:noVBand="1"/>
+      </w:tblPr>
+      <w:tblGrid>
+        <w:gridCol w:w="2978"/>
+        <w:gridCol w:w="2835"/>
+        <w:gridCol w:w="1559"/>
+        <w:gridCol w:w="2126"/>
+      </w:tblGrid>
+      <w:tr>
+        <w:trPr>
+          <w:cnfStyle w:val="100000000000" w:firstRow="1" w:lastRow="0" w:firstColumn="0" w:lastColumn="0" w:oddVBand="0" w:evenVBand="0" w:oddHBand="0" w:evenHBand="0" w:firstRowFirstColumn="0" w:firstRowLastColumn="0" w:lastRowFirstColumn="0" w:lastRowLastColumn="0"/>
+          <w:trHeight w:val="359"/>
+        </w:trPr>
+        <w:tc>
+          <w:tcPr>
+            <w:cnfStyle w:val="001000000000" w:firstRow="0" w:lastRow="0" w:firstColumn="1" w:lastColumn="0" w:oddVBand="0" w:evenVBand="0" w:oddHBand="0" w:evenHBand="0" w:firstRowFirstColumn="0" w:firstRowLastColumn="0" w:lastRowFirstColumn="0" w:lastRowLastColumn="0"/>
+            <w:tcW w:w="2978" w:type="dxa"/>
+            <w:tcBorders>
+              <w:right w:val="nil"/>
+            </w:tcBorders>
+            <w:noWrap/>
+            <w:vAlign w:val="center"/>
+            <w:hideMark/>
+          </w:tcPr>
+          <w:p>
+            <w:pPr>
+              <w:suppressAutoHyphens w:val="0"/>
+              <w:spacing w:before="100" w:beforeAutospacing="1" w:after="100" w:afterAutospacing="1" w:line="240" w:lineRule="auto"/>
+              <w:jc w:val="left"/>
+              <w:rPr>
+                <w:rFonts w:ascii="Arial" w:eastAsia="Times New Roman" w:hAnsi="Arial"/>
+                <w:sz w:val="16"/>
+                <w:szCs w:val="16"/>
+                <w:lang w:eastAsia="es-ES"/>
+              </w:rPr>
+            </w:pPr>
+            <w:r>
+              <w:rPr>
+                <w:rStyle w:val="Fuerte"/>
+                <w:rFonts w:ascii="Arial" w:hAnsi="Arial"/>
+                <w:color w:val="1F1F1F"/>
+                <w:bdr w:val="none" w:sz="0" w:space="0" w:color="auto" w:frame="1"/>
+              </w:rPr>
+              <w:t>Escenario de Submuestreo</w:t>
+            </w:r>
+          </w:p>
+        </w:tc>
+        <w:tc>
+          <w:tcPr>
+            <w:tcW w:w="2835" w:type="dxa"/>
+            <w:tcBorders>
+              <w:top w:val="nil"/>
+              <w:left w:val="nil"/>
+              <w:bottom w:val="nil"/>
+              <w:right w:val="nil"/>
+            </w:tcBorders>
+            <w:noWrap/>
+            <w:vAlign w:val="center"/>
+            <w:hideMark/>
+          </w:tcPr>
+          <w:p>
+            <w:pPr>
+              <w:suppressAutoHyphens w:val="0"/>
+              <w:spacing w:before="100" w:beforeAutospacing="1" w:after="100" w:afterAutospacing="1" w:line="240" w:lineRule="auto"/>
+              <w:jc w:val="left"/>
+              <w:cnfStyle w:val="100000000000" w:firstRow="1" w:lastRow="0" w:firstColumn="0" w:lastColumn="0" w:oddVBand="0" w:evenVBand="0" w:oddHBand="0" w:evenHBand="0" w:firstRowFirstColumn="0" w:firstRowLastColumn="0" w:lastRowFirstColumn="0" w:lastRowLastColumn="0"/>
+              <w:rPr>
+                <w:rFonts w:ascii="Arial" w:eastAsia="Times New Roman" w:hAnsi="Arial"/>
+                <w:sz w:val="16"/>
+                <w:szCs w:val="16"/>
+                <w:lang w:eastAsia="es-ES"/>
+              </w:rPr>
+            </w:pPr>
+            <w:r>
+              <w:rPr>
+                <w:rStyle w:val="Fuerte"/>
+                <w:rFonts w:ascii="Arial" w:hAnsi="Arial"/>
+                <w:color w:val="1F1F1F"/>
+                <w:bdr w:val="none" w:sz="0" w:space="0" w:color="auto" w:frame="1"/>
+              </w:rPr>
+              <w:t>Mejor Modelo</w:t>
+            </w:r>
+          </w:p>
+        </w:tc>
+        <w:tc>
+          <w:tcPr>
+            <w:tcW w:w="1559" w:type="dxa"/>
+            <w:tcBorders>
+              <w:left w:val="nil"/>
+            </w:tcBorders>
+            <w:noWrap/>
+            <w:vAlign w:val="center"/>
+            <w:hideMark/>
+          </w:tcPr>
+          <w:p>
+            <w:pPr>
+              <w:suppressAutoHyphens w:val="0"/>
+              <w:spacing w:before="100" w:beforeAutospacing="1" w:after="100" w:afterAutospacing="1" w:line="240" w:lineRule="auto"/>
+              <w:jc w:val="left"/>
+              <w:cnfStyle w:val="100000000000" w:firstRow="1" w:lastRow="0" w:firstColumn="0" w:lastColumn="0" w:oddVBand="0" w:evenVBand="0" w:oddHBand="0" w:evenHBand="0" w:firstRowFirstColumn="0" w:firstRowLastColumn="0" w:lastRowFirstColumn="0" w:lastRowLastColumn="0"/>
+              <w:rPr>
+                <w:rFonts w:ascii="Arial" w:eastAsia="Times New Roman" w:hAnsi="Arial"/>
+                <w:sz w:val="16"/>
+                <w:szCs w:val="16"/>
+                <w:lang w:eastAsia="es-ES"/>
+              </w:rPr>
+            </w:pPr>
+            <w:r>
+              <w:rPr>
+                <w:rStyle w:val="Fuerte"/>
+                <w:rFonts w:ascii="Arial" w:hAnsi="Arial"/>
+                <w:color w:val="1F1F1F"/>
+                <w:bdr w:val="none" w:sz="0" w:space="0" w:color="auto" w:frame="1"/>
+              </w:rPr>
+              <w:t>AUPRC</w:t>
+            </w:r>
+          </w:p>
+        </w:tc>
+        <w:tc>
+          <w:tcPr>
+            <w:tcW w:w="2126" w:type="dxa"/>
+            <w:noWrap/>
+            <w:vAlign w:val="center"/>
+            <w:hideMark/>
+          </w:tcPr>
+          <w:p>
+            <w:pPr>
+              <w:suppressAutoHyphens w:val="0"/>
+              <w:spacing w:before="100" w:beforeAutospacing="1" w:after="100" w:afterAutospacing="1" w:line="240" w:lineRule="auto"/>
+              <w:jc w:val="left"/>
+              <w:cnfStyle w:val="100000000000" w:firstRow="1" w:lastRow="0" w:firstColumn="0" w:lastColumn="0" w:oddVBand="0" w:evenVBand="0" w:oddHBand="0" w:evenHBand="0" w:firstRowFirstColumn="0" w:firstRowLastColumn="0" w:lastRowFirstColumn="0" w:lastRowLastColumn="0"/>
+              <w:rPr>
+                <w:rFonts w:ascii="Arial" w:eastAsia="Times New Roman" w:hAnsi="Arial"/>
+                <w:sz w:val="16"/>
+                <w:szCs w:val="16"/>
+                <w:lang w:eastAsia="es-ES"/>
+              </w:rPr>
+            </w:pPr>
+            <w:r>
+              <w:rPr>
+                <w:rStyle w:val="Fuerte"/>
+                <w:rFonts w:ascii="Arial" w:hAnsi="Arial"/>
+                <w:color w:val="1F1F1F"/>
+                <w:bdr w:val="none" w:sz="0" w:space="0" w:color="auto" w:frame="1"/>
+              </w:rPr>
+              <w:t>CP@100</w:t>
+            </w:r>
+          </w:p>
+        </w:tc>
+      </w:tr>
+      <w:tr>
+        <w:trPr>
+          <w:cnfStyle w:val="000000100000" w:firstRow="0" w:lastRow="0" w:firstColumn="0" w:lastColumn="0" w:oddVBand="0" w:evenVBand="0" w:oddHBand="1" w:evenHBand="0" w:firstRowFirstColumn="0" w:firstRowLastColumn="0" w:lastRowFirstColumn="0" w:lastRowLastColumn="0"/>
+          <w:trHeight w:val="348"/>
+        </w:trPr>
+        <w:tc>
+          <w:tcPr>
+            <w:cnfStyle w:val="001000000000" w:firstRow="0" w:lastRow="0" w:firstColumn="1" w:lastColumn="0" w:oddVBand="0" w:evenVBand="0" w:oddHBand="0" w:evenHBand="0" w:firstRowFirstColumn="0" w:firstRowLastColumn="0" w:lastRowFirstColumn="0" w:lastRowLastColumn="0"/>
+            <w:tcW w:w="2978" w:type="dxa"/>
+            <w:tcBorders>
+              <w:right w:val="nil"/>
+            </w:tcBorders>
+            <w:noWrap/>
+            <w:vAlign w:val="center"/>
+            <w:hideMark/>
+          </w:tcPr>
+          <w:p>
+            <w:pPr>
+              <w:suppressAutoHyphens w:val="0"/>
+              <w:spacing w:before="100" w:beforeAutospacing="1" w:after="100" w:afterAutospacing="1" w:line="240" w:lineRule="auto"/>
+              <w:jc w:val="left"/>
+              <w:rPr>
+                <w:rFonts w:ascii="Arial" w:eastAsia="Times New Roman" w:hAnsi="Arial"/>
+                <w:lang w:eastAsia="es-ES"/>
+              </w:rPr>
+            </w:pPr>
+            <w:r>
+              <w:rPr>
+                <w:rFonts w:ascii="Arial" w:hAnsi="Arial"/>
+                <w:b w:val="0"/>
+                <w:bCs w:val="0"/>
+                <w:color w:val="1F1F1F"/>
+                <w:bdr w:val="none" w:sz="0" w:space="0" w:color="auto" w:frame="1"/>
+              </w:rPr>
+              <w:t>Original (~118:1)</w:t>
+            </w:r>
+          </w:p>
+        </w:tc>
+        <w:tc>
+          <w:tcPr>
+            <w:tcW w:w="2835" w:type="dxa"/>
+            <w:tcBorders>
+              <w:top w:val="nil"/>
+              <w:left w:val="nil"/>
+              <w:bottom w:val="nil"/>
+              <w:right w:val="nil"/>
+            </w:tcBorders>
+            <w:noWrap/>
+            <w:vAlign w:val="center"/>
+            <w:hideMark/>
+          </w:tcPr>
+          <w:p>
+            <w:pPr>
+              <w:suppressAutoHyphens w:val="0"/>
+              <w:spacing w:before="100" w:beforeAutospacing="1" w:after="100" w:afterAutospacing="1" w:line="240" w:lineRule="auto"/>
+              <w:jc w:val="left"/>
+              <w:cnfStyle w:val="000000100000" w:firstRow="0" w:lastRow="0" w:firstColumn="0" w:lastColumn="0" w:oddVBand="0" w:evenVBand="0" w:oddHBand="1" w:evenHBand="0" w:firstRowFirstColumn="0" w:firstRowLastColumn="0" w:lastRowFirstColumn="0" w:lastRowLastColumn="0"/>
+              <w:rPr>
+                <w:rFonts w:ascii="Arial" w:eastAsia="Times New Roman" w:hAnsi="Arial"/>
+                <w:lang w:eastAsia="es-ES"/>
+              </w:rPr>
+            </w:pPr>
+            <w:r>
+              <w:rPr>
+                <w:rFonts w:ascii="Arial" w:hAnsi="Arial"/>
+                <w:color w:val="1F1F1F"/>
+                <w:bdr w:val="none" w:sz="0" w:space="0" w:color="auto" w:frame="1"/>
+              </w:rPr>
+              <w:t>Random Forest</w:t>
+            </w:r>
+          </w:p>
+        </w:tc>
+        <w:tc>
+          <w:tcPr>
+            <w:tcW w:w="1559" w:type="dxa"/>
+            <w:tcBorders>
+              <w:left w:val="nil"/>
+            </w:tcBorders>
+            <w:noWrap/>
+            <w:vAlign w:val="center"/>
+            <w:hideMark/>
+          </w:tcPr>
+          <w:p>
+            <w:pPr>
+              <w:suppressAutoHyphens w:val="0"/>
+              <w:spacing w:before="100" w:beforeAutospacing="1" w:after="100" w:afterAutospacing="1" w:line="240" w:lineRule="auto"/>
+              <w:jc w:val="left"/>
+              <w:cnfStyle w:val="000000100000" w:firstRow="0" w:lastRow="0" w:firstColumn="0" w:lastColumn="0" w:oddVBand="0" w:evenVBand="0" w:oddHBand="1" w:evenHBand="0" w:firstRowFirstColumn="0" w:firstRowLastColumn="0" w:lastRowFirstColumn="0" w:lastRowLastColumn="0"/>
+              <w:rPr>
+                <w:rFonts w:ascii="Arial" w:eastAsia="Times New Roman" w:hAnsi="Arial"/>
+                <w:lang w:eastAsia="es-ES"/>
+              </w:rPr>
+            </w:pPr>
+            <w:r>
+              <w:rPr>
+                <w:rFonts w:ascii="Arial" w:hAnsi="Arial"/>
+                <w:color w:val="1F1F1F"/>
+                <w:bdr w:val="none" w:sz="0" w:space="0" w:color="auto" w:frame="1"/>
+              </w:rPr>
+              <w:t>0.685</w:t>
+            </w:r>
+          </w:p>
+        </w:tc>
+        <w:tc>
+          <w:tcPr>
+            <w:tcW w:w="2126" w:type="dxa"/>
+            <w:noWrap/>
+            <w:vAlign w:val="center"/>
+            <w:hideMark/>
+          </w:tcPr>
+          <w:p>
+            <w:pPr>
+              <w:suppressAutoHyphens w:val="0"/>
+              <w:spacing w:before="100" w:beforeAutospacing="1" w:after="100" w:afterAutospacing="1" w:line="240" w:lineRule="auto"/>
+              <w:jc w:val="left"/>
+              <w:cnfStyle w:val="000000100000" w:firstRow="0" w:lastRow="0" w:firstColumn="0" w:lastColumn="0" w:oddVBand="0" w:evenVBand="0" w:oddHBand="1" w:evenHBand="0" w:firstRowFirstColumn="0" w:firstRowLastColumn="0" w:lastRowFirstColumn="0" w:lastRowLastColumn="0"/>
+              <w:rPr>
+                <w:rFonts w:ascii="Arial" w:eastAsia="Times New Roman" w:hAnsi="Arial"/>
+                <w:lang w:eastAsia="es-ES"/>
+              </w:rPr>
+            </w:pPr>
+            <w:r>
+              <w:rPr>
+                <w:rFonts w:ascii="Arial" w:hAnsi="Arial"/>
+                <w:color w:val="1F1F1F"/>
+                <w:bdr w:val="none" w:sz="0" w:space="0" w:color="auto" w:frame="1"/>
+              </w:rPr>
+              <w:t>0.256</w:t>
+            </w:r>
+          </w:p>
+        </w:tc>
+      </w:tr>
+      <w:tr>
+        <w:trPr>
+          <w:trHeight w:val="359"/>
+        </w:trPr>
+        <w:tc>
+          <w:tcPr>
+            <w:cnfStyle w:val="001000000000" w:firstRow="0" w:lastRow="0" w:firstColumn="1" w:lastColumn="0" w:oddVBand="0" w:evenVBand="0" w:oddHBand="0" w:evenHBand="0" w:firstRowFirstColumn="0" w:firstRowLastColumn="0" w:lastRowFirstColumn="0" w:lastRowLastColumn="0"/>
+            <w:tcW w:w="2978" w:type="dxa"/>
+            <w:tcBorders>
+              <w:right w:val="nil"/>
+            </w:tcBorders>
+            <w:noWrap/>
+            <w:vAlign w:val="center"/>
+            <w:hideMark/>
+          </w:tcPr>
+          <w:p>
+            <w:pPr>
+              <w:suppressAutoHyphens w:val="0"/>
+              <w:spacing w:before="100" w:beforeAutospacing="1" w:after="100" w:afterAutospacing="1" w:line="240" w:lineRule="auto"/>
+              <w:jc w:val="left"/>
+              <w:rPr>
+                <w:rFonts w:ascii="Arial" w:eastAsia="Times New Roman" w:hAnsi="Arial"/>
+                <w:lang w:eastAsia="es-ES"/>
+              </w:rPr>
+            </w:pPr>
+            <w:r>
+              <w:rPr>
+                <w:rFonts w:ascii="Arial" w:hAnsi="Arial"/>
+                <w:b w:val="0"/>
+                <w:bCs w:val="0"/>
+                <w:color w:val="1F1F1F"/>
+                <w:bdr w:val="none" w:sz="0" w:space="0" w:color="auto" w:frame="1"/>
+              </w:rPr>
+              <w:t>Ratio 10:1</w:t>
+            </w:r>
+          </w:p>
+        </w:tc>
+        <w:tc>
+          <w:tcPr>
+            <w:tcW w:w="2835" w:type="dxa"/>
+            <w:tcBorders>
+              <w:top w:val="nil"/>
+              <w:left w:val="nil"/>
+              <w:bottom w:val="nil"/>
+              <w:right w:val="nil"/>
+            </w:tcBorders>
+            <w:noWrap/>
+            <w:vAlign w:val="center"/>
+            <w:hideMark/>
+          </w:tcPr>
+          <w:p>
+            <w:pPr>
+              <w:suppressAutoHyphens w:val="0"/>
+              <w:spacing w:before="100" w:beforeAutospacing="1" w:after="100" w:afterAutospacing="1" w:line="240" w:lineRule="auto"/>
+              <w:jc w:val="left"/>
+              <w:cnfStyle w:val="000000000000" w:firstRow="0" w:lastRow="0" w:firstColumn="0" w:lastColumn="0" w:oddVBand="0" w:evenVBand="0" w:oddHBand="0" w:evenHBand="0" w:firstRowFirstColumn="0" w:firstRowLastColumn="0" w:lastRowFirstColumn="0" w:lastRowLastColumn="0"/>
+              <w:rPr>
+                <w:rFonts w:ascii="Arial" w:eastAsia="Times New Roman" w:hAnsi="Arial"/>
+                <w:lang w:eastAsia="es-ES"/>
+              </w:rPr>
+            </w:pPr>
+            <w:r>
+              <w:rPr>
+                <w:rFonts w:ascii="Arial" w:hAnsi="Arial"/>
+                <w:color w:val="1F1F1F"/>
+                <w:bdr w:val="none" w:sz="0" w:space="0" w:color="auto" w:frame="1"/>
+              </w:rPr>
+              <w:t>XGBoost</w:t>
+            </w:r>
+          </w:p>
+        </w:tc>
+        <w:tc>
+          <w:tcPr>
+            <w:tcW w:w="1559" w:type="dxa"/>
+            <w:tcBorders>
+              <w:left w:val="nil"/>
+            </w:tcBorders>
+            <w:noWrap/>
+            <w:vAlign w:val="center"/>
+            <w:hideMark/>
+          </w:tcPr>
+          <w:p>
+            <w:pPr>
+              <w:suppressAutoHyphens w:val="0"/>
+              <w:spacing w:before="100" w:beforeAutospacing="1" w:after="100" w:afterAutospacing="1" w:line="240" w:lineRule="auto"/>
+              <w:jc w:val="left"/>
+              <w:cnfStyle w:val="000000000000" w:firstRow="0" w:lastRow="0" w:firstColumn="0" w:lastColumn="0" w:oddVBand="0" w:evenVBand="0" w:oddHBand="0" w:evenHBand="0" w:firstRowFirstColumn="0" w:firstRowLastColumn="0" w:lastRowFirstColumn="0" w:lastRowLastColumn="0"/>
+              <w:rPr>
+                <w:rFonts w:ascii="Arial" w:eastAsia="Times New Roman" w:hAnsi="Arial"/>
+                <w:lang w:eastAsia="es-ES"/>
+              </w:rPr>
+            </w:pPr>
+            <w:r>
+              <w:rPr>
+                <w:rFonts w:ascii="Arial" w:hAnsi="Arial"/>
+                <w:color w:val="1F1F1F"/>
+                <w:bdr w:val="none" w:sz="0" w:space="0" w:color="auto" w:frame="1"/>
+              </w:rPr>
+              <w:t>0.659</w:t>
+            </w:r>
+          </w:p>
+        </w:tc>
+        <w:tc>
+          <w:tcPr>
+            <w:tcW w:w="2126" w:type="dxa"/>
+            <w:noWrap/>
+            <w:vAlign w:val="center"/>
+            <w:hideMark/>
+          </w:tcPr>
+          <w:p>
+            <w:pPr>
+              <w:suppressAutoHyphens w:val="0"/>
+              <w:spacing w:before="100" w:beforeAutospacing="1" w:after="100" w:afterAutospacing="1" w:line="240" w:lineRule="auto"/>
+              <w:jc w:val="left"/>
+              <w:cnfStyle w:val="000000000000" w:firstRow="0" w:lastRow="0" w:firstColumn="0" w:lastColumn="0" w:oddVBand="0" w:evenVBand="0" w:oddHBand="0" w:evenHBand="0" w:firstRowFirstColumn="0" w:firstRowLastColumn="0" w:lastRowFirstColumn="0" w:lastRowLastColumn="0"/>
+              <w:rPr>
+                <w:rFonts w:ascii="Arial" w:eastAsia="Times New Roman" w:hAnsi="Arial"/>
+                <w:lang w:eastAsia="es-ES"/>
+              </w:rPr>
+            </w:pPr>
+            <w:r>
+              <w:rPr>
+                <w:rFonts w:ascii="Arial" w:hAnsi="Arial"/>
+                <w:color w:val="1F1F1F"/>
+                <w:bdr w:val="none" w:sz="0" w:space="0" w:color="auto" w:frame="1"/>
+              </w:rPr>
+              <w:t>0.279</w:t>
+            </w:r>
+          </w:p>
+        </w:tc>
+      </w:tr>
+      <w:tr>
+        <w:trPr>
+          <w:cnfStyle w:val="000000100000" w:firstRow="0" w:lastRow="0" w:firstColumn="0" w:lastColumn="0" w:oddVBand="0" w:evenVBand="0" w:oddHBand="1" w:evenHBand="0" w:firstRowFirstColumn="0" w:firstRowLastColumn="0" w:lastRowFirstColumn="0" w:lastRowLastColumn="0"/>
+          <w:trHeight w:val="359"/>
+        </w:trPr>
+        <w:tc>
+          <w:tcPr>
+            <w:cnfStyle w:val="001000000000" w:firstRow="0" w:lastRow="0" w:firstColumn="1" w:lastColumn="0" w:oddVBand="0" w:evenVBand="0" w:oddHBand="0" w:evenHBand="0" w:firstRowFirstColumn="0" w:firstRowLastColumn="0" w:lastRowFirstColumn="0" w:lastRowLastColumn="0"/>
+            <w:tcW w:w="2978" w:type="dxa"/>
+            <w:tcBorders>
+              <w:right w:val="nil"/>
+            </w:tcBorders>
+            <w:noWrap/>
+            <w:vAlign w:val="center"/>
+            <w:hideMark/>
+          </w:tcPr>
+          <w:p>
+            <w:pPr>
+              <w:suppressAutoHyphens w:val="0"/>
+              <w:spacing w:before="100" w:beforeAutospacing="1" w:after="100" w:afterAutospacing="1" w:line="240" w:lineRule="auto"/>
+              <w:jc w:val="left"/>
+              <w:rPr>
+                <w:rFonts w:ascii="Arial" w:eastAsia="Times New Roman" w:hAnsi="Arial"/>
+                <w:lang w:eastAsia="es-ES"/>
+              </w:rPr>
+            </w:pPr>
+            <w:r>
+              <w:rPr>
+                <w:rFonts w:ascii="Arial" w:hAnsi="Arial"/>
+                <w:b w:val="0"/>
+                <w:bCs w:val="0"/>
+                <w:color w:val="1F1F1F"/>
+                <w:bdr w:val="none" w:sz="0" w:space="0" w:color="auto" w:frame="1"/>
+              </w:rPr>
+              <w:t>Ratio 5:1</w:t>
+            </w:r>
+          </w:p>
+        </w:tc>
+        <w:tc>
+          <w:tcPr>
+            <w:tcW w:w="2835" w:type="dxa"/>
+            <w:tcBorders>
+              <w:top w:val="nil"/>
+              <w:left w:val="nil"/>
+              <w:bottom w:val="nil"/>
+              <w:right w:val="nil"/>
+            </w:tcBorders>
+            <w:noWrap/>
+            <w:vAlign w:val="center"/>
+            <w:hideMark/>
+          </w:tcPr>
+          <w:p>
+            <w:pPr>
+              <w:suppressAutoHyphens w:val="0"/>
+              <w:spacing w:before="100" w:beforeAutospacing="1" w:after="100" w:afterAutospacing="1" w:line="240" w:lineRule="auto"/>
+              <w:jc w:val="left"/>
+              <w:cnfStyle w:val="000000100000" w:firstRow="0" w:lastRow="0" w:firstColumn="0" w:lastColumn="0" w:oddVBand="0" w:evenVBand="0" w:oddHBand="1" w:evenHBand="0" w:firstRowFirstColumn="0" w:firstRowLastColumn="0" w:lastRowFirstColumn="0" w:lastRowLastColumn="0"/>
+              <w:rPr>
+                <w:rFonts w:ascii="Arial" w:eastAsia="Times New Roman" w:hAnsi="Arial"/>
+                <w:lang w:eastAsia="es-ES"/>
+              </w:rPr>
+            </w:pPr>
+            <w:r>
+              <w:rPr>
+                <w:rFonts w:ascii="Arial" w:hAnsi="Arial"/>
+                <w:color w:val="1F1F1F"/>
+                <w:bdr w:val="none" w:sz="0" w:space="0" w:color="auto" w:frame="1"/>
+              </w:rPr>
+              <w:t>XGBoost</w:t>
+            </w:r>
+          </w:p>
+        </w:tc>
+        <w:tc>
+          <w:tcPr>
+            <w:tcW w:w="1559" w:type="dxa"/>
+            <w:tcBorders>
+              <w:left w:val="nil"/>
+            </w:tcBorders>
+            <w:noWrap/>
+            <w:vAlign w:val="center"/>
+            <w:hideMark/>
+          </w:tcPr>
+          <w:p>
+            <w:pPr>
+              <w:suppressAutoHyphens w:val="0"/>
+              <w:spacing w:before="100" w:beforeAutospacing="1" w:after="100" w:afterAutospacing="1" w:line="240" w:lineRule="auto"/>
+              <w:jc w:val="left"/>
+              <w:cnfStyle w:val="000000100000" w:firstRow="0" w:lastRow="0" w:firstColumn="0" w:lastColumn="0" w:oddVBand="0" w:evenVBand="0" w:oddHBand="1" w:evenHBand="0" w:firstRowFirstColumn="0" w:firstRowLastColumn="0" w:lastRowFirstColumn="0" w:lastRowLastColumn="0"/>
+              <w:rPr>
+                <w:rFonts w:ascii="Arial" w:eastAsia="Times New Roman" w:hAnsi="Arial"/>
+                <w:lang w:eastAsia="es-ES"/>
+              </w:rPr>
+            </w:pPr>
+            <w:r>
+              <w:rPr>
+                <w:rFonts w:ascii="Arial" w:hAnsi="Arial"/>
+                <w:color w:val="1F1F1F"/>
+                <w:bdr w:val="none" w:sz="0" w:space="0" w:color="auto" w:frame="1"/>
+              </w:rPr>
+              <w:t>0.651</w:t>
+            </w:r>
+          </w:p>
+        </w:tc>
+        <w:tc>
+          <w:tcPr>
+            <w:tcW w:w="2126" w:type="dxa"/>
+            <w:noWrap/>
+            <w:vAlign w:val="center"/>
+            <w:hideMark/>
+          </w:tcPr>
+          <w:p>
+            <w:pPr>
+              <w:suppressAutoHyphens w:val="0"/>
+              <w:spacing w:before="100" w:beforeAutospacing="1" w:after="100" w:afterAutospacing="1" w:line="240" w:lineRule="auto"/>
+              <w:jc w:val="left"/>
+              <w:cnfStyle w:val="000000100000" w:firstRow="0" w:lastRow="0" w:firstColumn="0" w:lastColumn="0" w:oddVBand="0" w:evenVBand="0" w:oddHBand="1" w:evenHBand="0" w:firstRowFirstColumn="0" w:firstRowLastColumn="0" w:lastRowFirstColumn="0" w:lastRowLastColumn="0"/>
+              <w:rPr>
+                <w:rFonts w:ascii="Arial" w:eastAsia="Times New Roman" w:hAnsi="Arial"/>
+                <w:lang w:eastAsia="es-ES"/>
+              </w:rPr>
+            </w:pPr>
+            <w:r>
+              <w:rPr>
+                <w:rFonts w:ascii="Arial" w:hAnsi="Arial"/>
+                <w:color w:val="1F1F1F"/>
+                <w:bdr w:val="none" w:sz="0" w:space="0" w:color="auto" w:frame="1"/>
+              </w:rPr>
+              <w:t>0.293</w:t>
+            </w:r>
+          </w:p>
+        </w:tc>
+      </w:tr>
+    </w:tbl>
+    <w:p>
+      <w:pPr>
+        <w:suppressAutoHyphens w:val="0"/>
+        <w:spacing w:before="100" w:beforeAutospacing="1" w:after="100" w:afterAutospacing="1" w:line="240" w:lineRule="auto"/>
+        <w:jc w:val="left"/>
+        <w:rPr>
+          <w:rFonts w:ascii="Arial" w:eastAsia="Times New Roman" w:hAnsi="Arial"/>
+          <w:lang w:eastAsia="es-ES"/>
+        </w:rPr>
+      </w:pPr>
+    </w:p>
+    <w:p>
+      <w:pPr>
+        <w:suppressAutoHyphens w:val="0"/>
+        <w:spacing w:before="100" w:beforeAutospacing="1" w:after="100" w:afterAutospacing="1" w:line="240" w:lineRule="auto"/>
+        <w:jc w:val="left"/>
+        <w:rPr>
+          <w:rFonts w:ascii="Arial" w:eastAsia="Times New Roman" w:hAnsi="Arial"/>
+          <w:lang w:eastAsia="es-ES"/>
+        </w:rPr>
+      </w:pPr>
+      <w:r>
+        <w:rPr>
+          <w:rFonts w:ascii="Arial" w:eastAsia="Times New Roman" w:hAnsi="Arial"/>
+          <w:lang w:eastAsia="es-ES"/>
+        </w:rPr>
+        <w:t>Los resultados de esta estrategia revelan dinámicas fundamentales sobre el aprendizaje en entornos de anomalías. En primer lugar, se observa que la eliminación extrema de datos de la clase mayoritaria (escenario 1:1) resulta contraproducente. Forzar una distribución equilibrada destruyó la capacidad predictiva de todos los algoritmos, colapsando el AUPRC de XGBoost a 0.497 y su precisión operativa a un inaceptable 0.113. Esto confirma que, en la detección de fraude, el modelo requiere una representación masiva de la "normalidad" para poder identificar eficazmente las desviaciones.</w:t>
+      </w:r>
+    </w:p>
+    <w:p>
+      <w:pPr>
+        <w:suppressAutoHyphens w:val="0"/>
+        <w:spacing w:before="100" w:beforeAutospacing="1" w:after="100" w:afterAutospacing="1" w:line="240" w:lineRule="auto"/>
+        <w:jc w:val="left"/>
+        <w:rPr>
+          <w:rFonts w:ascii="Arial" w:eastAsia="Times New Roman" w:hAnsi="Arial"/>
+          <w:lang w:eastAsia="es-ES"/>
+        </w:rPr>
+      </w:pPr>
+      <w:r>
+        <w:rPr>
+          <w:rFonts w:ascii="Arial" w:eastAsia="Times New Roman" w:hAnsi="Arial"/>
+          <w:lang w:eastAsia="es-ES"/>
+        </w:rPr>
+        <w:t>Por el contrario, las reducciones moderadas demostraron ser altamente beneficiosas. El escenario con un ratio 5:1 empleando la arquitectura XGBoost emergió como la configuración óptima para las necesidades del negocio. Si bien el ratio 10:1 logró un Área Bajo la Curva PR ligeramente superior (0.659 frente a 0.651), el entrenamiento a 5:1 maximizó la métrica de viabilidad operativa (</w:t>
+      </w:r>
+      <w:r>
+        <w:rPr>
+          <w:rFonts w:ascii="Arial" w:eastAsia="Times New Roman" w:hAnsi="Arial"/>
           <w:i/>
           <w:iCs/>
-        </w:rPr>
-        <w:t>Anti-Leakage</w:t>
-      </w:r>
-      <w:r>
-        <w:t>)</w:t>
-      </w:r>
-      <w:bookmarkEnd w:id="57"/>
-    </w:p>
-    <w:p>
-      <w:pPr>
-        <w:spacing w:line="240" w:lineRule="auto"/>
-        <w:rPr>
-          <w:rFonts w:ascii="Arial" w:hAnsi="Arial"/>
-          <w:lang w:eastAsia="es-ES"/>
-        </w:rPr>
-      </w:pPr>
-      <w:r>
-        <w:rPr>
-          <w:rFonts w:ascii="Arial" w:hAnsi="Arial"/>
-          <w:lang w:eastAsia="es-ES"/>
-        </w:rPr>
-        <w:t xml:space="preserve">El </w:t>
-      </w:r>
-      <w:r>
-        <w:rPr>
-          <w:rFonts w:ascii="Arial" w:hAnsi="Arial"/>
-          <w:lang w:eastAsia="es-ES"/>
-        </w:rPr>
-        <w:t xml:space="preserve">siguiente experimento </w:t>
-      </w:r>
-      <w:r>
-        <w:rPr>
-          <w:rFonts w:ascii="Arial" w:hAnsi="Arial"/>
-          <w:lang w:eastAsia="es-ES"/>
-        </w:rPr>
-        <w:t>constituye el núcleo crítico de esta investigación. Su objetivo es ejecutar una auditoría metodológica para demostrar de forma empírica cómo las prácticas de validación defectuosas inflan artificialmente las métricas de rendimiento. Para ello, se diseñó un ensayo de control con cinco ramas experimentales aislando las principales fuentes de fuga de información (</w:t>
-      </w:r>
-      <w:r>
-        <w:rPr>
-          <w:rFonts w:ascii="Arial" w:hAnsi="Arial"/>
+          <w:lang w:eastAsia="es-ES"/>
+        </w:rPr>
+        <w:t>Card Precision@100</w:t>
+      </w:r>
+      <w:r>
+        <w:rPr>
+          <w:rFonts w:ascii="Arial" w:eastAsia="Times New Roman" w:hAnsi="Arial"/>
+          <w:lang w:eastAsia="es-ES"/>
+        </w:rPr>
+        <w:t>), alcanzando el valor más alto de todo el ensayo preliminar: 0.293.</w:t>
+      </w:r>
+    </w:p>
+    <w:p>
+      <w:pPr>
+        <w:suppressAutoHyphens w:val="0"/>
+        <w:spacing w:before="100" w:beforeAutospacing="1" w:after="100" w:afterAutospacing="1" w:line="240" w:lineRule="auto"/>
+        <w:jc w:val="left"/>
+        <w:rPr>
+          <w:rFonts w:ascii="Arial" w:eastAsia="Times New Roman" w:hAnsi="Arial"/>
+          <w:lang w:eastAsia="es-ES"/>
+        </w:rPr>
+      </w:pPr>
+      <w:r>
+        <w:rPr>
+          <w:rFonts w:ascii="Arial" w:eastAsia="Times New Roman" w:hAnsi="Arial"/>
+          <w:lang w:eastAsia="es-ES"/>
+        </w:rPr>
+        <w:t>Esta decisión subraya un principio esencial en este estudio: en un entorno de producción donde la capacidad de auditoría manual (SOC) está estrictamente limitada a las 100 principales alertas diarias, la maximización del CP@100 justifica sobradamente una degradación marginal en el AUPRC global. Adicionalmente, esta compresión del volumen de entrada aceleró de manera drástica los tiempos de optimización, consolidando a XGBoost (5:1) como una solución ágil y operativamente superior.</w:t>
+      </w:r>
+    </w:p>
+    <w:p>
+      <w:pPr>
+        <w:pStyle w:val="Ttulo2"/>
+      </w:pPr>
+      <w:bookmarkStart w:id="57" w:name="_Toc222931140"/>
+      <w:r>
+        <w:t>Impacto de la Fuga de Datos (</w:t>
+      </w:r>
+      <w:r>
+        <w:rPr>
           <w:i/>
           <w:iCs/>
+        </w:rPr>
+        <w:t>Anti-Leakage</w:t>
+      </w:r>
+      <w:r>
+        <w:t>)</w:t>
+      </w:r>
+      <w:bookmarkEnd w:id="57"/>
+    </w:p>
+    <w:p>
+      <w:pPr>
+        <w:spacing w:line="240" w:lineRule="auto"/>
+        <w:rPr>
+          <w:rFonts w:ascii="Arial" w:hAnsi="Arial"/>
+          <w:lang w:eastAsia="es-ES"/>
+        </w:rPr>
+      </w:pPr>
+      <w:r>
+        <w:rPr>
+          <w:rFonts w:ascii="Arial" w:hAnsi="Arial"/>
+          <w:lang w:eastAsia="es-ES"/>
+        </w:rPr>
+        <w:t xml:space="preserve">El </w:t>
+      </w:r>
+      <w:r>
+        <w:rPr>
+          <w:rFonts w:ascii="Arial" w:hAnsi="Arial"/>
+          <w:lang w:eastAsia="es-ES"/>
+        </w:rPr>
+        <w:t xml:space="preserve">siguiente experimento </w:t>
+      </w:r>
+      <w:r>
+        <w:rPr>
+          <w:rFonts w:ascii="Arial" w:hAnsi="Arial"/>
+          <w:lang w:eastAsia="es-ES"/>
+        </w:rPr>
+        <w:t>constituye el núcleo crítico de esta investigación. Su objetivo es ejecutar una auditoría metodológica para demostrar de forma empírica cómo las prácticas de validación defectuosas inflan artificialmente las métricas de rendimiento. Para ello, se diseñó un ensayo de control con cinco ramas experimentales aislando las principales fuentes de fuga de información (</w:t>
+      </w:r>
+      <w:r>
+        <w:rPr>
+          <w:rFonts w:ascii="Arial" w:hAnsi="Arial"/>
+          <w:i/>
+          <w:iCs/>
           <w:lang w:eastAsia="es-ES"/>
         </w:rPr>
         <w:t>Data Leakage</w:t>
@@ -15840,6 +16520,7 @@
           <w:rFonts w:ascii="Arial" w:hAnsi="Arial"/>
           <w:b/>
           <w:bCs/>
+          <w:noProof/>
           <w:lang w:eastAsia="es-ES"/>
         </w:rPr>
         <w:lastRenderedPageBreak/>
@@ -17360,6 +18041,7 @@
         <w:rPr>
           <w:b/>
           <w:bCs/>
+          <w:noProof/>
           <w:lang w:eastAsia="es-ES"/>
         </w:rPr>
         <w:drawing>
@@ -17507,6 +18189,7 @@
         <w:rPr>
           <w:b/>
           <w:bCs/>
+          <w:noProof/>
           <w:lang w:eastAsia="es-ES"/>
         </w:rPr>
         <w:drawing>
@@ -17662,6 +18345,7 @@
         <w:rPr>
           <w:b/>
           <w:bCs/>
+          <w:noProof/>
           <w:lang w:eastAsia="es-ES"/>
         </w:rPr>
         <w:lastRenderedPageBreak/>
@@ -17713,6 +18397,7 @@
         <w:rPr>
           <w:b/>
           <w:bCs/>
+          <w:noProof/>
           <w:lang w:eastAsia="es-ES"/>
         </w:rPr>
         <w:drawing>
@@ -17789,6 +18474,630 @@
           <w:lang w:eastAsia="es-ES"/>
         </w:rPr>
       </w:pPr>
+      <w:r>
+        <w:rPr>
+          <w:b/>
+          <w:bCs/>
+          <w:lang w:eastAsia="es-ES"/>
+        </w:rPr>
+        <w:t>4.3.4. Validación de Relevancia mediante Estudio de Ablación</w:t>
+      </w:r>
+    </w:p>
+    <w:p>
+      <w:pPr>
+        <w:rPr>
+          <w:lang w:eastAsia="es-ES"/>
+        </w:rPr>
+      </w:pPr>
+      <w:r>
+        <w:rPr>
+          <w:lang w:eastAsia="es-ES"/>
+        </w:rPr>
+        <w:t>Para dotar de rigor empírico a los hallazgos de interpretabilidad, se diseñó una última prueba de esfuerzo metodológica: un estudio de ablación. El objetivo de esta fase fue comprobar si el alto impacto marginal atribuido por SHAP a la variable dominante del comportamiento de usuario (CUSTOMER_ID_AVG_AMOUNT_30DAY_WINDOW) se traducía verdaderamente en una dependencia predictiva crítica por parte del modelo.</w:t>
+      </w:r>
+    </w:p>
+    <w:p>
+      <w:pPr>
+        <w:rPr>
+          <w:lang w:eastAsia="es-ES"/>
+        </w:rPr>
+      </w:pPr>
+      <w:r>
+        <w:rPr>
+          <w:lang w:eastAsia="es-ES"/>
+        </w:rPr>
+        <w:lastRenderedPageBreak/>
+        <w:t>El experimento consistió en extirpar deliberadamente dicha característica del conjunto de datos y someter al modelo XGBoost de referencia a un reentrenamiento completo bajo el mismo rigor de aislamiento temporal.</w:t>
+      </w:r>
+    </w:p>
+    <w:tbl>
+      <w:tblPr>
+        <w:tblStyle w:val="Tablaconcuadrcula4-nfasis6"/>
+        <w:tblW w:w="8584" w:type="dxa"/>
+        <w:tblLook w:val="04A0" w:firstRow="1" w:lastRow="0" w:firstColumn="1" w:lastColumn="0" w:noHBand="0" w:noVBand="1"/>
+      </w:tblPr>
+      <w:tblGrid>
+        <w:gridCol w:w="4414"/>
+        <w:gridCol w:w="1469"/>
+        <w:gridCol w:w="1326"/>
+        <w:gridCol w:w="1375"/>
+      </w:tblGrid>
+      <w:tr>
+        <w:trPr>
+          <w:cnfStyle w:val="100000000000" w:firstRow="1" w:lastRow="0" w:firstColumn="0" w:lastColumn="0" w:oddVBand="0" w:evenVBand="0" w:oddHBand="0" w:evenHBand="0" w:firstRowFirstColumn="0" w:firstRowLastColumn="0" w:lastRowFirstColumn="0" w:lastRowLastColumn="0"/>
+          <w:trHeight w:val="368"/>
+        </w:trPr>
+        <w:tc>
+          <w:tcPr>
+            <w:cnfStyle w:val="001000000000" w:firstRow="0" w:lastRow="0" w:firstColumn="1" w:lastColumn="0" w:oddVBand="0" w:evenVBand="0" w:oddHBand="0" w:evenHBand="0" w:firstRowFirstColumn="0" w:firstRowLastColumn="0" w:lastRowFirstColumn="0" w:lastRowLastColumn="0"/>
+            <w:tcW w:w="0" w:type="auto"/>
+            <w:hideMark/>
+          </w:tcPr>
+          <w:p>
+            <w:pPr>
+              <w:rPr>
+                <w:lang w:eastAsia="es-ES"/>
+              </w:rPr>
+            </w:pPr>
+            <w:r>
+              <w:rPr>
+                <w:lang w:eastAsia="es-ES"/>
+              </w:rPr>
+              <w:t>Modelo Evaluado</w:t>
+            </w:r>
+          </w:p>
+        </w:tc>
+        <w:tc>
+          <w:tcPr>
+            <w:tcW w:w="0" w:type="auto"/>
+            <w:hideMark/>
+          </w:tcPr>
+          <w:p>
+            <w:pPr>
+              <w:cnfStyle w:val="100000000000" w:firstRow="1" w:lastRow="0" w:firstColumn="0" w:lastColumn="0" w:oddVBand="0" w:evenVBand="0" w:oddHBand="0" w:evenHBand="0" w:firstRowFirstColumn="0" w:firstRowLastColumn="0" w:lastRowFirstColumn="0" w:lastRowLastColumn="0"/>
+              <w:rPr>
+                <w:lang w:eastAsia="es-ES"/>
+              </w:rPr>
+            </w:pPr>
+            <w:r>
+              <w:rPr>
+                <w:lang w:eastAsia="es-ES"/>
+              </w:rPr>
+              <w:t>AUC ROC</w:t>
+            </w:r>
+          </w:p>
+        </w:tc>
+        <w:tc>
+          <w:tcPr>
+            <w:tcW w:w="0" w:type="auto"/>
+            <w:hideMark/>
+          </w:tcPr>
+          <w:p>
+            <w:pPr>
+              <w:cnfStyle w:val="100000000000" w:firstRow="1" w:lastRow="0" w:firstColumn="0" w:lastColumn="0" w:oddVBand="0" w:evenVBand="0" w:oddHBand="0" w:evenHBand="0" w:firstRowFirstColumn="0" w:firstRowLastColumn="0" w:lastRowFirstColumn="0" w:lastRowLastColumn="0"/>
+              <w:rPr>
+                <w:lang w:eastAsia="es-ES"/>
+              </w:rPr>
+            </w:pPr>
+            <w:r>
+              <w:rPr>
+                <w:lang w:eastAsia="es-ES"/>
+              </w:rPr>
+              <w:t>AUPRC</w:t>
+            </w:r>
+          </w:p>
+        </w:tc>
+        <w:tc>
+          <w:tcPr>
+            <w:tcW w:w="0" w:type="auto"/>
+            <w:hideMark/>
+          </w:tcPr>
+          <w:p>
+            <w:pPr>
+              <w:cnfStyle w:val="100000000000" w:firstRow="1" w:lastRow="0" w:firstColumn="0" w:lastColumn="0" w:oddVBand="0" w:evenVBand="0" w:oddHBand="0" w:evenHBand="0" w:firstRowFirstColumn="0" w:firstRowLastColumn="0" w:lastRowFirstColumn="0" w:lastRowLastColumn="0"/>
+              <w:rPr>
+                <w:lang w:eastAsia="es-ES"/>
+              </w:rPr>
+            </w:pPr>
+            <w:r>
+              <w:rPr>
+                <w:lang w:eastAsia="es-ES"/>
+              </w:rPr>
+              <w:t>CP@100</w:t>
+            </w:r>
+          </w:p>
+        </w:tc>
+      </w:tr>
+      <w:tr>
+        <w:trPr>
+          <w:cnfStyle w:val="000000100000" w:firstRow="0" w:lastRow="0" w:firstColumn="0" w:lastColumn="0" w:oddVBand="0" w:evenVBand="0" w:oddHBand="1" w:evenHBand="0" w:firstRowFirstColumn="0" w:firstRowLastColumn="0" w:lastRowFirstColumn="0" w:lastRowLastColumn="0"/>
+          <w:trHeight w:val="374"/>
+        </w:trPr>
+        <w:tc>
+          <w:tcPr>
+            <w:cnfStyle w:val="001000000000" w:firstRow="0" w:lastRow="0" w:firstColumn="1" w:lastColumn="0" w:oddVBand="0" w:evenVBand="0" w:oddHBand="0" w:evenHBand="0" w:firstRowFirstColumn="0" w:firstRowLastColumn="0" w:lastRowFirstColumn="0" w:lastRowLastColumn="0"/>
+            <w:tcW w:w="0" w:type="auto"/>
+            <w:hideMark/>
+          </w:tcPr>
+          <w:p>
+            <w:pPr>
+              <w:rPr>
+                <w:lang w:eastAsia="es-ES"/>
+              </w:rPr>
+            </w:pPr>
+            <w:r>
+              <w:rPr>
+                <w:lang w:eastAsia="es-ES"/>
+              </w:rPr>
+              <w:t>XGBoost (Conjunto Completo)</w:t>
+            </w:r>
+          </w:p>
+        </w:tc>
+        <w:tc>
+          <w:tcPr>
+            <w:tcW w:w="0" w:type="auto"/>
+            <w:hideMark/>
+          </w:tcPr>
+          <w:p>
+            <w:pPr>
+              <w:cnfStyle w:val="000000100000" w:firstRow="0" w:lastRow="0" w:firstColumn="0" w:lastColumn="0" w:oddVBand="0" w:evenVBand="0" w:oddHBand="1" w:evenHBand="0" w:firstRowFirstColumn="0" w:firstRowLastColumn="0" w:lastRowFirstColumn="0" w:lastRowLastColumn="0"/>
+              <w:rPr>
+                <w:lang w:eastAsia="es-ES"/>
+              </w:rPr>
+            </w:pPr>
+            <w:r>
+              <w:rPr>
+                <w:lang w:eastAsia="es-ES"/>
+              </w:rPr>
+              <w:t>0.8618</w:t>
+            </w:r>
+          </w:p>
+        </w:tc>
+        <w:tc>
+          <w:tcPr>
+            <w:tcW w:w="0" w:type="auto"/>
+            <w:hideMark/>
+          </w:tcPr>
+          <w:p>
+            <w:pPr>
+              <w:cnfStyle w:val="000000100000" w:firstRow="0" w:lastRow="0" w:firstColumn="0" w:lastColumn="0" w:oddVBand="0" w:evenVBand="0" w:oddHBand="1" w:evenHBand="0" w:firstRowFirstColumn="0" w:firstRowLastColumn="0" w:lastRowFirstColumn="0" w:lastRowLastColumn="0"/>
+              <w:rPr>
+                <w:lang w:eastAsia="es-ES"/>
+              </w:rPr>
+            </w:pPr>
+            <w:r>
+              <w:rPr>
+                <w:lang w:eastAsia="es-ES"/>
+              </w:rPr>
+              <w:t>0.6389</w:t>
+            </w:r>
+          </w:p>
+        </w:tc>
+        <w:tc>
+          <w:tcPr>
+            <w:tcW w:w="0" w:type="auto"/>
+            <w:hideMark/>
+          </w:tcPr>
+          <w:p>
+            <w:pPr>
+              <w:cnfStyle w:val="000000100000" w:firstRow="0" w:lastRow="0" w:firstColumn="0" w:lastColumn="0" w:oddVBand="0" w:evenVBand="0" w:oddHBand="1" w:evenHBand="0" w:firstRowFirstColumn="0" w:firstRowLastColumn="0" w:lastRowFirstColumn="0" w:lastRowLastColumn="0"/>
+              <w:rPr>
+                <w:lang w:eastAsia="es-ES"/>
+              </w:rPr>
+            </w:pPr>
+            <w:r>
+              <w:rPr>
+                <w:lang w:eastAsia="es-ES"/>
+              </w:rPr>
+              <w:t>0.2729</w:t>
+            </w:r>
+          </w:p>
+        </w:tc>
+      </w:tr>
+      <w:tr>
+        <w:trPr>
+          <w:trHeight w:val="368"/>
+        </w:trPr>
+        <w:tc>
+          <w:tcPr>
+            <w:cnfStyle w:val="001000000000" w:firstRow="0" w:lastRow="0" w:firstColumn="1" w:lastColumn="0" w:oddVBand="0" w:evenVBand="0" w:oddHBand="0" w:evenHBand="0" w:firstRowFirstColumn="0" w:firstRowLastColumn="0" w:lastRowFirstColumn="0" w:lastRowLastColumn="0"/>
+            <w:tcW w:w="0" w:type="auto"/>
+            <w:hideMark/>
+          </w:tcPr>
+          <w:p>
+            <w:pPr>
+              <w:rPr>
+                <w:lang w:eastAsia="es-ES"/>
+              </w:rPr>
+            </w:pPr>
+            <w:r>
+              <w:rPr>
+                <w:lang w:eastAsia="es-ES"/>
+              </w:rPr>
+              <w:t>XGBoost (Ablación Top-Feature)</w:t>
+            </w:r>
+          </w:p>
+        </w:tc>
+        <w:tc>
+          <w:tcPr>
+            <w:tcW w:w="0" w:type="auto"/>
+            <w:hideMark/>
+          </w:tcPr>
+          <w:p>
+            <w:pPr>
+              <w:cnfStyle w:val="000000000000" w:firstRow="0" w:lastRow="0" w:firstColumn="0" w:lastColumn="0" w:oddVBand="0" w:evenVBand="0" w:oddHBand="0" w:evenHBand="0" w:firstRowFirstColumn="0" w:firstRowLastColumn="0" w:lastRowFirstColumn="0" w:lastRowLastColumn="0"/>
+              <w:rPr>
+                <w:lang w:eastAsia="es-ES"/>
+              </w:rPr>
+            </w:pPr>
+            <w:r>
+              <w:rPr>
+                <w:lang w:eastAsia="es-ES"/>
+              </w:rPr>
+              <w:t>0.8498</w:t>
+            </w:r>
+          </w:p>
+        </w:tc>
+        <w:tc>
+          <w:tcPr>
+            <w:tcW w:w="0" w:type="auto"/>
+            <w:hideMark/>
+          </w:tcPr>
+          <w:p>
+            <w:pPr>
+              <w:cnfStyle w:val="000000000000" w:firstRow="0" w:lastRow="0" w:firstColumn="0" w:lastColumn="0" w:oddVBand="0" w:evenVBand="0" w:oddHBand="0" w:evenHBand="0" w:firstRowFirstColumn="0" w:firstRowLastColumn="0" w:lastRowFirstColumn="0" w:lastRowLastColumn="0"/>
+              <w:rPr>
+                <w:lang w:eastAsia="es-ES"/>
+              </w:rPr>
+            </w:pPr>
+            <w:r>
+              <w:rPr>
+                <w:lang w:eastAsia="es-ES"/>
+              </w:rPr>
+              <w:t>0.5942</w:t>
+            </w:r>
+          </w:p>
+        </w:tc>
+        <w:tc>
+          <w:tcPr>
+            <w:tcW w:w="0" w:type="auto"/>
+            <w:hideMark/>
+          </w:tcPr>
+          <w:p>
+            <w:pPr>
+              <w:cnfStyle w:val="000000000000" w:firstRow="0" w:lastRow="0" w:firstColumn="0" w:lastColumn="0" w:oddVBand="0" w:evenVBand="0" w:oddHBand="0" w:evenHBand="0" w:firstRowFirstColumn="0" w:firstRowLastColumn="0" w:lastRowFirstColumn="0" w:lastRowLastColumn="0"/>
+              <w:rPr>
+                <w:lang w:eastAsia="es-ES"/>
+              </w:rPr>
+            </w:pPr>
+            <w:r>
+              <w:rPr>
+                <w:lang w:eastAsia="es-ES"/>
+              </w:rPr>
+              <w:t>0.2714</w:t>
+            </w:r>
+          </w:p>
+        </w:tc>
+      </w:tr>
+      <w:tr>
+        <w:trPr>
+          <w:cnfStyle w:val="000000100000" w:firstRow="0" w:lastRow="0" w:firstColumn="0" w:lastColumn="0" w:oddVBand="0" w:evenVBand="0" w:oddHBand="1" w:evenHBand="0" w:firstRowFirstColumn="0" w:firstRowLastColumn="0" w:lastRowFirstColumn="0" w:lastRowLastColumn="0"/>
+          <w:trHeight w:val="374"/>
+        </w:trPr>
+        <w:tc>
+          <w:tcPr>
+            <w:cnfStyle w:val="001000000000" w:firstRow="0" w:lastRow="0" w:firstColumn="1" w:lastColumn="0" w:oddVBand="0" w:evenVBand="0" w:oddHBand="0" w:evenHBand="0" w:firstRowFirstColumn="0" w:firstRowLastColumn="0" w:lastRowFirstColumn="0" w:lastRowLastColumn="0"/>
+            <w:tcW w:w="0" w:type="auto"/>
+            <w:hideMark/>
+          </w:tcPr>
+          <w:p>
+            <w:pPr>
+              <w:rPr>
+                <w:lang w:eastAsia="es-ES"/>
+              </w:rPr>
+            </w:pPr>
+            <w:r>
+              <w:rPr>
+                <w:lang w:eastAsia="es-ES"/>
+              </w:rPr>
+              <w:t>Diferencial ($\Delta$)</w:t>
+            </w:r>
+          </w:p>
+        </w:tc>
+        <w:tc>
+          <w:tcPr>
+            <w:tcW w:w="0" w:type="auto"/>
+            <w:hideMark/>
+          </w:tcPr>
+          <w:p>
+            <w:pPr>
+              <w:cnfStyle w:val="000000100000" w:firstRow="0" w:lastRow="0" w:firstColumn="0" w:lastColumn="0" w:oddVBand="0" w:evenVBand="0" w:oddHBand="1" w:evenHBand="0" w:firstRowFirstColumn="0" w:firstRowLastColumn="0" w:lastRowFirstColumn="0" w:lastRowLastColumn="0"/>
+              <w:rPr>
+                <w:lang w:eastAsia="es-ES"/>
+              </w:rPr>
+            </w:pPr>
+            <w:r>
+              <w:rPr>
+                <w:lang w:eastAsia="es-ES"/>
+              </w:rPr>
+              <w:t>- 0.0121</w:t>
+            </w:r>
+          </w:p>
+        </w:tc>
+        <w:tc>
+          <w:tcPr>
+            <w:tcW w:w="0" w:type="auto"/>
+            <w:hideMark/>
+          </w:tcPr>
+          <w:p>
+            <w:pPr>
+              <w:cnfStyle w:val="000000100000" w:firstRow="0" w:lastRow="0" w:firstColumn="0" w:lastColumn="0" w:oddVBand="0" w:evenVBand="0" w:oddHBand="1" w:evenHBand="0" w:firstRowFirstColumn="0" w:firstRowLastColumn="0" w:lastRowFirstColumn="0" w:lastRowLastColumn="0"/>
+              <w:rPr>
+                <w:lang w:eastAsia="es-ES"/>
+              </w:rPr>
+            </w:pPr>
+            <w:r>
+              <w:rPr>
+                <w:lang w:eastAsia="es-ES"/>
+              </w:rPr>
+              <w:t>- 0.0447</w:t>
+            </w:r>
+          </w:p>
+        </w:tc>
+        <w:tc>
+          <w:tcPr>
+            <w:tcW w:w="0" w:type="auto"/>
+            <w:hideMark/>
+          </w:tcPr>
+          <w:p>
+            <w:pPr>
+              <w:cnfStyle w:val="000000100000" w:firstRow="0" w:lastRow="0" w:firstColumn="0" w:lastColumn="0" w:oddVBand="0" w:evenVBand="0" w:oddHBand="1" w:evenHBand="0" w:firstRowFirstColumn="0" w:firstRowLastColumn="0" w:lastRowFirstColumn="0" w:lastRowLastColumn="0"/>
+              <w:rPr>
+                <w:lang w:eastAsia="es-ES"/>
+              </w:rPr>
+            </w:pPr>
+            <w:r>
+              <w:rPr>
+                <w:lang w:eastAsia="es-ES"/>
+              </w:rPr>
+              <w:t>- 0.0014</w:t>
+            </w:r>
+          </w:p>
+        </w:tc>
+      </w:tr>
+    </w:tbl>
+    <w:p>
+      <w:pPr>
+        <w:rPr>
+          <w:lang w:eastAsia="es-ES"/>
+        </w:rPr>
+      </w:pPr>
+    </w:p>
+    <w:p>
+      <w:pPr>
+        <w:spacing w:line="240" w:lineRule="auto"/>
+        <w:rPr>
+          <w:rFonts w:ascii="Arial" w:hAnsi="Arial"/>
+          <w:lang w:eastAsia="es-ES"/>
+        </w:rPr>
+      </w:pPr>
+      <w:r>
+        <w:rPr>
+          <w:rFonts w:ascii="Arial" w:hAnsi="Arial"/>
+          <w:lang w:eastAsia="es-ES"/>
+        </w:rPr>
+        <w:t xml:space="preserve">La supresión de la variable confirmó contundentemente la validez del análisis XAI previo. Como detalla la </w:t>
+      </w:r>
+      <w:r>
+        <w:rPr>
+          <w:rFonts w:ascii="Arial" w:hAnsi="Arial"/>
+          <w:lang w:eastAsia="es-ES"/>
+        </w:rPr>
+        <w:t>tabla</w:t>
+      </w:r>
+      <w:r>
+        <w:rPr>
+          <w:rFonts w:ascii="Arial" w:hAnsi="Arial"/>
+          <w:lang w:eastAsia="es-ES"/>
+        </w:rPr>
+        <w:t>, el rendimiento técnico del modelo sufrió una erosión inmediata, evidenciada por una caída del 4.47% absoluto en la métrica principal AUPRC (descendiendo de 0.6389 a 0.5942) y una ligera pérdida de capacidad de separación global reflejada en el AUC ROC (-0.0121). Esta degradación empírica demuestra que la característica eliminada aportaba información fundacional y no redundante para la clasificación del fraude.</w:t>
+      </w:r>
+    </w:p>
+    <w:p>
+      <w:pPr>
+        <w:spacing w:line="240" w:lineRule="auto"/>
+        <w:rPr>
+          <w:rFonts w:ascii="Arial" w:hAnsi="Arial"/>
+          <w:lang w:eastAsia="es-ES"/>
+        </w:rPr>
+      </w:pPr>
+      <w:r>
+        <w:rPr>
+          <w:rFonts w:ascii="Arial" w:hAnsi="Arial"/>
+          <w:lang w:eastAsia="es-ES"/>
+        </w:rPr>
+        <w:t>Resulta igualmente revelador analizar la resiliencia de la arquitectura subyacente. Tras la ablación, un nuevo análisis de los valores absolutos medios de impacto redefinió la jerarquía de decisiones del algoritmo. La magnitud bruta de la transacción (TX_AMOUNT) ascendió a la primera posición como vector principal (impacto marginal de 1.027), seguida estrechamente por la ventana de gasto del cliente a corto plazo (CUSTOMER_ID_AVG_AMOUNT_7DAY_WINDOW, con 0.966).</w:t>
+      </w:r>
+      <w:r>
+        <w:rPr>
+          <w:rFonts w:ascii="Arial" w:hAnsi="Arial"/>
+          <w:lang w:eastAsia="es-ES"/>
+        </w:rPr>
+        <w:t xml:space="preserve"> Esto nos indica que al eliminar la característica más trascendente, otras características escalan su importancia de forma proporcional (TX_AMOUNT) y otras de forma exponencial (</w:t>
+      </w:r>
+      <w:r>
+        <w:rPr>
+          <w:rFonts w:ascii="Arial" w:hAnsi="Arial"/>
+          <w:lang w:eastAsia="es-ES"/>
+        </w:rPr>
+        <w:t>CUSTOMER_ID_AVG_AMOUNT_7DAY_WINDOW</w:t>
+      </w:r>
+      <w:r>
+        <w:rPr>
+          <w:rFonts w:ascii="Arial" w:hAnsi="Arial"/>
+          <w:lang w:eastAsia="es-ES"/>
+        </w:rPr>
+        <w:t>).</w:t>
+      </w:r>
+    </w:p>
+    <w:p>
+      <w:pPr>
+        <w:spacing w:line="240" w:lineRule="auto"/>
+        <w:rPr>
+          <w:rFonts w:ascii="Arial" w:hAnsi="Arial"/>
+          <w:lang w:eastAsia="es-ES"/>
+        </w:rPr>
+      </w:pPr>
+      <w:r>
+        <w:rPr>
+          <w:rFonts w:ascii="Arial" w:hAnsi="Arial"/>
+          <w:lang w:eastAsia="es-ES"/>
+        </w:rPr>
+        <w:drawing>
+          <wp:anchor distT="0" distB="0" distL="114300" distR="114300" simplePos="0" relativeHeight="251659264" behindDoc="0" locked="0" layoutInCell="1" allowOverlap="1" wp14:anchorId="737DD6DE" wp14:editId="5157EEE7">
+            <wp:simplePos x="0" y="0"/>
+            <wp:positionH relativeFrom="column">
+              <wp:posOffset>2626451</wp:posOffset>
+            </wp:positionH>
+            <wp:positionV relativeFrom="paragraph">
+              <wp:posOffset>-1814</wp:posOffset>
+            </wp:positionV>
+            <wp:extent cx="2781300" cy="2352675"/>
+            <wp:effectExtent l="0" t="0" r="0" b="9525"/>
+            <wp:wrapTopAndBottom/>
+            <wp:docPr id="1703186644" name="Imagen 1"/>
+            <wp:cNvGraphicFramePr>
+              <a:graphicFrameLocks xmlns:a="http://schemas.openxmlformats.org/drawingml/2006/main" noChangeAspect="1"/>
+            </wp:cNvGraphicFramePr>
+            <a:graphic xmlns:a="http://schemas.openxmlformats.org/drawingml/2006/main">
+              <a:graphicData uri="http://schemas.openxmlformats.org/drawingml/2006/picture">
+                <pic:pic xmlns:pic="http://schemas.openxmlformats.org/drawingml/2006/picture">
+                  <pic:nvPicPr>
+                    <pic:cNvPr id="1703186644" name=""/>
+                    <pic:cNvPicPr/>
+                  </pic:nvPicPr>
+                  <pic:blipFill>
+                    <a:blip r:embed="rId23" cstate="print">
+                      <a:extLst>
+                        <a:ext uri="{28A0092B-C50C-407E-A947-70E740481C1C}">
+                          <a14:useLocalDpi xmlns:a14="http://schemas.microsoft.com/office/drawing/2010/main" val="0"/>
+                        </a:ext>
+                      </a:extLst>
+                    </a:blip>
+                    <a:stretch>
+                      <a:fillRect/>
+                    </a:stretch>
+                  </pic:blipFill>
+                  <pic:spPr>
+                    <a:xfrm>
+                      <a:off x="0" y="0"/>
+                      <a:ext cx="2781300" cy="2352675"/>
+                    </a:xfrm>
+                    <a:prstGeom prst="rect">
+                      <a:avLst/>
+                    </a:prstGeom>
+                  </pic:spPr>
+                </pic:pic>
+              </a:graphicData>
+            </a:graphic>
+          </wp:anchor>
+        </w:drawing>
+      </w:r>
+      <w:r>
+        <w:rPr>
+          <w:rFonts w:ascii="Arial" w:hAnsi="Arial"/>
+          <w:lang w:eastAsia="es-ES"/>
+        </w:rPr>
+        <w:drawing>
+          <wp:anchor distT="0" distB="0" distL="114300" distR="114300" simplePos="0" relativeHeight="251660288" behindDoc="0" locked="0" layoutInCell="1" allowOverlap="1" wp14:anchorId="31CF31F9" wp14:editId="61C80440">
+            <wp:simplePos x="0" y="0"/>
+            <wp:positionH relativeFrom="column">
+              <wp:posOffset>-2540</wp:posOffset>
+            </wp:positionH>
+            <wp:positionV relativeFrom="paragraph">
+              <wp:posOffset>-1905</wp:posOffset>
+            </wp:positionV>
+            <wp:extent cx="2588260" cy="2359025"/>
+            <wp:effectExtent l="0" t="0" r="2540" b="3175"/>
+            <wp:wrapTopAndBottom/>
+            <wp:docPr id="1366119767" name="Imagen 1"/>
+            <wp:cNvGraphicFramePr>
+              <a:graphicFrameLocks xmlns:a="http://schemas.openxmlformats.org/drawingml/2006/main" noChangeAspect="1"/>
+            </wp:cNvGraphicFramePr>
+            <a:graphic xmlns:a="http://schemas.openxmlformats.org/drawingml/2006/main">
+              <a:graphicData uri="http://schemas.openxmlformats.org/drawingml/2006/picture">
+                <pic:pic xmlns:pic="http://schemas.openxmlformats.org/drawingml/2006/picture">
+                  <pic:nvPicPr>
+                    <pic:cNvPr id="1366119767" name=""/>
+                    <pic:cNvPicPr/>
+                  </pic:nvPicPr>
+                  <pic:blipFill>
+                    <a:blip r:embed="rId24" cstate="print">
+                      <a:extLst>
+                        <a:ext uri="{28A0092B-C50C-407E-A947-70E740481C1C}">
+                          <a14:useLocalDpi xmlns:a14="http://schemas.microsoft.com/office/drawing/2010/main" val="0"/>
+                        </a:ext>
+                      </a:extLst>
+                    </a:blip>
+                    <a:stretch>
+                      <a:fillRect/>
+                    </a:stretch>
+                  </pic:blipFill>
+                  <pic:spPr>
+                    <a:xfrm>
+                      <a:off x="0" y="0"/>
+                      <a:ext cx="2588260" cy="2359025"/>
+                    </a:xfrm>
+                    <a:prstGeom prst="rect">
+                      <a:avLst/>
+                    </a:prstGeom>
+                  </pic:spPr>
+                </pic:pic>
+              </a:graphicData>
+            </a:graphic>
+          </wp:anchor>
+        </w:drawing>
+      </w:r>
+    </w:p>
+    <w:p>
+      <w:pPr>
+        <w:spacing w:line="240" w:lineRule="auto"/>
+        <w:rPr>
+          <w:rFonts w:ascii="Arial" w:hAnsi="Arial"/>
+          <w:lang w:eastAsia="es-ES"/>
+        </w:rPr>
+      </w:pPr>
+      <w:r>
+        <w:rPr>
+          <w:rFonts w:ascii="Arial" w:hAnsi="Arial"/>
+          <w:lang w:eastAsia="es-ES"/>
+        </w:rPr>
+        <w:lastRenderedPageBreak/>
+        <w:t>El hecho de que la métrica de viabilidad operativa (CP@100) apenas sufriera una penalización marginal de -0.0014 confirma una cualidad esencial de las arquitecturas basadas en ensamblajes de árboles (</w:t>
+      </w:r>
+      <w:r>
+        <w:rPr>
+          <w:rFonts w:ascii="Arial" w:hAnsi="Arial"/>
+          <w:i/>
+          <w:iCs/>
+          <w:lang w:eastAsia="es-ES"/>
+        </w:rPr>
+        <w:t>Gradient Boosting</w:t>
+      </w:r>
+      <w:r>
+        <w:rPr>
+          <w:rFonts w:ascii="Arial" w:hAnsi="Arial"/>
+          <w:lang w:eastAsia="es-ES"/>
+        </w:rPr>
+        <w:t>): poseen una alta tolerancia a fallos ante la pérdida de señales aisladas. Al desaparecer su principal ancla de decisión, el modelo logró compensar la ausencia derivando la carga analítica hacia variables temporalmente correlacionadas, manteniendo así la eficacia del sistema en las alertas de máxima prioridad.</w:t>
+      </w:r>
+    </w:p>
+    <w:p>
+      <w:pPr>
+        <w:rPr>
+          <w:lang w:eastAsia="es-ES"/>
+        </w:rPr>
+      </w:pPr>
     </w:p>
     <w:p>
       <w:pPr>
@@ -17887,7 +19196,7 @@
         </w:rPr>
         <w:t xml:space="preserve">Chandola, V., Banerjee, A. y Kumar, V. (2009). Anomaly detection: A survey. ACM Computing Surveys (CSUR), 41(3), 1-58. </w:t>
       </w:r>
-      <w:hyperlink r:id="rId23" w:history="1">
+      <w:hyperlink r:id="rId25" w:history="1">
         <w:r>
           <w:rPr>
             <w:rStyle w:val="Hipervnculo"/>
@@ -17916,7 +19225,7 @@
         </w:rPr>
         <w:t xml:space="preserve">Dal Pozzolo, A., Caelen, O., Le Borgne, Y.-A., Waterschoot, S. y Bontempi, G. (2014). Learned lessons in credit card fraud detection from a practitioner perspective. Expert Systems with Applications, 41(10), 4915-4928. </w:t>
       </w:r>
-      <w:hyperlink r:id="rId24" w:history="1">
+      <w:hyperlink r:id="rId26" w:history="1">
         <w:r>
           <w:rPr>
             <w:rStyle w:val="Hipervnculo"/>
@@ -17945,7 +19254,7 @@
         </w:rPr>
         <w:t xml:space="preserve">Dal Pozzolo, A., Caelen, O., Johnson, R. A. y Bontempi, G. (2015). Calibrating Probability with Undersampling for Unbalanced Classification. 2015 IEEE Symposium Series on Computational Intelligence, 159-166. </w:t>
       </w:r>
-      <w:hyperlink r:id="rId25" w:history="1">
+      <w:hyperlink r:id="rId27" w:history="1">
         <w:r>
           <w:rPr>
             <w:rStyle w:val="Hipervnculo"/>
@@ -17988,7 +19297,7 @@
         </w:rPr>
         <w:t xml:space="preserve">Le Borgne, Y.-A., Siblini, W., Lebichot, B. y Bontempi, G. (2022). Reproducible Machine Learning for Credit Card Fraud Detection - Practical Handbook. Université Libre de Bruxelles. </w:t>
       </w:r>
-      <w:hyperlink r:id="rId26" w:history="1">
+      <w:hyperlink r:id="rId28" w:history="1">
         <w:r>
           <w:rPr>
             <w:rStyle w:val="Hipervnculo"/>
@@ -18017,7 +19326,7 @@
         </w:rPr>
         <w:t xml:space="preserve">Lundberg, S. M. y Lee, S. I. (2017). A Unified Approach to Interpreting Model Predictions. Advances in Neural Information Processing Systems, 30. </w:t>
       </w:r>
-      <w:hyperlink r:id="rId27" w:history="1">
+      <w:hyperlink r:id="rId29" w:history="1">
         <w:r>
           <w:rPr>
             <w:rStyle w:val="Hipervnculo"/>
@@ -18099,10 +19408,10 @@
       </w:pPr>
     </w:p>
     <w:sectPr>
-      <w:headerReference w:type="even" r:id="rId28"/>
-      <w:headerReference w:type="default" r:id="rId29"/>
-      <w:footerReference w:type="even" r:id="rId30"/>
-      <w:footerReference w:type="default" r:id="rId31"/>
+      <w:headerReference w:type="even" r:id="rId30"/>
+      <w:headerReference w:type="default" r:id="rId31"/>
+      <w:footerReference w:type="even" r:id="rId32"/>
+      <w:footerReference w:type="default" r:id="rId33"/>
       <w:pgSz w:w="11906" w:h="16838"/>
       <w:pgMar w:top="2153" w:right="1701" w:bottom="1244" w:left="1701" w:header="708" w:footer="708" w:gutter="0"/>
       <w:cols w:space="720"/>
@@ -27278,6 +28587,9 @@
     <w:abstractNumId w:val="59"/>
   </w:num>
   <w:num w:numId="134" w16cid:durableId="1475180571">
+    <w:abstractNumId w:val="2"/>
+  </w:num>
+  <w:num w:numId="135" w16cid:durableId="1617953740">
     <w:abstractNumId w:val="2"/>
   </w:num>
 </w:numbering>
@@ -29173,6 +30485,127 @@
       </w:tcPr>
     </w:tblStylePr>
   </w:style>
+  <w:style w:type="table" w:styleId="Tabladelista3-nfasis6">
+    <w:name w:val="List Table 3 Accent 6"/>
+    <w:basedOn w:val="Tablanormal"/>
+    <w:uiPriority w:val="48"/>
+    <w:rsid w:val="0020159F"/>
+    <w:tblPr>
+      <w:tblStyleRowBandSize w:val="1"/>
+      <w:tblStyleColBandSize w:val="1"/>
+      <w:tblBorders>
+        <w:top w:val="single" w:sz="4" w:space="0" w:color="F79646" w:themeColor="accent6"/>
+        <w:left w:val="single" w:sz="4" w:space="0" w:color="F79646" w:themeColor="accent6"/>
+        <w:bottom w:val="single" w:sz="4" w:space="0" w:color="F79646" w:themeColor="accent6"/>
+        <w:right w:val="single" w:sz="4" w:space="0" w:color="F79646" w:themeColor="accent6"/>
+      </w:tblBorders>
+    </w:tblPr>
+    <w:tblStylePr w:type="firstRow">
+      <w:rPr>
+        <w:b/>
+        <w:bCs/>
+        <w:color w:val="FFFFFF" w:themeColor="background1"/>
+      </w:rPr>
+      <w:tblPr/>
+      <w:tcPr>
+        <w:shd w:val="clear" w:color="auto" w:fill="F79646" w:themeFill="accent6"/>
+      </w:tcPr>
+    </w:tblStylePr>
+    <w:tblStylePr w:type="lastRow">
+      <w:rPr>
+        <w:b/>
+        <w:bCs/>
+      </w:rPr>
+      <w:tblPr/>
+      <w:tcPr>
+        <w:tcBorders>
+          <w:top w:val="double" w:sz="4" w:space="0" w:color="F79646" w:themeColor="accent6"/>
+        </w:tcBorders>
+        <w:shd w:val="clear" w:color="auto" w:fill="FFFFFF" w:themeFill="background1"/>
+      </w:tcPr>
+    </w:tblStylePr>
+    <w:tblStylePr w:type="firstCol">
+      <w:rPr>
+        <w:b/>
+        <w:bCs/>
+      </w:rPr>
+      <w:tblPr/>
+      <w:tcPr>
+        <w:tcBorders>
+          <w:right w:val="nil"/>
+        </w:tcBorders>
+        <w:shd w:val="clear" w:color="auto" w:fill="FFFFFF" w:themeFill="background1"/>
+      </w:tcPr>
+    </w:tblStylePr>
+    <w:tblStylePr w:type="lastCol">
+      <w:rPr>
+        <w:b/>
+        <w:bCs/>
+      </w:rPr>
+      <w:tblPr/>
+      <w:tcPr>
+        <w:tcBorders>
+          <w:left w:val="nil"/>
+        </w:tcBorders>
+        <w:shd w:val="clear" w:color="auto" w:fill="FFFFFF" w:themeFill="background1"/>
+      </w:tcPr>
+    </w:tblStylePr>
+    <w:tblStylePr w:type="band1Vert">
+      <w:tblPr/>
+      <w:tcPr>
+        <w:tcBorders>
+          <w:left w:val="single" w:sz="4" w:space="0" w:color="F79646" w:themeColor="accent6"/>
+          <w:right w:val="single" w:sz="4" w:space="0" w:color="F79646" w:themeColor="accent6"/>
+        </w:tcBorders>
+      </w:tcPr>
+    </w:tblStylePr>
+    <w:tblStylePr w:type="band1Horz">
+      <w:tblPr/>
+      <w:tcPr>
+        <w:tcBorders>
+          <w:top w:val="single" w:sz="4" w:space="0" w:color="F79646" w:themeColor="accent6"/>
+          <w:bottom w:val="single" w:sz="4" w:space="0" w:color="F79646" w:themeColor="accent6"/>
+          <w:insideH w:val="nil"/>
+        </w:tcBorders>
+      </w:tcPr>
+    </w:tblStylePr>
+    <w:tblStylePr w:type="neCell">
+      <w:tblPr/>
+      <w:tcPr>
+        <w:tcBorders>
+          <w:left w:val="nil"/>
+          <w:bottom w:val="nil"/>
+        </w:tcBorders>
+      </w:tcPr>
+    </w:tblStylePr>
+    <w:tblStylePr w:type="nwCell">
+      <w:tblPr/>
+      <w:tcPr>
+        <w:tcBorders>
+          <w:bottom w:val="nil"/>
+          <w:right w:val="nil"/>
+        </w:tcBorders>
+      </w:tcPr>
+    </w:tblStylePr>
+    <w:tblStylePr w:type="seCell">
+      <w:tblPr/>
+      <w:tcPr>
+        <w:tcBorders>
+          <w:top w:val="double" w:sz="4" w:space="0" w:color="F79646" w:themeColor="accent6"/>
+          <w:left w:val="nil"/>
+        </w:tcBorders>
+      </w:tcPr>
+    </w:tblStylePr>
+    <w:tblStylePr w:type="swCell">
+      <w:tblPr/>
+      <w:tcPr>
+        <w:tcBorders>
+          <w:top w:val="double" w:sz="4" w:space="0" w:color="F79646" w:themeColor="accent6"/>
+          <w:right w:val="nil"/>
+        </w:tcBorders>
+      </w:tcPr>
+    </w:tblStylePr>
+  </w:style>
 </w:styles>
 </file>
 
@@ -29460,6 +30893,15 @@
 </file>
 
 <file path=customXml/item1.xml><?xml version="1.0" encoding="utf-8"?>
+<?mso-contentType ?>
+<FormTemplates xmlns="http://schemas.microsoft.com/sharepoint/v3/contenttype/forms">
+  <Display>DocumentLibraryForm</Display>
+  <Edit>DocumentLibraryForm</Edit>
+  <New>DocumentLibraryForm</New>
+</FormTemplates>
+</file>
+
+<file path=customXml/item2.xml><?xml version="1.0" encoding="utf-8"?>
 <p:properties xmlns:p="http://schemas.microsoft.com/office/2006/metadata/properties" xmlns:xsi="http://www.w3.org/2001/XMLSchema-instance" xmlns:pc="http://schemas.microsoft.com/office/infopath/2007/PartnerControls">
   <documentManagement>
     <GDDescripcion xmlns="ef848eef-985f-4e5f-af94-9b10d2c40a72" xsi:nil="true"/>
@@ -29487,20 +30929,7 @@
 </p:properties>
 </file>
 
-<file path=customXml/item2.xml><?xml version="1.0" encoding="utf-8"?>
-<?mso-contentType ?>
-<FormTemplates xmlns="http://schemas.microsoft.com/sharepoint/v3/contenttype/forms">
-  <Display>DocumentLibraryForm</Display>
-  <Edit>DocumentLibraryForm</Edit>
-  <New>DocumentLibraryForm</New>
-</FormTemplates>
-</file>
-
 <file path=customXml/item3.xml><?xml version="1.0" encoding="utf-8"?>
-<b:Sources xmlns:b="http://schemas.openxmlformats.org/officeDocument/2006/bibliography" xmlns="http://schemas.openxmlformats.org/officeDocument/2006/bibliography" SelectedStyle="\APASixthEditionOfficeOnline.xsl" StyleName="APA" Version="6"/>
-</file>
-
-<file path=customXml/item4.xml><?xml version="1.0" encoding="utf-8"?>
 <ct:contentTypeSchema xmlns:ct="http://schemas.microsoft.com/office/2006/metadata/contentType" xmlns:ma="http://schemas.microsoft.com/office/2006/metadata/properties/metaAttributes" ct:_="" ma:_="" ma:contentTypeName="VIU" ma:contentTypeID="0x0101001F78872F1579B14E90DA3A6EEDE63FFE0018510EEED1C50C49AD0F3D3BCEAAFC3C" ma:contentTypeVersion="26" ma:contentTypeDescription="" ma:contentTypeScope="" ma:versionID="d0b27130e95aaa99b0c356f807fd553b">
   <xsd:schema xmlns:xsd="http://www.w3.org/2001/XMLSchema" xmlns:xs="http://www.w3.org/2001/XMLSchema" xmlns:p="http://schemas.microsoft.com/office/2006/metadata/properties" xmlns:ns2="ef848eef-985f-4e5f-af94-9b10d2c40a72" xmlns:ns3="17bdaf06-e97e-4c95-a053-70575cfc447b" targetNamespace="http://schemas.microsoft.com/office/2006/metadata/properties" ma:root="true" ma:fieldsID="15aeb2f0f67f5185a412b0c5958713dc" ns2:_="" ns3:_="">
     <xsd:import namespace="ef848eef-985f-4e5f-af94-9b10d2c40a72"/>
@@ -29944,7 +31373,19 @@
 </ct:contentTypeSchema>
 </file>
 
+<file path=customXml/item4.xml><?xml version="1.0" encoding="utf-8"?>
+<b:Sources xmlns:b="http://schemas.openxmlformats.org/officeDocument/2006/bibliography" xmlns="http://schemas.openxmlformats.org/officeDocument/2006/bibliography" SelectedStyle="\APASixthEditionOfficeOnline.xsl" StyleName="APA" Version="6"/>
+</file>
+
 <file path=customXml/itemProps1.xml><?xml version="1.0" encoding="utf-8"?>
+<ds:datastoreItem xmlns:ds="http://schemas.openxmlformats.org/officeDocument/2006/customXml" ds:itemID="{D2E34552-30F1-4197-AD08-9874EE871786}">
+  <ds:schemaRefs>
+    <ds:schemaRef ds:uri="http://schemas.microsoft.com/sharepoint/v3/contenttype/forms"/>
+  </ds:schemaRefs>
+</ds:datastoreItem>
+</file>
+
+<file path=customXml/itemProps2.xml><?xml version="1.0" encoding="utf-8"?>
 <ds:datastoreItem xmlns:ds="http://schemas.openxmlformats.org/officeDocument/2006/customXml" ds:itemID="{07A964DA-14FF-4E77-85C4-CF3717E496CA}">
   <ds:schemaRefs>
     <ds:schemaRef ds:uri="http://schemas.microsoft.com/office/2006/metadata/properties"/>
@@ -29955,23 +31396,7 @@
 </ds:datastoreItem>
 </file>
 
-<file path=customXml/itemProps2.xml><?xml version="1.0" encoding="utf-8"?>
-<ds:datastoreItem xmlns:ds="http://schemas.openxmlformats.org/officeDocument/2006/customXml" ds:itemID="{D2E34552-30F1-4197-AD08-9874EE871786}">
-  <ds:schemaRefs>
-    <ds:schemaRef ds:uri="http://schemas.microsoft.com/sharepoint/v3/contenttype/forms"/>
-  </ds:schemaRefs>
-</ds:datastoreItem>
-</file>
-
 <file path=customXml/itemProps3.xml><?xml version="1.0" encoding="utf-8"?>
-<ds:datastoreItem xmlns:ds="http://schemas.openxmlformats.org/officeDocument/2006/customXml" ds:itemID="{D63F4731-4595-44D5-887D-AE208B5F9D7E}">
-  <ds:schemaRefs>
-    <ds:schemaRef ds:uri="http://schemas.openxmlformats.org/officeDocument/2006/bibliography"/>
-  </ds:schemaRefs>
-</ds:datastoreItem>
-</file>
-
-<file path=customXml/itemProps4.xml><?xml version="1.0" encoding="utf-8"?>
 <ds:datastoreItem xmlns:ds="http://schemas.openxmlformats.org/officeDocument/2006/customXml" ds:itemID="{3E57E9A8-5303-411D-9422-2A748018A89F}">
   <ds:schemaRefs>
     <ds:schemaRef ds:uri="http://schemas.microsoft.com/office/2006/metadata/contentType"/>
@@ -29988,4 +31413,12 @@
     <ds:schemaRef ds:uri="http://schemas.microsoft.com/internal/obd"/>
   </ds:schemaRefs>
 </ds:datastoreItem>
+</file>
+
+<file path=customXml/itemProps4.xml><?xml version="1.0" encoding="utf-8"?>
+<ds:datastoreItem xmlns:ds="http://schemas.openxmlformats.org/officeDocument/2006/customXml" ds:itemID="{D63F4731-4595-44D5-887D-AE208B5F9D7E}">
+  <ds:schemaRefs>
+    <ds:schemaRef ds:uri="http://schemas.openxmlformats.org/officeDocument/2006/bibliography"/>
+  </ds:schemaRefs>
+</ds:datastoreItem>
 </file>
</xml_diff>

<commit_message>
Notebooks Ch5, Ch7, experimentos A y D | docs memoria y guía | script sync
</commit_message>
<xml_diff>
--- a/CARPETA COMPARTIDA TUTOR/15MUIN E2 MOYA MARIN SERGIO.docx
+++ b/CARPETA COMPARTIDA TUTOR/15MUIN E2 MOYA MARIN SERGIO.docx
@@ -77,7 +77,21 @@
           <w:b/>
           <w:sz w:val="52"/>
         </w:rPr>
-        <w:t>Detección de Fraude en Tarjetas de Crédito: Un Enfoque Metodológico Robusto mediante Aprendizaje Cost-Sensitive y Explicabilidad (XAI)</w:t>
+        <w:t xml:space="preserve">Detección de Fraude en Tarjetas de Crédito: Un Enfoque Metodológico Robusto mediante </w:t>
+      </w:r>
+      <w:r>
+        <w:rPr>
+          <w:b/>
+          <w:sz w:val="52"/>
+        </w:rPr>
+        <w:t>Gestión del Desbalance</w:t>
+      </w:r>
+      <w:r>
+        <w:rPr>
+          <w:b/>
+          <w:sz w:val="52"/>
+        </w:rPr>
+        <w:t xml:space="preserve"> y Explicabilidad (XAI)</w:t>
       </w:r>
     </w:p>
     <w:p>
@@ -6979,21 +6993,17 @@
         <w:jc w:val="left"/>
         <w:rPr>
           <w:rFonts w:ascii="Arial" w:hAnsi="Arial"/>
-        </w:rPr>
-      </w:pPr>
-      <w:r>
-        <w:rPr>
-          <w:rFonts w:ascii="Arial" w:hAnsi="Arial"/>
           <w:b/>
           <w:bCs/>
         </w:rPr>
-        <w:t>Generalización Temporal y Geográfica</w:t>
-      </w:r>
-      <w:r>
-        <w:rPr>
-          <w:rFonts w:ascii="Arial" w:hAnsi="Arial"/>
-        </w:rPr>
-        <w:t xml:space="preserve"> </w:t>
+      </w:pPr>
+      <w:r>
+        <w:rPr>
+          <w:rFonts w:ascii="Arial" w:hAnsi="Arial"/>
+          <w:b/>
+          <w:bCs/>
+        </w:rPr>
+        <w:t>Generalización Temporal y Geográfica (Uso de Datos Sintéticos)</w:t>
       </w:r>
     </w:p>
     <w:p>
@@ -7008,7 +7018,7 @@
         <w:rPr>
           <w:rFonts w:ascii="Arial" w:hAnsi="Arial"/>
         </w:rPr>
-        <w:t xml:space="preserve">El estudio se fundamenta en el dataset </w:t>
+        <w:t>Al fundamentarse en el uso de un generador de datos sintéticos (</w:t>
       </w:r>
       <w:r>
         <w:rPr>
@@ -7016,78 +7026,13 @@
           <w:i/>
           <w:iCs/>
         </w:rPr>
-        <w:t>ULB Credit Card Fraud</w:t>
-      </w:r>
-      <w:r>
-        <w:rPr>
-          <w:rFonts w:ascii="Arial" w:hAnsi="Arial"/>
-        </w:rPr>
-        <w:t xml:space="preserve">, que recopila transacciones de titulares europeos en septiembre de 2013. Dado la naturaleza evolutiva del fraude y los cambios en los hábitos de pago (auge de </w:t>
-      </w:r>
-      <w:r>
-        <w:rPr>
-          <w:rFonts w:ascii="Arial" w:hAnsi="Arial"/>
-          <w:i/>
-          <w:iCs/>
-        </w:rPr>
-        <w:t>wallets</w:t>
-      </w:r>
-      <w:r>
-        <w:rPr>
-          <w:rFonts w:ascii="Arial" w:hAnsi="Arial"/>
-        </w:rPr>
-        <w:t xml:space="preserve"> digitales, </w:t>
-      </w:r>
-      <w:r>
-        <w:rPr>
-          <w:rFonts w:ascii="Arial" w:hAnsi="Arial"/>
-          <w:i/>
-          <w:iCs/>
-        </w:rPr>
-        <w:t>tokenización</w:t>
-      </w:r>
-      <w:r>
-        <w:rPr>
-          <w:rFonts w:ascii="Arial" w:hAnsi="Arial"/>
-        </w:rPr>
-        <w:t>, 3D-Secure 2.0), existe un riesgo de obsolescencia en los patrones específicos detectados (variables V1-V28).</w:t>
-      </w:r>
-    </w:p>
-    <w:p>
-      <w:pPr>
-        <w:spacing w:after="0"/>
-        <w:jc w:val="left"/>
-        <w:rPr>
-          <w:rFonts w:ascii="Arial" w:hAnsi="Arial"/>
-        </w:rPr>
-      </w:pPr>
-      <w:r>
-        <w:rPr>
-          <w:rFonts w:ascii="Arial" w:hAnsi="Arial"/>
-          <w:i/>
-          <w:iCs/>
-        </w:rPr>
-        <w:t>Alcance:</w:t>
-      </w:r>
-      <w:r>
-        <w:rPr>
-          <w:rFonts w:ascii="Arial" w:hAnsi="Arial"/>
-        </w:rPr>
-        <w:t xml:space="preserve"> Las conclusiones de este TFM deben interpretarse como una validación de la </w:t>
-      </w:r>
-      <w:r>
-        <w:rPr>
-          <w:rFonts w:ascii="Arial" w:hAnsi="Arial"/>
-          <w:b/>
-          <w:bCs/>
-        </w:rPr>
-        <w:t>metodología de detección</w:t>
-      </w:r>
-      <w:r>
-        <w:rPr>
-          <w:rFonts w:ascii="Arial" w:hAnsi="Arial"/>
-        </w:rPr>
-        <w:t xml:space="preserve"> y no necesariamente como un mapa actual de los patrones de fraude vigentes en 2026. La contribución reside en el "cómo" se construye el sistema robusto, más que en los parámetros específicos del modelo entrenado.</w:t>
+        <w:t>Transaction Data Simulator</w:t>
+      </w:r>
+      <w:r>
+        <w:rPr>
+          <w:rFonts w:ascii="Arial" w:hAnsi="Arial"/>
+        </w:rPr>
+        <w:t>), el modelo aprende de un entorno simulado y acotado estocásticamente. Aunque la simulación mimetiza con gran fidelidad la topología de una red de pagos y la inyección de fraudes continuados, existe una brecha semántica entre este entorno controlado y un ecosistema bancario real. Por tanto, las conclusiones empíricas de este TFM deben interpretarse como una validación de la arquitectura metodológica (cómo aislar, evaluar y explicar el modelo algorítmico) y no como un mapa de los patrones de fraude reales vigentes en la actualidad.</w:t>
       </w:r>
     </w:p>
     <w:p>
@@ -7228,7 +7173,25 @@
         <w:rPr>
           <w:rFonts w:ascii="Arial" w:hAnsi="Arial"/>
         </w:rPr>
-        <w:t xml:space="preserve"> —simulando la latencia de verificación real de los bancos— corrige significativamente las expectativas de rendimiento. Este trabajo establece un </w:t>
+        <w:t xml:space="preserve">, </w:t>
+      </w:r>
+      <w:r>
+        <w:rPr>
+          <w:rFonts w:ascii="Arial" w:hAnsi="Arial"/>
+        </w:rPr>
+        <w:t>simulando la latencia de verificación real de los bancos</w:t>
+      </w:r>
+      <w:r>
+        <w:rPr>
+          <w:rFonts w:ascii="Arial" w:hAnsi="Arial"/>
+        </w:rPr>
+        <w:t>,</w:t>
+      </w:r>
+      <w:r>
+        <w:rPr>
+          <w:rFonts w:ascii="Arial" w:hAnsi="Arial"/>
+        </w:rPr>
+        <w:t xml:space="preserve"> corrige significativamente las expectativas de rendimiento. Este trabajo establece un </w:t>
       </w:r>
       <w:r>
         <w:rPr>
@@ -7269,16 +7232,18 @@
         <w:jc w:val="left"/>
         <w:rPr>
           <w:rFonts w:ascii="Arial" w:hAnsi="Arial"/>
-        </w:rPr>
-      </w:pPr>
-      <w:r>
-        <w:rPr>
-          <w:rFonts w:ascii="Arial" w:hAnsi="Arial"/>
           <w:b/>
           <w:bCs/>
         </w:rPr>
+      </w:pPr>
+      <w:r>
+        <w:rPr>
+          <w:rFonts w:ascii="Arial" w:hAnsi="Arial"/>
+          <w:b/>
+          <w:bCs/>
+        </w:rPr>
         <w:lastRenderedPageBreak/>
-        <w:t>Suficiencia del Aprendizaje Cost-Sensitive frente a la Complejidad del Remuestreo:</w:t>
+        <w:t>Gestión Operativa del Desbalance (Submuestreo Controlado y Aprendizaje Sensible al Costo):</w:t>
       </w:r>
     </w:p>
     <w:p>
@@ -7291,21 +7256,17 @@
         <w:jc w:val="left"/>
         <w:rPr>
           <w:rFonts w:ascii="Arial" w:hAnsi="Arial"/>
-        </w:rPr>
-      </w:pPr>
-      <w:r>
-        <w:rPr>
-          <w:rFonts w:ascii="Arial" w:hAnsi="Arial"/>
           <w:i/>
           <w:iCs/>
         </w:rPr>
-        <w:t>Hipótesis:</w:t>
-      </w:r>
-      <w:r>
-        <w:rPr>
-          <w:rFonts w:ascii="Arial" w:hAnsi="Arial"/>
-        </w:rPr>
-        <w:t xml:space="preserve"> A menudo se asume por defecto que el desbalance extremo (0.17%) requiere obligatoriamente técnicas de generación de datos sintéticos (SMOTE/ADASYN).</w:t>
+      </w:pPr>
+      <w:r>
+        <w:rPr>
+          <w:rFonts w:ascii="Arial" w:hAnsi="Arial"/>
+          <w:i/>
+          <w:iCs/>
+        </w:rPr>
+        <w:t>Hipótesis: A menudo se asume en la literatura que el desbalance extremo (0.17%) requiere obligatoriamente aplicar técnicas complejas de generación de datos sintéticos (como SMOTE o ADASYN) para que el modelo logre aprender.</w:t>
       </w:r>
     </w:p>
     <w:p>
@@ -7318,81 +7279,17 @@
         <w:jc w:val="left"/>
         <w:rPr>
           <w:rFonts w:ascii="Arial" w:hAnsi="Arial"/>
-        </w:rPr>
-      </w:pPr>
-      <w:r>
-        <w:rPr>
-          <w:rFonts w:ascii="Arial" w:hAnsi="Arial"/>
           <w:i/>
           <w:iCs/>
         </w:rPr>
-        <w:t>Contribución:</w:t>
-      </w:r>
-      <w:r>
-        <w:rPr>
-          <w:rFonts w:ascii="Arial" w:hAnsi="Arial"/>
-        </w:rPr>
-        <w:t xml:space="preserve"> Se cuestiona la necesidad de alterar la distribución de los datos financieros. El estudio evidencia que la </w:t>
-      </w:r>
-      <w:r>
-        <w:rPr>
-          <w:rFonts w:ascii="Arial" w:hAnsi="Arial"/>
-          <w:b/>
-          <w:bCs/>
-        </w:rPr>
-        <w:t>ponderación de clases (</w:t>
-      </w:r>
-      <w:r>
-        <w:rPr>
-          <w:rFonts w:ascii="Arial" w:hAnsi="Arial"/>
-          <w:b/>
-          <w:bCs/>
+      </w:pPr>
+      <w:r>
+        <w:rPr>
+          <w:rFonts w:ascii="Arial" w:hAnsi="Arial"/>
           <w:i/>
           <w:iCs/>
         </w:rPr>
-        <w:t>Cost-Sensitive Learning</w:t>
-      </w:r>
-      <w:r>
-        <w:rPr>
-          <w:rFonts w:ascii="Arial" w:hAnsi="Arial"/>
-          <w:b/>
-          <w:bCs/>
-        </w:rPr>
-        <w:t>)</w:t>
-      </w:r>
-      <w:r>
-        <w:rPr>
-          <w:rFonts w:ascii="Arial" w:hAnsi="Arial"/>
-        </w:rPr>
-        <w:t xml:space="preserve"> en algoritmos de </w:t>
-      </w:r>
-      <w:r>
-        <w:rPr>
-          <w:rFonts w:ascii="Arial" w:hAnsi="Arial"/>
-          <w:i/>
-          <w:iCs/>
-        </w:rPr>
-        <w:t>Gradient Boosting</w:t>
-      </w:r>
-      <w:r>
-        <w:rPr>
-          <w:rFonts w:ascii="Arial" w:hAnsi="Arial"/>
-        </w:rPr>
-        <w:t xml:space="preserve"> alcanza un rendimiento estadísticamente equivalente o superior en métricas de precisión (</w:t>
-      </w:r>
-      <w:r>
-        <w:rPr>
-          <w:rFonts w:ascii="Arial" w:hAnsi="Arial"/>
-          <w:i/>
-          <w:iCs/>
-        </w:rPr>
-        <w:t>Precision@Top-K</w:t>
-      </w:r>
-      <w:r>
-        <w:rPr>
-          <w:rFonts w:ascii="Arial" w:hAnsi="Arial"/>
-        </w:rPr>
-        <w:t>) sin incurrir en el coste computacional ni en el riesgo de generar patrones artificiales inverosímiles asociados a SMOTE.</w:t>
+        <w:t>Contribución: El estudio cuestiona la necesidad de inyectar datos artificiales que aumentan la complejidad y el riesgo de fuga de información. Se demuestra empíricamente que la simplificación del espacio de datos mediante un submuestreo controlado de la clase mayoritaria (ratio 5:1), combinada con la optimización de arquitecturas de Gradient Boosting, supera operativamente a las técnicas de sobremuestreo sintético. Esta estrategia maximiza la métrica de negocio (Card Precision@100) reduciendo drásticamente la carga computacional, validando un enfoque más ágil y realista frente a la complejidad del estado del arte.</w:t>
       </w:r>
     </w:p>
     <w:p>
@@ -12188,7 +12085,25 @@
           <w:rFonts w:ascii="Arial" w:hAnsi="Arial"/>
         </w:rPr>
         <w:lastRenderedPageBreak/>
-        <w:t>Desarrollo de Experimentos Tentativos</w:t>
+        <w:t xml:space="preserve">Desarrollo de </w:t>
+      </w:r>
+      <w:r>
+        <w:rPr>
+          <w:rFonts w:ascii="Arial" w:hAnsi="Arial"/>
+        </w:rPr>
+        <w:t xml:space="preserve">la fase </w:t>
+      </w:r>
+      <w:r>
+        <w:rPr>
+          <w:rFonts w:ascii="Arial" w:hAnsi="Arial"/>
+        </w:rPr>
+        <w:t>Experiment</w:t>
+      </w:r>
+      <w:r>
+        <w:rPr>
+          <w:rFonts w:ascii="Arial" w:hAnsi="Arial"/>
+        </w:rPr>
+        <w:t>al</w:t>
       </w:r>
       <w:bookmarkEnd w:id="38"/>
     </w:p>
@@ -12569,50 +12484,54 @@
     </w:p>
     <w:p>
       <w:pPr>
-        <w:pStyle w:val="Ttulo3"/>
+        <w:pStyle w:val="Ttulo4"/>
         <w:numPr>
           <w:ilvl w:val="0"/>
           <w:numId w:val="0"/>
         </w:numPr>
         <w:rPr>
+          <w:rFonts w:ascii="Arial" w:hAnsi="Arial" w:cs="Arial"/>
+          <w:i w:val="0"/>
+          <w:iCs w:val="0"/>
+          <w:color w:val="auto"/>
+          <w:sz w:val="28"/>
+          <w:szCs w:val="28"/>
+        </w:rPr>
+      </w:pPr>
+      <w:bookmarkStart w:id="40" w:name="_Toc222931124"/>
+      <w:r>
+        <w:rPr>
+          <w:rFonts w:ascii="Arial" w:hAnsi="Arial" w:cs="Arial"/>
+          <w:i w:val="0"/>
+          <w:iCs w:val="0"/>
+          <w:color w:val="auto"/>
+          <w:sz w:val="28"/>
+          <w:szCs w:val="28"/>
+        </w:rPr>
+        <w:t>Objetivo</w:t>
+      </w:r>
+      <w:bookmarkEnd w:id="40"/>
+    </w:p>
+    <w:p>
+      <w:pPr>
+        <w:spacing w:line="240" w:lineRule="auto"/>
+        <w:rPr>
+          <w:rFonts w:ascii="Arial" w:hAnsi="Arial"/>
+          <w:lang w:eastAsia="es-ES"/>
+        </w:rPr>
+      </w:pPr>
+      <w:r>
+        <w:rPr>
+          <w:rFonts w:ascii="Arial" w:hAnsi="Arial"/>
+          <w:lang w:eastAsia="es-ES"/>
+        </w:rPr>
+        <w:t xml:space="preserve">El propósito fundamental de esta primera fase experimental no es la construcción del modelo predictivo definitivo, sino la definición de una </w:t>
+      </w:r>
+      <w:r>
+        <w:rPr>
+          <w:rFonts w:ascii="Arial" w:hAnsi="Arial"/>
           <w:b/>
           <w:bCs/>
-          <w:sz w:val="28"/>
-          <w:szCs w:val="28"/>
-        </w:rPr>
-      </w:pPr>
-      <w:bookmarkStart w:id="40" w:name="_Toc222931124"/>
-      <w:r>
-        <w:rPr>
-          <w:b/>
-          <w:bCs/>
-          <w:sz w:val="28"/>
-          <w:szCs w:val="28"/>
-        </w:rPr>
-        <w:t>Objetivo</w:t>
-      </w:r>
-      <w:bookmarkEnd w:id="40"/>
-    </w:p>
-    <w:p>
-      <w:pPr>
-        <w:spacing w:line="240" w:lineRule="auto"/>
-        <w:rPr>
-          <w:rFonts w:ascii="Arial" w:hAnsi="Arial"/>
-          <w:lang w:eastAsia="es-ES"/>
-        </w:rPr>
-      </w:pPr>
-      <w:r>
-        <w:rPr>
-          <w:rFonts w:ascii="Arial" w:hAnsi="Arial"/>
-          <w:lang w:eastAsia="es-ES"/>
-        </w:rPr>
-        <w:t xml:space="preserve">El propósito fundamental de esta primera fase experimental no es la construcción del modelo predictivo definitivo, sino la definición de una </w:t>
-      </w:r>
-      <w:r>
-        <w:rPr>
-          <w:rFonts w:ascii="Arial" w:hAnsi="Arial"/>
-          <w:b/>
-          <w:bCs/>
           <w:lang w:eastAsia="es-ES"/>
         </w:rPr>
         <w:t>referencia de rendimiento</w:t>
@@ -12659,14 +12578,16 @@
     </w:p>
     <w:p>
       <w:pPr>
-        <w:pStyle w:val="Ttulo3"/>
+        <w:pStyle w:val="Ttulo4"/>
         <w:numPr>
           <w:ilvl w:val="0"/>
           <w:numId w:val="0"/>
         </w:numPr>
         <w:rPr>
-          <w:b/>
-          <w:bCs/>
+          <w:rFonts w:ascii="Arial" w:hAnsi="Arial" w:cs="Arial"/>
+          <w:i w:val="0"/>
+          <w:iCs w:val="0"/>
+          <w:color w:val="auto"/>
           <w:sz w:val="28"/>
           <w:szCs w:val="28"/>
         </w:rPr>
@@ -12674,8 +12595,10 @@
       <w:bookmarkStart w:id="41" w:name="_Toc222931125"/>
       <w:r>
         <w:rPr>
-          <w:b/>
-          <w:bCs/>
+          <w:rFonts w:ascii="Arial" w:hAnsi="Arial" w:cs="Arial"/>
+          <w:i w:val="0"/>
+          <w:iCs w:val="0"/>
+          <w:color w:val="auto"/>
           <w:sz w:val="28"/>
           <w:szCs w:val="28"/>
         </w:rPr>
@@ -13003,61 +12926,120 @@
     </w:p>
     <w:p>
       <w:pPr>
-        <w:pStyle w:val="Ttulo3"/>
+        <w:pStyle w:val="Ttulo4"/>
         <w:numPr>
           <w:ilvl w:val="0"/>
           <w:numId w:val="0"/>
         </w:numPr>
         <w:rPr>
+          <w:rFonts w:ascii="Arial" w:hAnsi="Arial" w:cs="Arial"/>
+          <w:i w:val="0"/>
+          <w:iCs w:val="0"/>
+          <w:color w:val="auto"/>
+          <w:sz w:val="28"/>
+          <w:szCs w:val="28"/>
+        </w:rPr>
+      </w:pPr>
+      <w:bookmarkStart w:id="42" w:name="_Toc222931126"/>
+      <w:r>
+        <w:rPr>
+          <w:rFonts w:ascii="Arial" w:hAnsi="Arial" w:cs="Arial"/>
+          <w:i w:val="0"/>
+          <w:iCs w:val="0"/>
+          <w:color w:val="auto"/>
+          <w:sz w:val="28"/>
+          <w:szCs w:val="28"/>
+        </w:rPr>
+        <w:t>Hipótesis de Trabajo</w:t>
+      </w:r>
+      <w:bookmarkEnd w:id="42"/>
+    </w:p>
+    <w:p>
+      <w:pPr>
+        <w:spacing w:line="240" w:lineRule="auto"/>
+        <w:rPr>
+          <w:rFonts w:ascii="Arial" w:hAnsi="Arial"/>
+          <w:lang w:eastAsia="es-ES"/>
+        </w:rPr>
+      </w:pPr>
+      <w:r>
+        <w:rPr>
+          <w:rFonts w:ascii="Arial" w:hAnsi="Arial"/>
+          <w:lang w:eastAsia="es-ES"/>
+        </w:rPr>
+        <w:t>Bajo estas condiciones de "ceguera algorítmica" ante la asimetría de clases, se proyecta observar una divergencia radical en los indicadores de rendimiento, confirmando la falacia de las métricas generalistas.</w:t>
+      </w:r>
+    </w:p>
+    <w:p>
+      <w:pPr>
+        <w:spacing w:line="240" w:lineRule="auto"/>
+        <w:rPr>
+          <w:rFonts w:ascii="Arial" w:hAnsi="Arial"/>
+          <w:lang w:eastAsia="es-ES"/>
+        </w:rPr>
+      </w:pPr>
+      <w:r>
+        <w:rPr>
+          <w:rFonts w:ascii="Arial" w:hAnsi="Arial"/>
+          <w:lang w:eastAsia="es-ES"/>
+        </w:rPr>
+        <w:t>Se hipotetiza que los modelos reportarán una Exactitud Global (</w:t>
+      </w:r>
+      <w:r>
+        <w:rPr>
+          <w:rFonts w:ascii="Arial" w:hAnsi="Arial"/>
+          <w:i/>
+          <w:iCs/>
+          <w:lang w:eastAsia="es-ES"/>
+        </w:rPr>
+        <w:t>Accuracy</w:t>
+      </w:r>
+      <w:r>
+        <w:rPr>
+          <w:rFonts w:ascii="Arial" w:hAnsi="Arial"/>
+          <w:lang w:eastAsia="es-ES"/>
+        </w:rPr>
+        <w:t xml:space="preserve">) ilusoriamente alta (rozando el 99%), impulsada únicamente por la clasificación trivial de la clase mayoritaria legítima. Sin embargo, al observar las métricas objetivo, se espera que el </w:t>
+      </w:r>
+      <w:r>
+        <w:rPr>
+          <w:rFonts w:ascii="Arial" w:hAnsi="Arial"/>
+          <w:i/>
+          <w:iCs/>
+          <w:lang w:eastAsia="es-ES"/>
+        </w:rPr>
+        <w:t>Recall</w:t>
+      </w:r>
+      <w:r>
+        <w:rPr>
+          <w:rFonts w:ascii="Arial" w:hAnsi="Arial"/>
+          <w:lang w:eastAsia="es-ES"/>
+        </w:rPr>
+        <w:t xml:space="preserve"> y la </w:t>
+      </w:r>
+      <w:r>
+        <w:rPr>
+          <w:rFonts w:ascii="Arial" w:hAnsi="Arial"/>
           <w:b/>
           <w:bCs/>
-          <w:sz w:val="28"/>
-          <w:szCs w:val="28"/>
-        </w:rPr>
-      </w:pPr>
-      <w:bookmarkStart w:id="42" w:name="_Toc222931126"/>
-      <w:r>
-        <w:rPr>
-          <w:b/>
-          <w:bCs/>
-          <w:sz w:val="28"/>
-          <w:szCs w:val="28"/>
-        </w:rPr>
-        <w:t>Hipótesis de Trabajo</w:t>
-      </w:r>
-      <w:bookmarkEnd w:id="42"/>
-    </w:p>
-    <w:p>
-      <w:pPr>
-        <w:spacing w:line="240" w:lineRule="auto"/>
-        <w:rPr>
-          <w:rFonts w:ascii="Arial" w:hAnsi="Arial"/>
-          <w:lang w:eastAsia="es-ES"/>
-        </w:rPr>
-      </w:pPr>
-      <w:r>
-        <w:rPr>
-          <w:rFonts w:ascii="Arial" w:hAnsi="Arial"/>
-          <w:lang w:eastAsia="es-ES"/>
-        </w:rPr>
-        <w:t>Bajo estas condiciones de "ceguera algorítmica" ante la asimetría de clases, se proyecta observar una divergencia radical en los indicadores de rendimiento, confirmando la falacia de las métricas generalistas.</w:t>
-      </w:r>
-    </w:p>
-    <w:p>
-      <w:pPr>
-        <w:spacing w:line="240" w:lineRule="auto"/>
-        <w:rPr>
-          <w:rFonts w:ascii="Arial" w:hAnsi="Arial"/>
-          <w:lang w:eastAsia="es-ES"/>
-        </w:rPr>
-      </w:pPr>
+          <w:lang w:eastAsia="es-ES"/>
+        </w:rPr>
+        <w:t>AUPRC</w:t>
+      </w:r>
+      <w:r>
+        <w:rPr>
+          <w:rFonts w:ascii="Arial" w:hAnsi="Arial"/>
+          <w:lang w:eastAsia="es-ES"/>
+        </w:rPr>
+        <w:t xml:space="preserve"> revelen una degradación crítica, demostrando la incapacidad del </w:t>
+      </w:r>
       <w:r>
         <w:rPr>
           <w:rFonts w:ascii="Arial" w:hAnsi="Arial"/>
           <w:lang w:eastAsia="es-ES"/>
         </w:rPr>
         <w:lastRenderedPageBreak/>
-        <w:t>Se hipotetiza que los modelos reportarán una Exactitud Global (</w:t>
+        <w:t xml:space="preserve">aprendizaje estándar para interceptar el fraude de forma autónoma. Adicionalmente, se anticipa que las arquitecturas basadas en árboles superarán ampliamente a la Regresión Logística en </w:t>
       </w:r>
       <w:r>
         <w:rPr>
@@ -13066,54 +13048,6 @@
           <w:iCs/>
           <w:lang w:eastAsia="es-ES"/>
         </w:rPr>
-        <w:t>Accuracy</w:t>
-      </w:r>
-      <w:r>
-        <w:rPr>
-          <w:rFonts w:ascii="Arial" w:hAnsi="Arial"/>
-          <w:lang w:eastAsia="es-ES"/>
-        </w:rPr>
-        <w:t xml:space="preserve">) ilusoriamente alta (rozando el 99%), impulsada únicamente por la clasificación trivial de la clase mayoritaria legítima. Sin embargo, al observar las métricas objetivo, se espera que el </w:t>
-      </w:r>
-      <w:r>
-        <w:rPr>
-          <w:rFonts w:ascii="Arial" w:hAnsi="Arial"/>
-          <w:i/>
-          <w:iCs/>
-          <w:lang w:eastAsia="es-ES"/>
-        </w:rPr>
-        <w:t>Recall</w:t>
-      </w:r>
-      <w:r>
-        <w:rPr>
-          <w:rFonts w:ascii="Arial" w:hAnsi="Arial"/>
-          <w:lang w:eastAsia="es-ES"/>
-        </w:rPr>
-        <w:t xml:space="preserve"> y la </w:t>
-      </w:r>
-      <w:r>
-        <w:rPr>
-          <w:rFonts w:ascii="Arial" w:hAnsi="Arial"/>
-          <w:b/>
-          <w:bCs/>
-          <w:lang w:eastAsia="es-ES"/>
-        </w:rPr>
-        <w:t>AUPRC</w:t>
-      </w:r>
-      <w:r>
-        <w:rPr>
-          <w:rFonts w:ascii="Arial" w:hAnsi="Arial"/>
-          <w:lang w:eastAsia="es-ES"/>
-        </w:rPr>
-        <w:t xml:space="preserve"> revelen una degradación crítica, demostrando la incapacidad del aprendizaje estándar para interceptar el fraude de forma autónoma. Adicionalmente, se anticipa que las arquitecturas basadas en árboles superarán ampliamente a la Regresión Logística en </w:t>
-      </w:r>
-      <w:r>
-        <w:rPr>
-          <w:rFonts w:ascii="Arial" w:hAnsi="Arial"/>
-          <w:i/>
-          <w:iCs/>
-          <w:lang w:eastAsia="es-ES"/>
-        </w:rPr>
         <w:t>Card Precision@100</w:t>
       </w:r>
       <w:r>
@@ -13143,14 +13077,16 @@
     </w:p>
     <w:p>
       <w:pPr>
-        <w:pStyle w:val="Ttulo3"/>
+        <w:pStyle w:val="Ttulo4"/>
         <w:numPr>
           <w:ilvl w:val="0"/>
           <w:numId w:val="0"/>
         </w:numPr>
         <w:rPr>
-          <w:b/>
-          <w:bCs/>
+          <w:rFonts w:ascii="Arial" w:hAnsi="Arial" w:cs="Arial"/>
+          <w:i w:val="0"/>
+          <w:iCs w:val="0"/>
+          <w:color w:val="auto"/>
           <w:sz w:val="28"/>
           <w:szCs w:val="28"/>
         </w:rPr>
@@ -13158,8 +13094,10 @@
       <w:bookmarkStart w:id="44" w:name="_Toc222931128"/>
       <w:r>
         <w:rPr>
-          <w:b/>
-          <w:bCs/>
+          <w:rFonts w:ascii="Arial" w:hAnsi="Arial" w:cs="Arial"/>
+          <w:i w:val="0"/>
+          <w:iCs w:val="0"/>
+          <w:color w:val="auto"/>
           <w:sz w:val="28"/>
           <w:szCs w:val="28"/>
         </w:rPr>
@@ -13201,14 +13139,16 @@
     </w:p>
     <w:p>
       <w:pPr>
-        <w:pStyle w:val="Ttulo3"/>
+        <w:pStyle w:val="Ttulo4"/>
         <w:numPr>
           <w:ilvl w:val="0"/>
           <w:numId w:val="0"/>
         </w:numPr>
         <w:rPr>
-          <w:b/>
-          <w:bCs/>
+          <w:rFonts w:ascii="Arial" w:hAnsi="Arial" w:cs="Arial"/>
+          <w:i w:val="0"/>
+          <w:iCs w:val="0"/>
+          <w:color w:val="auto"/>
           <w:sz w:val="28"/>
           <w:szCs w:val="28"/>
         </w:rPr>
@@ -13216,8 +13156,10 @@
       <w:bookmarkStart w:id="45" w:name="_Toc222931129"/>
       <w:r>
         <w:rPr>
-          <w:b/>
-          <w:bCs/>
+          <w:rFonts w:ascii="Arial" w:hAnsi="Arial" w:cs="Arial"/>
+          <w:i w:val="0"/>
+          <w:iCs w:val="0"/>
+          <w:color w:val="auto"/>
           <w:sz w:val="28"/>
           <w:szCs w:val="28"/>
         </w:rPr>
@@ -13469,7 +13411,6 @@
           <w:iCs/>
           <w:lang w:eastAsia="es-ES"/>
         </w:rPr>
-        <w:lastRenderedPageBreak/>
         <w:t>Preprocesamiento:</w:t>
       </w:r>
       <w:r>
@@ -13528,14 +13469,16 @@
     </w:p>
     <w:p>
       <w:pPr>
-        <w:pStyle w:val="Ttulo3"/>
+        <w:pStyle w:val="Ttulo4"/>
         <w:numPr>
           <w:ilvl w:val="0"/>
           <w:numId w:val="0"/>
         </w:numPr>
         <w:rPr>
-          <w:b/>
-          <w:bCs/>
+          <w:rFonts w:ascii="Arial" w:hAnsi="Arial" w:cs="Arial"/>
+          <w:i w:val="0"/>
+          <w:iCs w:val="0"/>
+          <w:color w:val="auto"/>
           <w:sz w:val="28"/>
           <w:szCs w:val="28"/>
         </w:rPr>
@@ -13543,11 +13486,14 @@
       <w:bookmarkStart w:id="46" w:name="_Toc222931130"/>
       <w:r>
         <w:rPr>
-          <w:b/>
-          <w:bCs/>
+          <w:rFonts w:ascii="Arial" w:hAnsi="Arial" w:cs="Arial"/>
+          <w:i w:val="0"/>
+          <w:iCs w:val="0"/>
+          <w:color w:val="auto"/>
           <w:sz w:val="28"/>
           <w:szCs w:val="28"/>
         </w:rPr>
+        <w:lastRenderedPageBreak/>
         <w:t>Hipótesis de Trabajo</w:t>
       </w:r>
       <w:bookmarkEnd w:id="46"/>
@@ -13659,14 +13605,16 @@
     </w:p>
     <w:p>
       <w:pPr>
-        <w:pStyle w:val="Ttulo3"/>
+        <w:pStyle w:val="Ttulo4"/>
         <w:numPr>
           <w:ilvl w:val="0"/>
           <w:numId w:val="0"/>
         </w:numPr>
         <w:rPr>
-          <w:b/>
-          <w:bCs/>
+          <w:rFonts w:ascii="Arial" w:hAnsi="Arial" w:cs="Arial"/>
+          <w:i w:val="0"/>
+          <w:iCs w:val="0"/>
+          <w:color w:val="auto"/>
           <w:sz w:val="28"/>
           <w:szCs w:val="28"/>
         </w:rPr>
@@ -13674,8 +13622,10 @@
       <w:bookmarkStart w:id="48" w:name="_Toc222931132"/>
       <w:r>
         <w:rPr>
-          <w:b/>
-          <w:bCs/>
+          <w:rFonts w:ascii="Arial" w:hAnsi="Arial" w:cs="Arial"/>
+          <w:i w:val="0"/>
+          <w:iCs w:val="0"/>
+          <w:color w:val="auto"/>
           <w:sz w:val="28"/>
           <w:szCs w:val="28"/>
         </w:rPr>
@@ -13701,14 +13651,16 @@
     </w:p>
     <w:p>
       <w:pPr>
-        <w:pStyle w:val="Ttulo3"/>
+        <w:pStyle w:val="Ttulo4"/>
         <w:numPr>
           <w:ilvl w:val="0"/>
           <w:numId w:val="0"/>
         </w:numPr>
         <w:rPr>
-          <w:b/>
-          <w:bCs/>
+          <w:rFonts w:ascii="Arial" w:hAnsi="Arial" w:cs="Arial"/>
+          <w:i w:val="0"/>
+          <w:iCs w:val="0"/>
+          <w:color w:val="auto"/>
           <w:sz w:val="28"/>
           <w:szCs w:val="28"/>
         </w:rPr>
@@ -13716,8 +13668,10 @@
       <w:bookmarkStart w:id="49" w:name="_Toc222931133"/>
       <w:r>
         <w:rPr>
-          <w:b/>
-          <w:bCs/>
+          <w:rFonts w:ascii="Arial" w:hAnsi="Arial" w:cs="Arial"/>
+          <w:i w:val="0"/>
+          <w:iCs w:val="0"/>
+          <w:color w:val="auto"/>
           <w:sz w:val="28"/>
           <w:szCs w:val="28"/>
         </w:rPr>
@@ -13841,7 +13795,6 @@
           <w:bCs/>
           <w:lang w:eastAsia="es-ES"/>
         </w:rPr>
-        <w:lastRenderedPageBreak/>
         <w:t>Interpretabilidad Agnóstica basada en Teoría de Juegos (</w:t>
       </w:r>
       <w:r>
@@ -13961,6 +13914,7 @@
           <w:iCs/>
           <w:lang w:eastAsia="es-ES"/>
         </w:rPr>
+        <w:lastRenderedPageBreak/>
         <w:t>Gráficos de Cascada y Fuerza Local</w:t>
       </w:r>
       <w:r>
@@ -13982,14 +13936,16 @@
     </w:p>
     <w:p>
       <w:pPr>
-        <w:pStyle w:val="Ttulo3"/>
+        <w:pStyle w:val="Ttulo4"/>
         <w:numPr>
           <w:ilvl w:val="0"/>
           <w:numId w:val="0"/>
         </w:numPr>
         <w:rPr>
-          <w:b/>
-          <w:bCs/>
+          <w:rFonts w:ascii="Arial" w:hAnsi="Arial" w:cs="Arial"/>
+          <w:i w:val="0"/>
+          <w:iCs w:val="0"/>
+          <w:color w:val="auto"/>
           <w:sz w:val="28"/>
           <w:szCs w:val="28"/>
         </w:rPr>
@@ -13997,8 +13953,10 @@
       <w:bookmarkStart w:id="50" w:name="_Toc222931134"/>
       <w:r>
         <w:rPr>
-          <w:b/>
-          <w:bCs/>
+          <w:rFonts w:ascii="Arial" w:hAnsi="Arial" w:cs="Arial"/>
+          <w:i w:val="0"/>
+          <w:iCs w:val="0"/>
+          <w:color w:val="auto"/>
           <w:sz w:val="28"/>
           <w:szCs w:val="28"/>
         </w:rPr>
@@ -18954,6 +18912,7 @@
       <w:r>
         <w:rPr>
           <w:rFonts w:ascii="Arial" w:hAnsi="Arial"/>
+          <w:noProof/>
           <w:lang w:eastAsia="es-ES"/>
         </w:rPr>
         <w:drawing>
@@ -19009,6 +18968,7 @@
       <w:r>
         <w:rPr>
           <w:rFonts w:ascii="Arial" w:hAnsi="Arial"/>
+          <w:noProof/>
           <w:lang w:eastAsia="es-ES"/>
         </w:rPr>
         <w:drawing>
@@ -19123,6 +19083,7 @@
     <w:p>
       <w:pPr>
         <w:pStyle w:val="Ttulo1"/>
+        <w:spacing w:line="240" w:lineRule="auto"/>
         <w:rPr>
           <w:rFonts w:ascii="Arial" w:hAnsi="Arial"/>
         </w:rPr>
@@ -19139,10 +19100,116 @@
     </w:p>
     <w:p>
       <w:pPr>
+        <w:suppressAutoHyphens w:val="0"/>
+        <w:spacing w:before="100" w:beforeAutospacing="1" w:after="100" w:afterAutospacing="1" w:line="240" w:lineRule="auto"/>
+        <w:jc w:val="left"/>
+        <w:rPr>
+          <w:rFonts w:ascii="Arial" w:eastAsia="Times New Roman" w:hAnsi="Arial"/>
+          <w:lang w:eastAsia="es-ES"/>
+        </w:rPr>
+      </w:pPr>
+      <w:r>
+        <w:rPr>
+          <w:rFonts w:ascii="Arial" w:eastAsia="Times New Roman" w:hAnsi="Arial"/>
+          <w:lang w:eastAsia="es-ES"/>
+        </w:rPr>
+        <w:t xml:space="preserve">La presente investigación se articuló con el propósito de auditar, desde una perspectiva crítica y operativa, el ciclo de vida completo de los modelos de </w:t>
+      </w:r>
+      <w:r>
+        <w:rPr>
+          <w:rFonts w:ascii="Arial" w:eastAsia="Times New Roman" w:hAnsi="Arial"/>
+          <w:i/>
+          <w:iCs/>
+          <w:lang w:eastAsia="es-ES"/>
+        </w:rPr>
+        <w:t>Machine Learning</w:t>
+      </w:r>
+      <w:r>
+        <w:rPr>
+          <w:rFonts w:ascii="Arial" w:eastAsia="Times New Roman" w:hAnsi="Arial"/>
+          <w:lang w:eastAsia="es-ES"/>
+        </w:rPr>
+        <w:t xml:space="preserve"> aplicados a la detección de fraude en tarjetas de crédito. A través de un diseño experimental progresivo, se ha trascendido la mera búsqueda de rendimiento algorítmico para abordar problemas estructurales del dominio, tales como la asimetría extrema de clases, la propagación de sesgos metodológicos (</w:t>
+      </w:r>
+      <w:r>
+        <w:rPr>
+          <w:rFonts w:ascii="Arial" w:eastAsia="Times New Roman" w:hAnsi="Arial"/>
+          <w:i/>
+          <w:iCs/>
+          <w:lang w:eastAsia="es-ES"/>
+        </w:rPr>
+        <w:t>Data Leakage</w:t>
+      </w:r>
+      <w:r>
+        <w:rPr>
+          <w:rFonts w:ascii="Arial" w:eastAsia="Times New Roman" w:hAnsi="Arial"/>
+          <w:lang w:eastAsia="es-ES"/>
+        </w:rPr>
+        <w:t>) y la opacidad en la toma de decisiones.</w:t>
+      </w:r>
+    </w:p>
+    <w:p>
+      <w:pPr>
+        <w:suppressAutoHyphens w:val="0"/>
+        <w:spacing w:before="100" w:beforeAutospacing="1" w:after="100" w:afterAutospacing="1" w:line="240" w:lineRule="auto"/>
+        <w:jc w:val="left"/>
+        <w:rPr>
+          <w:rFonts w:ascii="Arial" w:eastAsia="Times New Roman" w:hAnsi="Arial"/>
+          <w:lang w:eastAsia="es-ES"/>
+        </w:rPr>
+      </w:pPr>
+      <w:r>
+        <w:rPr>
+          <w:rFonts w:ascii="Arial" w:eastAsia="Times New Roman" w:hAnsi="Arial"/>
+          <w:lang w:eastAsia="es-ES"/>
+        </w:rPr>
+        <w:t>Los resultados empíricos obtenidos permiten extraer conclusiones sólidas que validan las hipótesis iniciales y aportan directrices claras para la implementación de estos sistemas en entornos financieros reales.</w:t>
+      </w:r>
+    </w:p>
+    <w:p>
+      <w:pPr>
+        <w:pStyle w:val="Ttulo2"/>
+        <w:spacing w:line="240" w:lineRule="auto"/>
+        <w:rPr>
+          <w:rFonts w:ascii="Arial" w:hAnsi="Arial"/>
+        </w:rPr>
+      </w:pPr>
+      <w:r>
+        <w:rPr>
+          <w:rFonts w:ascii="Arial" w:hAnsi="Arial"/>
+        </w:rPr>
+        <w:t>Síntesis de Hallazgos y Validación de Hipótesis</w:t>
+      </w:r>
+    </w:p>
+    <w:p>
+      <w:pPr>
+        <w:spacing w:line="240" w:lineRule="auto"/>
+        <w:rPr>
+          <w:rFonts w:ascii="Arial" w:hAnsi="Arial"/>
+        </w:rPr>
+      </w:pPr>
+      <w:r>
+        <w:rPr>
+          <w:rFonts w:ascii="Arial" w:hAnsi="Arial"/>
+        </w:rPr>
+        <w:t>El análisis de los ensayos metodológicos arroja tres conclusiones técnicas fundamentales:</w:t>
+      </w:r>
+    </w:p>
+    <w:p>
+      <w:pPr>
+        <w:pStyle w:val="Ttulo3"/>
+        <w:numPr>
+          <w:ilvl w:val="0"/>
+          <w:numId w:val="0"/>
+        </w:numPr>
+        <w:spacing w:line="240" w:lineRule="auto"/>
+        <w:ind w:left="720" w:hanging="720"/>
         <w:rPr>
           <w:rFonts w:ascii="Arial" w:hAnsi="Arial"/>
           <w:b/>
           <w:bCs/>
+          <w:sz w:val="24"/>
+          <w:szCs w:val="24"/>
         </w:rPr>
       </w:pPr>
       <w:r>
@@ -19150,37 +19217,991 @@
           <w:rFonts w:ascii="Arial" w:hAnsi="Arial"/>
           <w:b/>
           <w:bCs/>
-        </w:rPr>
-        <w:t>¿Cómo se verificaría</w:t>
+          <w:sz w:val="24"/>
+          <w:szCs w:val="24"/>
+        </w:rPr>
+        <w:t>La falacia de las métricas generalistas y el valor del submuestreo</w:t>
       </w:r>
       <w:r>
         <w:rPr>
           <w:rFonts w:ascii="Arial" w:hAnsi="Arial"/>
           <w:b/>
           <w:bCs/>
-        </w:rPr>
-        <w:t xml:space="preserve"> la latencia de 7 días</w:t>
-      </w:r>
-      <w:r>
+          <w:sz w:val="24"/>
+          <w:szCs w:val="24"/>
+        </w:rPr>
+        <w:t>:</w:t>
+      </w:r>
+    </w:p>
+    <w:p>
+      <w:pPr>
+        <w:spacing w:line="240" w:lineRule="auto"/>
+        <w:rPr>
+          <w:rFonts w:ascii="Arial" w:hAnsi="Arial"/>
+        </w:rPr>
+      </w:pPr>
+      <w:r>
+        <w:rPr>
+          <w:rFonts w:ascii="Arial" w:hAnsi="Arial"/>
+        </w:rPr>
+        <w:t>El</w:t>
+      </w:r>
+      <w:r>
+        <w:rPr>
+          <w:rFonts w:ascii="Arial" w:hAnsi="Arial"/>
+        </w:rPr>
+        <w:t xml:space="preserve"> experimento</w:t>
+      </w:r>
+      <w:r>
+        <w:rPr>
+          <w:rFonts w:ascii="Arial" w:hAnsi="Arial"/>
+        </w:rPr>
+        <w:t xml:space="preserve"> </w:t>
+      </w:r>
+      <w:r>
+        <w:rPr>
+          <w:rFonts w:ascii="Arial" w:hAnsi="Arial"/>
+        </w:rPr>
+        <w:t>con el que se definió el modelo de referencia,</w:t>
+      </w:r>
+      <w:r>
+        <w:rPr>
+          <w:rFonts w:ascii="Arial" w:hAnsi="Arial"/>
+        </w:rPr>
+        <w:t xml:space="preserve"> demostró empíricamente que la Exactitud (</w:t>
+      </w:r>
+      <w:r>
+        <w:rPr>
+          <w:rFonts w:ascii="Arial" w:hAnsi="Arial"/>
+          <w:i/>
+          <w:iCs/>
+        </w:rPr>
+        <w:t>Accuracy</w:t>
+      </w:r>
+      <w:r>
+        <w:rPr>
+          <w:rFonts w:ascii="Arial" w:hAnsi="Arial"/>
+        </w:rPr>
+        <w:t xml:space="preserve">) carece de validez como indicador de éxito en entornos de fraude, al invisibilizar la tasa de falsos negativos bajo el peso de la clase mayoritaria. Adicionalmente, se constató que las estrategias de balanceo extremo (1:1) destruyen la semántica de la normalidad, degradando severamente la capacidad predictiva. Por el contrario, un submuestreo moderado (ratio 5:1) empleando la arquitectura </w:t>
+      </w:r>
+      <w:r>
+        <w:rPr>
+          <w:rFonts w:ascii="Arial" w:hAnsi="Arial"/>
+          <w:i/>
+          <w:iCs/>
+        </w:rPr>
+        <w:t>XGBoost</w:t>
+      </w:r>
+      <w:r>
+        <w:rPr>
+          <w:rFonts w:ascii="Arial" w:hAnsi="Arial"/>
+        </w:rPr>
+        <w:t xml:space="preserve"> emergió como la solución óptima, incrementando drásticamente el volumen de fraude interceptado y reduciendo los tiempos de optimización, consolidándose como un modelo ágil y altamente sensible.</w:t>
+      </w:r>
+    </w:p>
+    <w:p>
+      <w:pPr>
+        <w:pStyle w:val="Ttulo3"/>
+        <w:numPr>
+          <w:ilvl w:val="0"/>
+          <w:numId w:val="0"/>
+        </w:numPr>
+        <w:spacing w:line="240" w:lineRule="auto"/>
+        <w:ind w:left="720" w:hanging="720"/>
         <w:rPr>
           <w:rFonts w:ascii="Arial" w:hAnsi="Arial"/>
           <w:b/>
           <w:bCs/>
-        </w:rPr>
-        <w:t>?</w:t>
-      </w:r>
-    </w:p>
-    <w:p>
-      <w:pPr>
-        <w:rPr>
-          <w:rFonts w:ascii="Arial" w:hAnsi="Arial"/>
-        </w:rPr>
-      </w:pPr>
-      <w:r>
-        <w:rPr>
-          <w:rFonts w:ascii="Arial" w:hAnsi="Arial"/>
-        </w:rPr>
-        <w:t>Para verificar el impacto de la latencia de 7 días, habría que diseñar un Análisis de Sensibilidad Temporal. Consistiría en coger el Experimento A y reentrenar el modelo XGBoost cambiando el parámetro de retraso (DELTA_DELAY) a 1 día, 7 días, 14 días y 21 días. Luego, se compararían las métricas (AUPRC) para ver cuánto se degrada el modelo a medida que el banco tarda más en recibir las etiquetas de fraude.</w:t>
+          <w:sz w:val="24"/>
+          <w:szCs w:val="24"/>
+        </w:rPr>
+      </w:pPr>
+      <w:r>
+        <w:rPr>
+          <w:rFonts w:ascii="Arial" w:hAnsi="Arial"/>
+          <w:b/>
+          <w:bCs/>
+          <w:sz w:val="24"/>
+          <w:szCs w:val="24"/>
+        </w:rPr>
+        <w:t>Cuantificación empírica del Data Leakage en la literatura:</w:t>
+      </w:r>
+    </w:p>
+    <w:p>
+      <w:pPr>
+        <w:spacing w:line="240" w:lineRule="auto"/>
+        <w:rPr>
+          <w:rFonts w:ascii="Arial" w:hAnsi="Arial"/>
+        </w:rPr>
+      </w:pPr>
+      <w:r>
+        <w:rPr>
+          <w:rFonts w:ascii="Arial" w:hAnsi="Arial"/>
+        </w:rPr>
+        <w:t xml:space="preserve">El </w:t>
+      </w:r>
+      <w:r>
+        <w:rPr>
+          <w:rFonts w:ascii="Arial" w:hAnsi="Arial"/>
+        </w:rPr>
+        <w:t>e</w:t>
+      </w:r>
+      <w:r>
+        <w:rPr>
+          <w:rFonts w:ascii="Arial" w:hAnsi="Arial"/>
+        </w:rPr>
+        <w:t xml:space="preserve">xperimento </w:t>
+      </w:r>
+      <w:r>
+        <w:rPr>
+          <w:rFonts w:ascii="Arial" w:hAnsi="Arial"/>
+        </w:rPr>
+        <w:t>sobre el impacto de la fuga de datos</w:t>
+      </w:r>
+      <w:r>
+        <w:rPr>
+          <w:rFonts w:ascii="Arial" w:hAnsi="Arial"/>
+        </w:rPr>
+        <w:t xml:space="preserve"> constituye la aportación más crítica de este trabajo. Se ha demostrado matemáticamente cómo prácticas comunes y deficientes en la investigación actual inflan artificialmente la métrica AUPRC hasta en un 40%. Este hallazgo invalida operativamente aquellos modelos del estado del arte que reportan eficacias cercanas al 99% sin aplicar un protocolo estricto de validación prequencial, evidenciando que dichos algoritmos no están detectando fraude inédito, sino memorizando vectores temporalmente contaminados.</w:t>
+      </w:r>
+    </w:p>
+    <w:p>
+      <w:pPr>
+        <w:pStyle w:val="Ttulo3"/>
+        <w:numPr>
+          <w:ilvl w:val="0"/>
+          <w:numId w:val="0"/>
+        </w:numPr>
+        <w:spacing w:line="240" w:lineRule="auto"/>
+        <w:ind w:left="720" w:hanging="720"/>
+        <w:rPr>
+          <w:rFonts w:ascii="Arial" w:hAnsi="Arial"/>
+          <w:b/>
+          <w:bCs/>
+          <w:sz w:val="24"/>
+          <w:szCs w:val="24"/>
+        </w:rPr>
+      </w:pPr>
+      <w:r>
+        <w:rPr>
+          <w:rFonts w:ascii="Arial" w:hAnsi="Arial"/>
+          <w:b/>
+          <w:bCs/>
+          <w:sz w:val="24"/>
+          <w:szCs w:val="24"/>
+        </w:rPr>
+        <w:t>La transición hacia la "Caja Blanca" validada:</w:t>
+      </w:r>
+    </w:p>
+    <w:p>
+      <w:pPr>
+        <w:spacing w:line="240" w:lineRule="auto"/>
+        <w:rPr>
+          <w:rFonts w:ascii="Arial" w:hAnsi="Arial"/>
+        </w:rPr>
+      </w:pPr>
+      <w:r>
+        <w:rPr>
+          <w:rFonts w:ascii="Arial" w:hAnsi="Arial"/>
+        </w:rPr>
+        <w:t xml:space="preserve">El </w:t>
+      </w:r>
+      <w:r>
+        <w:rPr>
+          <w:rFonts w:ascii="Arial" w:hAnsi="Arial"/>
+        </w:rPr>
+        <w:t>experimento de la interpretabilidad algorítmica</w:t>
+      </w:r>
+      <w:r>
+        <w:rPr>
+          <w:rFonts w:ascii="Arial" w:hAnsi="Arial"/>
+        </w:rPr>
+        <w:t xml:space="preserve"> confirmó que el alto rendimiento predictivo no tiene por qué sacrificar la transparencia. La integración de Teoría de Juegos (valores SHAP) permitió revelar que el modelo fundamenta sus decisiones en principios lógicos de negocio (riesgo histórico del terminal a corto plazo y alteraciones bruscas en el gasto del cliente), alejando cualquier sospecha de ajuste sobre ruido estocástico. Más relevante aún, el estudio de ablación demostró empíricamente la robustez técnica del análisis XAI: al extirpar la variable catalogada como dominante, el modelo sufrió una penalización medible en su rendimiento global, pero evidenció la </w:t>
+      </w:r>
+      <w:r>
+        <w:rPr>
+          <w:rFonts w:ascii="Arial" w:hAnsi="Arial"/>
+        </w:rPr>
+        <w:lastRenderedPageBreak/>
+        <w:t xml:space="preserve">notable resiliencia de la arquitectura </w:t>
+      </w:r>
+      <w:r>
+        <w:rPr>
+          <w:rFonts w:ascii="Arial" w:hAnsi="Arial"/>
+          <w:i/>
+          <w:iCs/>
+        </w:rPr>
+        <w:t>Gradient Boosting</w:t>
+      </w:r>
+      <w:r>
+        <w:rPr>
+          <w:rFonts w:ascii="Arial" w:hAnsi="Arial"/>
+        </w:rPr>
+        <w:t xml:space="preserve"> al derivar la carga analítica hacia factores temporalmente correlacionados.</w:t>
+      </w:r>
+    </w:p>
+    <w:p>
+      <w:pPr>
+        <w:pStyle w:val="Ttulo2"/>
+        <w:spacing w:line="240" w:lineRule="auto"/>
+        <w:rPr>
+          <w:rFonts w:ascii="Arial" w:hAnsi="Arial"/>
+        </w:rPr>
+      </w:pPr>
+      <w:r>
+        <w:rPr>
+          <w:rFonts w:ascii="Arial" w:hAnsi="Arial"/>
+        </w:rPr>
+        <w:t>Implicaciones para el Negocio Bancario</w:t>
+      </w:r>
+    </w:p>
+    <w:p>
+      <w:pPr>
+        <w:spacing w:line="240" w:lineRule="auto"/>
+        <w:rPr>
+          <w:rFonts w:ascii="Arial" w:hAnsi="Arial"/>
+        </w:rPr>
+      </w:pPr>
+      <w:r>
+        <w:rPr>
+          <w:rFonts w:ascii="Arial" w:hAnsi="Arial"/>
+        </w:rPr>
+        <w:t>Desde una perspectiva operativa, las conclusiones de este Trabajo Fin de Máster subrayan la necesidad de alinear la métrica matemática con la capacidad humana.</w:t>
+      </w:r>
+    </w:p>
+    <w:p>
+      <w:pPr>
+        <w:spacing w:line="240" w:lineRule="auto"/>
+        <w:rPr>
+          <w:rFonts w:ascii="Arial" w:hAnsi="Arial"/>
+        </w:rPr>
+      </w:pPr>
+      <w:r>
+        <w:rPr>
+          <w:rFonts w:ascii="Arial" w:hAnsi="Arial"/>
+        </w:rPr>
+        <w:t xml:space="preserve">La adopción de la métrica </w:t>
+      </w:r>
+      <w:r>
+        <w:rPr>
+          <w:rFonts w:ascii="Arial" w:hAnsi="Arial"/>
+          <w:i/>
+          <w:iCs/>
+        </w:rPr>
+        <w:t>Card Precision@100</w:t>
+      </w:r>
+      <w:r>
+        <w:rPr>
+          <w:rFonts w:ascii="Arial" w:hAnsi="Arial"/>
+        </w:rPr>
+        <w:t xml:space="preserve"> (CP@100) como criterio de decisión ha evidenciado que el mejor modelo no es aquel que detecta teóricamente más anomalías, sino el que maximiza la densidad de fraudes reales en la cabecera del sistema de alertas. El modelo final desarrollado garantiza la intercepción de casi 30 tarjetas comprometidas diarias asumiendo una restricción estricta de 100 revisiones manuales por parte del Centro de Operaciones de Seguridad (SOC).</w:t>
+      </w:r>
+    </w:p>
+    <w:p>
+      <w:pPr>
+        <w:spacing w:line="240" w:lineRule="auto"/>
+        <w:rPr>
+          <w:rFonts w:ascii="Arial" w:hAnsi="Arial"/>
+        </w:rPr>
+      </w:pPr>
+      <w:r>
+        <w:rPr>
+          <w:rFonts w:ascii="Arial" w:hAnsi="Arial"/>
+        </w:rPr>
+        <w:t>Paralelamente, la generación de "códigos de razón" (</w:t>
+      </w:r>
+      <w:r>
+        <w:rPr>
+          <w:rFonts w:ascii="Arial" w:hAnsi="Arial"/>
+          <w:i/>
+          <w:iCs/>
+        </w:rPr>
+        <w:t>reason codes</w:t>
+      </w:r>
+      <w:r>
+        <w:rPr>
+          <w:rFonts w:ascii="Arial" w:hAnsi="Arial"/>
+        </w:rPr>
+        <w:t xml:space="preserve">) a través de los gráficos de fuerza local (SHAP </w:t>
+      </w:r>
+      <w:r>
+        <w:rPr>
+          <w:rFonts w:ascii="Arial" w:hAnsi="Arial"/>
+          <w:i/>
+          <w:iCs/>
+        </w:rPr>
+        <w:t>Force Plots</w:t>
+      </w:r>
+      <w:r>
+        <w:rPr>
+          <w:rFonts w:ascii="Arial" w:hAnsi="Arial"/>
+        </w:rPr>
+        <w:t>) resuelve la barrera regulatoria. Dotar a los analistas humanos de una explicación visual, transacción por transacción, sobre qué vectores de riesgo detonaron un bloqueo preventivo, permite a la entidad bancaria justificar sus acciones ante los clientes, mitigar el daño reputacional de los falsos positivos y cumplir con los requisitos de explicabilidad algorítmica exigidos por la normativa europea.</w:t>
+      </w:r>
+    </w:p>
+    <w:p>
+      <w:pPr>
+        <w:pStyle w:val="Ttulo2"/>
+        <w:rPr>
+          <w:rFonts w:ascii="Arial" w:hAnsi="Arial"/>
+          <w:sz w:val="36"/>
+        </w:rPr>
+      </w:pPr>
+      <w:r>
+        <w:rPr>
+          <w:rFonts w:ascii="Arial" w:hAnsi="Arial"/>
+        </w:rPr>
+        <w:t>Limitaciones del Estudio</w:t>
+      </w:r>
+    </w:p>
+    <w:p>
+      <w:pPr>
+        <w:pStyle w:val="NormalWeb"/>
+        <w:ind w:firstLine="0"/>
+        <w:rPr>
+          <w:rFonts w:ascii="Arial" w:hAnsi="Arial" w:cs="Arial"/>
+          <w:sz w:val="22"/>
+          <w:szCs w:val="22"/>
+          <w:lang w:val="es-ES"/>
+        </w:rPr>
+      </w:pPr>
+      <w:r>
+        <w:rPr>
+          <w:rFonts w:ascii="Arial" w:hAnsi="Arial" w:cs="Arial"/>
+          <w:sz w:val="22"/>
+          <w:szCs w:val="22"/>
+          <w:lang w:val="es-ES"/>
+        </w:rPr>
+        <w:t>La validez de cualquier investigación empírica en ingeniería de datos está supeditada a las condiciones de contorno de su diseño experimental. Para interpretar correctamente el alcance de los resultados de este Trabajo Fin de Máster, es preceptivo reconocer las siguientes limitaciones estructurales:</w:t>
+      </w:r>
+    </w:p>
+    <w:p>
+      <w:pPr>
+        <w:pStyle w:val="Ttulo3"/>
+        <w:numPr>
+          <w:ilvl w:val="0"/>
+          <w:numId w:val="0"/>
+        </w:numPr>
+        <w:spacing w:line="240" w:lineRule="auto"/>
+        <w:ind w:left="720" w:hanging="720"/>
+        <w:rPr>
+          <w:rFonts w:ascii="Arial" w:hAnsi="Arial"/>
+          <w:b/>
+          <w:bCs/>
+          <w:sz w:val="24"/>
+          <w:szCs w:val="24"/>
+        </w:rPr>
+      </w:pPr>
+      <w:r>
+        <w:rPr>
+          <w:rFonts w:ascii="Arial" w:hAnsi="Arial"/>
+          <w:b/>
+          <w:bCs/>
+          <w:sz w:val="24"/>
+          <w:szCs w:val="24"/>
+        </w:rPr>
+        <w:t>La brecha semántica de la simulación de datos:</w:t>
+      </w:r>
+    </w:p>
+    <w:p>
+      <w:pPr>
+        <w:pStyle w:val="NormalWeb"/>
+        <w:ind w:firstLine="0"/>
+        <w:rPr>
+          <w:rFonts w:ascii="Arial" w:hAnsi="Arial" w:cs="Arial"/>
+          <w:sz w:val="22"/>
+          <w:szCs w:val="22"/>
+          <w:lang w:val="es-ES"/>
+        </w:rPr>
+      </w:pPr>
+      <w:r>
+        <w:rPr>
+          <w:rFonts w:ascii="Arial" w:hAnsi="Arial" w:cs="Arial"/>
+          <w:sz w:val="22"/>
+          <w:szCs w:val="22"/>
+          <w:lang w:val="es-ES"/>
+        </w:rPr>
+        <w:t>Para sortear las restricciones de confidencialidad impuestas por la regulación bancaria y garantizar la trazabilidad absoluta de la "verdad fundamental" (</w:t>
+      </w:r>
+      <w:r>
+        <w:rPr>
+          <w:rFonts w:ascii="Arial" w:hAnsi="Arial" w:cs="Arial"/>
+          <w:i/>
+          <w:iCs/>
+          <w:sz w:val="22"/>
+          <w:szCs w:val="22"/>
+          <w:lang w:val="es-ES"/>
+        </w:rPr>
+        <w:t>ground truth</w:t>
+      </w:r>
+      <w:r>
+        <w:rPr>
+          <w:rFonts w:ascii="Arial" w:hAnsi="Arial" w:cs="Arial"/>
+          <w:sz w:val="22"/>
+          <w:szCs w:val="22"/>
+          <w:lang w:val="es-ES"/>
+        </w:rPr>
+        <w:t xml:space="preserve">), este estudio se ha fundamentado íntegramente en el </w:t>
+      </w:r>
+      <w:r>
+        <w:rPr>
+          <w:rFonts w:ascii="Arial" w:hAnsi="Arial" w:cs="Arial"/>
+          <w:i/>
+          <w:iCs/>
+          <w:sz w:val="22"/>
+          <w:szCs w:val="22"/>
+          <w:lang w:val="es-ES"/>
+        </w:rPr>
+        <w:t>Transaction Data Simulator</w:t>
+      </w:r>
+      <w:r>
+        <w:rPr>
+          <w:rFonts w:ascii="Arial" w:hAnsi="Arial" w:cs="Arial"/>
+          <w:sz w:val="22"/>
+          <w:szCs w:val="22"/>
+          <w:lang w:val="es-ES"/>
+        </w:rPr>
+        <w:t xml:space="preserve"> de la ULB. Aunque esta herramienta mimetiza con alta fidelidad las distribuciones estocásticas de transacciones legítimas y superpone escenarios de ataque realistas (compromiso de terminales), no deja de ser un entorno determinista acotado. En el mundo real, el fraude financiero es un juego del gato y el ratón en constante evolución (</w:t>
+      </w:r>
+      <w:r>
+        <w:rPr>
+          <w:rFonts w:ascii="Arial" w:hAnsi="Arial" w:cs="Arial"/>
+          <w:i/>
+          <w:iCs/>
+          <w:sz w:val="22"/>
+          <w:szCs w:val="22"/>
+          <w:lang w:val="es-ES"/>
+        </w:rPr>
+        <w:t>concept drift</w:t>
+      </w:r>
+      <w:r>
+        <w:rPr>
+          <w:rFonts w:ascii="Arial" w:hAnsi="Arial" w:cs="Arial"/>
+          <w:sz w:val="22"/>
+          <w:szCs w:val="22"/>
+          <w:lang w:val="es-ES"/>
+        </w:rPr>
+        <w:t xml:space="preserve"> dinámico), fuertemente influenciado por variables exógenas (ataques coordinados, filtraciones masivas de credenciales o ingeniería social) que el simulador no tiene capacidad de replicar.</w:t>
+      </w:r>
+    </w:p>
+    <w:p>
+      <w:pPr>
+        <w:pStyle w:val="Ttulo3"/>
+        <w:numPr>
+          <w:ilvl w:val="0"/>
+          <w:numId w:val="0"/>
+        </w:numPr>
+        <w:spacing w:line="240" w:lineRule="auto"/>
+        <w:ind w:left="720" w:hanging="720"/>
+        <w:rPr>
+          <w:rFonts w:ascii="Arial" w:hAnsi="Arial"/>
+          <w:b/>
+          <w:bCs/>
+          <w:sz w:val="24"/>
+          <w:szCs w:val="24"/>
+        </w:rPr>
+      </w:pPr>
+      <w:r>
+        <w:rPr>
+          <w:rFonts w:ascii="Arial" w:hAnsi="Arial"/>
+          <w:b/>
+          <w:bCs/>
+          <w:sz w:val="24"/>
+          <w:szCs w:val="24"/>
+        </w:rPr>
+        <w:t>El sesgo de la Explicabilidad (XAI) sobre reglas sintéticas:</w:t>
+      </w:r>
+    </w:p>
+    <w:p>
+      <w:pPr>
+        <w:pStyle w:val="NormalWeb"/>
+        <w:ind w:firstLine="0"/>
+        <w:rPr>
+          <w:rFonts w:ascii="Arial" w:hAnsi="Arial" w:cs="Arial"/>
+          <w:sz w:val="22"/>
+          <w:szCs w:val="22"/>
+          <w:lang w:val="es-ES"/>
+        </w:rPr>
+      </w:pPr>
+      <w:r>
+        <w:rPr>
+          <w:rFonts w:ascii="Arial" w:hAnsi="Arial" w:cs="Arial"/>
+          <w:sz w:val="22"/>
+          <w:szCs w:val="22"/>
+          <w:lang w:val="es-ES"/>
+        </w:rPr>
+        <w:t xml:space="preserve">Derivado del punto anterior, el éxito empírico del </w:t>
+      </w:r>
+      <w:r>
+        <w:rPr>
+          <w:rFonts w:ascii="Arial" w:hAnsi="Arial" w:cs="Arial"/>
+          <w:sz w:val="22"/>
+          <w:szCs w:val="22"/>
+          <w:lang w:val="es-ES"/>
+        </w:rPr>
+        <w:t>tercer experimento</w:t>
+      </w:r>
+      <w:r>
+        <w:rPr>
+          <w:rFonts w:ascii="Arial" w:hAnsi="Arial" w:cs="Arial"/>
+          <w:sz w:val="22"/>
+          <w:szCs w:val="22"/>
+          <w:lang w:val="es-ES"/>
+        </w:rPr>
+        <w:t xml:space="preserve"> (la extracción de patrones lógicos mediante valores SHAP y estudios de ablación) debe interpretarse como una validación de la </w:t>
+      </w:r>
+      <w:r>
+        <w:rPr>
+          <w:rFonts w:ascii="Arial" w:hAnsi="Arial" w:cs="Arial"/>
+          <w:i/>
+          <w:iCs/>
+          <w:sz w:val="22"/>
+          <w:szCs w:val="22"/>
+          <w:lang w:val="es-ES"/>
+        </w:rPr>
+        <w:t>arquitectura de auditoría</w:t>
+      </w:r>
+      <w:r>
+        <w:rPr>
+          <w:rFonts w:ascii="Arial" w:hAnsi="Arial" w:cs="Arial"/>
+          <w:sz w:val="22"/>
+          <w:szCs w:val="22"/>
+          <w:lang w:val="es-ES"/>
+        </w:rPr>
+        <w:t xml:space="preserve">, no como el descubrimiento de nueva psicología criminal. Al auditar la "caja negra" de </w:t>
+      </w:r>
+      <w:r>
+        <w:rPr>
+          <w:rFonts w:ascii="Arial" w:hAnsi="Arial" w:cs="Arial"/>
+          <w:i/>
+          <w:iCs/>
+          <w:sz w:val="22"/>
+          <w:szCs w:val="22"/>
+          <w:lang w:val="es-ES"/>
+        </w:rPr>
+        <w:t>XGBoost</w:t>
+      </w:r>
+      <w:r>
+        <w:rPr>
+          <w:rFonts w:ascii="Arial" w:hAnsi="Arial" w:cs="Arial"/>
+          <w:sz w:val="22"/>
+          <w:szCs w:val="22"/>
+          <w:lang w:val="es-ES"/>
+        </w:rPr>
+        <w:t xml:space="preserve"> entrenado sobre datos simulados, SHAP no está revelando necesariamente cómo se comporta un </w:t>
+      </w:r>
+      <w:r>
+        <w:rPr>
+          <w:rFonts w:ascii="Arial" w:hAnsi="Arial" w:cs="Arial"/>
+          <w:sz w:val="22"/>
+          <w:szCs w:val="22"/>
+          <w:lang w:val="es-ES"/>
+        </w:rPr>
+        <w:lastRenderedPageBreak/>
+        <w:t>estafador humano en la realidad, sino que está haciendo ingeniería inversa sobre cómo los creadores del simulador programaron la inyección del fraude.</w:t>
+      </w:r>
+    </w:p>
+    <w:p>
+      <w:pPr>
+        <w:pStyle w:val="Ttulo3"/>
+        <w:numPr>
+          <w:ilvl w:val="0"/>
+          <w:numId w:val="0"/>
+        </w:numPr>
+        <w:spacing w:line="240" w:lineRule="auto"/>
+        <w:ind w:left="720" w:hanging="720"/>
+        <w:rPr>
+          <w:rFonts w:ascii="Arial" w:hAnsi="Arial"/>
+          <w:b/>
+          <w:bCs/>
+          <w:sz w:val="24"/>
+          <w:szCs w:val="24"/>
+        </w:rPr>
+      </w:pPr>
+      <w:r>
+        <w:rPr>
+          <w:rFonts w:ascii="Arial" w:hAnsi="Arial"/>
+          <w:b/>
+          <w:bCs/>
+          <w:sz w:val="24"/>
+          <w:szCs w:val="24"/>
+        </w:rPr>
+        <w:t>Restricción del espacio de características (Feature Space):</w:t>
+      </w:r>
+    </w:p>
+    <w:p>
+      <w:pPr>
+        <w:pStyle w:val="NormalWeb"/>
+        <w:ind w:firstLine="0"/>
+        <w:rPr>
+          <w:rFonts w:ascii="Arial" w:hAnsi="Arial" w:cs="Arial"/>
+          <w:sz w:val="22"/>
+          <w:szCs w:val="22"/>
+          <w:lang w:val="es-ES"/>
+        </w:rPr>
+      </w:pPr>
+      <w:r>
+        <w:rPr>
+          <w:rFonts w:ascii="Arial" w:hAnsi="Arial" w:cs="Arial"/>
+          <w:sz w:val="22"/>
+          <w:szCs w:val="22"/>
+          <w:lang w:val="es-ES"/>
+        </w:rPr>
+        <w:t>Los algoritmos evaluados han basado sus decisiones en un vector de características estrictamente transaccional (importes, temporalidad y métricas RFM). En un sistema de detección de fraude en producción contemporáneo, el motor de aprendizaje automático se enriquece con cientos de variables no transaccionales, tales como la telemetría del dispositivo (</w:t>
+      </w:r>
+      <w:r>
+        <w:rPr>
+          <w:rFonts w:ascii="Arial" w:hAnsi="Arial" w:cs="Arial"/>
+          <w:i/>
+          <w:iCs/>
+          <w:sz w:val="22"/>
+          <w:szCs w:val="22"/>
+          <w:lang w:val="es-ES"/>
+        </w:rPr>
+        <w:t>device fingerprinting</w:t>
+      </w:r>
+      <w:r>
+        <w:rPr>
+          <w:rFonts w:ascii="Arial" w:hAnsi="Arial" w:cs="Arial"/>
+          <w:sz w:val="22"/>
+          <w:szCs w:val="22"/>
+          <w:lang w:val="es-ES"/>
+        </w:rPr>
+        <w:t>), la geolocalización IP, biometría comportamental (cadencia de tecleo) o información del ecosistema 3D-Secure. La ausencia de estas dimensiones limita la capacidad predictiva máxima teórica alcanzable en el presente ensayo comparado con un entorno comercial en vivo.</w:t>
+      </w:r>
+    </w:p>
+    <w:p>
+      <w:pPr>
+        <w:pStyle w:val="Ttulo2"/>
+        <w:rPr>
+          <w:rFonts w:ascii="Arial" w:hAnsi="Arial"/>
+          <w:sz w:val="36"/>
+        </w:rPr>
+      </w:pPr>
+      <w:r>
+        <w:rPr>
+          <w:rFonts w:ascii="Arial" w:hAnsi="Arial"/>
+        </w:rPr>
+        <w:t>Líneas de Investigación Futuras</w:t>
+      </w:r>
+    </w:p>
+    <w:p>
+      <w:pPr>
+        <w:pStyle w:val="NormalWeb"/>
+        <w:rPr>
+          <w:rFonts w:ascii="Arial" w:hAnsi="Arial" w:cs="Arial"/>
+          <w:sz w:val="22"/>
+          <w:szCs w:val="22"/>
+          <w:lang w:val="es-ES"/>
+        </w:rPr>
+      </w:pPr>
+      <w:r>
+        <w:rPr>
+          <w:rFonts w:ascii="Arial" w:hAnsi="Arial" w:cs="Arial"/>
+          <w:sz w:val="22"/>
+          <w:szCs w:val="22"/>
+          <w:lang w:val="es-ES"/>
+        </w:rPr>
+        <w:t>La presente investigación establece un marco fundacional robusto para la evaluación justa y transparente de modelos de detección de fraude. Partiendo de las limitaciones identificadas y del conocimiento adquirido, se proponen las siguientes líneas de desarrollo para proyectar este trabajo hacia su siguiente fase de madurez tecnológica:</w:t>
+      </w:r>
+    </w:p>
+    <w:p>
+      <w:pPr>
+        <w:pStyle w:val="Ttulo3"/>
+        <w:numPr>
+          <w:ilvl w:val="0"/>
+          <w:numId w:val="0"/>
+        </w:numPr>
+        <w:spacing w:line="240" w:lineRule="auto"/>
+        <w:ind w:left="720" w:hanging="720"/>
+        <w:rPr>
+          <w:rFonts w:ascii="Arial" w:hAnsi="Arial"/>
+          <w:b/>
+          <w:bCs/>
+          <w:sz w:val="24"/>
+          <w:szCs w:val="24"/>
+        </w:rPr>
+      </w:pPr>
+      <w:r>
+        <w:rPr>
+          <w:rFonts w:ascii="Arial" w:hAnsi="Arial"/>
+          <w:b/>
+          <w:bCs/>
+          <w:sz w:val="24"/>
+          <w:szCs w:val="24"/>
+        </w:rPr>
+        <w:t>Análisis de Sensibilidad sobre la Latencia de Etiquetado</w:t>
+      </w:r>
+      <w:r>
+        <w:rPr>
+          <w:rFonts w:ascii="Arial" w:hAnsi="Arial"/>
+          <w:b/>
+          <w:bCs/>
+          <w:sz w:val="24"/>
+          <w:szCs w:val="24"/>
+        </w:rPr>
+        <w:t>:</w:t>
+      </w:r>
+    </w:p>
+    <w:p>
+      <w:pPr>
+        <w:pStyle w:val="NormalWeb"/>
+        <w:ind w:firstLine="0"/>
+        <w:rPr>
+          <w:rFonts w:ascii="Arial" w:hAnsi="Arial" w:cs="Arial"/>
+          <w:sz w:val="22"/>
+          <w:szCs w:val="22"/>
+          <w:lang w:val="es-ES"/>
+        </w:rPr>
+      </w:pPr>
+      <w:r>
+        <w:rPr>
+          <w:rFonts w:ascii="Arial" w:hAnsi="Arial" w:cs="Arial"/>
+          <w:sz w:val="22"/>
+          <w:szCs w:val="22"/>
+          <w:lang w:val="es-ES"/>
+        </w:rPr>
+        <w:t>En el presente estudio, la validación prequencial asume un retraso de verificación (</w:t>
+      </w:r>
+      <w:r>
+        <w:rPr>
+          <w:rFonts w:ascii="Arial" w:hAnsi="Arial" w:cs="Arial"/>
+          <w:i/>
+          <w:iCs/>
+          <w:sz w:val="22"/>
+          <w:szCs w:val="22"/>
+          <w:lang w:val="es-ES"/>
+        </w:rPr>
+        <w:t>feedback delay</w:t>
+      </w:r>
+      <w:r>
+        <w:rPr>
+          <w:rFonts w:ascii="Arial" w:hAnsi="Arial" w:cs="Arial"/>
+          <w:sz w:val="22"/>
+          <w:szCs w:val="22"/>
+          <w:lang w:val="es-ES"/>
+        </w:rPr>
+        <w:t>) estático de 7 días, mimetizando el tiempo medio que transcurre en el mundo real hasta que un titular detecta un cargo ilícito y el banco confirma el fraude. Si bien este parámetro garantiza la ausencia de sesgo de anticipación (</w:t>
+      </w:r>
+      <w:r>
+        <w:rPr>
+          <w:rFonts w:ascii="Arial" w:hAnsi="Arial" w:cs="Arial"/>
+          <w:i/>
+          <w:iCs/>
+          <w:sz w:val="22"/>
+          <w:szCs w:val="22"/>
+          <w:lang w:val="es-ES"/>
+        </w:rPr>
+        <w:t>look-ahead bias</w:t>
+      </w:r>
+      <w:r>
+        <w:rPr>
+          <w:rFonts w:ascii="Arial" w:hAnsi="Arial" w:cs="Arial"/>
+          <w:sz w:val="22"/>
+          <w:szCs w:val="22"/>
+          <w:lang w:val="es-ES"/>
+        </w:rPr>
+        <w:t>), su optimización paramétrica queda fuera del alcance analítico del presente Trabajo Fin de Máster.</w:t>
+      </w:r>
+    </w:p>
+    <w:p>
+      <w:pPr>
+        <w:pStyle w:val="NormalWeb"/>
+        <w:ind w:firstLine="0"/>
+        <w:rPr>
+          <w:rFonts w:ascii="Arial" w:hAnsi="Arial" w:cs="Arial"/>
+          <w:sz w:val="22"/>
+          <w:szCs w:val="22"/>
+          <w:lang w:val="es-ES"/>
+        </w:rPr>
+      </w:pPr>
+      <w:r>
+        <w:rPr>
+          <w:rFonts w:ascii="Arial" w:hAnsi="Arial" w:cs="Arial"/>
+          <w:sz w:val="22"/>
+          <w:szCs w:val="22"/>
+          <w:lang w:val="es-ES"/>
+        </w:rPr>
+        <w:t>Como línea de investigación prioritaria, resultaría de alto valor operativo plantear un análisis de sensibilidad temporal. Este experimento consistiría en evaluar la degradación del Área Bajo la Curva PR (AUPRC) variando sistemáticamente la ventana de retraso (ej. 1, 7, 14 y 30 días). Dicho análisis permitiría a una entidad bancaria cuantificar exactamente cuánto rendimiento predictivo pierde por cada día de demora en sus procesos de reclamación de clientes, facilitando así un análisis de coste-beneficio sobre la rentabilidad de agilizar sus canales de atención al cliente.</w:t>
+      </w:r>
+    </w:p>
+    <w:p>
+      <w:pPr>
+        <w:pStyle w:val="Ttulo3"/>
+        <w:numPr>
+          <w:ilvl w:val="0"/>
+          <w:numId w:val="0"/>
+        </w:numPr>
+        <w:spacing w:line="240" w:lineRule="auto"/>
+        <w:ind w:left="720" w:hanging="720"/>
+        <w:rPr>
+          <w:rFonts w:ascii="Arial" w:hAnsi="Arial"/>
+          <w:b/>
+          <w:bCs/>
+          <w:sz w:val="24"/>
+          <w:szCs w:val="24"/>
+        </w:rPr>
+      </w:pPr>
+      <w:r>
+        <w:rPr>
+          <w:rFonts w:ascii="Arial" w:hAnsi="Arial"/>
+          <w:b/>
+          <w:bCs/>
+          <w:sz w:val="24"/>
+          <w:szCs w:val="24"/>
+        </w:rPr>
+        <w:t>Transición hacia Arquitecturas de Deep Learning Secuencial:</w:t>
+      </w:r>
+    </w:p>
+    <w:p>
+      <w:pPr>
+        <w:pStyle w:val="NormalWeb"/>
+        <w:ind w:firstLine="0"/>
+        <w:rPr>
+          <w:rFonts w:ascii="Arial" w:hAnsi="Arial" w:cs="Arial"/>
+          <w:sz w:val="22"/>
+          <w:szCs w:val="22"/>
+          <w:lang w:val="es-ES"/>
+        </w:rPr>
+      </w:pPr>
+      <w:r>
+        <w:rPr>
+          <w:rFonts w:ascii="Arial" w:hAnsi="Arial" w:cs="Arial"/>
+          <w:sz w:val="22"/>
+          <w:szCs w:val="22"/>
+          <w:lang w:val="es-ES"/>
+        </w:rPr>
+        <w:t xml:space="preserve">Aunque la arquitectura </w:t>
+      </w:r>
+      <w:r>
+        <w:rPr>
+          <w:rFonts w:ascii="Arial" w:hAnsi="Arial" w:cs="Arial"/>
+          <w:i/>
+          <w:iCs/>
+          <w:sz w:val="22"/>
+          <w:szCs w:val="22"/>
+          <w:lang w:val="es-ES"/>
+        </w:rPr>
+        <w:t>XGBoost</w:t>
+      </w:r>
+      <w:r>
+        <w:rPr>
+          <w:rFonts w:ascii="Arial" w:hAnsi="Arial" w:cs="Arial"/>
+          <w:sz w:val="22"/>
+          <w:szCs w:val="22"/>
+          <w:lang w:val="es-ES"/>
+        </w:rPr>
+        <w:t xml:space="preserve"> combinada con la ingeniería de características RFM ha demostrado ser altamente competente, este enfoque tabular obliga a resumir la historia del cliente en agregaciones estáticas (medias, conteos). El siguiente paso natural es explorar el paradigma del </w:t>
+      </w:r>
+      <w:r>
+        <w:rPr>
+          <w:rFonts w:ascii="Arial" w:hAnsi="Arial" w:cs="Arial"/>
+          <w:i/>
+          <w:iCs/>
+          <w:sz w:val="22"/>
+          <w:szCs w:val="22"/>
+          <w:lang w:val="es-ES"/>
+        </w:rPr>
+        <w:t>Deep Learning</w:t>
+      </w:r>
+      <w:r>
+        <w:rPr>
+          <w:rFonts w:ascii="Arial" w:hAnsi="Arial" w:cs="Arial"/>
+          <w:sz w:val="22"/>
+          <w:szCs w:val="22"/>
+          <w:lang w:val="es-ES"/>
+        </w:rPr>
+        <w:t>, modelando las transacciones como secuencias temporales puras. La implementación de Redes Neuronales Recurrentes (RNN, LSTM) o arquitecturas basadas en mecanismos de Atención (</w:t>
+      </w:r>
+      <w:r>
+        <w:rPr>
+          <w:rFonts w:ascii="Arial" w:hAnsi="Arial" w:cs="Arial"/>
+          <w:i/>
+          <w:iCs/>
+          <w:sz w:val="22"/>
+          <w:szCs w:val="22"/>
+          <w:lang w:val="es-ES"/>
+        </w:rPr>
+        <w:t>Transformers</w:t>
+      </w:r>
+      <w:r>
+        <w:rPr>
+          <w:rFonts w:ascii="Arial" w:hAnsi="Arial" w:cs="Arial"/>
+          <w:sz w:val="22"/>
+          <w:szCs w:val="22"/>
+          <w:lang w:val="es-ES"/>
+        </w:rPr>
+        <w:t>) permitiría al modelo ingerir el historial completo de un usuario y aprender dependencias a largo plazo de forma nativa, sin depender de la creación manual de ventanas temporales.</w:t>
+      </w:r>
+    </w:p>
+    <w:p>
+      <w:pPr>
+        <w:pStyle w:val="Ttulo3"/>
+        <w:numPr>
+          <w:ilvl w:val="0"/>
+          <w:numId w:val="0"/>
+        </w:numPr>
+        <w:spacing w:line="240" w:lineRule="auto"/>
+        <w:ind w:left="720" w:hanging="720"/>
+        <w:rPr>
+          <w:rFonts w:ascii="Arial" w:hAnsi="Arial"/>
+          <w:b/>
+          <w:bCs/>
+          <w:sz w:val="24"/>
+          <w:szCs w:val="24"/>
+        </w:rPr>
+      </w:pPr>
+      <w:r>
+        <w:rPr>
+          <w:rFonts w:ascii="Arial" w:hAnsi="Arial"/>
+          <w:b/>
+          <w:bCs/>
+          <w:sz w:val="24"/>
+          <w:szCs w:val="24"/>
+        </w:rPr>
+        <w:lastRenderedPageBreak/>
+        <w:t>Análisis Topológico mediante Grafos (Graph Neural Networks):</w:t>
+      </w:r>
+    </w:p>
+    <w:p>
+      <w:pPr>
+        <w:pStyle w:val="NormalWeb"/>
+        <w:ind w:firstLine="0"/>
+        <w:rPr>
+          <w:rFonts w:ascii="Arial" w:hAnsi="Arial" w:cs="Arial"/>
+          <w:sz w:val="22"/>
+          <w:szCs w:val="22"/>
+          <w:lang w:val="es-ES"/>
+        </w:rPr>
+      </w:pPr>
+      <w:r>
+        <w:rPr>
+          <w:rFonts w:ascii="Arial" w:hAnsi="Arial" w:cs="Arial"/>
+          <w:sz w:val="22"/>
+          <w:szCs w:val="22"/>
+          <w:lang w:val="es-ES"/>
+        </w:rPr>
+        <w:t xml:space="preserve">El fraude organizado rara vez actúa de forma aislada; opera a través de redes de terminales comprometidos y tarjetas clonadas que interactúan entre sí. Una prometedora línea de mejora consistiría en abandonar la visión individual de la transacción para adoptar un enfoque topológico. Utilizando </w:t>
+      </w:r>
+      <w:r>
+        <w:rPr>
+          <w:rFonts w:ascii="Arial" w:hAnsi="Arial" w:cs="Arial"/>
+          <w:i/>
+          <w:iCs/>
+          <w:sz w:val="22"/>
+          <w:szCs w:val="22"/>
+          <w:lang w:val="es-ES"/>
+        </w:rPr>
+        <w:t>Graph Neural Networks</w:t>
+      </w:r>
+      <w:r>
+        <w:rPr>
+          <w:rFonts w:ascii="Arial" w:hAnsi="Arial" w:cs="Arial"/>
+          <w:sz w:val="22"/>
+          <w:szCs w:val="22"/>
+          <w:lang w:val="es-ES"/>
+        </w:rPr>
+        <w:t xml:space="preserve"> (GNN), se podría modelar a los clientes y terminales como nodos, y las transacciones como aristas, permitiendo que el sistema detecte "anillos" de fraude o estructuras criminales complejas (como el lavado de dinero o la triangulación de pagos) analizando la densidad y las anomalías en la estructura del grafo del ecosistema financiero.</w:t>
       </w:r>
     </w:p>
     <w:p>
@@ -19234,18 +20255,143 @@
     </w:p>
     <w:p>
       <w:pPr>
-        <w:ind w:left="709" w:hanging="709"/>
-        <w:rPr>
-          <w:rFonts w:ascii="Arial" w:hAnsi="Arial"/>
-        </w:rPr>
-      </w:pPr>
-      <w:r>
-        <w:rPr>
-          <w:rFonts w:ascii="Arial" w:hAnsi="Arial"/>
-        </w:rPr>
-        <w:t xml:space="preserve">Chandola, V., Banerjee, A. y Kumar, V. (2009). Anomaly detection: A survey. ACM Computing Surveys (CSUR), 41(3), 1-58. </w:t>
-      </w:r>
-      <w:hyperlink r:id="rId25" w:history="1">
+        <w:spacing w:line="240" w:lineRule="auto"/>
+        <w:rPr>
+          <w:rFonts w:ascii="Arial" w:hAnsi="Arial"/>
+        </w:rPr>
+      </w:pPr>
+      <w:r>
+        <w:rPr>
+          <w:rFonts w:ascii="Arial" w:hAnsi="Arial"/>
+        </w:rPr>
+        <w:t xml:space="preserve">Abdulghani, A. Q., Uçan, O. N., &amp; Alheeti, K. M. A. (2021). Credit card fraud detection using XGBoost algorithm. </w:t>
+      </w:r>
+      <w:r>
+        <w:rPr>
+          <w:rFonts w:ascii="Arial" w:hAnsi="Arial"/>
+          <w:i/>
+          <w:iCs/>
+        </w:rPr>
+        <w:t>2021 14th International Conference on Developments in eSystems Engineering (DeSE)</w:t>
+      </w:r>
+      <w:r>
+        <w:rPr>
+          <w:rFonts w:ascii="Arial" w:hAnsi="Arial"/>
+        </w:rPr>
+        <w:t xml:space="preserve">, 487-492. </w:t>
+      </w:r>
+      <w:hyperlink r:id="rId25" w:tgtFrame="_blank" w:history="1">
+        <w:r>
+          <w:rPr>
+            <w:rStyle w:val="Hipervnculo"/>
+            <w:rFonts w:ascii="Arial" w:hAnsi="Arial"/>
+          </w:rPr>
+          <w:t>https://doi.org/10.1109/DeSE54285.2021.9719584</w:t>
+        </w:r>
+      </w:hyperlink>
+    </w:p>
+    <w:p>
+      <w:pPr>
+        <w:spacing w:line="240" w:lineRule="auto"/>
+        <w:rPr>
+          <w:rFonts w:ascii="Arial" w:hAnsi="Arial"/>
+        </w:rPr>
+      </w:pPr>
+      <w:r>
+        <w:rPr>
+          <w:rFonts w:ascii="Arial" w:hAnsi="Arial"/>
+        </w:rPr>
+        <w:t xml:space="preserve">Asha, R. B., &amp; Suresh Kumar, K. R. (2021). Credit card fraud detection using artificial neural network. </w:t>
+      </w:r>
+      <w:r>
+        <w:rPr>
+          <w:rFonts w:ascii="Arial" w:hAnsi="Arial"/>
+          <w:i/>
+          <w:iCs/>
+        </w:rPr>
+        <w:t>Global Transitions Proceedings</w:t>
+      </w:r>
+      <w:r>
+        <w:rPr>
+          <w:rFonts w:ascii="Arial" w:hAnsi="Arial"/>
+        </w:rPr>
+        <w:t xml:space="preserve">, 2(1), 35-41. </w:t>
+      </w:r>
+      <w:hyperlink r:id="rId26" w:tgtFrame="_blank" w:history="1">
+        <w:r>
+          <w:rPr>
+            <w:rStyle w:val="Hipervnculo"/>
+            <w:rFonts w:ascii="Arial" w:hAnsi="Arial"/>
+          </w:rPr>
+          <w:t>https://doi.org/10.1016/j.gltp.2021.01.006</w:t>
+        </w:r>
+      </w:hyperlink>
+    </w:p>
+    <w:p>
+      <w:pPr>
+        <w:spacing w:line="240" w:lineRule="auto"/>
+        <w:rPr>
+          <w:rFonts w:ascii="Arial" w:hAnsi="Arial"/>
+        </w:rPr>
+      </w:pPr>
+      <w:r>
+        <w:rPr>
+          <w:rFonts w:ascii="Arial" w:hAnsi="Arial"/>
+        </w:rPr>
+        <w:t xml:space="preserve">Breiman, L. (2001). Random forests. </w:t>
+      </w:r>
+      <w:r>
+        <w:rPr>
+          <w:rFonts w:ascii="Arial" w:hAnsi="Arial"/>
+          <w:i/>
+          <w:iCs/>
+        </w:rPr>
+        <w:t>Machine Learning</w:t>
+      </w:r>
+      <w:r>
+        <w:rPr>
+          <w:rFonts w:ascii="Arial" w:hAnsi="Arial"/>
+        </w:rPr>
+        <w:t xml:space="preserve">, 45(1), 5-32. </w:t>
+      </w:r>
+      <w:hyperlink r:id="rId27" w:tgtFrame="_blank" w:history="1">
+        <w:r>
+          <w:rPr>
+            <w:rStyle w:val="Hipervnculo"/>
+            <w:rFonts w:ascii="Arial" w:hAnsi="Arial"/>
+          </w:rPr>
+          <w:t>https://doi.org/10.1023/A:1010933404324</w:t>
+        </w:r>
+      </w:hyperlink>
+    </w:p>
+    <w:p>
+      <w:pPr>
+        <w:spacing w:line="240" w:lineRule="auto"/>
+        <w:rPr>
+          <w:rFonts w:ascii="Arial" w:hAnsi="Arial"/>
+        </w:rPr>
+      </w:pPr>
+      <w:r>
+        <w:rPr>
+          <w:rFonts w:ascii="Arial" w:hAnsi="Arial"/>
+        </w:rPr>
+        <w:t xml:space="preserve">Chandola, V., Banerjee, A., &amp; Kumar, V. (2009). Anomaly detection: A survey. </w:t>
+      </w:r>
+      <w:r>
+        <w:rPr>
+          <w:rFonts w:ascii="Arial" w:hAnsi="Arial"/>
+          <w:i/>
+          <w:iCs/>
+        </w:rPr>
+        <w:t>ACM Computing Surveys (CSUR)</w:t>
+      </w:r>
+      <w:r>
+        <w:rPr>
+          <w:rFonts w:ascii="Arial" w:hAnsi="Arial"/>
+        </w:rPr>
+        <w:t xml:space="preserve">, 41(3), 1-58. </w:t>
+      </w:r>
+      <w:hyperlink r:id="rId28" w:tgtFrame="_blank" w:history="1">
         <w:r>
           <w:rPr>
             <w:rStyle w:val="Hipervnculo"/>
@@ -19254,27 +20400,109 @@
           <w:t>https://doi.org/10.1145/1541880.1541882</w:t>
         </w:r>
       </w:hyperlink>
-      <w:r>
-        <w:rPr>
-          <w:rFonts w:ascii="Arial" w:hAnsi="Arial"/>
-        </w:rPr>
-        <w:t xml:space="preserve"> </w:t>
-      </w:r>
-    </w:p>
-    <w:p>
-      <w:pPr>
-        <w:ind w:left="709" w:hanging="709"/>
-        <w:rPr>
-          <w:rFonts w:ascii="Arial" w:hAnsi="Arial"/>
-        </w:rPr>
-      </w:pPr>
-      <w:r>
-        <w:rPr>
-          <w:rFonts w:ascii="Arial" w:hAnsi="Arial"/>
-        </w:rPr>
-        <w:t xml:space="preserve">Dal Pozzolo, A., Caelen, O., Le Borgne, Y.-A., Waterschoot, S. y Bontempi, G. (2014). Learned lessons in credit card fraud detection from a practitioner perspective. Expert Systems with Applications, 41(10), 4915-4928. </w:t>
-      </w:r>
-      <w:hyperlink r:id="rId26" w:history="1">
+    </w:p>
+    <w:p>
+      <w:pPr>
+        <w:spacing w:line="240" w:lineRule="auto"/>
+        <w:rPr>
+          <w:rFonts w:ascii="Arial" w:hAnsi="Arial"/>
+        </w:rPr>
+      </w:pPr>
+      <w:r>
+        <w:rPr>
+          <w:rFonts w:ascii="Arial" w:hAnsi="Arial"/>
+        </w:rPr>
+        <w:t xml:space="preserve">Chawla, N. V., Bowyer, K. W., Hall, L. O., &amp; Kegelmeyer, W. P. (2002). SMOTE: Synthetic minority over-sampling technique. </w:t>
+      </w:r>
+      <w:r>
+        <w:rPr>
+          <w:rFonts w:ascii="Arial" w:hAnsi="Arial"/>
+          <w:i/>
+          <w:iCs/>
+        </w:rPr>
+        <w:t>Journal of Artificial Intelligence Research</w:t>
+      </w:r>
+      <w:r>
+        <w:rPr>
+          <w:rFonts w:ascii="Arial" w:hAnsi="Arial"/>
+        </w:rPr>
+        <w:t xml:space="preserve">, 16, 321-357. </w:t>
+      </w:r>
+      <w:hyperlink r:id="rId29" w:tgtFrame="_blank" w:history="1">
+        <w:r>
+          <w:rPr>
+            <w:rStyle w:val="Hipervnculo"/>
+            <w:rFonts w:ascii="Arial" w:hAnsi="Arial"/>
+          </w:rPr>
+          <w:t>https://doi.org/10.1613/jair.953</w:t>
+        </w:r>
+      </w:hyperlink>
+    </w:p>
+    <w:p>
+      <w:pPr>
+        <w:spacing w:line="240" w:lineRule="auto"/>
+        <w:rPr>
+          <w:rFonts w:ascii="Arial" w:hAnsi="Arial"/>
+        </w:rPr>
+      </w:pPr>
+      <w:r>
+        <w:rPr>
+          <w:rFonts w:ascii="Arial" w:hAnsi="Arial"/>
+        </w:rPr>
+        <w:t xml:space="preserve">Chen, T., &amp; Guestrin, C. (2016). XGBoost: A scalable tree boosting system. </w:t>
+      </w:r>
+      <w:r>
+        <w:rPr>
+          <w:rFonts w:ascii="Arial" w:hAnsi="Arial"/>
+          <w:i/>
+          <w:iCs/>
+        </w:rPr>
+        <w:t>Proceedings of the 22nd ACM SIGKDD International Conference on Knowledge Discovery and Data Mining</w:t>
+      </w:r>
+      <w:r>
+        <w:rPr>
+          <w:rFonts w:ascii="Arial" w:hAnsi="Arial"/>
+        </w:rPr>
+        <w:t xml:space="preserve">, 785-794. </w:t>
+      </w:r>
+      <w:hyperlink r:id="rId30" w:tgtFrame="_blank" w:history="1">
+        <w:r>
+          <w:rPr>
+            <w:rStyle w:val="Hipervnculo"/>
+            <w:rFonts w:ascii="Arial" w:hAnsi="Arial"/>
+          </w:rPr>
+          <w:t>https://doi.org/10.1145/2939672.2939785</w:t>
+        </w:r>
+      </w:hyperlink>
+    </w:p>
+    <w:p>
+      <w:pPr>
+        <w:spacing w:line="240" w:lineRule="auto"/>
+        <w:rPr>
+          <w:rFonts w:ascii="Arial" w:hAnsi="Arial"/>
+        </w:rPr>
+      </w:pPr>
+      <w:r>
+        <w:rPr>
+          <w:rFonts w:ascii="Arial" w:hAnsi="Arial"/>
+        </w:rPr>
+        <w:t xml:space="preserve">Dal Pozzolo, A., Caelen, O., Le Borgne, Y.-A., Waterschoot, S., &amp; Bontempi, G. (2014). Learned lessons in credit card fraud detection from a practitioner perspective. </w:t>
+      </w:r>
+      <w:r>
+        <w:rPr>
+          <w:rFonts w:ascii="Arial" w:hAnsi="Arial"/>
+          <w:i/>
+          <w:iCs/>
+        </w:rPr>
+        <w:t>Expert Systems with Applications</w:t>
+      </w:r>
+      <w:r>
+        <w:rPr>
+          <w:rFonts w:ascii="Arial" w:hAnsi="Arial"/>
+        </w:rPr>
+        <w:t xml:space="preserve">, 41(10), 4915-4928. </w:t>
+      </w:r>
+      <w:hyperlink r:id="rId31" w:tgtFrame="_blank" w:history="1">
         <w:r>
           <w:rPr>
             <w:rStyle w:val="Hipervnculo"/>
@@ -19283,27 +20511,35 @@
           <w:t>https://doi.org/10.1016/j.eswa.2014.02.026</w:t>
         </w:r>
       </w:hyperlink>
-      <w:r>
-        <w:rPr>
-          <w:rFonts w:ascii="Arial" w:hAnsi="Arial"/>
-        </w:rPr>
-        <w:t xml:space="preserve"> </w:t>
-      </w:r>
-    </w:p>
-    <w:p>
-      <w:pPr>
-        <w:ind w:left="709" w:hanging="709"/>
-        <w:rPr>
-          <w:rFonts w:ascii="Arial" w:hAnsi="Arial"/>
-        </w:rPr>
-      </w:pPr>
-      <w:r>
-        <w:rPr>
-          <w:rFonts w:ascii="Arial" w:hAnsi="Arial"/>
-        </w:rPr>
-        <w:t xml:space="preserve">Dal Pozzolo, A., Caelen, O., Johnson, R. A. y Bontempi, G. (2015). Calibrating Probability with Undersampling for Unbalanced Classification. 2015 IEEE Symposium Series on Computational Intelligence, 159-166. </w:t>
-      </w:r>
-      <w:hyperlink r:id="rId27" w:history="1">
+    </w:p>
+    <w:p>
+      <w:pPr>
+        <w:spacing w:line="240" w:lineRule="auto"/>
+        <w:rPr>
+          <w:rFonts w:ascii="Arial" w:hAnsi="Arial"/>
+        </w:rPr>
+      </w:pPr>
+      <w:r>
+        <w:rPr>
+          <w:rFonts w:ascii="Arial" w:hAnsi="Arial"/>
+        </w:rPr>
+        <w:t xml:space="preserve">Dal Pozzolo, A., Caelen, O., Johnson, R. A., &amp; Bontempi, G. (2015). Calibrating Probability with Undersampling for Unbalanced Classification. </w:t>
+      </w:r>
+      <w:r>
+        <w:rPr>
+          <w:rFonts w:ascii="Arial" w:hAnsi="Arial"/>
+          <w:i/>
+          <w:iCs/>
+        </w:rPr>
+        <w:t>2015 IEEE Symposium Series on Computational Intelligence</w:t>
+      </w:r>
+      <w:r>
+        <w:rPr>
+          <w:rFonts w:ascii="Arial" w:hAnsi="Arial"/>
+        </w:rPr>
+        <w:t xml:space="preserve">, 159-166. </w:t>
+      </w:r>
+      <w:hyperlink r:id="rId32" w:tgtFrame="_blank" w:history="1">
         <w:r>
           <w:rPr>
             <w:rStyle w:val="Hipervnculo"/>
@@ -19312,41 +20548,137 @@
           <w:t>https://doi.org/10.1109/SSCI.2015.33</w:t>
         </w:r>
       </w:hyperlink>
-      <w:r>
-        <w:rPr>
-          <w:rFonts w:ascii="Arial" w:hAnsi="Arial"/>
-        </w:rPr>
-        <w:t xml:space="preserve"> </w:t>
-      </w:r>
-    </w:p>
-    <w:p>
-      <w:pPr>
-        <w:ind w:left="709" w:hanging="709"/>
-        <w:rPr>
-          <w:rFonts w:ascii="Arial" w:hAnsi="Arial"/>
-        </w:rPr>
-      </w:pPr>
-      <w:r>
-        <w:rPr>
-          <w:rFonts w:ascii="Arial" w:hAnsi="Arial"/>
-        </w:rPr>
-        <w:t>Elkan, C. (2001). The Foundations of Cost-Sensitive Learning. International Joint Conference on Artificial Intelligence (IJCAI), 17, 973-978.</w:t>
-      </w:r>
-    </w:p>
-    <w:p>
-      <w:pPr>
-        <w:ind w:left="709" w:hanging="709"/>
-        <w:rPr>
-          <w:rFonts w:ascii="Arial" w:hAnsi="Arial"/>
-        </w:rPr>
-      </w:pPr>
-      <w:r>
-        <w:rPr>
-          <w:rFonts w:ascii="Arial" w:hAnsi="Arial"/>
-        </w:rPr>
-        <w:t xml:space="preserve">Le Borgne, Y.-A., Siblini, W., Lebichot, B. y Bontempi, G. (2022). Reproducible Machine Learning for Credit Card Fraud Detection - Practical Handbook. Université Libre de Bruxelles. </w:t>
-      </w:r>
-      <w:hyperlink r:id="rId28" w:history="1">
+    </w:p>
+    <w:p>
+      <w:pPr>
+        <w:spacing w:line="240" w:lineRule="auto"/>
+        <w:rPr>
+          <w:rFonts w:ascii="Arial" w:hAnsi="Arial"/>
+        </w:rPr>
+      </w:pPr>
+      <w:r>
+        <w:rPr>
+          <w:rFonts w:ascii="Arial" w:hAnsi="Arial"/>
+        </w:rPr>
+        <w:t xml:space="preserve">Elkan, C. (2001). The foundations of cost-sensitive learning. </w:t>
+      </w:r>
+      <w:r>
+        <w:rPr>
+          <w:rFonts w:ascii="Arial" w:hAnsi="Arial"/>
+          <w:i/>
+          <w:iCs/>
+        </w:rPr>
+        <w:t>International Joint Conference on Artificial Intelligence (IJCAI)</w:t>
+      </w:r>
+      <w:r>
+        <w:rPr>
+          <w:rFonts w:ascii="Arial" w:hAnsi="Arial"/>
+        </w:rPr>
+        <w:t>, 17, 973-978.</w:t>
+      </w:r>
+    </w:p>
+    <w:p>
+      <w:pPr>
+        <w:spacing w:line="240" w:lineRule="auto"/>
+        <w:rPr>
+          <w:rFonts w:ascii="Arial" w:hAnsi="Arial"/>
+        </w:rPr>
+      </w:pPr>
+      <w:r>
+        <w:rPr>
+          <w:rFonts w:ascii="Arial" w:hAnsi="Arial"/>
+        </w:rPr>
+        <w:t xml:space="preserve">Hayat, K., &amp; Magnier, B. (2025). Data Leakage and Deceptive Performance: A Critical Examination of Credit Card Fraud Detection Methodologies. </w:t>
+      </w:r>
+      <w:r>
+        <w:rPr>
+          <w:rFonts w:ascii="Arial" w:hAnsi="Arial"/>
+          <w:i/>
+          <w:iCs/>
+        </w:rPr>
+        <w:t>Mathematics</w:t>
+      </w:r>
+      <w:r>
+        <w:rPr>
+          <w:rFonts w:ascii="Arial" w:hAnsi="Arial"/>
+        </w:rPr>
+        <w:t xml:space="preserve">, 13(16), 2563. </w:t>
+      </w:r>
+      <w:hyperlink r:id="rId33" w:tgtFrame="_blank" w:history="1">
+        <w:r>
+          <w:rPr>
+            <w:rStyle w:val="Hipervnculo"/>
+            <w:rFonts w:ascii="Arial" w:hAnsi="Arial"/>
+          </w:rPr>
+          <w:t>https://doi.org/10.3390/math13162563</w:t>
+        </w:r>
+      </w:hyperlink>
+    </w:p>
+    <w:p>
+      <w:pPr>
+        <w:spacing w:line="240" w:lineRule="auto"/>
+        <w:rPr>
+          <w:rFonts w:ascii="Arial" w:hAnsi="Arial"/>
+        </w:rPr>
+      </w:pPr>
+      <w:r>
+        <w:rPr>
+          <w:rFonts w:ascii="Arial" w:hAnsi="Arial"/>
+        </w:rPr>
+        <w:t xml:space="preserve">Ileberi, E., Sun, Y., &amp; Wang, Z. (2021). Performance Evaluation of Machine Learning Methods for Credit Card Fraud Detection Using SMOTE and AdaBoost. </w:t>
+      </w:r>
+      <w:r>
+        <w:rPr>
+          <w:rFonts w:ascii="Arial" w:hAnsi="Arial"/>
+          <w:i/>
+          <w:iCs/>
+        </w:rPr>
+        <w:t>IEEE Access</w:t>
+      </w:r>
+      <w:r>
+        <w:rPr>
+          <w:rFonts w:ascii="Arial" w:hAnsi="Arial"/>
+        </w:rPr>
+        <w:t xml:space="preserve">, 9, 165286-165294. </w:t>
+      </w:r>
+      <w:hyperlink r:id="rId34" w:tgtFrame="_blank" w:history="1">
+        <w:r>
+          <w:rPr>
+            <w:rStyle w:val="Hipervnculo"/>
+            <w:rFonts w:ascii="Arial" w:hAnsi="Arial"/>
+          </w:rPr>
+          <w:t>https://doi.org/10.1109/ACCESS.2021.3134330</w:t>
+        </w:r>
+      </w:hyperlink>
+    </w:p>
+    <w:p>
+      <w:pPr>
+        <w:spacing w:line="240" w:lineRule="auto"/>
+        <w:rPr>
+          <w:rFonts w:ascii="Arial" w:hAnsi="Arial"/>
+        </w:rPr>
+      </w:pPr>
+      <w:r>
+        <w:rPr>
+          <w:rFonts w:ascii="Arial" w:hAnsi="Arial"/>
+        </w:rPr>
+        <w:t xml:space="preserve">Le Borgne, Y.-A., Siblini, W., Lebichot, B., &amp; Bontempi, G. (2022). Reproducible Machine Learning for Credit Card Fraud Detection - Practical Handbook. </w:t>
+      </w:r>
+      <w:r>
+        <w:rPr>
+          <w:rFonts w:ascii="Arial" w:hAnsi="Arial"/>
+          <w:i/>
+          <w:iCs/>
+        </w:rPr>
+        <w:t>Université Libre de Bruxelles</w:t>
+      </w:r>
+      <w:r>
+        <w:rPr>
+          <w:rFonts w:ascii="Arial" w:hAnsi="Arial"/>
+        </w:rPr>
+        <w:t xml:space="preserve">. </w:t>
+      </w:r>
+      <w:hyperlink r:id="rId35" w:tgtFrame="_blank" w:history="1">
         <w:r>
           <w:rPr>
             <w:rStyle w:val="Hipervnculo"/>
@@ -19355,40 +20687,62 @@
           <w:t>https://github.com/Fraud-Detection-Handbook/fraud-detection-handbook</w:t>
         </w:r>
       </w:hyperlink>
-      <w:r>
-        <w:rPr>
-          <w:rFonts w:ascii="Arial" w:hAnsi="Arial"/>
-        </w:rPr>
-        <w:t xml:space="preserve"> </w:t>
-      </w:r>
-    </w:p>
-    <w:p>
-      <w:pPr>
-        <w:ind w:left="709" w:hanging="709"/>
-        <w:rPr>
-          <w:rFonts w:ascii="Arial" w:hAnsi="Arial"/>
-        </w:rPr>
-      </w:pPr>
-      <w:r>
-        <w:rPr>
-          <w:rFonts w:ascii="Arial" w:hAnsi="Arial"/>
-        </w:rPr>
-        <w:t xml:space="preserve">Lundberg, S. M. y Lee, S. I. (2017). A Unified Approach to Interpreting Model Predictions. Advances in Neural Information Processing Systems, 30. </w:t>
-      </w:r>
-      <w:hyperlink r:id="rId29" w:history="1">
-        <w:r>
-          <w:rPr>
-            <w:rStyle w:val="Hipervnculo"/>
-            <w:rFonts w:ascii="Arial" w:hAnsi="Arial"/>
-          </w:rPr>
-          <w:t>http://papers.nips.cc/paper/7062-a-unified-approach-to-interpreting-model-predictions.pdf</w:t>
-        </w:r>
-      </w:hyperlink>
-      <w:r>
-        <w:rPr>
-          <w:rFonts w:ascii="Arial" w:hAnsi="Arial"/>
-        </w:rPr>
-        <w:t xml:space="preserve"> </w:t>
+    </w:p>
+    <w:p>
+      <w:pPr>
+        <w:spacing w:line="240" w:lineRule="auto"/>
+        <w:rPr>
+          <w:rFonts w:ascii="Arial" w:hAnsi="Arial"/>
+        </w:rPr>
+      </w:pPr>
+      <w:r>
+        <w:rPr>
+          <w:rFonts w:ascii="Arial" w:hAnsi="Arial"/>
+        </w:rPr>
+        <w:t xml:space="preserve">Lundberg, S. M., &amp; Lee, S. I. (2017). A unified approach to interpreting model predictions. </w:t>
+      </w:r>
+      <w:r>
+        <w:rPr>
+          <w:rFonts w:ascii="Arial" w:hAnsi="Arial"/>
+          <w:i/>
+          <w:iCs/>
+        </w:rPr>
+        <w:t>Advances in Neural Information Processing Systems</w:t>
+      </w:r>
+      <w:r>
+        <w:rPr>
+          <w:rFonts w:ascii="Arial" w:hAnsi="Arial"/>
+        </w:rPr>
+        <w:t>, 30.</w:t>
+      </w:r>
+    </w:p>
+    <w:p>
+      <w:pPr>
+        <w:spacing w:line="240" w:lineRule="auto"/>
+        <w:rPr>
+          <w:rFonts w:ascii="Arial" w:hAnsi="Arial"/>
+        </w:rPr>
+      </w:pPr>
+      <w:r>
+        <w:rPr>
+          <w:rFonts w:ascii="Arial" w:hAnsi="Arial"/>
+        </w:rPr>
+        <w:lastRenderedPageBreak/>
+        <w:t xml:space="preserve">Sadgali, I., Sael, N., &amp; Benabbou, F. (2021). Adaptive Model for Credit Card Fraud Detection. </w:t>
+      </w:r>
+      <w:r>
+        <w:rPr>
+          <w:rFonts w:ascii="Arial" w:hAnsi="Arial"/>
+          <w:i/>
+          <w:iCs/>
+        </w:rPr>
+        <w:t>International Journal of Interactive Mobile Technologies</w:t>
+      </w:r>
+      <w:r>
+        <w:rPr>
+          <w:rFonts w:ascii="Arial" w:hAnsi="Arial"/>
+        </w:rPr>
+        <w:t>, 14(3).</w:t>
       </w:r>
     </w:p>
     <w:p>
@@ -19457,10 +20811,10 @@
       </w:pPr>
     </w:p>
     <w:sectPr>
-      <w:headerReference w:type="even" r:id="rId30"/>
-      <w:headerReference w:type="default" r:id="rId31"/>
-      <w:footerReference w:type="even" r:id="rId32"/>
-      <w:footerReference w:type="default" r:id="rId33"/>
+      <w:headerReference w:type="even" r:id="rId36"/>
+      <w:headerReference w:type="default" r:id="rId37"/>
+      <w:footerReference w:type="even" r:id="rId38"/>
+      <w:footerReference w:type="default" r:id="rId39"/>
       <w:pgSz w:w="11906" w:h="16838"/>
       <w:pgMar w:top="2153" w:right="1701" w:bottom="1244" w:left="1701" w:header="708" w:footer="708" w:gutter="0"/>
       <w:cols w:space="720"/>
@@ -20026,6 +21380,155 @@
 <file path=word/numbering.xml><?xml version="1.0" encoding="utf-8"?>
 <w:numbering xmlns:wpc="http://schemas.microsoft.com/office/word/2010/wordprocessingCanvas" xmlns:cx="http://schemas.microsoft.com/office/drawing/2014/chartex" xmlns:cx1="http://schemas.microsoft.com/office/drawing/2015/9/8/chartex" xmlns:cx2="http://schemas.microsoft.com/office/drawing/2015/10/21/chartex" xmlns:cx3="http://schemas.microsoft.com/office/drawing/2016/5/9/chartex" xmlns:cx4="http://schemas.microsoft.com/office/drawing/2016/5/10/chartex" xmlns:cx5="http://schemas.microsoft.com/office/drawing/2016/5/11/chartex" xmlns:cx6="http://schemas.microsoft.com/office/drawing/2016/5/12/chartex" xmlns:cx7="http://schemas.microsoft.com/office/drawing/2016/5/13/chartex" xmlns:cx8="http://schemas.microsoft.com/office/drawing/2016/5/14/chartex" xmlns:mc="http://schemas.openxmlformats.org/markup-compatibility/2006" xmlns:aink="http://schemas.microsoft.com/office/drawing/2016/ink" xmlns:am3d="http://schemas.microsoft.com/office/drawing/2017/model3d" xmlns:o="urn:schemas-microsoft-com:office:office" xmlns:oel="http://schemas.microsoft.com/office/2019/extlst" xmlns:r="http://schemas.openxmlformats.org/officeDocument/2006/relationships" xmlns:m="http://schemas.openxmlformats.org/officeDocument/2006/math" xmlns:v="urn:schemas-microsoft-com:vml" xmlns:wp14="http://schemas.microsoft.com/office/word/2010/wordprocessingDrawing" xmlns:wp="http://schemas.openxmlformats.org/drawingml/2006/wordprocessingDrawing" xmlns:w10="urn:schemas-microsoft-com:office:word" xmlns:w="http://schemas.openxmlformats.org/wordprocessingml/2006/main" xmlns:w14="http://schemas.microsoft.com/office/word/2010/wordml" xmlns:w15="http://schemas.microsoft.com/office/word/2012/wordml" xmlns:w16cex="http://schemas.microsoft.com/office/word/2018/wordml/cex" xmlns:w16cid="http://schemas.microsoft.com/office/word/2016/wordml/cid" xmlns:w16="http://schemas.microsoft.com/office/word/2018/wordml" xmlns:w16du="http://schemas.microsoft.com/office/word/2023/wordml/word16du" xmlns:w16sdtdh="http://schemas.microsoft.com/office/word/2020/wordml/sdtdatahash" xmlns:w16sdtfl="http://schemas.microsoft.com/office/word/2024/wordml/sdtformatlock" xmlns:w16se="http://schemas.microsoft.com/office/word/2015/wordml/symex" xmlns:wpg="http://schemas.microsoft.com/office/word/2010/wordprocessingGroup" xmlns:wpi="http://schemas.microsoft.com/office/word/2010/wordprocessingInk" xmlns:wne="http://schemas.microsoft.com/office/word/2006/wordml" xmlns:wps="http://schemas.microsoft.com/office/word/2010/wordprocessingShape" mc:Ignorable="w14 w15 w16se w16cid w16 w16cex w16sdtdh w16sdtfl w16du wp14">
   <w:abstractNum w:abstractNumId="0" w15:restartNumberingAfterBreak="0">
+    <w:nsid w:val="01DA46DD"/>
+    <w:multiLevelType w:val="multilevel"/>
+    <w:tmpl w:val="20FCB2AE"/>
+    <w:lvl w:ilvl="0">
+      <w:start w:val="1"/>
+      <w:numFmt w:val="bullet"/>
+      <w:lvlText w:val=""/>
+      <w:lvlJc w:val="left"/>
+      <w:pPr>
+        <w:tabs>
+          <w:tab w:val="num" w:pos="720"/>
+        </w:tabs>
+        <w:ind w:left="720" w:hanging="360"/>
+      </w:pPr>
+      <w:rPr>
+        <w:rFonts w:ascii="Symbol" w:hAnsi="Symbol" w:hint="default"/>
+        <w:sz w:val="20"/>
+      </w:rPr>
+    </w:lvl>
+    <w:lvl w:ilvl="1" w:tentative="1">
+      <w:start w:val="1"/>
+      <w:numFmt w:val="bullet"/>
+      <w:lvlText w:val="o"/>
+      <w:lvlJc w:val="left"/>
+      <w:pPr>
+        <w:tabs>
+          <w:tab w:val="num" w:pos="1440"/>
+        </w:tabs>
+        <w:ind w:left="1440" w:hanging="360"/>
+      </w:pPr>
+      <w:rPr>
+        <w:rFonts w:ascii="Courier New" w:hAnsi="Courier New" w:hint="default"/>
+        <w:sz w:val="20"/>
+      </w:rPr>
+    </w:lvl>
+    <w:lvl w:ilvl="2" w:tentative="1">
+      <w:start w:val="1"/>
+      <w:numFmt w:val="bullet"/>
+      <w:lvlText w:val=""/>
+      <w:lvlJc w:val="left"/>
+      <w:pPr>
+        <w:tabs>
+          <w:tab w:val="num" w:pos="2160"/>
+        </w:tabs>
+        <w:ind w:left="2160" w:hanging="360"/>
+      </w:pPr>
+      <w:rPr>
+        <w:rFonts w:ascii="Wingdings" w:hAnsi="Wingdings" w:hint="default"/>
+        <w:sz w:val="20"/>
+      </w:rPr>
+    </w:lvl>
+    <w:lvl w:ilvl="3" w:tentative="1">
+      <w:start w:val="1"/>
+      <w:numFmt w:val="bullet"/>
+      <w:lvlText w:val=""/>
+      <w:lvlJc w:val="left"/>
+      <w:pPr>
+        <w:tabs>
+          <w:tab w:val="num" w:pos="2880"/>
+        </w:tabs>
+        <w:ind w:left="2880" w:hanging="360"/>
+      </w:pPr>
+      <w:rPr>
+        <w:rFonts w:ascii="Wingdings" w:hAnsi="Wingdings" w:hint="default"/>
+        <w:sz w:val="20"/>
+      </w:rPr>
+    </w:lvl>
+    <w:lvl w:ilvl="4" w:tentative="1">
+      <w:start w:val="1"/>
+      <w:numFmt w:val="bullet"/>
+      <w:lvlText w:val=""/>
+      <w:lvlJc w:val="left"/>
+      <w:pPr>
+        <w:tabs>
+          <w:tab w:val="num" w:pos="3600"/>
+        </w:tabs>
+        <w:ind w:left="3600" w:hanging="360"/>
+      </w:pPr>
+      <w:rPr>
+        <w:rFonts w:ascii="Wingdings" w:hAnsi="Wingdings" w:hint="default"/>
+        <w:sz w:val="20"/>
+      </w:rPr>
+    </w:lvl>
+    <w:lvl w:ilvl="5" w:tentative="1">
+      <w:start w:val="1"/>
+      <w:numFmt w:val="bullet"/>
+      <w:lvlText w:val=""/>
+      <w:lvlJc w:val="left"/>
+      <w:pPr>
+        <w:tabs>
+          <w:tab w:val="num" w:pos="4320"/>
+        </w:tabs>
+        <w:ind w:left="4320" w:hanging="360"/>
+      </w:pPr>
+      <w:rPr>
+        <w:rFonts w:ascii="Wingdings" w:hAnsi="Wingdings" w:hint="default"/>
+        <w:sz w:val="20"/>
+      </w:rPr>
+    </w:lvl>
+    <w:lvl w:ilvl="6" w:tentative="1">
+      <w:start w:val="1"/>
+      <w:numFmt w:val="bullet"/>
+      <w:lvlText w:val=""/>
+      <w:lvlJc w:val="left"/>
+      <w:pPr>
+        <w:tabs>
+          <w:tab w:val="num" w:pos="5040"/>
+        </w:tabs>
+        <w:ind w:left="5040" w:hanging="360"/>
+      </w:pPr>
+      <w:rPr>
+        <w:rFonts w:ascii="Wingdings" w:hAnsi="Wingdings" w:hint="default"/>
+        <w:sz w:val="20"/>
+      </w:rPr>
+    </w:lvl>
+    <w:lvl w:ilvl="7" w:tentative="1">
+      <w:start w:val="1"/>
+      <w:numFmt w:val="bullet"/>
+      <w:lvlText w:val=""/>
+      <w:lvlJc w:val="left"/>
+      <w:pPr>
+        <w:tabs>
+          <w:tab w:val="num" w:pos="5760"/>
+        </w:tabs>
+        <w:ind w:left="5760" w:hanging="360"/>
+      </w:pPr>
+      <w:rPr>
+        <w:rFonts w:ascii="Wingdings" w:hAnsi="Wingdings" w:hint="default"/>
+        <w:sz w:val="20"/>
+      </w:rPr>
+    </w:lvl>
+    <w:lvl w:ilvl="8" w:tentative="1">
+      <w:start w:val="1"/>
+      <w:numFmt w:val="bullet"/>
+      <w:lvlText w:val=""/>
+      <w:lvlJc w:val="left"/>
+      <w:pPr>
+        <w:tabs>
+          <w:tab w:val="num" w:pos="6480"/>
+        </w:tabs>
+        <w:ind w:left="6480" w:hanging="360"/>
+      </w:pPr>
+      <w:rPr>
+        <w:rFonts w:ascii="Wingdings" w:hAnsi="Wingdings" w:hint="default"/>
+        <w:sz w:val="20"/>
+      </w:rPr>
+    </w:lvl>
+  </w:abstractNum>
+  <w:abstractNum w:abstractNumId="1" w15:restartNumberingAfterBreak="0">
     <w:nsid w:val="03910CB3"/>
     <w:multiLevelType w:val="multilevel"/>
     <w:tmpl w:val="D122B5C4"/>
@@ -20036,9 +21539,9 @@
       <w:lvlJc w:val="left"/>
       <w:pPr>
         <w:tabs>
-          <w:tab w:val="num" w:pos="720"/>
-        </w:tabs>
-        <w:ind w:left="720" w:hanging="360"/>
+          <w:tab w:val="num" w:pos="360"/>
+        </w:tabs>
+        <w:ind w:left="360" w:hanging="360"/>
       </w:pPr>
     </w:lvl>
     <w:lvl w:ilvl="1">
@@ -20048,9 +21551,9 @@
       <w:lvlJc w:val="left"/>
       <w:pPr>
         <w:tabs>
-          <w:tab w:val="num" w:pos="1440"/>
-        </w:tabs>
-        <w:ind w:left="1440" w:hanging="360"/>
+          <w:tab w:val="num" w:pos="1080"/>
+        </w:tabs>
+        <w:ind w:left="1080" w:hanging="360"/>
       </w:pPr>
       <w:rPr>
         <w:rFonts w:ascii="Courier New" w:hAnsi="Courier New" w:hint="default"/>
@@ -20064,9 +21567,9 @@
       <w:lvlJc w:val="left"/>
       <w:pPr>
         <w:tabs>
-          <w:tab w:val="num" w:pos="2160"/>
-        </w:tabs>
-        <w:ind w:left="2160" w:hanging="360"/>
+          <w:tab w:val="num" w:pos="1800"/>
+        </w:tabs>
+        <w:ind w:left="1800" w:hanging="360"/>
       </w:pPr>
     </w:lvl>
     <w:lvl w:ilvl="3" w:tentative="1">
@@ -20076,9 +21579,9 @@
       <w:lvlJc w:val="left"/>
       <w:pPr>
         <w:tabs>
-          <w:tab w:val="num" w:pos="2880"/>
-        </w:tabs>
-        <w:ind w:left="2880" w:hanging="360"/>
+          <w:tab w:val="num" w:pos="2520"/>
+        </w:tabs>
+        <w:ind w:left="2520" w:hanging="360"/>
       </w:pPr>
     </w:lvl>
     <w:lvl w:ilvl="4" w:tentative="1">
@@ -20088,9 +21591,9 @@
       <w:lvlJc w:val="left"/>
       <w:pPr>
         <w:tabs>
-          <w:tab w:val="num" w:pos="3600"/>
-        </w:tabs>
-        <w:ind w:left="3600" w:hanging="360"/>
+          <w:tab w:val="num" w:pos="3240"/>
+        </w:tabs>
+        <w:ind w:left="3240" w:hanging="360"/>
       </w:pPr>
     </w:lvl>
     <w:lvl w:ilvl="5" w:tentative="1">
@@ -20100,9 +21603,9 @@
       <w:lvlJc w:val="left"/>
       <w:pPr>
         <w:tabs>
-          <w:tab w:val="num" w:pos="4320"/>
-        </w:tabs>
-        <w:ind w:left="4320" w:hanging="360"/>
+          <w:tab w:val="num" w:pos="3960"/>
+        </w:tabs>
+        <w:ind w:left="3960" w:hanging="360"/>
       </w:pPr>
     </w:lvl>
     <w:lvl w:ilvl="6" w:tentative="1">
@@ -20112,9 +21615,9 @@
       <w:lvlJc w:val="left"/>
       <w:pPr>
         <w:tabs>
-          <w:tab w:val="num" w:pos="5040"/>
-        </w:tabs>
-        <w:ind w:left="5040" w:hanging="360"/>
+          <w:tab w:val="num" w:pos="4680"/>
+        </w:tabs>
+        <w:ind w:left="4680" w:hanging="360"/>
       </w:pPr>
     </w:lvl>
     <w:lvl w:ilvl="7" w:tentative="1">
@@ -20124,9 +21627,9 @@
       <w:lvlJc w:val="left"/>
       <w:pPr>
         <w:tabs>
-          <w:tab w:val="num" w:pos="5760"/>
-        </w:tabs>
-        <w:ind w:left="5760" w:hanging="360"/>
+          <w:tab w:val="num" w:pos="5400"/>
+        </w:tabs>
+        <w:ind w:left="5400" w:hanging="360"/>
       </w:pPr>
     </w:lvl>
     <w:lvl w:ilvl="8" w:tentative="1">
@@ -20136,13 +21639,13 @@
       <w:lvlJc w:val="left"/>
       <w:pPr>
         <w:tabs>
-          <w:tab w:val="num" w:pos="6480"/>
-        </w:tabs>
-        <w:ind w:left="6480" w:hanging="360"/>
+          <w:tab w:val="num" w:pos="6120"/>
+        </w:tabs>
+        <w:ind w:left="6120" w:hanging="360"/>
       </w:pPr>
     </w:lvl>
   </w:abstractNum>
-  <w:abstractNum w:abstractNumId="1" w15:restartNumberingAfterBreak="0">
+  <w:abstractNum w:abstractNumId="2" w15:restartNumberingAfterBreak="0">
     <w:nsid w:val="04A30410"/>
     <w:multiLevelType w:val="multilevel"/>
     <w:tmpl w:val="1EA4C970"/>
@@ -20291,7 +21794,7 @@
       </w:rPr>
     </w:lvl>
   </w:abstractNum>
-  <w:abstractNum w:abstractNumId="2" w15:restartNumberingAfterBreak="0">
+  <w:abstractNum w:abstractNumId="3" w15:restartNumberingAfterBreak="0">
     <w:nsid w:val="06B02CD0"/>
     <w:multiLevelType w:val="multilevel"/>
     <w:tmpl w:val="0C0A0025"/>
@@ -20386,7 +21889,7 @@
       </w:pPr>
     </w:lvl>
   </w:abstractNum>
-  <w:abstractNum w:abstractNumId="3" w15:restartNumberingAfterBreak="0">
+  <w:abstractNum w:abstractNumId="4" w15:restartNumberingAfterBreak="0">
     <w:nsid w:val="06DD75F5"/>
     <w:multiLevelType w:val="hybridMultilevel"/>
     <w:tmpl w:val="01E63C54"/>
@@ -20472,7 +21975,7 @@
       </w:pPr>
     </w:lvl>
   </w:abstractNum>
-  <w:abstractNum w:abstractNumId="4" w15:restartNumberingAfterBreak="0">
+  <w:abstractNum w:abstractNumId="5" w15:restartNumberingAfterBreak="0">
     <w:nsid w:val="06E77F18"/>
     <w:multiLevelType w:val="multilevel"/>
     <w:tmpl w:val="6E344F18"/>
@@ -20585,7 +22088,7 @@
       </w:pPr>
     </w:lvl>
   </w:abstractNum>
-  <w:abstractNum w:abstractNumId="5" w15:restartNumberingAfterBreak="0">
+  <w:abstractNum w:abstractNumId="6" w15:restartNumberingAfterBreak="0">
     <w:nsid w:val="07EA4BCA"/>
     <w:multiLevelType w:val="hybridMultilevel"/>
     <w:tmpl w:val="26D89400"/>
@@ -20675,7 +22178,7 @@
       </w:pPr>
     </w:lvl>
   </w:abstractNum>
-  <w:abstractNum w:abstractNumId="6" w15:restartNumberingAfterBreak="0">
+  <w:abstractNum w:abstractNumId="7" w15:restartNumberingAfterBreak="0">
     <w:nsid w:val="0B446C63"/>
     <w:multiLevelType w:val="multilevel"/>
     <w:tmpl w:val="3E8AC5AC"/>
@@ -20794,7 +22297,7 @@
       </w:pPr>
     </w:lvl>
   </w:abstractNum>
-  <w:abstractNum w:abstractNumId="7" w15:restartNumberingAfterBreak="0">
+  <w:abstractNum w:abstractNumId="8" w15:restartNumberingAfterBreak="0">
     <w:nsid w:val="0BAB52E3"/>
     <w:multiLevelType w:val="multilevel"/>
     <w:tmpl w:val="18000630"/>
@@ -20943,7 +22446,7 @@
       </w:rPr>
     </w:lvl>
   </w:abstractNum>
-  <w:abstractNum w:abstractNumId="8" w15:restartNumberingAfterBreak="0">
+  <w:abstractNum w:abstractNumId="9" w15:restartNumberingAfterBreak="0">
     <w:nsid w:val="0E0C113D"/>
     <w:multiLevelType w:val="multilevel"/>
     <w:tmpl w:val="6E344F18"/>
@@ -21056,7 +22559,7 @@
       </w:pPr>
     </w:lvl>
   </w:abstractNum>
-  <w:abstractNum w:abstractNumId="9" w15:restartNumberingAfterBreak="0">
+  <w:abstractNum w:abstractNumId="10" w15:restartNumberingAfterBreak="0">
     <w:nsid w:val="10931866"/>
     <w:multiLevelType w:val="multilevel"/>
     <w:tmpl w:val="6494EB5C"/>
@@ -21169,7 +22672,93 @@
       </w:pPr>
     </w:lvl>
   </w:abstractNum>
-  <w:abstractNum w:abstractNumId="10" w15:restartNumberingAfterBreak="0">
+  <w:abstractNum w:abstractNumId="11" w15:restartNumberingAfterBreak="0">
+    <w:nsid w:val="161548C3"/>
+    <w:multiLevelType w:val="hybridMultilevel"/>
+    <w:tmpl w:val="4C7CB6D0"/>
+    <w:lvl w:ilvl="0" w:tplc="0C0A000F">
+      <w:start w:val="1"/>
+      <w:numFmt w:val="decimal"/>
+      <w:lvlText w:val="%1."/>
+      <w:lvlJc w:val="left"/>
+      <w:pPr>
+        <w:ind w:left="360" w:hanging="360"/>
+      </w:pPr>
+    </w:lvl>
+    <w:lvl w:ilvl="1" w:tplc="0C0A0019" w:tentative="1">
+      <w:start w:val="1"/>
+      <w:numFmt w:val="lowerLetter"/>
+      <w:lvlText w:val="%2."/>
+      <w:lvlJc w:val="left"/>
+      <w:pPr>
+        <w:ind w:left="1080" w:hanging="360"/>
+      </w:pPr>
+    </w:lvl>
+    <w:lvl w:ilvl="2" w:tplc="0C0A001B" w:tentative="1">
+      <w:start w:val="1"/>
+      <w:numFmt w:val="lowerRoman"/>
+      <w:lvlText w:val="%3."/>
+      <w:lvlJc w:val="right"/>
+      <w:pPr>
+        <w:ind w:left="1800" w:hanging="180"/>
+      </w:pPr>
+    </w:lvl>
+    <w:lvl w:ilvl="3" w:tplc="0C0A000F" w:tentative="1">
+      <w:start w:val="1"/>
+      <w:numFmt w:val="decimal"/>
+      <w:lvlText w:val="%4."/>
+      <w:lvlJc w:val="left"/>
+      <w:pPr>
+        <w:ind w:left="2520" w:hanging="360"/>
+      </w:pPr>
+    </w:lvl>
+    <w:lvl w:ilvl="4" w:tplc="0C0A0019" w:tentative="1">
+      <w:start w:val="1"/>
+      <w:numFmt w:val="lowerLetter"/>
+      <w:lvlText w:val="%5."/>
+      <w:lvlJc w:val="left"/>
+      <w:pPr>
+        <w:ind w:left="3240" w:hanging="360"/>
+      </w:pPr>
+    </w:lvl>
+    <w:lvl w:ilvl="5" w:tplc="0C0A001B" w:tentative="1">
+      <w:start w:val="1"/>
+      <w:numFmt w:val="lowerRoman"/>
+      <w:lvlText w:val="%6."/>
+      <w:lvlJc w:val="right"/>
+      <w:pPr>
+        <w:ind w:left="3960" w:hanging="180"/>
+      </w:pPr>
+    </w:lvl>
+    <w:lvl w:ilvl="6" w:tplc="0C0A000F" w:tentative="1">
+      <w:start w:val="1"/>
+      <w:numFmt w:val="decimal"/>
+      <w:lvlText w:val="%7."/>
+      <w:lvlJc w:val="left"/>
+      <w:pPr>
+        <w:ind w:left="4680" w:hanging="360"/>
+      </w:pPr>
+    </w:lvl>
+    <w:lvl w:ilvl="7" w:tplc="0C0A0019" w:tentative="1">
+      <w:start w:val="1"/>
+      <w:numFmt w:val="lowerLetter"/>
+      <w:lvlText w:val="%8."/>
+      <w:lvlJc w:val="left"/>
+      <w:pPr>
+        <w:ind w:left="5400" w:hanging="360"/>
+      </w:pPr>
+    </w:lvl>
+    <w:lvl w:ilvl="8" w:tplc="0C0A001B" w:tentative="1">
+      <w:start w:val="1"/>
+      <w:numFmt w:val="lowerRoman"/>
+      <w:lvlText w:val="%9."/>
+      <w:lvlJc w:val="right"/>
+      <w:pPr>
+        <w:ind w:left="6120" w:hanging="180"/>
+      </w:pPr>
+    </w:lvl>
+  </w:abstractNum>
+  <w:abstractNum w:abstractNumId="12" w15:restartNumberingAfterBreak="0">
     <w:nsid w:val="164214F8"/>
     <w:multiLevelType w:val="multilevel"/>
     <w:tmpl w:val="67103372"/>
@@ -21282,7 +22871,7 @@
       </w:pPr>
     </w:lvl>
   </w:abstractNum>
-  <w:abstractNum w:abstractNumId="11" w15:restartNumberingAfterBreak="0">
+  <w:abstractNum w:abstractNumId="13" w15:restartNumberingAfterBreak="0">
     <w:nsid w:val="179446CC"/>
     <w:multiLevelType w:val="multilevel"/>
     <w:tmpl w:val="7D04AA6E"/>
@@ -21431,7 +23020,7 @@
       </w:rPr>
     </w:lvl>
   </w:abstractNum>
-  <w:abstractNum w:abstractNumId="12" w15:restartNumberingAfterBreak="0">
+  <w:abstractNum w:abstractNumId="14" w15:restartNumberingAfterBreak="0">
     <w:nsid w:val="18424940"/>
     <w:multiLevelType w:val="multilevel"/>
     <w:tmpl w:val="9E128A3C"/>
@@ -21580,7 +23169,7 @@
       </w:rPr>
     </w:lvl>
   </w:abstractNum>
-  <w:abstractNum w:abstractNumId="13" w15:restartNumberingAfterBreak="0">
+  <w:abstractNum w:abstractNumId="15" w15:restartNumberingAfterBreak="0">
     <w:nsid w:val="193D7EFA"/>
     <w:multiLevelType w:val="multilevel"/>
     <w:tmpl w:val="392CD584"/>
@@ -21729,7 +23318,7 @@
       </w:rPr>
     </w:lvl>
   </w:abstractNum>
-  <w:abstractNum w:abstractNumId="14" w15:restartNumberingAfterBreak="0">
+  <w:abstractNum w:abstractNumId="16" w15:restartNumberingAfterBreak="0">
     <w:nsid w:val="1A503831"/>
     <w:multiLevelType w:val="multilevel"/>
     <w:tmpl w:val="F2CC2956"/>
@@ -21842,7 +23431,7 @@
       </w:pPr>
     </w:lvl>
   </w:abstractNum>
-  <w:abstractNum w:abstractNumId="15" w15:restartNumberingAfterBreak="0">
+  <w:abstractNum w:abstractNumId="17" w15:restartNumberingAfterBreak="0">
     <w:nsid w:val="1D9922E0"/>
     <w:multiLevelType w:val="multilevel"/>
     <w:tmpl w:val="3F2AAC4A"/>
@@ -21955,7 +23544,7 @@
       </w:pPr>
     </w:lvl>
   </w:abstractNum>
-  <w:abstractNum w:abstractNumId="16" w15:restartNumberingAfterBreak="0">
+  <w:abstractNum w:abstractNumId="18" w15:restartNumberingAfterBreak="0">
     <w:nsid w:val="203B3BBE"/>
     <w:multiLevelType w:val="multilevel"/>
     <w:tmpl w:val="743EF512"/>
@@ -22104,7 +23693,7 @@
       </w:rPr>
     </w:lvl>
   </w:abstractNum>
-  <w:abstractNum w:abstractNumId="17" w15:restartNumberingAfterBreak="0">
+  <w:abstractNum w:abstractNumId="19" w15:restartNumberingAfterBreak="0">
     <w:nsid w:val="234C49B8"/>
     <w:multiLevelType w:val="multilevel"/>
     <w:tmpl w:val="9AEE49F6"/>
@@ -22217,7 +23806,7 @@
       </w:pPr>
     </w:lvl>
   </w:abstractNum>
-  <w:abstractNum w:abstractNumId="18" w15:restartNumberingAfterBreak="0">
+  <w:abstractNum w:abstractNumId="20" w15:restartNumberingAfterBreak="0">
     <w:nsid w:val="23843DFC"/>
     <w:multiLevelType w:val="multilevel"/>
     <w:tmpl w:val="5DF641F8"/>
@@ -22362,7 +23951,7 @@
       </w:rPr>
     </w:lvl>
   </w:abstractNum>
-  <w:abstractNum w:abstractNumId="19" w15:restartNumberingAfterBreak="0">
+  <w:abstractNum w:abstractNumId="21" w15:restartNumberingAfterBreak="0">
     <w:nsid w:val="247C6B2D"/>
     <w:multiLevelType w:val="multilevel"/>
     <w:tmpl w:val="DABCF41A"/>
@@ -22475,7 +24064,7 @@
       </w:pPr>
     </w:lvl>
   </w:abstractNum>
-  <w:abstractNum w:abstractNumId="20" w15:restartNumberingAfterBreak="0">
+  <w:abstractNum w:abstractNumId="22" w15:restartNumberingAfterBreak="0">
     <w:nsid w:val="26D60C78"/>
     <w:multiLevelType w:val="multilevel"/>
     <w:tmpl w:val="01043D7E"/>
@@ -22595,7 +24184,7 @@
       </w:pPr>
     </w:lvl>
   </w:abstractNum>
-  <w:abstractNum w:abstractNumId="21" w15:restartNumberingAfterBreak="0">
+  <w:abstractNum w:abstractNumId="23" w15:restartNumberingAfterBreak="0">
     <w:nsid w:val="27E957B4"/>
     <w:multiLevelType w:val="multilevel"/>
     <w:tmpl w:val="C8C0F5B4"/>
@@ -22744,7 +24333,7 @@
       </w:rPr>
     </w:lvl>
   </w:abstractNum>
-  <w:abstractNum w:abstractNumId="22" w15:restartNumberingAfterBreak="0">
+  <w:abstractNum w:abstractNumId="24" w15:restartNumberingAfterBreak="0">
     <w:nsid w:val="2D2D57EB"/>
     <w:multiLevelType w:val="multilevel"/>
     <w:tmpl w:val="49721278"/>
@@ -22893,7 +24482,7 @@
       </w:rPr>
     </w:lvl>
   </w:abstractNum>
-  <w:abstractNum w:abstractNumId="23" w15:restartNumberingAfterBreak="0">
+  <w:abstractNum w:abstractNumId="25" w15:restartNumberingAfterBreak="0">
     <w:nsid w:val="2E75081A"/>
     <w:multiLevelType w:val="multilevel"/>
     <w:tmpl w:val="136A2888"/>
@@ -23042,7 +24631,7 @@
       </w:rPr>
     </w:lvl>
   </w:abstractNum>
-  <w:abstractNum w:abstractNumId="24" w15:restartNumberingAfterBreak="0">
+  <w:abstractNum w:abstractNumId="26" w15:restartNumberingAfterBreak="0">
     <w:nsid w:val="2EB338E2"/>
     <w:multiLevelType w:val="multilevel"/>
     <w:tmpl w:val="10A874AC"/>
@@ -23155,7 +24744,7 @@
       </w:pPr>
     </w:lvl>
   </w:abstractNum>
-  <w:abstractNum w:abstractNumId="25" w15:restartNumberingAfterBreak="0">
+  <w:abstractNum w:abstractNumId="27" w15:restartNumberingAfterBreak="0">
     <w:nsid w:val="2F337DA3"/>
     <w:multiLevelType w:val="multilevel"/>
     <w:tmpl w:val="5AC82E58"/>
@@ -23304,7 +24893,7 @@
       </w:rPr>
     </w:lvl>
   </w:abstractNum>
-  <w:abstractNum w:abstractNumId="26" w15:restartNumberingAfterBreak="0">
+  <w:abstractNum w:abstractNumId="28" w15:restartNumberingAfterBreak="0">
     <w:nsid w:val="31467C4D"/>
     <w:multiLevelType w:val="multilevel"/>
     <w:tmpl w:val="BE70496E"/>
@@ -23417,7 +25006,7 @@
       </w:pPr>
     </w:lvl>
   </w:abstractNum>
-  <w:abstractNum w:abstractNumId="27" w15:restartNumberingAfterBreak="0">
+  <w:abstractNum w:abstractNumId="29" w15:restartNumberingAfterBreak="0">
     <w:nsid w:val="31611896"/>
     <w:multiLevelType w:val="multilevel"/>
     <w:tmpl w:val="CCB6ED42"/>
@@ -23566,7 +25155,7 @@
       </w:rPr>
     </w:lvl>
   </w:abstractNum>
-  <w:abstractNum w:abstractNumId="28" w15:restartNumberingAfterBreak="0">
+  <w:abstractNum w:abstractNumId="30" w15:restartNumberingAfterBreak="0">
     <w:nsid w:val="32C02CED"/>
     <w:multiLevelType w:val="multilevel"/>
     <w:tmpl w:val="821004F8"/>
@@ -23715,7 +25304,7 @@
       </w:rPr>
     </w:lvl>
   </w:abstractNum>
-  <w:abstractNum w:abstractNumId="29" w15:restartNumberingAfterBreak="0">
+  <w:abstractNum w:abstractNumId="31" w15:restartNumberingAfterBreak="0">
     <w:nsid w:val="33823CAF"/>
     <w:multiLevelType w:val="multilevel"/>
     <w:tmpl w:val="A320AE62"/>
@@ -23864,7 +25453,7 @@
       </w:rPr>
     </w:lvl>
   </w:abstractNum>
-  <w:abstractNum w:abstractNumId="30" w15:restartNumberingAfterBreak="0">
+  <w:abstractNum w:abstractNumId="32" w15:restartNumberingAfterBreak="0">
     <w:nsid w:val="383100DE"/>
     <w:multiLevelType w:val="multilevel"/>
     <w:tmpl w:val="6E344F18"/>
@@ -23981,7 +25570,7 @@
       </w:pPr>
     </w:lvl>
   </w:abstractNum>
-  <w:abstractNum w:abstractNumId="31" w15:restartNumberingAfterBreak="0">
+  <w:abstractNum w:abstractNumId="33" w15:restartNumberingAfterBreak="0">
     <w:nsid w:val="3D6B6F71"/>
     <w:multiLevelType w:val="multilevel"/>
     <w:tmpl w:val="17DA76A4"/>
@@ -24130,7 +25719,7 @@
       </w:rPr>
     </w:lvl>
   </w:abstractNum>
-  <w:abstractNum w:abstractNumId="32" w15:restartNumberingAfterBreak="0">
+  <w:abstractNum w:abstractNumId="34" w15:restartNumberingAfterBreak="0">
     <w:nsid w:val="3D7A3FBA"/>
     <w:multiLevelType w:val="hybridMultilevel"/>
     <w:tmpl w:val="6D1AE4A8"/>
@@ -24220,7 +25809,7 @@
       </w:pPr>
     </w:lvl>
   </w:abstractNum>
-  <w:abstractNum w:abstractNumId="33" w15:restartNumberingAfterBreak="0">
+  <w:abstractNum w:abstractNumId="35" w15:restartNumberingAfterBreak="0">
     <w:nsid w:val="40222390"/>
     <w:multiLevelType w:val="multilevel"/>
     <w:tmpl w:val="2DC8AEC0"/>
@@ -24369,7 +25958,7 @@
       </w:rPr>
     </w:lvl>
   </w:abstractNum>
-  <w:abstractNum w:abstractNumId="34" w15:restartNumberingAfterBreak="0">
+  <w:abstractNum w:abstractNumId="36" w15:restartNumberingAfterBreak="0">
     <w:nsid w:val="44012285"/>
     <w:multiLevelType w:val="multilevel"/>
     <w:tmpl w:val="E774F13C"/>
@@ -24518,7 +26107,7 @@
       </w:rPr>
     </w:lvl>
   </w:abstractNum>
-  <w:abstractNum w:abstractNumId="35" w15:restartNumberingAfterBreak="0">
+  <w:abstractNum w:abstractNumId="37" w15:restartNumberingAfterBreak="0">
     <w:nsid w:val="44897586"/>
     <w:multiLevelType w:val="hybridMultilevel"/>
     <w:tmpl w:val="D1BCB05C"/>
@@ -24631,7 +26220,7 @@
       </w:rPr>
     </w:lvl>
   </w:abstractNum>
-  <w:abstractNum w:abstractNumId="36" w15:restartNumberingAfterBreak="0">
+  <w:abstractNum w:abstractNumId="38" w15:restartNumberingAfterBreak="0">
     <w:nsid w:val="483D08E6"/>
     <w:multiLevelType w:val="multilevel"/>
     <w:tmpl w:val="471C82D0"/>
@@ -24780,7 +26369,7 @@
       </w:rPr>
     </w:lvl>
   </w:abstractNum>
-  <w:abstractNum w:abstractNumId="37" w15:restartNumberingAfterBreak="0">
+  <w:abstractNum w:abstractNumId="39" w15:restartNumberingAfterBreak="0">
     <w:nsid w:val="4B6E7314"/>
     <w:multiLevelType w:val="multilevel"/>
     <w:tmpl w:val="53AA179E"/>
@@ -24925,7 +26514,7 @@
       </w:rPr>
     </w:lvl>
   </w:abstractNum>
-  <w:abstractNum w:abstractNumId="38" w15:restartNumberingAfterBreak="0">
+  <w:abstractNum w:abstractNumId="40" w15:restartNumberingAfterBreak="0">
     <w:nsid w:val="4E2C24DD"/>
     <w:multiLevelType w:val="multilevel"/>
     <w:tmpl w:val="C336A7EA"/>
@@ -25074,7 +26663,7 @@
       </w:rPr>
     </w:lvl>
   </w:abstractNum>
-  <w:abstractNum w:abstractNumId="39" w15:restartNumberingAfterBreak="0">
+  <w:abstractNum w:abstractNumId="41" w15:restartNumberingAfterBreak="0">
     <w:nsid w:val="4E4871E8"/>
     <w:multiLevelType w:val="multilevel"/>
     <w:tmpl w:val="D3305E10"/>
@@ -25223,7 +26812,7 @@
       </w:rPr>
     </w:lvl>
   </w:abstractNum>
-  <w:abstractNum w:abstractNumId="40" w15:restartNumberingAfterBreak="0">
+  <w:abstractNum w:abstractNumId="42" w15:restartNumberingAfterBreak="0">
     <w:nsid w:val="4FDE336C"/>
     <w:multiLevelType w:val="multilevel"/>
     <w:tmpl w:val="C31CC312"/>
@@ -25340,7 +26929,7 @@
       </w:pPr>
     </w:lvl>
   </w:abstractNum>
-  <w:abstractNum w:abstractNumId="41" w15:restartNumberingAfterBreak="0">
+  <w:abstractNum w:abstractNumId="43" w15:restartNumberingAfterBreak="0">
     <w:nsid w:val="501455FF"/>
     <w:multiLevelType w:val="multilevel"/>
     <w:tmpl w:val="0809001F"/>
@@ -25453,7 +27042,7 @@
       </w:pPr>
     </w:lvl>
   </w:abstractNum>
-  <w:abstractNum w:abstractNumId="42" w15:restartNumberingAfterBreak="0">
+  <w:abstractNum w:abstractNumId="44" w15:restartNumberingAfterBreak="0">
     <w:nsid w:val="51073111"/>
     <w:multiLevelType w:val="multilevel"/>
     <w:tmpl w:val="3306C262"/>
@@ -25602,7 +27191,7 @@
       </w:rPr>
     </w:lvl>
   </w:abstractNum>
-  <w:abstractNum w:abstractNumId="43" w15:restartNumberingAfterBreak="0">
+  <w:abstractNum w:abstractNumId="45" w15:restartNumberingAfterBreak="0">
     <w:nsid w:val="521356DA"/>
     <w:multiLevelType w:val="multilevel"/>
     <w:tmpl w:val="E12E3D98"/>
@@ -25751,7 +27340,7 @@
       </w:rPr>
     </w:lvl>
   </w:abstractNum>
-  <w:abstractNum w:abstractNumId="44" w15:restartNumberingAfterBreak="0">
+  <w:abstractNum w:abstractNumId="46" w15:restartNumberingAfterBreak="0">
     <w:nsid w:val="579252F5"/>
     <w:multiLevelType w:val="multilevel"/>
     <w:tmpl w:val="8564E4DC"/>
@@ -25864,7 +27453,7 @@
       </w:pPr>
     </w:lvl>
   </w:abstractNum>
-  <w:abstractNum w:abstractNumId="45" w15:restartNumberingAfterBreak="0">
+  <w:abstractNum w:abstractNumId="47" w15:restartNumberingAfterBreak="0">
     <w:nsid w:val="5A6C1EC2"/>
     <w:multiLevelType w:val="multilevel"/>
     <w:tmpl w:val="6E344F18"/>
@@ -25977,7 +27566,7 @@
       </w:pPr>
     </w:lvl>
   </w:abstractNum>
-  <w:abstractNum w:abstractNumId="46" w15:restartNumberingAfterBreak="0">
+  <w:abstractNum w:abstractNumId="48" w15:restartNumberingAfterBreak="0">
     <w:nsid w:val="5BC31D0A"/>
     <w:multiLevelType w:val="multilevel"/>
     <w:tmpl w:val="7F5EA3EE"/>
@@ -26126,7 +27715,7 @@
       </w:rPr>
     </w:lvl>
   </w:abstractNum>
-  <w:abstractNum w:abstractNumId="47" w15:restartNumberingAfterBreak="0">
+  <w:abstractNum w:abstractNumId="49" w15:restartNumberingAfterBreak="0">
     <w:nsid w:val="5F6856C9"/>
     <w:multiLevelType w:val="multilevel"/>
     <w:tmpl w:val="4CCA39D2"/>
@@ -26239,7 +27828,7 @@
       </w:pPr>
     </w:lvl>
   </w:abstractNum>
-  <w:abstractNum w:abstractNumId="48" w15:restartNumberingAfterBreak="0">
+  <w:abstractNum w:abstractNumId="50" w15:restartNumberingAfterBreak="0">
     <w:nsid w:val="60F01367"/>
     <w:multiLevelType w:val="multilevel"/>
     <w:tmpl w:val="28E2ACA0"/>
@@ -26388,7 +27977,7 @@
       </w:rPr>
     </w:lvl>
   </w:abstractNum>
-  <w:abstractNum w:abstractNumId="49" w15:restartNumberingAfterBreak="0">
+  <w:abstractNum w:abstractNumId="51" w15:restartNumberingAfterBreak="0">
     <w:nsid w:val="62BE52D9"/>
     <w:multiLevelType w:val="multilevel"/>
     <w:tmpl w:val="0FB2A214"/>
@@ -26537,7 +28126,7 @@
       </w:rPr>
     </w:lvl>
   </w:abstractNum>
-  <w:abstractNum w:abstractNumId="50" w15:restartNumberingAfterBreak="0">
+  <w:abstractNum w:abstractNumId="52" w15:restartNumberingAfterBreak="0">
     <w:nsid w:val="63CE1CBB"/>
     <w:multiLevelType w:val="multilevel"/>
     <w:tmpl w:val="E12E3D98"/>
@@ -26686,7 +28275,7 @@
       </w:rPr>
     </w:lvl>
   </w:abstractNum>
-  <w:abstractNum w:abstractNumId="51" w15:restartNumberingAfterBreak="0">
+  <w:abstractNum w:abstractNumId="53" w15:restartNumberingAfterBreak="0">
     <w:nsid w:val="65442AD3"/>
     <w:multiLevelType w:val="multilevel"/>
     <w:tmpl w:val="36FAA49A"/>
@@ -26835,7 +28424,7 @@
       </w:rPr>
     </w:lvl>
   </w:abstractNum>
-  <w:abstractNum w:abstractNumId="52" w15:restartNumberingAfterBreak="0">
+  <w:abstractNum w:abstractNumId="54" w15:restartNumberingAfterBreak="0">
     <w:nsid w:val="66866A0A"/>
     <w:multiLevelType w:val="multilevel"/>
     <w:tmpl w:val="6E344F18"/>
@@ -26952,7 +28541,7 @@
       </w:pPr>
     </w:lvl>
   </w:abstractNum>
-  <w:abstractNum w:abstractNumId="53" w15:restartNumberingAfterBreak="0">
+  <w:abstractNum w:abstractNumId="55" w15:restartNumberingAfterBreak="0">
     <w:nsid w:val="6A4B1CDB"/>
     <w:multiLevelType w:val="hybridMultilevel"/>
     <w:tmpl w:val="683E8830"/>
@@ -27042,7 +28631,7 @@
       </w:pPr>
     </w:lvl>
   </w:abstractNum>
-  <w:abstractNum w:abstractNumId="54" w15:restartNumberingAfterBreak="0">
+  <w:abstractNum w:abstractNumId="56" w15:restartNumberingAfterBreak="0">
     <w:nsid w:val="6C333DAD"/>
     <w:multiLevelType w:val="multilevel"/>
     <w:tmpl w:val="CED8BE70"/>
@@ -27155,7 +28744,7 @@
       </w:pPr>
     </w:lvl>
   </w:abstractNum>
-  <w:abstractNum w:abstractNumId="55" w15:restartNumberingAfterBreak="0">
+  <w:abstractNum w:abstractNumId="57" w15:restartNumberingAfterBreak="0">
     <w:nsid w:val="6DE81CB7"/>
     <w:multiLevelType w:val="multilevel"/>
     <w:tmpl w:val="B3F8C438"/>
@@ -27304,7 +28893,7 @@
       </w:rPr>
     </w:lvl>
   </w:abstractNum>
-  <w:abstractNum w:abstractNumId="56" w15:restartNumberingAfterBreak="0">
+  <w:abstractNum w:abstractNumId="58" w15:restartNumberingAfterBreak="0">
     <w:nsid w:val="6F4A47B2"/>
     <w:multiLevelType w:val="multilevel"/>
     <w:tmpl w:val="6556259A"/>
@@ -27417,7 +29006,7 @@
       </w:pPr>
     </w:lvl>
   </w:abstractNum>
-  <w:abstractNum w:abstractNumId="57" w15:restartNumberingAfterBreak="0">
+  <w:abstractNum w:abstractNumId="59" w15:restartNumberingAfterBreak="0">
     <w:nsid w:val="71104967"/>
     <w:multiLevelType w:val="hybridMultilevel"/>
     <w:tmpl w:val="EB84DA22"/>
@@ -27530,7 +29119,7 @@
       </w:rPr>
     </w:lvl>
   </w:abstractNum>
-  <w:abstractNum w:abstractNumId="58" w15:restartNumberingAfterBreak="0">
+  <w:abstractNum w:abstractNumId="60" w15:restartNumberingAfterBreak="0">
     <w:nsid w:val="72416FAA"/>
     <w:multiLevelType w:val="multilevel"/>
     <w:tmpl w:val="49B4E668"/>
@@ -27670,7 +29259,7 @@
       </w:rPr>
     </w:lvl>
   </w:abstractNum>
-  <w:abstractNum w:abstractNumId="59" w15:restartNumberingAfterBreak="0">
+  <w:abstractNum w:abstractNumId="61" w15:restartNumberingAfterBreak="0">
     <w:nsid w:val="727B3179"/>
     <w:multiLevelType w:val="multilevel"/>
     <w:tmpl w:val="447A6596"/>
@@ -27819,7 +29408,7 @@
       </w:rPr>
     </w:lvl>
   </w:abstractNum>
-  <w:abstractNum w:abstractNumId="60" w15:restartNumberingAfterBreak="0">
+  <w:abstractNum w:abstractNumId="62" w15:restartNumberingAfterBreak="0">
     <w:nsid w:val="73763D00"/>
     <w:multiLevelType w:val="multilevel"/>
     <w:tmpl w:val="EF088428"/>
@@ -27968,7 +29557,7 @@
       </w:rPr>
     </w:lvl>
   </w:abstractNum>
-  <w:abstractNum w:abstractNumId="61" w15:restartNumberingAfterBreak="0">
+  <w:abstractNum w:abstractNumId="63" w15:restartNumberingAfterBreak="0">
     <w:nsid w:val="73780321"/>
     <w:multiLevelType w:val="hybridMultilevel"/>
     <w:tmpl w:val="69242740"/>
@@ -28081,7 +29670,7 @@
       </w:rPr>
     </w:lvl>
   </w:abstractNum>
-  <w:abstractNum w:abstractNumId="62" w15:restartNumberingAfterBreak="0">
+  <w:abstractNum w:abstractNumId="64" w15:restartNumberingAfterBreak="0">
     <w:nsid w:val="74581BB9"/>
     <w:multiLevelType w:val="multilevel"/>
     <w:tmpl w:val="5B94CE08"/>
@@ -28230,7 +29819,7 @@
       </w:rPr>
     </w:lvl>
   </w:abstractNum>
-  <w:abstractNum w:abstractNumId="63" w15:restartNumberingAfterBreak="0">
+  <w:abstractNum w:abstractNumId="65" w15:restartNumberingAfterBreak="0">
     <w:nsid w:val="7E1D60C3"/>
     <w:multiLevelType w:val="hybridMultilevel"/>
     <w:tmpl w:val="CC6008D8"/>
@@ -28316,7 +29905,7 @@
       </w:pPr>
     </w:lvl>
   </w:abstractNum>
-  <w:abstractNum w:abstractNumId="64" w15:restartNumberingAfterBreak="0">
+  <w:abstractNum w:abstractNumId="66" w15:restartNumberingAfterBreak="0">
     <w:nsid w:val="7F2A3C5C"/>
     <w:multiLevelType w:val="multilevel"/>
     <w:tmpl w:val="3E8AC5AC"/>
@@ -28436,415 +30025,478 @@
     </w:lvl>
   </w:abstractNum>
   <w:num w:numId="1" w16cid:durableId="1176699081">
+    <w:abstractNumId w:val="7"/>
+  </w:num>
+  <w:num w:numId="2" w16cid:durableId="494494898">
+    <w:abstractNumId w:val="43"/>
+  </w:num>
+  <w:num w:numId="3" w16cid:durableId="1200778367">
+    <w:abstractNumId w:val="60"/>
+  </w:num>
+  <w:num w:numId="4" w16cid:durableId="500238440">
+    <w:abstractNumId w:val="46"/>
+  </w:num>
+  <w:num w:numId="5" w16cid:durableId="54090542">
+    <w:abstractNumId w:val="7"/>
+  </w:num>
+  <w:num w:numId="6" w16cid:durableId="236794149">
+    <w:abstractNumId w:val="12"/>
+  </w:num>
+  <w:num w:numId="7" w16cid:durableId="1297445989">
+    <w:abstractNumId w:val="4"/>
+  </w:num>
+  <w:num w:numId="8" w16cid:durableId="605771027">
     <w:abstractNumId w:val="6"/>
   </w:num>
-  <w:num w:numId="2" w16cid:durableId="494494898">
+  <w:num w:numId="9" w16cid:durableId="641925348">
     <w:abstractNumId w:val="41"/>
   </w:num>
-  <w:num w:numId="3" w16cid:durableId="1200778367">
+  <w:num w:numId="10" w16cid:durableId="1405370748">
+    <w:abstractNumId w:val="47"/>
+  </w:num>
+  <w:num w:numId="11" w16cid:durableId="1782718875">
+    <w:abstractNumId w:val="52"/>
+  </w:num>
+  <w:num w:numId="12" w16cid:durableId="1867138050">
+    <w:abstractNumId w:val="45"/>
+  </w:num>
+  <w:num w:numId="13" w16cid:durableId="1515454589">
+    <w:abstractNumId w:val="7"/>
+  </w:num>
+  <w:num w:numId="14" w16cid:durableId="1048535536">
+    <w:abstractNumId w:val="7"/>
+  </w:num>
+  <w:num w:numId="15" w16cid:durableId="154689950">
+    <w:abstractNumId w:val="7"/>
+  </w:num>
+  <w:num w:numId="16" w16cid:durableId="1622687441">
+    <w:abstractNumId w:val="7"/>
+  </w:num>
+  <w:num w:numId="17" w16cid:durableId="546987107">
+    <w:abstractNumId w:val="7"/>
+  </w:num>
+  <w:num w:numId="18" w16cid:durableId="2037077925">
+    <w:abstractNumId w:val="7"/>
+  </w:num>
+  <w:num w:numId="19" w16cid:durableId="202911025">
+    <w:abstractNumId w:val="50"/>
+  </w:num>
+  <w:num w:numId="20" w16cid:durableId="1163200953">
+    <w:abstractNumId w:val="49"/>
+  </w:num>
+  <w:num w:numId="21" w16cid:durableId="887686438">
+    <w:abstractNumId w:val="26"/>
+  </w:num>
+  <w:num w:numId="22" w16cid:durableId="359208971">
+    <w:abstractNumId w:val="20"/>
+  </w:num>
+  <w:num w:numId="23" w16cid:durableId="612171986">
+    <w:abstractNumId w:val="16"/>
+  </w:num>
+  <w:num w:numId="24" w16cid:durableId="1913075478">
+    <w:abstractNumId w:val="24"/>
+  </w:num>
+  <w:num w:numId="25" w16cid:durableId="2133286701">
+    <w:abstractNumId w:val="7"/>
+  </w:num>
+  <w:num w:numId="26" w16cid:durableId="881870947">
+    <w:abstractNumId w:val="7"/>
+  </w:num>
+  <w:num w:numId="27" w16cid:durableId="1832214677">
+    <w:abstractNumId w:val="7"/>
+  </w:num>
+  <w:num w:numId="28" w16cid:durableId="1497916287">
+    <w:abstractNumId w:val="7"/>
+  </w:num>
+  <w:num w:numId="29" w16cid:durableId="1617057083">
+    <w:abstractNumId w:val="7"/>
+  </w:num>
+  <w:num w:numId="30" w16cid:durableId="1689064264">
+    <w:abstractNumId w:val="7"/>
+  </w:num>
+  <w:num w:numId="31" w16cid:durableId="384565334">
+    <w:abstractNumId w:val="36"/>
+  </w:num>
+  <w:num w:numId="32" w16cid:durableId="1829705080">
+    <w:abstractNumId w:val="7"/>
+  </w:num>
+  <w:num w:numId="33" w16cid:durableId="496265946">
+    <w:abstractNumId w:val="7"/>
+  </w:num>
+  <w:num w:numId="34" w16cid:durableId="1507741614">
+    <w:abstractNumId w:val="1"/>
+  </w:num>
+  <w:num w:numId="35" w16cid:durableId="739327860">
+    <w:abstractNumId w:val="7"/>
+  </w:num>
+  <w:num w:numId="36" w16cid:durableId="1239092181">
+    <w:abstractNumId w:val="48"/>
+  </w:num>
+  <w:num w:numId="37" w16cid:durableId="1537350934">
+    <w:abstractNumId w:val="15"/>
+  </w:num>
+  <w:num w:numId="38" w16cid:durableId="991953662">
+    <w:abstractNumId w:val="2"/>
+  </w:num>
+  <w:num w:numId="39" w16cid:durableId="1673140504">
+    <w:abstractNumId w:val="64"/>
+  </w:num>
+  <w:num w:numId="40" w16cid:durableId="391733110">
+    <w:abstractNumId w:val="34"/>
+  </w:num>
+  <w:num w:numId="41" w16cid:durableId="116871802">
+    <w:abstractNumId w:val="59"/>
+  </w:num>
+  <w:num w:numId="42" w16cid:durableId="1233081910">
+    <w:abstractNumId w:val="28"/>
+  </w:num>
+  <w:num w:numId="43" w16cid:durableId="700476519">
+    <w:abstractNumId w:val="27"/>
+  </w:num>
+  <w:num w:numId="44" w16cid:durableId="1838155833">
     <w:abstractNumId w:val="58"/>
   </w:num>
-  <w:num w:numId="4" w16cid:durableId="500238440">
+  <w:num w:numId="45" w16cid:durableId="548492312">
+    <w:abstractNumId w:val="7"/>
+  </w:num>
+  <w:num w:numId="46" w16cid:durableId="1365449020">
+    <w:abstractNumId w:val="7"/>
+  </w:num>
+  <w:num w:numId="47" w16cid:durableId="58095565">
+    <w:abstractNumId w:val="7"/>
+  </w:num>
+  <w:num w:numId="48" w16cid:durableId="2006975715">
+    <w:abstractNumId w:val="38"/>
+  </w:num>
+  <w:num w:numId="49" w16cid:durableId="79497306">
+    <w:abstractNumId w:val="21"/>
+  </w:num>
+  <w:num w:numId="50" w16cid:durableId="2121415597">
+    <w:abstractNumId w:val="7"/>
+  </w:num>
+  <w:num w:numId="51" w16cid:durableId="1897885630">
+    <w:abstractNumId w:val="7"/>
+  </w:num>
+  <w:num w:numId="52" w16cid:durableId="1785884815">
+    <w:abstractNumId w:val="7"/>
+  </w:num>
+  <w:num w:numId="53" w16cid:durableId="1144083397">
+    <w:abstractNumId w:val="7"/>
+  </w:num>
+  <w:num w:numId="54" w16cid:durableId="201207800">
+    <w:abstractNumId w:val="7"/>
+  </w:num>
+  <w:num w:numId="55" w16cid:durableId="443039468">
+    <w:abstractNumId w:val="7"/>
+  </w:num>
+  <w:num w:numId="56" w16cid:durableId="111629732">
+    <w:abstractNumId w:val="7"/>
+  </w:num>
+  <w:num w:numId="57" w16cid:durableId="1534876872">
+    <w:abstractNumId w:val="61"/>
+  </w:num>
+  <w:num w:numId="58" w16cid:durableId="841630886">
+    <w:abstractNumId w:val="31"/>
+  </w:num>
+  <w:num w:numId="59" w16cid:durableId="147332457">
+    <w:abstractNumId w:val="53"/>
+  </w:num>
+  <w:num w:numId="60" w16cid:durableId="1726952072">
+    <w:abstractNumId w:val="8"/>
+  </w:num>
+  <w:num w:numId="61" w16cid:durableId="1202982037">
+    <w:abstractNumId w:val="14"/>
+  </w:num>
+  <w:num w:numId="62" w16cid:durableId="596136958">
+    <w:abstractNumId w:val="57"/>
+  </w:num>
+  <w:num w:numId="63" w16cid:durableId="1540318805">
+    <w:abstractNumId w:val="55"/>
+  </w:num>
+  <w:num w:numId="64" w16cid:durableId="1383560384">
+    <w:abstractNumId w:val="7"/>
+  </w:num>
+  <w:num w:numId="65" w16cid:durableId="766000792">
+    <w:abstractNumId w:val="3"/>
+  </w:num>
+  <w:num w:numId="66" w16cid:durableId="760642094">
+    <w:abstractNumId w:val="66"/>
+  </w:num>
+  <w:num w:numId="67" w16cid:durableId="1038628803">
+    <w:abstractNumId w:val="3"/>
+  </w:num>
+  <w:num w:numId="68" w16cid:durableId="439568490">
+    <w:abstractNumId w:val="37"/>
+  </w:num>
+  <w:num w:numId="69" w16cid:durableId="516501371">
+    <w:abstractNumId w:val="3"/>
+  </w:num>
+  <w:num w:numId="70" w16cid:durableId="1864905542">
+    <w:abstractNumId w:val="3"/>
+  </w:num>
+  <w:num w:numId="71" w16cid:durableId="1138649261">
+    <w:abstractNumId w:val="5"/>
+  </w:num>
+  <w:num w:numId="72" w16cid:durableId="54014029">
+    <w:abstractNumId w:val="9"/>
+  </w:num>
+  <w:num w:numId="73" w16cid:durableId="536435765">
+    <w:abstractNumId w:val="3"/>
+  </w:num>
+  <w:num w:numId="74" w16cid:durableId="1068264346">
+    <w:abstractNumId w:val="3"/>
+  </w:num>
+  <w:num w:numId="75" w16cid:durableId="1566262037">
+    <w:abstractNumId w:val="3"/>
+  </w:num>
+  <w:num w:numId="76" w16cid:durableId="1944222289">
+    <w:abstractNumId w:val="32"/>
+  </w:num>
+  <w:num w:numId="77" w16cid:durableId="851532290">
+    <w:abstractNumId w:val="3"/>
+  </w:num>
+  <w:num w:numId="78" w16cid:durableId="927810419">
+    <w:abstractNumId w:val="3"/>
+  </w:num>
+  <w:num w:numId="79" w16cid:durableId="1340692222">
+    <w:abstractNumId w:val="3"/>
+  </w:num>
+  <w:num w:numId="80" w16cid:durableId="2016224658">
+    <w:abstractNumId w:val="22"/>
+  </w:num>
+  <w:num w:numId="81" w16cid:durableId="1654215340">
+    <w:abstractNumId w:val="54"/>
+  </w:num>
+  <w:num w:numId="82" w16cid:durableId="1724140020">
+    <w:abstractNumId w:val="3"/>
+  </w:num>
+  <w:num w:numId="83" w16cid:durableId="495850546">
+    <w:abstractNumId w:val="63"/>
+  </w:num>
+  <w:num w:numId="84" w16cid:durableId="1918049249">
+    <w:abstractNumId w:val="33"/>
+  </w:num>
+  <w:num w:numId="85" w16cid:durableId="766343421">
+    <w:abstractNumId w:val="25"/>
+  </w:num>
+  <w:num w:numId="86" w16cid:durableId="1498769241">
+    <w:abstractNumId w:val="3"/>
+  </w:num>
+  <w:num w:numId="87" w16cid:durableId="1359812244">
+    <w:abstractNumId w:val="3"/>
+  </w:num>
+  <w:num w:numId="88" w16cid:durableId="2136481363">
+    <w:abstractNumId w:val="3"/>
+  </w:num>
+  <w:num w:numId="89" w16cid:durableId="405107229">
+    <w:abstractNumId w:val="3"/>
+  </w:num>
+  <w:num w:numId="90" w16cid:durableId="1787574365">
+    <w:abstractNumId w:val="3"/>
+  </w:num>
+  <w:num w:numId="91" w16cid:durableId="602880272">
+    <w:abstractNumId w:val="3"/>
+  </w:num>
+  <w:num w:numId="92" w16cid:durableId="291137230">
+    <w:abstractNumId w:val="3"/>
+  </w:num>
+  <w:num w:numId="93" w16cid:durableId="1285648576">
+    <w:abstractNumId w:val="3"/>
+  </w:num>
+  <w:num w:numId="94" w16cid:durableId="53281645">
+    <w:abstractNumId w:val="3"/>
+  </w:num>
+  <w:num w:numId="95" w16cid:durableId="240875848">
+    <w:abstractNumId w:val="3"/>
+  </w:num>
+  <w:num w:numId="96" w16cid:durableId="1453861316">
+    <w:abstractNumId w:val="10"/>
+  </w:num>
+  <w:num w:numId="97" w16cid:durableId="1352803074">
+    <w:abstractNumId w:val="3"/>
+  </w:num>
+  <w:num w:numId="98" w16cid:durableId="864907344">
+    <w:abstractNumId w:val="39"/>
+  </w:num>
+  <w:num w:numId="99" w16cid:durableId="1526208391">
+    <w:abstractNumId w:val="3"/>
+  </w:num>
+  <w:num w:numId="100" w16cid:durableId="1160345402">
+    <w:abstractNumId w:val="3"/>
+  </w:num>
+  <w:num w:numId="101" w16cid:durableId="3358748">
+    <w:abstractNumId w:val="3"/>
+  </w:num>
+  <w:num w:numId="102" w16cid:durableId="1410034972">
+    <w:abstractNumId w:val="23"/>
+  </w:num>
+  <w:num w:numId="103" w16cid:durableId="1684091492">
+    <w:abstractNumId w:val="3"/>
+  </w:num>
+  <w:num w:numId="104" w16cid:durableId="304744141">
+    <w:abstractNumId w:val="3"/>
+  </w:num>
+  <w:num w:numId="105" w16cid:durableId="900675759">
+    <w:abstractNumId w:val="3"/>
+  </w:num>
+  <w:num w:numId="106" w16cid:durableId="105274670">
+    <w:abstractNumId w:val="42"/>
+  </w:num>
+  <w:num w:numId="107" w16cid:durableId="595022119">
+    <w:abstractNumId w:val="3"/>
+  </w:num>
+  <w:num w:numId="108" w16cid:durableId="86659819">
+    <w:abstractNumId w:val="3"/>
+  </w:num>
+  <w:num w:numId="109" w16cid:durableId="709651870">
+    <w:abstractNumId w:val="3"/>
+  </w:num>
+  <w:num w:numId="110" w16cid:durableId="1946813662">
+    <w:abstractNumId w:val="3"/>
+  </w:num>
+  <w:num w:numId="111" w16cid:durableId="1257248572">
+    <w:abstractNumId w:val="3"/>
+  </w:num>
+  <w:num w:numId="112" w16cid:durableId="277033691">
+    <w:abstractNumId w:val="3"/>
+  </w:num>
+  <w:num w:numId="113" w16cid:durableId="1542324837">
+    <w:abstractNumId w:val="3"/>
+  </w:num>
+  <w:num w:numId="114" w16cid:durableId="1266772052">
+    <w:abstractNumId w:val="3"/>
+  </w:num>
+  <w:num w:numId="115" w16cid:durableId="1101949730">
+    <w:abstractNumId w:val="3"/>
+  </w:num>
+  <w:num w:numId="116" w16cid:durableId="1593317511">
+    <w:abstractNumId w:val="3"/>
+  </w:num>
+  <w:num w:numId="117" w16cid:durableId="344405650">
+    <w:abstractNumId w:val="3"/>
+  </w:num>
+  <w:num w:numId="118" w16cid:durableId="2074693580">
+    <w:abstractNumId w:val="3"/>
+  </w:num>
+  <w:num w:numId="119" w16cid:durableId="845755056">
+    <w:abstractNumId w:val="3"/>
+  </w:num>
+  <w:num w:numId="120" w16cid:durableId="883563731">
+    <w:abstractNumId w:val="3"/>
+  </w:num>
+  <w:num w:numId="121" w16cid:durableId="1843205857">
+    <w:abstractNumId w:val="3"/>
+  </w:num>
+  <w:num w:numId="122" w16cid:durableId="34894343">
+    <w:abstractNumId w:val="3"/>
+  </w:num>
+  <w:num w:numId="123" w16cid:durableId="1549224119">
+    <w:abstractNumId w:val="13"/>
+  </w:num>
+  <w:num w:numId="124" w16cid:durableId="589315466">
+    <w:abstractNumId w:val="40"/>
+  </w:num>
+  <w:num w:numId="125" w16cid:durableId="505634470">
+    <w:abstractNumId w:val="18"/>
+  </w:num>
+  <w:num w:numId="126" w16cid:durableId="554318877">
+    <w:abstractNumId w:val="51"/>
+  </w:num>
+  <w:num w:numId="127" w16cid:durableId="866210892">
+    <w:abstractNumId w:val="56"/>
+  </w:num>
+  <w:num w:numId="128" w16cid:durableId="2086762505">
+    <w:abstractNumId w:val="30"/>
+  </w:num>
+  <w:num w:numId="129" w16cid:durableId="317080664">
+    <w:abstractNumId w:val="17"/>
+  </w:num>
+  <w:num w:numId="130" w16cid:durableId="866018878">
+    <w:abstractNumId w:val="35"/>
+  </w:num>
+  <w:num w:numId="131" w16cid:durableId="1347101783">
+    <w:abstractNumId w:val="29"/>
+  </w:num>
+  <w:num w:numId="132" w16cid:durableId="1551114141">
     <w:abstractNumId w:val="44"/>
   </w:num>
-  <w:num w:numId="5" w16cid:durableId="54090542">
-    <w:abstractNumId w:val="6"/>
+  <w:num w:numId="133" w16cid:durableId="985356075">
+    <w:abstractNumId w:val="62"/>
   </w:num>
-  <w:num w:numId="6" w16cid:durableId="236794149">
-    <w:abstractNumId w:val="10"/>
-  </w:num>
-  <w:num w:numId="7" w16cid:durableId="1297445989">
+  <w:num w:numId="134" w16cid:durableId="1475180571">
     <w:abstractNumId w:val="3"/>
   </w:num>
-  <w:num w:numId="8" w16cid:durableId="605771027">
-    <w:abstractNumId w:val="5"/>
+  <w:num w:numId="135" w16cid:durableId="1617953740">
+    <w:abstractNumId w:val="3"/>
   </w:num>
-  <w:num w:numId="9" w16cid:durableId="641925348">
-    <w:abstractNumId w:val="39"/>
+  <w:num w:numId="136" w16cid:durableId="1894657317">
+    <w:abstractNumId w:val="19"/>
   </w:num>
-  <w:num w:numId="10" w16cid:durableId="1405370748">
-    <w:abstractNumId w:val="45"/>
+  <w:num w:numId="137" w16cid:durableId="524949181">
+    <w:abstractNumId w:val="65"/>
   </w:num>
-  <w:num w:numId="11" w16cid:durableId="1782718875">
-    <w:abstractNumId w:val="50"/>
+  <w:num w:numId="138" w16cid:durableId="335764875">
+    <w:abstractNumId w:val="3"/>
   </w:num>
-  <w:num w:numId="12" w16cid:durableId="1867138050">
-    <w:abstractNumId w:val="43"/>
+  <w:num w:numId="139" w16cid:durableId="1719278643">
+    <w:abstractNumId w:val="11"/>
   </w:num>
-  <w:num w:numId="13" w16cid:durableId="1515454589">
-    <w:abstractNumId w:val="6"/>
+  <w:num w:numId="140" w16cid:durableId="81265465">
+    <w:abstractNumId w:val="3"/>
   </w:num>
-  <w:num w:numId="14" w16cid:durableId="1048535536">
-    <w:abstractNumId w:val="6"/>
+  <w:num w:numId="141" w16cid:durableId="1491092367">
+    <w:abstractNumId w:val="3"/>
   </w:num>
-  <w:num w:numId="15" w16cid:durableId="154689950">
-    <w:abstractNumId w:val="6"/>
+  <w:num w:numId="142" w16cid:durableId="1409614168">
+    <w:abstractNumId w:val="3"/>
   </w:num>
-  <w:num w:numId="16" w16cid:durableId="1622687441">
-    <w:abstractNumId w:val="6"/>
+  <w:num w:numId="143" w16cid:durableId="636689497">
+    <w:abstractNumId w:val="3"/>
   </w:num>
-  <w:num w:numId="17" w16cid:durableId="546987107">
-    <w:abstractNumId w:val="6"/>
+  <w:num w:numId="144" w16cid:durableId="1079252313">
+    <w:abstractNumId w:val="3"/>
   </w:num>
-  <w:num w:numId="18" w16cid:durableId="2037077925">
-    <w:abstractNumId w:val="6"/>
+  <w:num w:numId="145" w16cid:durableId="1661888689">
+    <w:abstractNumId w:val="3"/>
   </w:num>
-  <w:num w:numId="19" w16cid:durableId="202911025">
-    <w:abstractNumId w:val="48"/>
+  <w:num w:numId="146" w16cid:durableId="1816411049">
+    <w:abstractNumId w:val="3"/>
   </w:num>
-  <w:num w:numId="20" w16cid:durableId="1163200953">
-    <w:abstractNumId w:val="47"/>
+  <w:num w:numId="147" w16cid:durableId="1511214682">
+    <w:abstractNumId w:val="3"/>
   </w:num>
-  <w:num w:numId="21" w16cid:durableId="887686438">
-    <w:abstractNumId w:val="24"/>
+  <w:num w:numId="148" w16cid:durableId="1256597690">
+    <w:abstractNumId w:val="3"/>
   </w:num>
-  <w:num w:numId="22" w16cid:durableId="359208971">
-    <w:abstractNumId w:val="18"/>
-  </w:num>
-  <w:num w:numId="23" w16cid:durableId="612171986">
-    <w:abstractNumId w:val="14"/>
-  </w:num>
-  <w:num w:numId="24" w16cid:durableId="1913075478">
-    <w:abstractNumId w:val="22"/>
-  </w:num>
-  <w:num w:numId="25" w16cid:durableId="2133286701">
-    <w:abstractNumId w:val="6"/>
-  </w:num>
-  <w:num w:numId="26" w16cid:durableId="881870947">
-    <w:abstractNumId w:val="6"/>
-  </w:num>
-  <w:num w:numId="27" w16cid:durableId="1832214677">
-    <w:abstractNumId w:val="6"/>
-  </w:num>
-  <w:num w:numId="28" w16cid:durableId="1497916287">
-    <w:abstractNumId w:val="6"/>
-  </w:num>
-  <w:num w:numId="29" w16cid:durableId="1617057083">
-    <w:abstractNumId w:val="6"/>
-  </w:num>
-  <w:num w:numId="30" w16cid:durableId="1689064264">
-    <w:abstractNumId w:val="6"/>
-  </w:num>
-  <w:num w:numId="31" w16cid:durableId="384565334">
-    <w:abstractNumId w:val="34"/>
-  </w:num>
-  <w:num w:numId="32" w16cid:durableId="1829705080">
-    <w:abstractNumId w:val="6"/>
-  </w:num>
-  <w:num w:numId="33" w16cid:durableId="496265946">
-    <w:abstractNumId w:val="6"/>
-  </w:num>
-  <w:num w:numId="34" w16cid:durableId="1507741614">
+  <w:num w:numId="149" w16cid:durableId="360205231">
     <w:abstractNumId w:val="0"/>
   </w:num>
-  <w:num w:numId="35" w16cid:durableId="739327860">
-    <w:abstractNumId w:val="6"/>
+  <w:num w:numId="150" w16cid:durableId="1113549932">
+    <w:abstractNumId w:val="3"/>
   </w:num>
-  <w:num w:numId="36" w16cid:durableId="1239092181">
-    <w:abstractNumId w:val="46"/>
+  <w:num w:numId="151" w16cid:durableId="184099635">
+    <w:abstractNumId w:val="3"/>
   </w:num>
-  <w:num w:numId="37" w16cid:durableId="1537350934">
-    <w:abstractNumId w:val="13"/>
+  <w:num w:numId="152" w16cid:durableId="983239053">
+    <w:abstractNumId w:val="3"/>
   </w:num>
-  <w:num w:numId="38" w16cid:durableId="991953662">
-    <w:abstractNumId w:val="1"/>
+  <w:num w:numId="153" w16cid:durableId="1575972187">
+    <w:abstractNumId w:val="3"/>
   </w:num>
-  <w:num w:numId="39" w16cid:durableId="1673140504">
-    <w:abstractNumId w:val="62"/>
+  <w:num w:numId="154" w16cid:durableId="548225888">
+    <w:abstractNumId w:val="3"/>
   </w:num>
-  <w:num w:numId="40" w16cid:durableId="391733110">
-    <w:abstractNumId w:val="32"/>
+  <w:num w:numId="155" w16cid:durableId="1762876805">
+    <w:abstractNumId w:val="3"/>
   </w:num>
-  <w:num w:numId="41" w16cid:durableId="116871802">
-    <w:abstractNumId w:val="57"/>
+  <w:num w:numId="156" w16cid:durableId="546142573">
+    <w:abstractNumId w:val="3"/>
   </w:num>
-  <w:num w:numId="42" w16cid:durableId="1233081910">
-    <w:abstractNumId w:val="26"/>
+  <w:num w:numId="157" w16cid:durableId="778447152">
+    <w:abstractNumId w:val="3"/>
   </w:num>
-  <w:num w:numId="43" w16cid:durableId="700476519">
-    <w:abstractNumId w:val="25"/>
-  </w:num>
-  <w:num w:numId="44" w16cid:durableId="1838155833">
-    <w:abstractNumId w:val="56"/>
-  </w:num>
-  <w:num w:numId="45" w16cid:durableId="548492312">
-    <w:abstractNumId w:val="6"/>
-  </w:num>
-  <w:num w:numId="46" w16cid:durableId="1365449020">
-    <w:abstractNumId w:val="6"/>
-  </w:num>
-  <w:num w:numId="47" w16cid:durableId="58095565">
-    <w:abstractNumId w:val="6"/>
-  </w:num>
-  <w:num w:numId="48" w16cid:durableId="2006975715">
-    <w:abstractNumId w:val="36"/>
-  </w:num>
-  <w:num w:numId="49" w16cid:durableId="79497306">
-    <w:abstractNumId w:val="19"/>
-  </w:num>
-  <w:num w:numId="50" w16cid:durableId="2121415597">
-    <w:abstractNumId w:val="6"/>
-  </w:num>
-  <w:num w:numId="51" w16cid:durableId="1897885630">
-    <w:abstractNumId w:val="6"/>
-  </w:num>
-  <w:num w:numId="52" w16cid:durableId="1785884815">
-    <w:abstractNumId w:val="6"/>
-  </w:num>
-  <w:num w:numId="53" w16cid:durableId="1144083397">
-    <w:abstractNumId w:val="6"/>
-  </w:num>
-  <w:num w:numId="54" w16cid:durableId="201207800">
-    <w:abstractNumId w:val="6"/>
-  </w:num>
-  <w:num w:numId="55" w16cid:durableId="443039468">
-    <w:abstractNumId w:val="6"/>
-  </w:num>
-  <w:num w:numId="56" w16cid:durableId="111629732">
-    <w:abstractNumId w:val="6"/>
-  </w:num>
-  <w:num w:numId="57" w16cid:durableId="1534876872">
-    <w:abstractNumId w:val="59"/>
-  </w:num>
-  <w:num w:numId="58" w16cid:durableId="841630886">
-    <w:abstractNumId w:val="29"/>
-  </w:num>
-  <w:num w:numId="59" w16cid:durableId="147332457">
-    <w:abstractNumId w:val="51"/>
-  </w:num>
-  <w:num w:numId="60" w16cid:durableId="1726952072">
-    <w:abstractNumId w:val="7"/>
-  </w:num>
-  <w:num w:numId="61" w16cid:durableId="1202982037">
-    <w:abstractNumId w:val="12"/>
-  </w:num>
-  <w:num w:numId="62" w16cid:durableId="596136958">
-    <w:abstractNumId w:val="55"/>
-  </w:num>
-  <w:num w:numId="63" w16cid:durableId="1540318805">
-    <w:abstractNumId w:val="53"/>
-  </w:num>
-  <w:num w:numId="64" w16cid:durableId="1383560384">
-    <w:abstractNumId w:val="6"/>
-  </w:num>
-  <w:num w:numId="65" w16cid:durableId="766000792">
-    <w:abstractNumId w:val="2"/>
-  </w:num>
-  <w:num w:numId="66" w16cid:durableId="760642094">
-    <w:abstractNumId w:val="64"/>
-  </w:num>
-  <w:num w:numId="67" w16cid:durableId="1038628803">
-    <w:abstractNumId w:val="2"/>
-  </w:num>
-  <w:num w:numId="68" w16cid:durableId="439568490">
-    <w:abstractNumId w:val="35"/>
-  </w:num>
-  <w:num w:numId="69" w16cid:durableId="516501371">
-    <w:abstractNumId w:val="2"/>
-  </w:num>
-  <w:num w:numId="70" w16cid:durableId="1864905542">
-    <w:abstractNumId w:val="2"/>
-  </w:num>
-  <w:num w:numId="71" w16cid:durableId="1138649261">
-    <w:abstractNumId w:val="4"/>
-  </w:num>
-  <w:num w:numId="72" w16cid:durableId="54014029">
-    <w:abstractNumId w:val="8"/>
-  </w:num>
-  <w:num w:numId="73" w16cid:durableId="536435765">
-    <w:abstractNumId w:val="2"/>
-  </w:num>
-  <w:num w:numId="74" w16cid:durableId="1068264346">
-    <w:abstractNumId w:val="2"/>
-  </w:num>
-  <w:num w:numId="75" w16cid:durableId="1566262037">
-    <w:abstractNumId w:val="2"/>
-  </w:num>
-  <w:num w:numId="76" w16cid:durableId="1944222289">
-    <w:abstractNumId w:val="30"/>
-  </w:num>
-  <w:num w:numId="77" w16cid:durableId="851532290">
-    <w:abstractNumId w:val="2"/>
-  </w:num>
-  <w:num w:numId="78" w16cid:durableId="927810419">
-    <w:abstractNumId w:val="2"/>
-  </w:num>
-  <w:num w:numId="79" w16cid:durableId="1340692222">
-    <w:abstractNumId w:val="2"/>
-  </w:num>
-  <w:num w:numId="80" w16cid:durableId="2016224658">
-    <w:abstractNumId w:val="20"/>
-  </w:num>
-  <w:num w:numId="81" w16cid:durableId="1654215340">
-    <w:abstractNumId w:val="52"/>
-  </w:num>
-  <w:num w:numId="82" w16cid:durableId="1724140020">
-    <w:abstractNumId w:val="2"/>
-  </w:num>
-  <w:num w:numId="83" w16cid:durableId="495850546">
-    <w:abstractNumId w:val="61"/>
-  </w:num>
-  <w:num w:numId="84" w16cid:durableId="1918049249">
-    <w:abstractNumId w:val="31"/>
-  </w:num>
-  <w:num w:numId="85" w16cid:durableId="766343421">
-    <w:abstractNumId w:val="23"/>
-  </w:num>
-  <w:num w:numId="86" w16cid:durableId="1498769241">
-    <w:abstractNumId w:val="2"/>
-  </w:num>
-  <w:num w:numId="87" w16cid:durableId="1359812244">
-    <w:abstractNumId w:val="2"/>
-  </w:num>
-  <w:num w:numId="88" w16cid:durableId="2136481363">
-    <w:abstractNumId w:val="2"/>
-  </w:num>
-  <w:num w:numId="89" w16cid:durableId="405107229">
-    <w:abstractNumId w:val="2"/>
-  </w:num>
-  <w:num w:numId="90" w16cid:durableId="1787574365">
-    <w:abstractNumId w:val="2"/>
-  </w:num>
-  <w:num w:numId="91" w16cid:durableId="602880272">
-    <w:abstractNumId w:val="2"/>
-  </w:num>
-  <w:num w:numId="92" w16cid:durableId="291137230">
-    <w:abstractNumId w:val="2"/>
-  </w:num>
-  <w:num w:numId="93" w16cid:durableId="1285648576">
-    <w:abstractNumId w:val="2"/>
-  </w:num>
-  <w:num w:numId="94" w16cid:durableId="53281645">
-    <w:abstractNumId w:val="2"/>
-  </w:num>
-  <w:num w:numId="95" w16cid:durableId="240875848">
-    <w:abstractNumId w:val="2"/>
-  </w:num>
-  <w:num w:numId="96" w16cid:durableId="1453861316">
-    <w:abstractNumId w:val="9"/>
-  </w:num>
-  <w:num w:numId="97" w16cid:durableId="1352803074">
-    <w:abstractNumId w:val="2"/>
-  </w:num>
-  <w:num w:numId="98" w16cid:durableId="864907344">
-    <w:abstractNumId w:val="37"/>
-  </w:num>
-  <w:num w:numId="99" w16cid:durableId="1526208391">
-    <w:abstractNumId w:val="2"/>
-  </w:num>
-  <w:num w:numId="100" w16cid:durableId="1160345402">
-    <w:abstractNumId w:val="2"/>
-  </w:num>
-  <w:num w:numId="101" w16cid:durableId="3358748">
-    <w:abstractNumId w:val="2"/>
-  </w:num>
-  <w:num w:numId="102" w16cid:durableId="1410034972">
-    <w:abstractNumId w:val="21"/>
-  </w:num>
-  <w:num w:numId="103" w16cid:durableId="1684091492">
-    <w:abstractNumId w:val="2"/>
-  </w:num>
-  <w:num w:numId="104" w16cid:durableId="304744141">
-    <w:abstractNumId w:val="2"/>
-  </w:num>
-  <w:num w:numId="105" w16cid:durableId="900675759">
-    <w:abstractNumId w:val="2"/>
-  </w:num>
-  <w:num w:numId="106" w16cid:durableId="105274670">
-    <w:abstractNumId w:val="40"/>
-  </w:num>
-  <w:num w:numId="107" w16cid:durableId="595022119">
-    <w:abstractNumId w:val="2"/>
-  </w:num>
-  <w:num w:numId="108" w16cid:durableId="86659819">
-    <w:abstractNumId w:val="2"/>
-  </w:num>
-  <w:num w:numId="109" w16cid:durableId="709651870">
-    <w:abstractNumId w:val="2"/>
-  </w:num>
-  <w:num w:numId="110" w16cid:durableId="1946813662">
-    <w:abstractNumId w:val="2"/>
-  </w:num>
-  <w:num w:numId="111" w16cid:durableId="1257248572">
-    <w:abstractNumId w:val="2"/>
-  </w:num>
-  <w:num w:numId="112" w16cid:durableId="277033691">
-    <w:abstractNumId w:val="2"/>
-  </w:num>
-  <w:num w:numId="113" w16cid:durableId="1542324837">
-    <w:abstractNumId w:val="2"/>
-  </w:num>
-  <w:num w:numId="114" w16cid:durableId="1266772052">
-    <w:abstractNumId w:val="2"/>
-  </w:num>
-  <w:num w:numId="115" w16cid:durableId="1101949730">
-    <w:abstractNumId w:val="2"/>
-  </w:num>
-  <w:num w:numId="116" w16cid:durableId="1593317511">
-    <w:abstractNumId w:val="2"/>
-  </w:num>
-  <w:num w:numId="117" w16cid:durableId="344405650">
-    <w:abstractNumId w:val="2"/>
-  </w:num>
-  <w:num w:numId="118" w16cid:durableId="2074693580">
-    <w:abstractNumId w:val="2"/>
-  </w:num>
-  <w:num w:numId="119" w16cid:durableId="845755056">
-    <w:abstractNumId w:val="2"/>
-  </w:num>
-  <w:num w:numId="120" w16cid:durableId="883563731">
-    <w:abstractNumId w:val="2"/>
-  </w:num>
-  <w:num w:numId="121" w16cid:durableId="1843205857">
-    <w:abstractNumId w:val="2"/>
-  </w:num>
-  <w:num w:numId="122" w16cid:durableId="34894343">
-    <w:abstractNumId w:val="2"/>
-  </w:num>
-  <w:num w:numId="123" w16cid:durableId="1549224119">
-    <w:abstractNumId w:val="11"/>
-  </w:num>
-  <w:num w:numId="124" w16cid:durableId="589315466">
-    <w:abstractNumId w:val="38"/>
-  </w:num>
-  <w:num w:numId="125" w16cid:durableId="505634470">
-    <w:abstractNumId w:val="16"/>
-  </w:num>
-  <w:num w:numId="126" w16cid:durableId="554318877">
-    <w:abstractNumId w:val="49"/>
-  </w:num>
-  <w:num w:numId="127" w16cid:durableId="866210892">
-    <w:abstractNumId w:val="54"/>
-  </w:num>
-  <w:num w:numId="128" w16cid:durableId="2086762505">
-    <w:abstractNumId w:val="28"/>
-  </w:num>
-  <w:num w:numId="129" w16cid:durableId="317080664">
-    <w:abstractNumId w:val="15"/>
-  </w:num>
-  <w:num w:numId="130" w16cid:durableId="866018878">
-    <w:abstractNumId w:val="33"/>
-  </w:num>
-  <w:num w:numId="131" w16cid:durableId="1347101783">
-    <w:abstractNumId w:val="27"/>
-  </w:num>
-  <w:num w:numId="132" w16cid:durableId="1551114141">
-    <w:abstractNumId w:val="42"/>
-  </w:num>
-  <w:num w:numId="133" w16cid:durableId="985356075">
-    <w:abstractNumId w:val="60"/>
-  </w:num>
-  <w:num w:numId="134" w16cid:durableId="1475180571">
-    <w:abstractNumId w:val="2"/>
-  </w:num>
-  <w:num w:numId="135" w16cid:durableId="1617953740">
-    <w:abstractNumId w:val="2"/>
-  </w:num>
-  <w:num w:numId="136" w16cid:durableId="1894657317">
-    <w:abstractNumId w:val="17"/>
-  </w:num>
-  <w:num w:numId="137" w16cid:durableId="524949181">
-    <w:abstractNumId w:val="63"/>
+  <w:num w:numId="158" w16cid:durableId="1997495800">
+    <w:abstractNumId w:val="3"/>
   </w:num>
 </w:numbering>
 </file>
@@ -31147,40 +32799,16 @@
 </file>
 
 <file path=customXml/item1.xml><?xml version="1.0" encoding="utf-8"?>
+<b:Sources xmlns:b="http://schemas.openxmlformats.org/officeDocument/2006/bibliography" xmlns="http://schemas.openxmlformats.org/officeDocument/2006/bibliography" SelectedStyle="\APASixthEditionOfficeOnline.xsl" StyleName="APA" Version="6"/>
+</file>
+
+<file path=customXml/item2.xml><?xml version="1.0" encoding="utf-8"?>
 <?mso-contentType ?>
 <FormTemplates xmlns="http://schemas.microsoft.com/sharepoint/v3/contenttype/forms">
   <Display>DocumentLibraryForm</Display>
   <Edit>DocumentLibraryForm</Edit>
   <New>DocumentLibraryForm</New>
 </FormTemplates>
-</file>
-
-<file path=customXml/item2.xml><?xml version="1.0" encoding="utf-8"?>
-<p:properties xmlns:p="http://schemas.microsoft.com/office/2006/metadata/properties" xmlns:xsi="http://www.w3.org/2001/XMLSchema-instance" xmlns:pc="http://schemas.microsoft.com/office/infopath/2007/PartnerControls">
-  <documentManagement>
-    <GDDescripcion xmlns="ef848eef-985f-4e5f-af94-9b10d2c40a72" xsi:nil="true"/>
-    <N_x00ba_versi_x00f3_n xmlns="17bdaf06-e97e-4c95-a053-70575cfc447b">2</N_x00ba_versi_x00f3_n>
-    <Tipo_x0020_de_x0020_Servicio xmlns="ef848eef-985f-4e5f-af94-9b10d2c40a72" xsi:nil="true"/>
-    <WEB xmlns="17bdaf06-e97e-4c95-a053-70575cfc447b">false</WEB>
-    <Evaluación xmlns="ef848eef-985f-4e5f-af94-9b10d2c40a72" xsi:nil="true"/>
-    <VIGENTE0 xmlns="17bdaf06-e97e-4c95-a053-70575cfc447b">SI</VIGENTE0>
-    <Motivobaja xmlns="17bdaf06-e97e-4c95-a053-70575cfc447b">Se genera una nueva versión para no dar lugar a confusión al estudiantado si lee que hay 2 modalidades de TFT evitando así posibles incidencias.</Motivobaja>
-    <Fechabaja xmlns="17bdaf06-e97e-4c95-a053-70575cfc447b" xsi:nil="true"/>
-    <Responsable_x0020_ xmlns="ef848eef-985f-4e5f-af94-9b10d2c40a72" xsi:nil="true"/>
-    <Fechaalta xmlns="17bdaf06-e97e-4c95-a053-70575cfc447b">2025-05-28T07:00:00+00:00</Fechaalta>
-    <TIPODOC xmlns="17bdaf06-e97e-4c95-a053-70575cfc447b">Formato</TIPODOC>
-    <_x00da_ltimarevisi_x00f3_n xmlns="17bdaf06-e97e-4c95-a053-70575cfc447b" xsi:nil="true"/>
-    <N_x00ba__x0020_de_x0020_Incidencias_x0020_ xmlns="ef848eef-985f-4e5f-af94-9b10d2c40a72" xsi:nil="true"/>
-    <GDAsuntoF3 xmlns="ef848eef-985f-4e5f-af94-9b10d2c40a72" xsi:nil="true"/>
-    <Homologado_x0020_por xmlns="ef848eef-985f-4e5f-af94-9b10d2c40a72" xsi:nil="true"/>
-    <Vigente xmlns="ef848eef-985f-4e5f-af94-9b10d2c40a72">true</Vigente>
-    <PROCESO xmlns="17bdaf06-e97e-4c95-a053-70575cfc447b">P11_ DESARROLLO DOCENCIA</PROCESO>
-    <Fecha_x0020_Firma xmlns="ef848eef-985f-4e5f-af94-9b10d2c40a72" xsi:nil="true"/>
-    <GDTipoDoc xmlns="ef848eef-985f-4e5f-af94-9b10d2c40a72" xsi:nil="true"/>
-    <GDUBFisica xmlns="ef848eef-985f-4e5f-af94-9b10d2c40a72" xsi:nil="true"/>
-    <AYUDAPDI xmlns="17bdaf06-e97e-4c95-a053-70575cfc447b">false</AYUDAPDI>
-  </documentManagement>
-</p:properties>
 </file>
 
 <file path=customXml/item3.xml><?xml version="1.0" encoding="utf-8"?>
@@ -31628,24 +33256,45 @@
 </file>
 
 <file path=customXml/item4.xml><?xml version="1.0" encoding="utf-8"?>
-<b:Sources xmlns:b="http://schemas.openxmlformats.org/officeDocument/2006/bibliography" xmlns="http://schemas.openxmlformats.org/officeDocument/2006/bibliography" SelectedStyle="\APASixthEditionOfficeOnline.xsl" StyleName="APA" Version="6"/>
+<p:properties xmlns:p="http://schemas.microsoft.com/office/2006/metadata/properties" xmlns:xsi="http://www.w3.org/2001/XMLSchema-instance" xmlns:pc="http://schemas.microsoft.com/office/infopath/2007/PartnerControls">
+  <documentManagement>
+    <GDDescripcion xmlns="ef848eef-985f-4e5f-af94-9b10d2c40a72" xsi:nil="true"/>
+    <N_x00ba_versi_x00f3_n xmlns="17bdaf06-e97e-4c95-a053-70575cfc447b">2</N_x00ba_versi_x00f3_n>
+    <Tipo_x0020_de_x0020_Servicio xmlns="ef848eef-985f-4e5f-af94-9b10d2c40a72" xsi:nil="true"/>
+    <WEB xmlns="17bdaf06-e97e-4c95-a053-70575cfc447b">false</WEB>
+    <Evaluación xmlns="ef848eef-985f-4e5f-af94-9b10d2c40a72" xsi:nil="true"/>
+    <VIGENTE0 xmlns="17bdaf06-e97e-4c95-a053-70575cfc447b">SI</VIGENTE0>
+    <Motivobaja xmlns="17bdaf06-e97e-4c95-a053-70575cfc447b">Se genera una nueva versión para no dar lugar a confusión al estudiantado si lee que hay 2 modalidades de TFT evitando así posibles incidencias.</Motivobaja>
+    <Fechabaja xmlns="17bdaf06-e97e-4c95-a053-70575cfc447b" xsi:nil="true"/>
+    <Responsable_x0020_ xmlns="ef848eef-985f-4e5f-af94-9b10d2c40a72" xsi:nil="true"/>
+    <Fechaalta xmlns="17bdaf06-e97e-4c95-a053-70575cfc447b">2025-05-28T07:00:00+00:00</Fechaalta>
+    <TIPODOC xmlns="17bdaf06-e97e-4c95-a053-70575cfc447b">Formato</TIPODOC>
+    <_x00da_ltimarevisi_x00f3_n xmlns="17bdaf06-e97e-4c95-a053-70575cfc447b" xsi:nil="true"/>
+    <N_x00ba__x0020_de_x0020_Incidencias_x0020_ xmlns="ef848eef-985f-4e5f-af94-9b10d2c40a72" xsi:nil="true"/>
+    <GDAsuntoF3 xmlns="ef848eef-985f-4e5f-af94-9b10d2c40a72" xsi:nil="true"/>
+    <Homologado_x0020_por xmlns="ef848eef-985f-4e5f-af94-9b10d2c40a72" xsi:nil="true"/>
+    <Vigente xmlns="ef848eef-985f-4e5f-af94-9b10d2c40a72">true</Vigente>
+    <PROCESO xmlns="17bdaf06-e97e-4c95-a053-70575cfc447b">P11_ DESARROLLO DOCENCIA</PROCESO>
+    <Fecha_x0020_Firma xmlns="ef848eef-985f-4e5f-af94-9b10d2c40a72" xsi:nil="true"/>
+    <GDTipoDoc xmlns="ef848eef-985f-4e5f-af94-9b10d2c40a72" xsi:nil="true"/>
+    <GDUBFisica xmlns="ef848eef-985f-4e5f-af94-9b10d2c40a72" xsi:nil="true"/>
+    <AYUDAPDI xmlns="17bdaf06-e97e-4c95-a053-70575cfc447b">false</AYUDAPDI>
+  </documentManagement>
+</p:properties>
 </file>
 
 <file path=customXml/itemProps1.xml><?xml version="1.0" encoding="utf-8"?>
-<ds:datastoreItem xmlns:ds="http://schemas.openxmlformats.org/officeDocument/2006/customXml" ds:itemID="{D2E34552-30F1-4197-AD08-9874EE871786}">
+<ds:datastoreItem xmlns:ds="http://schemas.openxmlformats.org/officeDocument/2006/customXml" ds:itemID="{D63F4731-4595-44D5-887D-AE208B5F9D7E}">
   <ds:schemaRefs>
-    <ds:schemaRef ds:uri="http://schemas.microsoft.com/sharepoint/v3/contenttype/forms"/>
+    <ds:schemaRef ds:uri="http://schemas.openxmlformats.org/officeDocument/2006/bibliography"/>
   </ds:schemaRefs>
 </ds:datastoreItem>
 </file>
 
 <file path=customXml/itemProps2.xml><?xml version="1.0" encoding="utf-8"?>
-<ds:datastoreItem xmlns:ds="http://schemas.openxmlformats.org/officeDocument/2006/customXml" ds:itemID="{07A964DA-14FF-4E77-85C4-CF3717E496CA}">
+<ds:datastoreItem xmlns:ds="http://schemas.openxmlformats.org/officeDocument/2006/customXml" ds:itemID="{D2E34552-30F1-4197-AD08-9874EE871786}">
   <ds:schemaRefs>
-    <ds:schemaRef ds:uri="http://schemas.microsoft.com/office/2006/metadata/properties"/>
-    <ds:schemaRef ds:uri="http://schemas.microsoft.com/office/infopath/2007/PartnerControls"/>
-    <ds:schemaRef ds:uri="ef848eef-985f-4e5f-af94-9b10d2c40a72"/>
-    <ds:schemaRef ds:uri="17bdaf06-e97e-4c95-a053-70575cfc447b"/>
+    <ds:schemaRef ds:uri="http://schemas.microsoft.com/sharepoint/v3/contenttype/forms"/>
   </ds:schemaRefs>
 </ds:datastoreItem>
 </file>
@@ -31670,9 +33319,12 @@
 </file>
 
 <file path=customXml/itemProps4.xml><?xml version="1.0" encoding="utf-8"?>
-<ds:datastoreItem xmlns:ds="http://schemas.openxmlformats.org/officeDocument/2006/customXml" ds:itemID="{D63F4731-4595-44D5-887D-AE208B5F9D7E}">
+<ds:datastoreItem xmlns:ds="http://schemas.openxmlformats.org/officeDocument/2006/customXml" ds:itemID="{07A964DA-14FF-4E77-85C4-CF3717E496CA}">
   <ds:schemaRefs>
-    <ds:schemaRef ds:uri="http://schemas.openxmlformats.org/officeDocument/2006/bibliography"/>
+    <ds:schemaRef ds:uri="http://schemas.microsoft.com/office/2006/metadata/properties"/>
+    <ds:schemaRef ds:uri="http://schemas.microsoft.com/office/infopath/2007/PartnerControls"/>
+    <ds:schemaRef ds:uri="ef848eef-985f-4e5f-af94-9b10d2c40a72"/>
+    <ds:schemaRef ds:uri="17bdaf06-e97e-4c95-a053-70575cfc447b"/>
   </ds:schemaRefs>
 </ds:datastoreItem>
 </file>
</xml_diff>

<commit_message>
docs: actualizar memoria TFM 15MUIN E2
</commit_message>
<xml_diff>
--- a/CARPETA COMPARTIDA TUTOR/15MUIN E2 MOYA MARIN SERGIO.docx
+++ b/CARPETA COMPARTIDA TUTOR/15MUIN E2 MOYA MARIN SERGIO.docx
@@ -6091,6 +6091,9 @@
       <w:bookmarkEnd w:id="3"/>
       <w:commentRangeStart w:id="5"/>
       <w:commentRangeStart w:id="6"/>
+      <w:commentRangeStart w:id="7"/>
+      <w:commentRangeStart w:id="8"/>
+      <w:commentRangeStart w:id="9"/>
       <w:r>
         <w:rPr>
           <w:rFonts w:ascii="Arial" w:hAnsi="Arial"/>
@@ -6125,6 +6128,42 @@
         </w:rPr>
         <w:commentReference w:id="6"/>
       </w:r>
+      <w:commentRangeEnd w:id="7"/>
+      <w:r>
+        <w:rPr>
+          <w:rStyle w:val="Refdecomentario"/>
+          <w:rFonts w:ascii="Arial" w:hAnsi="Arial"/>
+          <w:b/>
+          <w:bCs/>
+          <w:sz w:val="44"/>
+          <w:szCs w:val="36"/>
+        </w:rPr>
+        <w:commentReference w:id="7"/>
+      </w:r>
+      <w:commentRangeEnd w:id="8"/>
+      <w:r>
+        <w:rPr>
+          <w:rStyle w:val="Refdecomentario"/>
+          <w:rFonts w:ascii="Arial" w:hAnsi="Arial"/>
+          <w:b/>
+          <w:bCs/>
+          <w:sz w:val="44"/>
+          <w:szCs w:val="36"/>
+        </w:rPr>
+        <w:commentReference w:id="8"/>
+      </w:r>
+      <w:commentRangeEnd w:id="9"/>
+      <w:r>
+        <w:rPr>
+          <w:rStyle w:val="Refdecomentario"/>
+          <w:rFonts w:ascii="Arial" w:hAnsi="Arial"/>
+          <w:b/>
+          <w:bCs/>
+          <w:sz w:val="44"/>
+          <w:szCs w:val="36"/>
+        </w:rPr>
+        <w:commentReference w:id="9"/>
+      </w:r>
     </w:p>
     <w:p>
       <w:pPr>
@@ -6149,30 +6188,30 @@
       <w:pPr>
         <w:pStyle w:val="Ttulo2"/>
       </w:pPr>
-      <w:bookmarkStart w:id="7" w:name="_Toc222931098"/>
-      <w:commentRangeStart w:id="8"/>
-      <w:commentRangeStart w:id="9"/>
+      <w:bookmarkStart w:id="10" w:name="_Toc222931098"/>
+      <w:commentRangeStart w:id="11"/>
+      <w:commentRangeStart w:id="12"/>
       <w:r>
         <w:t>Contexto y Problemática</w:t>
       </w:r>
-      <w:bookmarkEnd w:id="7"/>
-      <w:commentRangeEnd w:id="8"/>
+      <w:bookmarkEnd w:id="10"/>
+      <w:commentRangeEnd w:id="11"/>
       <w:r>
         <w:rPr>
           <w:rStyle w:val="Refdecomentario"/>
           <w:sz w:val="32"/>
           <w:szCs w:val="32"/>
         </w:rPr>
-        <w:commentReference w:id="8"/>
-      </w:r>
-      <w:commentRangeEnd w:id="9"/>
+        <w:commentReference w:id="11"/>
+      </w:r>
+      <w:commentRangeEnd w:id="12"/>
       <w:r>
         <w:rPr>
           <w:rStyle w:val="Refdecomentario"/>
           <w:sz w:val="32"/>
           <w:szCs w:val="32"/>
         </w:rPr>
-        <w:commentReference w:id="9"/>
+        <w:commentReference w:id="12"/>
       </w:r>
     </w:p>
     <w:p>
@@ -6287,11 +6326,11 @@
       <w:pPr>
         <w:pStyle w:val="Ttulo2"/>
       </w:pPr>
-      <w:bookmarkStart w:id="10" w:name="_Toc222931099"/>
+      <w:bookmarkStart w:id="13" w:name="_Toc222931099"/>
       <w:r>
         <w:t>La Brecha entre Precisión y Explicabilidad</w:t>
       </w:r>
-      <w:bookmarkEnd w:id="10"/>
+      <w:bookmarkEnd w:id="13"/>
     </w:p>
     <w:p>
       <w:pPr>
@@ -6373,11 +6412,11 @@
       <w:pPr>
         <w:pStyle w:val="Ttulo2"/>
       </w:pPr>
-      <w:bookmarkStart w:id="11" w:name="_Toc222931100"/>
+      <w:bookmarkStart w:id="14" w:name="_Toc222931100"/>
       <w:r>
         <w:t>Justificación y Enfoque Metodológico</w:t>
       </w:r>
-      <w:bookmarkEnd w:id="11"/>
+      <w:bookmarkEnd w:id="14"/>
     </w:p>
     <w:p>
       <w:pPr>
@@ -6479,11 +6518,11 @@
       <w:pPr>
         <w:pStyle w:val="Ttulo2"/>
       </w:pPr>
-      <w:bookmarkStart w:id="12" w:name="_Toc222931101"/>
+      <w:bookmarkStart w:id="15" w:name="_Toc222931101"/>
       <w:r>
         <w:t>Objetivos del Estudio</w:t>
       </w:r>
-      <w:bookmarkEnd w:id="12"/>
+      <w:bookmarkEnd w:id="15"/>
     </w:p>
     <w:p>
       <w:pPr>
@@ -6633,12 +6672,22 @@
       <w:pPr>
         <w:pStyle w:val="Ttulo2"/>
       </w:pPr>
-      <w:bookmarkStart w:id="13" w:name="_Toc222931102"/>
+      <w:bookmarkStart w:id="16" w:name="_Toc222931102"/>
+      <w:commentRangeStart w:id="17"/>
       <w:r>
         <w:lastRenderedPageBreak/>
         <w:t>Limitaciones y Riesgos del Enfoque</w:t>
       </w:r>
-      <w:bookmarkEnd w:id="13"/>
+      <w:bookmarkEnd w:id="16"/>
+      <w:commentRangeEnd w:id="17"/>
+      <w:r>
+        <w:rPr>
+          <w:rStyle w:val="Refdecomentario"/>
+          <w:sz w:val="32"/>
+          <w:szCs w:val="32"/>
+        </w:rPr>
+        <w:commentReference w:id="17"/>
+      </w:r>
     </w:p>
     <w:p>
       <w:pPr>
@@ -6677,7 +6726,7 @@
           <w:rFonts w:ascii="Arial" w:hAnsi="Arial"/>
         </w:rPr>
       </w:pPr>
-      <w:commentRangeStart w:id="14"/>
+      <w:commentRangeStart w:id="18"/>
       <w:r>
         <w:rPr>
           <w:rFonts w:ascii="Arial" w:hAnsi="Arial"/>
@@ -6710,7 +6759,7 @@
         </w:rPr>
         <w:t>:</w:t>
       </w:r>
-      <w:commentRangeEnd w:id="14"/>
+      <w:commentRangeEnd w:id="18"/>
       <w:r>
         <w:rPr>
           <w:rStyle w:val="Refdecomentario"/>
@@ -6718,7 +6767,7 @@
           <w:sz w:val="22"/>
           <w:szCs w:val="22"/>
         </w:rPr>
-        <w:commentReference w:id="14"/>
+        <w:commentReference w:id="18"/>
       </w:r>
     </w:p>
     <w:p>
@@ -7048,11 +7097,11 @@
       <w:pPr>
         <w:pStyle w:val="Ttulo2"/>
       </w:pPr>
-      <w:bookmarkStart w:id="15" w:name="_Toc222931103"/>
+      <w:bookmarkStart w:id="19" w:name="_Toc222931103"/>
       <w:r>
         <w:t>Contribuciones Principales del Trabajo</w:t>
       </w:r>
-      <w:bookmarkEnd w:id="15"/>
+      <w:bookmarkEnd w:id="19"/>
     </w:p>
     <w:p>
       <w:pPr>
@@ -7105,10 +7154,18 @@
       <w:r>
         <w:rPr>
           <w:rFonts w:ascii="Arial" w:hAnsi="Arial"/>
+          <w:b/>
+          <w:bCs/>
+        </w:rPr>
+        <w:t>Hipótesis</w:t>
+      </w:r>
+      <w:r>
+        <w:rPr>
+          <w:rFonts w:ascii="Arial" w:hAnsi="Arial"/>
           <w:i/>
           <w:iCs/>
         </w:rPr>
-        <w:t>Hipótesis:</w:t>
+        <w:t>:</w:t>
       </w:r>
       <w:r>
         <w:rPr>
@@ -7132,10 +7189,18 @@
       <w:r>
         <w:rPr>
           <w:rFonts w:ascii="Arial" w:hAnsi="Arial"/>
+          <w:b/>
+          <w:bCs/>
+        </w:rPr>
+        <w:t>Contribución</w:t>
+      </w:r>
+      <w:r>
+        <w:rPr>
+          <w:rFonts w:ascii="Arial" w:hAnsi="Arial"/>
           <w:i/>
           <w:iCs/>
         </w:rPr>
-        <w:t>Contribución:</w:t>
+        <w:t>:</w:t>
       </w:r>
       <w:r>
         <w:rPr>
@@ -7266,7 +7331,13 @@
           <w:i/>
           <w:iCs/>
         </w:rPr>
-        <w:t>Hipótesis: A menudo se asume en la literatura que el desbalance extremo (0.17%) requiere obligatoriamente aplicar técnicas complejas de generación de datos sintéticos (como SMOTE o ADASYN) para que el modelo logre aprender.</w:t>
+        <w:t xml:space="preserve">Hipótesis: </w:t>
+      </w:r>
+      <w:r>
+        <w:rPr>
+          <w:rFonts w:ascii="Arial" w:hAnsi="Arial"/>
+        </w:rPr>
+        <w:t>A menudo se asume en la literatura que el desbalance extremo (0.17%) requiere obligatoriamente aplicar técnicas complejas de generación de datos sintéticos (como SMOTE o ADASYN) para que el modelo logre aprender.</w:t>
       </w:r>
     </w:p>
     <w:p>
@@ -7289,7 +7360,13 @@
           <w:i/>
           <w:iCs/>
         </w:rPr>
-        <w:t>Contribución: El estudio cuestiona la necesidad de inyectar datos artificiales que aumentan la complejidad y el riesgo de fuga de información. Se demuestra empíricamente que la simplificación del espacio de datos mediante un submuestreo controlado de la clase mayoritaria (ratio 5:1), combinada con la optimización de arquitecturas de Gradient Boosting, supera operativamente a las técnicas de sobremuestreo sintético. Esta estrategia maximiza la métrica de negocio (Card Precision@100) reduciendo drásticamente la carga computacional, validando un enfoque más ágil y realista frente a la complejidad del estado del arte.</w:t>
+        <w:t xml:space="preserve">Contribución: </w:t>
+      </w:r>
+      <w:r>
+        <w:rPr>
+          <w:rFonts w:ascii="Arial" w:hAnsi="Arial"/>
+        </w:rPr>
+        <w:t>El estudio cuestiona la necesidad de inyectar datos artificiales que aumentan la complejidad y el riesgo de fuga de información. Se demuestra empíricamente que la simplificación del espacio de datos mediante un submuestreo controlado de la clase mayoritaria (ratio 5:1), combinada con la optimización de arquitecturas de Gradient Boosting, supera operativamente a las técnicas de sobremuestreo sintético. Esta estrategia maximiza la métrica de negocio (Card Precision@100) reduciendo drásticamente la carga computacional, validando un enfoque más ágil y realista frente a la complejidad del estado del arte.</w:t>
       </w:r>
     </w:p>
     <w:p>
@@ -7356,8 +7433,8 @@
       <w:r>
         <w:rPr>
           <w:rFonts w:ascii="Arial" w:hAnsi="Arial"/>
-          <w:b/>
-          <w:bCs/>
+          <w:i/>
+          <w:iCs/>
         </w:rPr>
         <w:t>SHAP</w:t>
       </w:r>
@@ -7418,7 +7495,7 @@
           <w:bCs/>
         </w:rPr>
       </w:pPr>
-      <w:bookmarkStart w:id="16" w:name="_Toc222931104"/>
+      <w:bookmarkStart w:id="20" w:name="_Toc222931104"/>
       <w:r>
         <w:rPr>
           <w:rFonts w:ascii="Arial" w:hAnsi="Arial"/>
@@ -7444,7 +7521,7 @@
         </w:rPr>
         <w:t xml:space="preserve"> Marco Teórico</w:t>
       </w:r>
-      <w:bookmarkEnd w:id="16"/>
+      <w:bookmarkEnd w:id="20"/>
     </w:p>
     <w:p>
       <w:pPr>
@@ -7504,11 +7581,11 @@
       <w:pPr>
         <w:pStyle w:val="Ttulo2"/>
       </w:pPr>
-      <w:bookmarkStart w:id="17" w:name="_Toc222931105"/>
+      <w:bookmarkStart w:id="21" w:name="_Toc222931105"/>
       <w:r>
         <w:t>Naturaleza del Problema: Desbalance Extremo y Concept Drift</w:t>
       </w:r>
-      <w:bookmarkEnd w:id="17"/>
+      <w:bookmarkEnd w:id="21"/>
     </w:p>
     <w:p>
       <w:pPr>
@@ -7580,11 +7657,11 @@
       <w:pPr>
         <w:pStyle w:val="Ttulo2"/>
       </w:pPr>
-      <w:bookmarkStart w:id="18" w:name="_Toc222931106"/>
+      <w:bookmarkStart w:id="22" w:name="_Toc222931106"/>
       <w:r>
         <w:t>Paradigmas de Aprendizaje: Clasificación Supervisada vs. Detección de Anomalías</w:t>
       </w:r>
-      <w:bookmarkEnd w:id="18"/>
+      <w:bookmarkEnd w:id="22"/>
     </w:p>
     <w:p>
       <w:pPr>
@@ -7785,20 +7862,20 @@
       <w:pPr>
         <w:pStyle w:val="Ttulo2"/>
       </w:pPr>
-      <w:bookmarkStart w:id="19" w:name="_Toc222931107"/>
-      <w:commentRangeStart w:id="20"/>
+      <w:bookmarkStart w:id="23" w:name="_Toc222931107"/>
+      <w:commentRangeStart w:id="24"/>
       <w:r>
         <w:t>La Problemática de la Validación y el Data Leakage</w:t>
       </w:r>
-      <w:bookmarkEnd w:id="19"/>
-      <w:commentRangeEnd w:id="20"/>
+      <w:bookmarkEnd w:id="23"/>
+      <w:commentRangeEnd w:id="24"/>
       <w:r>
         <w:rPr>
           <w:rStyle w:val="Refdecomentario"/>
           <w:sz w:val="32"/>
           <w:szCs w:val="32"/>
         </w:rPr>
-        <w:commentReference w:id="20"/>
+        <w:commentReference w:id="24"/>
       </w:r>
     </w:p>
     <w:p>
@@ -8078,11 +8155,11 @@
       <w:pPr>
         <w:pStyle w:val="Ttulo2"/>
       </w:pPr>
-      <w:bookmarkStart w:id="21" w:name="_Toc222931108"/>
+      <w:bookmarkStart w:id="25" w:name="_Toc222931108"/>
       <w:r>
         <w:t>Inteligencia Artificial Explicable (XAI): Superando la Caja Negra</w:t>
       </w:r>
-      <w:bookmarkEnd w:id="21"/>
+      <w:bookmarkEnd w:id="25"/>
     </w:p>
     <w:p>
       <w:pPr>
@@ -8408,9 +8485,10 @@
           <w:bCs/>
         </w:rPr>
       </w:pPr>
-      <w:bookmarkStart w:id="22" w:name="_Toc222931109"/>
-      <w:commentRangeStart w:id="23"/>
-      <w:commentRangeStart w:id="24"/>
+      <w:bookmarkStart w:id="26" w:name="_Toc222931109"/>
+      <w:commentRangeStart w:id="27"/>
+      <w:commentRangeStart w:id="28"/>
+      <w:commentRangeStart w:id="29"/>
       <w:r>
         <w:rPr>
           <w:rFonts w:ascii="Arial" w:hAnsi="Arial"/>
@@ -8420,8 +8498,8 @@
         <w:lastRenderedPageBreak/>
         <w:t>Metodología</w:t>
       </w:r>
-      <w:bookmarkEnd w:id="22"/>
-      <w:commentRangeEnd w:id="23"/>
+      <w:bookmarkEnd w:id="26"/>
+      <w:commentRangeEnd w:id="27"/>
       <w:r>
         <w:rPr>
           <w:rStyle w:val="Refdecomentario"/>
@@ -8431,9 +8509,9 @@
           <w:sz w:val="44"/>
           <w:szCs w:val="36"/>
         </w:rPr>
-        <w:commentReference w:id="23"/>
-      </w:r>
-      <w:commentRangeEnd w:id="24"/>
+        <w:commentReference w:id="27"/>
+      </w:r>
+      <w:commentRangeEnd w:id="28"/>
       <w:r>
         <w:rPr>
           <w:rStyle w:val="Refdecomentario"/>
@@ -8443,7 +8521,19 @@
           <w:sz w:val="44"/>
           <w:szCs w:val="36"/>
         </w:rPr>
-        <w:commentReference w:id="24"/>
+        <w:commentReference w:id="28"/>
+      </w:r>
+      <w:commentRangeEnd w:id="29"/>
+      <w:r>
+        <w:rPr>
+          <w:rStyle w:val="Refdecomentario"/>
+          <w:rFonts w:ascii="Arial" w:hAnsi="Arial"/>
+          <w:b/>
+          <w:bCs/>
+          <w:sz w:val="44"/>
+          <w:szCs w:val="36"/>
+        </w:rPr>
+        <w:commentReference w:id="29"/>
       </w:r>
     </w:p>
     <w:p>
@@ -8643,14 +8733,14 @@
           <w:rFonts w:ascii="Arial" w:hAnsi="Arial"/>
         </w:rPr>
       </w:pPr>
-      <w:bookmarkStart w:id="25" w:name="_Toc222931110"/>
+      <w:bookmarkStart w:id="30" w:name="_Toc222931110"/>
       <w:r>
         <w:rPr>
           <w:rFonts w:ascii="Arial" w:hAnsi="Arial"/>
         </w:rPr>
         <w:t>Marco Metodológico de Referencia</w:t>
       </w:r>
-      <w:bookmarkEnd w:id="25"/>
+      <w:bookmarkEnd w:id="30"/>
     </w:p>
     <w:p>
       <w:pPr>
@@ -8693,14 +8783,14 @@
           <w:rFonts w:ascii="Arial" w:hAnsi="Arial"/>
         </w:rPr>
       </w:pPr>
-      <w:bookmarkStart w:id="26" w:name="_Toc222931111"/>
+      <w:bookmarkStart w:id="31" w:name="_Toc222931111"/>
       <w:r>
         <w:rPr>
           <w:rFonts w:ascii="Arial" w:hAnsi="Arial"/>
         </w:rPr>
         <w:t>Origen y Contexto del Estudio Base</w:t>
       </w:r>
-      <w:bookmarkEnd w:id="26"/>
+      <w:bookmarkEnd w:id="31"/>
     </w:p>
     <w:p>
       <w:pPr>
@@ -8806,14 +8896,14 @@
           <w:rFonts w:ascii="Arial" w:hAnsi="Arial"/>
         </w:rPr>
       </w:pPr>
-      <w:bookmarkStart w:id="27" w:name="_Toc222931112"/>
+      <w:bookmarkStart w:id="32" w:name="_Toc222931112"/>
       <w:r>
         <w:rPr>
           <w:rFonts w:ascii="Arial" w:hAnsi="Arial"/>
         </w:rPr>
         <w:t>Pipeline de Referencia: Ingeniería de Características RFM</w:t>
       </w:r>
-      <w:bookmarkEnd w:id="27"/>
+      <w:bookmarkEnd w:id="32"/>
     </w:p>
     <w:p>
       <w:pPr>
@@ -9263,7 +9353,7 @@
           <w:rFonts w:ascii="Arial" w:hAnsi="Arial"/>
         </w:rPr>
       </w:pPr>
-      <w:bookmarkStart w:id="28" w:name="_Toc222931113"/>
+      <w:bookmarkStart w:id="33" w:name="_Toc222931113"/>
       <w:r>
         <w:rPr>
           <w:rFonts w:ascii="Arial" w:hAnsi="Arial"/>
@@ -9276,7 +9366,7 @@
         </w:rPr>
         <w:t xml:space="preserve"> Temporal</w:t>
       </w:r>
-      <w:bookmarkEnd w:id="28"/>
+      <w:bookmarkEnd w:id="33"/>
     </w:p>
     <w:p>
       <w:pPr>
@@ -9374,7 +9464,7 @@
         </w:rPr>
         <w:t xml:space="preserve">Validación </w:t>
       </w:r>
-      <w:commentRangeStart w:id="29"/>
+      <w:commentRangeStart w:id="34"/>
       <w:r>
         <w:rPr>
           <w:rFonts w:ascii="Arial" w:eastAsia="Times New Roman" w:hAnsi="Arial"/>
@@ -9409,7 +9499,7 @@
         </w:rPr>
         <w:t xml:space="preserve"> </w:t>
       </w:r>
-      <w:commentRangeEnd w:id="29"/>
+      <w:commentRangeEnd w:id="34"/>
       <w:r>
         <w:rPr>
           <w:rStyle w:val="Refdecomentario"/>
@@ -9418,7 +9508,7 @@
           <w:szCs w:val="22"/>
           <w:lang w:eastAsia="es-ES"/>
         </w:rPr>
-        <w:commentReference w:id="29"/>
+        <w:commentReference w:id="34"/>
       </w:r>
       <w:r>
         <w:rPr>
@@ -9552,7 +9642,7 @@
           <w:sz w:val="36"/>
         </w:rPr>
       </w:pPr>
-      <w:bookmarkStart w:id="30" w:name="_Toc222931114"/>
+      <w:bookmarkStart w:id="35" w:name="_Toc222931114"/>
       <w:r>
         <w:rPr>
           <w:rFonts w:ascii="Arial" w:hAnsi="Arial"/>
@@ -9560,7 +9650,7 @@
         <w:lastRenderedPageBreak/>
         <w:t>Adaptaciones y Contribuciones Metodológicas Propias</w:t>
       </w:r>
-      <w:bookmarkEnd w:id="30"/>
+      <w:bookmarkEnd w:id="35"/>
     </w:p>
     <w:p>
       <w:pPr>
@@ -9812,14 +9902,14 @@
           <w:rFonts w:ascii="Arial" w:hAnsi="Arial"/>
         </w:rPr>
       </w:pPr>
-      <w:bookmarkStart w:id="31" w:name="_Toc222931115"/>
+      <w:bookmarkStart w:id="36" w:name="_Toc222931115"/>
       <w:r>
         <w:rPr>
           <w:rFonts w:ascii="Arial" w:hAnsi="Arial"/>
         </w:rPr>
         <w:t>Refinamiento del Protocolo Experimental</w:t>
       </w:r>
-      <w:bookmarkEnd w:id="31"/>
+      <w:bookmarkEnd w:id="36"/>
     </w:p>
     <w:p>
       <w:pPr>
@@ -10116,14 +10206,14 @@
           <w:rFonts w:ascii="Arial" w:hAnsi="Arial"/>
         </w:rPr>
       </w:pPr>
-      <w:bookmarkStart w:id="32" w:name="_Toc222931116"/>
+      <w:bookmarkStart w:id="37" w:name="_Toc222931116"/>
       <w:r>
         <w:rPr>
           <w:rFonts w:ascii="Arial" w:hAnsi="Arial"/>
         </w:rPr>
         <w:t>Implementación de Integridad Metodológica (Test Anti-Leakage)</w:t>
       </w:r>
-      <w:bookmarkEnd w:id="32"/>
+      <w:bookmarkEnd w:id="37"/>
     </w:p>
     <w:p>
       <w:pPr>
@@ -10602,14 +10692,14 @@
           <w:rFonts w:ascii="Arial" w:hAnsi="Arial"/>
         </w:rPr>
       </w:pPr>
-      <w:bookmarkStart w:id="33" w:name="_Toc222931117"/>
+      <w:bookmarkStart w:id="38" w:name="_Toc222931117"/>
       <w:r>
         <w:rPr>
           <w:rFonts w:ascii="Arial" w:hAnsi="Arial"/>
         </w:rPr>
         <w:t>Incorporación de Explicabilidad (XAI)</w:t>
       </w:r>
-      <w:bookmarkEnd w:id="33"/>
+      <w:bookmarkEnd w:id="38"/>
     </w:p>
     <w:p>
       <w:pPr>
@@ -10920,14 +11010,14 @@
           <w:rFonts w:ascii="Arial" w:hAnsi="Arial"/>
         </w:rPr>
       </w:pPr>
-      <w:bookmarkStart w:id="34" w:name="_Toc222931118"/>
+      <w:bookmarkStart w:id="39" w:name="_Toc222931118"/>
       <w:r>
         <w:rPr>
           <w:rFonts w:ascii="Arial" w:hAnsi="Arial"/>
         </w:rPr>
         <w:t>Diseño Experimental</w:t>
       </w:r>
-      <w:bookmarkEnd w:id="34"/>
+      <w:bookmarkEnd w:id="39"/>
     </w:p>
     <w:p>
       <w:pPr>
@@ -10951,15 +11041,15 @@
           <w:rFonts w:ascii="Arial" w:hAnsi="Arial"/>
         </w:rPr>
       </w:pPr>
-      <w:bookmarkStart w:id="35" w:name="_Toc222931119"/>
+      <w:bookmarkStart w:id="40" w:name="_Toc222931119"/>
       <w:r>
         <w:rPr>
           <w:rFonts w:ascii="Arial" w:hAnsi="Arial"/>
         </w:rPr>
         <w:t>Descripción del Conjunto de Datos</w:t>
       </w:r>
-      <w:bookmarkStart w:id="36" w:name="_Toc222931120"/>
-      <w:bookmarkEnd w:id="35"/>
+      <w:bookmarkStart w:id="41" w:name="_Toc222931120"/>
+      <w:bookmarkEnd w:id="40"/>
     </w:p>
     <w:p>
       <w:pPr>
@@ -11191,7 +11281,7 @@
         </w:rPr>
         <w:t>Configuración del Entorno de Ejecución</w:t>
       </w:r>
-      <w:bookmarkEnd w:id="36"/>
+      <w:bookmarkEnd w:id="41"/>
     </w:p>
     <w:p>
       <w:pPr>
@@ -11494,14 +11584,14 @@
           <w:rFonts w:ascii="Arial" w:hAnsi="Arial"/>
         </w:rPr>
       </w:pPr>
-      <w:bookmarkStart w:id="37" w:name="_Toc222931121"/>
+      <w:bookmarkStart w:id="42" w:name="_Toc222931121"/>
       <w:r>
         <w:rPr>
           <w:rFonts w:ascii="Arial" w:hAnsi="Arial"/>
         </w:rPr>
         <w:t>Definición de Métricas de Evaluación</w:t>
       </w:r>
-      <w:bookmarkEnd w:id="37"/>
+      <w:bookmarkEnd w:id="42"/>
     </w:p>
     <w:p>
       <w:pPr>
@@ -12079,7 +12169,7 @@
           <w:rFonts w:ascii="Arial" w:hAnsi="Arial"/>
         </w:rPr>
       </w:pPr>
-      <w:bookmarkStart w:id="38" w:name="_Toc222931122"/>
+      <w:bookmarkStart w:id="43" w:name="_Toc222931122"/>
       <w:r>
         <w:rPr>
           <w:rFonts w:ascii="Arial" w:hAnsi="Arial"/>
@@ -12105,7 +12195,7 @@
         </w:rPr>
         <w:t>al</w:t>
       </w:r>
-      <w:bookmarkEnd w:id="38"/>
+      <w:bookmarkEnd w:id="43"/>
     </w:p>
     <w:p>
       <w:pPr>
@@ -12472,7 +12562,8 @@
           <w:rFonts w:ascii="Arial" w:hAnsi="Arial"/>
         </w:rPr>
       </w:pPr>
-      <w:bookmarkStart w:id="39" w:name="_Toc222931123"/>
+      <w:bookmarkStart w:id="44" w:name="_Toc222931123"/>
+      <w:commentRangeStart w:id="45"/>
       <w:r>
         <w:rPr>
           <w:rFonts w:ascii="Arial" w:hAnsi="Arial"/>
@@ -12480,7 +12571,17 @@
         <w:lastRenderedPageBreak/>
         <w:t>Definición del Modelo de Referencia (Baseline)</w:t>
       </w:r>
-      <w:bookmarkEnd w:id="39"/>
+      <w:bookmarkEnd w:id="44"/>
+      <w:commentRangeEnd w:id="45"/>
+      <w:r>
+        <w:rPr>
+          <w:rStyle w:val="Refdecomentario"/>
+          <w:rFonts w:ascii="Arial" w:hAnsi="Arial"/>
+          <w:sz w:val="32"/>
+          <w:szCs w:val="32"/>
+        </w:rPr>
+        <w:commentReference w:id="45"/>
+      </w:r>
     </w:p>
     <w:p>
       <w:pPr>
@@ -12498,7 +12599,7 @@
           <w:szCs w:val="28"/>
         </w:rPr>
       </w:pPr>
-      <w:bookmarkStart w:id="40" w:name="_Toc222931124"/>
+      <w:bookmarkStart w:id="46" w:name="_Toc222931124"/>
       <w:r>
         <w:rPr>
           <w:rFonts w:ascii="Arial" w:hAnsi="Arial" w:cs="Arial"/>
@@ -12510,7 +12611,7 @@
         </w:rPr>
         <w:t>Objetivo</w:t>
       </w:r>
-      <w:bookmarkEnd w:id="40"/>
+      <w:bookmarkEnd w:id="46"/>
     </w:p>
     <w:p>
       <w:pPr>
@@ -12592,7 +12693,7 @@
           <w:szCs w:val="28"/>
         </w:rPr>
       </w:pPr>
-      <w:bookmarkStart w:id="41" w:name="_Toc222931125"/>
+      <w:bookmarkStart w:id="47" w:name="_Toc222931125"/>
       <w:r>
         <w:rPr>
           <w:rFonts w:ascii="Arial" w:hAnsi="Arial" w:cs="Arial"/>
@@ -12604,7 +12705,7 @@
         </w:rPr>
         <w:t>Configuración Experimental</w:t>
       </w:r>
-      <w:bookmarkEnd w:id="41"/>
+      <w:bookmarkEnd w:id="47"/>
     </w:p>
     <w:p>
       <w:pPr>
@@ -12753,6 +12854,7 @@
           <w:lang w:eastAsia="es-ES"/>
         </w:rPr>
       </w:pPr>
+      <w:commentRangeStart w:id="48"/>
       <w:r>
         <w:rPr>
           <w:rFonts w:ascii="Arial" w:hAnsi="Arial"/>
@@ -12784,6 +12886,17 @@
           <w:lang w:eastAsia="es-ES"/>
         </w:rPr>
         <w:t>), posicionado como el estado del arte en la clasificación de datos tabulares.</w:t>
+      </w:r>
+      <w:commentRangeEnd w:id="48"/>
+      <w:r>
+        <w:rPr>
+          <w:rStyle w:val="Refdecomentario"/>
+          <w:rFonts w:ascii="Arial" w:hAnsi="Arial"/>
+          <w:sz w:val="22"/>
+          <w:szCs w:val="22"/>
+          <w:lang w:eastAsia="es-ES"/>
+        </w:rPr>
+        <w:commentReference w:id="48"/>
       </w:r>
     </w:p>
     <w:p>
@@ -12921,7 +13034,55 @@
           <w:rFonts w:ascii="Arial" w:hAnsi="Arial"/>
           <w:lang w:eastAsia="es-ES"/>
         </w:rPr>
-        <w:t xml:space="preserve"> el uso de técnicas de aprendizaje sensible al costo (como class_weight='balanced' o scale_pos_weight) y cualquier mecanismo de remuestreo sintético (SMOTE). Los algoritmos deben enfrentarse al ratio original de fraude sin asistencia.</w:t>
+        <w:t xml:space="preserve"> el uso de técnicas de aprendizaje sensible al costo (como </w:t>
+      </w:r>
+      <w:r>
+        <w:rPr>
+          <w:rFonts w:ascii="Arial" w:hAnsi="Arial"/>
+          <w:i/>
+          <w:iCs/>
+          <w:lang w:eastAsia="es-ES"/>
+        </w:rPr>
+        <w:t>class_weight='balanced'</w:t>
+      </w:r>
+      <w:r>
+        <w:rPr>
+          <w:rFonts w:ascii="Arial" w:hAnsi="Arial"/>
+          <w:lang w:eastAsia="es-ES"/>
+        </w:rPr>
+        <w:t xml:space="preserve"> o </w:t>
+      </w:r>
+      <w:r>
+        <w:rPr>
+          <w:rFonts w:ascii="Arial" w:hAnsi="Arial"/>
+          <w:i/>
+          <w:iCs/>
+          <w:lang w:eastAsia="es-ES"/>
+        </w:rPr>
+        <w:t>scale_pos_weight</w:t>
+      </w:r>
+      <w:r>
+        <w:rPr>
+          <w:rFonts w:ascii="Arial" w:hAnsi="Arial"/>
+          <w:lang w:eastAsia="es-ES"/>
+        </w:rPr>
+        <w:t>) y cualquier mecanismo de remuestreo sintético (</w:t>
+      </w:r>
+      <w:r>
+        <w:rPr>
+          <w:rFonts w:ascii="Arial" w:hAnsi="Arial"/>
+          <w:i/>
+          <w:iCs/>
+          <w:lang w:eastAsia="es-ES"/>
+        </w:rPr>
+        <w:t>SMOTE</w:t>
+      </w:r>
+      <w:r>
+        <w:rPr>
+          <w:rFonts w:ascii="Arial" w:hAnsi="Arial"/>
+          <w:lang w:eastAsia="es-ES"/>
+        </w:rPr>
+        <w:t>). Los algoritmos deben enfrentarse al ratio original de fraude sin asistencia.</w:t>
       </w:r>
     </w:p>
     <w:p>
@@ -12940,7 +13101,7 @@
           <w:szCs w:val="28"/>
         </w:rPr>
       </w:pPr>
-      <w:bookmarkStart w:id="42" w:name="_Toc222931126"/>
+      <w:bookmarkStart w:id="49" w:name="_Toc222931126"/>
       <w:r>
         <w:rPr>
           <w:rFonts w:ascii="Arial" w:hAnsi="Arial" w:cs="Arial"/>
@@ -12952,7 +13113,7 @@
         </w:rPr>
         <w:t>Hipótesis de Trabajo</w:t>
       </w:r>
-      <w:bookmarkEnd w:id="42"/>
+      <w:bookmarkEnd w:id="49"/>
     </w:p>
     <w:p>
       <w:pPr>
@@ -13066,14 +13227,14 @@
           <w:rFonts w:ascii="Arial" w:hAnsi="Arial"/>
         </w:rPr>
       </w:pPr>
-      <w:bookmarkStart w:id="43" w:name="_Toc222931127"/>
+      <w:bookmarkStart w:id="50" w:name="_Toc222931127"/>
       <w:r>
         <w:rPr>
           <w:rFonts w:ascii="Arial" w:hAnsi="Arial"/>
         </w:rPr>
         <w:t>Validación de Integridad Metodológica (Test Anti-Leakage)</w:t>
       </w:r>
-      <w:bookmarkEnd w:id="43"/>
+      <w:bookmarkEnd w:id="50"/>
     </w:p>
     <w:p>
       <w:pPr>
@@ -13091,7 +13252,7 @@
           <w:szCs w:val="28"/>
         </w:rPr>
       </w:pPr>
-      <w:bookmarkStart w:id="44" w:name="_Toc222931128"/>
+      <w:bookmarkStart w:id="51" w:name="_Toc222931128"/>
       <w:r>
         <w:rPr>
           <w:rFonts w:ascii="Arial" w:hAnsi="Arial" w:cs="Arial"/>
@@ -13103,7 +13264,7 @@
         </w:rPr>
         <w:t>Objetivo</w:t>
       </w:r>
-      <w:bookmarkEnd w:id="44"/>
+      <w:bookmarkEnd w:id="51"/>
     </w:p>
     <w:p>
       <w:pPr>
@@ -13153,7 +13314,7 @@
           <w:szCs w:val="28"/>
         </w:rPr>
       </w:pPr>
-      <w:bookmarkStart w:id="45" w:name="_Toc222931129"/>
+      <w:bookmarkStart w:id="52" w:name="_Toc222931129"/>
       <w:r>
         <w:rPr>
           <w:rFonts w:ascii="Arial" w:hAnsi="Arial" w:cs="Arial"/>
@@ -13165,7 +13326,7 @@
         </w:rPr>
         <w:t>Configuración Experimental</w:t>
       </w:r>
-      <w:bookmarkEnd w:id="45"/>
+      <w:bookmarkEnd w:id="52"/>
     </w:p>
     <w:p>
       <w:pPr>
@@ -13196,7 +13357,21 @@
           <w:rFonts w:ascii="Arial" w:hAnsi="Arial"/>
           <w:lang w:eastAsia="es-ES"/>
         </w:rPr>
-        <w:t xml:space="preserve"> de procesamiento y entrenamiento paralelos y antagónicos. En ambas ramas se utiliza el mismo algoritmo (el modelo basado en árboles con mejor rendimiento del Experimento A, XGBoost), asegurando que cualquier discrepancia en los resultados provenga exclusivamente del tratamiento de los datos:</w:t>
+        <w:t xml:space="preserve"> de procesamiento y entrenamiento paralelos y antagónicos. En ambas ramas se utiliza el mismo algoritmo (el modelo basado en árboles con mejor rendimiento del </w:t>
+      </w:r>
+      <w:r>
+        <w:rPr>
+          <w:rFonts w:ascii="Arial" w:hAnsi="Arial"/>
+          <w:lang w:eastAsia="es-ES"/>
+        </w:rPr>
+        <w:t>primer experimento</w:t>
+      </w:r>
+      <w:r>
+        <w:rPr>
+          <w:rFonts w:ascii="Arial" w:hAnsi="Arial"/>
+          <w:lang w:eastAsia="es-ES"/>
+        </w:rPr>
+        <w:t>, XGBoost), asegurando que cualquier discrepancia en los resultados provenga exclusivamente del tratamiento de los datos:</w:t>
       </w:r>
     </w:p>
     <w:p>
@@ -13483,7 +13658,7 @@
           <w:szCs w:val="28"/>
         </w:rPr>
       </w:pPr>
-      <w:bookmarkStart w:id="46" w:name="_Toc222931130"/>
+      <w:bookmarkStart w:id="53" w:name="_Toc222931130"/>
       <w:r>
         <w:rPr>
           <w:rFonts w:ascii="Arial" w:hAnsi="Arial" w:cs="Arial"/>
@@ -13496,7 +13671,7 @@
         <w:lastRenderedPageBreak/>
         <w:t>Hipótesis de Trabajo</w:t>
       </w:r>
-      <w:bookmarkEnd w:id="46"/>
+      <w:bookmarkEnd w:id="53"/>
     </w:p>
     <w:p>
       <w:pPr>
@@ -13594,14 +13769,14 @@
           <w:rFonts w:ascii="Arial" w:hAnsi="Arial"/>
         </w:rPr>
       </w:pPr>
-      <w:bookmarkStart w:id="47" w:name="_Toc222931131"/>
+      <w:bookmarkStart w:id="54" w:name="_Toc222931131"/>
       <w:r>
         <w:rPr>
           <w:rFonts w:ascii="Arial" w:hAnsi="Arial"/>
         </w:rPr>
         <w:t>Análisis de Interpretabilidad Algorítmica (Explainable AI)</w:t>
       </w:r>
-      <w:bookmarkEnd w:id="47"/>
+      <w:bookmarkEnd w:id="54"/>
     </w:p>
     <w:p>
       <w:pPr>
@@ -13619,7 +13794,7 @@
           <w:szCs w:val="28"/>
         </w:rPr>
       </w:pPr>
-      <w:bookmarkStart w:id="48" w:name="_Toc222931132"/>
+      <w:bookmarkStart w:id="55" w:name="_Toc222931132"/>
       <w:r>
         <w:rPr>
           <w:rFonts w:ascii="Arial" w:hAnsi="Arial" w:cs="Arial"/>
@@ -13631,7 +13806,7 @@
         </w:rPr>
         <w:t>Objetivo</w:t>
       </w:r>
-      <w:bookmarkEnd w:id="48"/>
+      <w:bookmarkEnd w:id="55"/>
     </w:p>
     <w:p>
       <w:pPr>
@@ -13665,7 +13840,7 @@
           <w:szCs w:val="28"/>
         </w:rPr>
       </w:pPr>
-      <w:bookmarkStart w:id="49" w:name="_Toc222931133"/>
+      <w:bookmarkStart w:id="56" w:name="_Toc222931133"/>
       <w:r>
         <w:rPr>
           <w:rFonts w:ascii="Arial" w:hAnsi="Arial" w:cs="Arial"/>
@@ -13677,7 +13852,7 @@
         </w:rPr>
         <w:t>Configuración Experimental</w:t>
       </w:r>
-      <w:bookmarkEnd w:id="49"/>
+      <w:bookmarkEnd w:id="56"/>
     </w:p>
     <w:p>
       <w:pPr>
@@ -13950,7 +14125,7 @@
           <w:szCs w:val="28"/>
         </w:rPr>
       </w:pPr>
-      <w:bookmarkStart w:id="50" w:name="_Toc222931134"/>
+      <w:bookmarkStart w:id="57" w:name="_Toc222931134"/>
       <w:r>
         <w:rPr>
           <w:rFonts w:ascii="Arial" w:hAnsi="Arial" w:cs="Arial"/>
@@ -13962,7 +14137,7 @@
         </w:rPr>
         <w:t>Hipótesis de Trabajo</w:t>
       </w:r>
-      <w:bookmarkEnd w:id="50"/>
+      <w:bookmarkEnd w:id="57"/>
     </w:p>
     <w:p>
       <w:pPr>
@@ -14048,8 +14223,8 @@
           <w:bCs/>
         </w:rPr>
       </w:pPr>
-      <w:bookmarkStart w:id="51" w:name="_Toc222931135"/>
-      <w:commentRangeStart w:id="52"/>
+      <w:bookmarkStart w:id="58" w:name="_Toc222931135"/>
+      <w:commentRangeStart w:id="59"/>
       <w:r>
         <w:rPr>
           <w:rFonts w:ascii="Arial" w:hAnsi="Arial"/>
@@ -14067,8 +14242,8 @@
         </w:rPr>
         <w:t xml:space="preserve"> y Análisis de Resultados.</w:t>
       </w:r>
-      <w:bookmarkEnd w:id="51"/>
-      <w:commentRangeEnd w:id="52"/>
+      <w:bookmarkEnd w:id="58"/>
+      <w:commentRangeEnd w:id="59"/>
       <w:r>
         <w:rPr>
           <w:rStyle w:val="Refdecomentario"/>
@@ -14078,7 +14253,7 @@
           <w:sz w:val="44"/>
           <w:szCs w:val="36"/>
         </w:rPr>
-        <w:commentReference w:id="52"/>
+        <w:commentReference w:id="59"/>
       </w:r>
     </w:p>
     <w:p>
@@ -14107,11 +14282,11 @@
       <w:pPr>
         <w:pStyle w:val="Ttulo2"/>
       </w:pPr>
-      <w:bookmarkStart w:id="53" w:name="_Toc222931136"/>
+      <w:bookmarkStart w:id="60" w:name="_Toc222931136"/>
       <w:r>
         <w:t>Definición del Modelo de Referencia</w:t>
       </w:r>
-      <w:bookmarkEnd w:id="53"/>
+      <w:bookmarkEnd w:id="60"/>
     </w:p>
     <w:p>
       <w:pPr>
@@ -14145,11 +14320,11 @@
       <w:pPr>
         <w:pStyle w:val="Ttulo3"/>
       </w:pPr>
-      <w:bookmarkStart w:id="54" w:name="_Toc222931137"/>
+      <w:bookmarkStart w:id="61" w:name="_Toc222931137"/>
       <w:r>
         <w:t>Análisis de Rendimiento bajo Desbalance Natural</w:t>
       </w:r>
-      <w:bookmarkEnd w:id="54"/>
+      <w:bookmarkEnd w:id="61"/>
     </w:p>
     <w:p>
       <w:pPr>
@@ -14297,11 +14472,11 @@
       <w:pPr>
         <w:pStyle w:val="Ttulo3"/>
       </w:pPr>
-      <w:bookmarkStart w:id="55" w:name="_Toc222931138"/>
+      <w:bookmarkStart w:id="62" w:name="_Toc222931138"/>
       <w:r>
         <w:t>Comparativa Algorítmica Estándar</w:t>
       </w:r>
-      <w:bookmarkEnd w:id="55"/>
+      <w:bookmarkEnd w:id="62"/>
     </w:p>
     <w:p>
       <w:pPr>
@@ -14335,26 +14510,6 @@
           <w:lang w:eastAsia="es-ES"/>
         </w:rPr>
         <w:t>) y sus respectivos costes computacionales.</w:t>
-      </w:r>
-    </w:p>
-    <w:p>
-      <w:pPr>
-        <w:suppressAutoHyphens w:val="0"/>
-        <w:spacing w:before="100" w:beforeAutospacing="1" w:after="100" w:afterAutospacing="1" w:line="240" w:lineRule="auto"/>
-        <w:jc w:val="left"/>
-        <w:rPr>
-          <w:rFonts w:ascii="Arial" w:eastAsia="Times New Roman" w:hAnsi="Arial"/>
-          <w:lang w:eastAsia="es-ES"/>
-        </w:rPr>
-      </w:pPr>
-      <w:r>
-        <w:rPr>
-          <w:rFonts w:ascii="Arial" w:eastAsia="Times New Roman" w:hAnsi="Arial"/>
-          <w:b/>
-          <w:bCs/>
-          <w:lang w:eastAsia="es-ES"/>
-        </w:rPr>
-        <w:t>[INSERTAR TABLA AQUÍ: Tabla de Resultados Baseline]</w:t>
       </w:r>
     </w:p>
     <w:tbl>
@@ -15164,12 +15319,12 @@
       <w:pPr>
         <w:pStyle w:val="Ttulo3"/>
       </w:pPr>
-      <w:bookmarkStart w:id="56" w:name="_Toc222931139"/>
+      <w:bookmarkStart w:id="63" w:name="_Toc222931139"/>
       <w:r>
         <w:lastRenderedPageBreak/>
         <w:t>Selección y Justificación del Modelo Base</w:t>
       </w:r>
-      <w:bookmarkEnd w:id="56"/>
+      <w:bookmarkEnd w:id="63"/>
     </w:p>
     <w:p>
       <w:pPr>
@@ -16155,7 +16310,7 @@
       <w:pPr>
         <w:pStyle w:val="Ttulo2"/>
       </w:pPr>
-      <w:bookmarkStart w:id="57" w:name="_Toc222931140"/>
+      <w:bookmarkStart w:id="64" w:name="_Toc222931140"/>
       <w:r>
         <w:t>Impacto de la Fuga de Datos (</w:t>
       </w:r>
@@ -16169,7 +16324,7 @@
       <w:r>
         <w:t>)</w:t>
       </w:r>
-      <w:bookmarkEnd w:id="57"/>
+      <w:bookmarkEnd w:id="64"/>
     </w:p>
     <w:p>
       <w:pPr>
@@ -16245,11 +16400,11 @@
       <w:pPr>
         <w:pStyle w:val="Ttulo3"/>
       </w:pPr>
-      <w:bookmarkStart w:id="58" w:name="_Toc222931141"/>
+      <w:bookmarkStart w:id="65" w:name="_Toc222931141"/>
       <w:r>
         <w:t>Evaluación bajo Metodología Deficiente (El Espejismo)</w:t>
       </w:r>
-      <w:bookmarkEnd w:id="58"/>
+      <w:bookmarkEnd w:id="65"/>
     </w:p>
     <w:p>
       <w:pPr>
@@ -16351,11 +16506,11 @@
       <w:pPr>
         <w:pStyle w:val="Ttulo3"/>
       </w:pPr>
-      <w:bookmarkStart w:id="59" w:name="_Toc222931142"/>
+      <w:bookmarkStart w:id="66" w:name="_Toc222931142"/>
       <w:r>
         <w:t>Evaluación bajo Metodología Estricta (La Realidad)</w:t>
       </w:r>
-      <w:bookmarkEnd w:id="59"/>
+      <w:bookmarkEnd w:id="66"/>
     </w:p>
     <w:p>
       <w:pPr>
@@ -16409,7 +16564,7 @@
       <w:pPr>
         <w:pStyle w:val="Ttulo3"/>
       </w:pPr>
-      <w:bookmarkStart w:id="60" w:name="_Toc222931143"/>
+      <w:bookmarkStart w:id="67" w:name="_Toc222931143"/>
       <w:r>
         <w:t>Cuantificación de la Divergencia Algorítmica (</w:t>
       </w:r>
@@ -16422,7 +16577,7 @@
       <w:r>
         <w:t>)</w:t>
       </w:r>
-      <w:bookmarkEnd w:id="60"/>
+      <w:bookmarkEnd w:id="67"/>
     </w:p>
     <w:p>
       <w:pPr>
@@ -17292,11 +17447,11 @@
       <w:pPr>
         <w:pStyle w:val="Ttulo2"/>
       </w:pPr>
-      <w:bookmarkStart w:id="61" w:name="_Toc222931144"/>
+      <w:bookmarkStart w:id="68" w:name="_Toc222931144"/>
       <w:r>
         <w:t>Interpretabilidad Algorítmica (XAI)</w:t>
       </w:r>
-      <w:bookmarkEnd w:id="61"/>
+      <w:bookmarkEnd w:id="68"/>
     </w:p>
     <w:p>
       <w:pPr>
@@ -17362,11 +17517,11 @@
       <w:pPr>
         <w:pStyle w:val="Ttulo3"/>
       </w:pPr>
-      <w:bookmarkStart w:id="62" w:name="_Toc222931145"/>
+      <w:bookmarkStart w:id="69" w:name="_Toc222931145"/>
       <w:r>
         <w:t>Identificación Global de Patrones (Importancia Nativa)</w:t>
       </w:r>
-      <w:bookmarkEnd w:id="62"/>
+      <w:bookmarkEnd w:id="69"/>
     </w:p>
     <w:p>
       <w:pPr>
@@ -18061,11 +18216,11 @@
       <w:pPr>
         <w:pStyle w:val="Ttulo3"/>
       </w:pPr>
-      <w:bookmarkStart w:id="63" w:name="_Toc222931146"/>
+      <w:bookmarkStart w:id="70" w:name="_Toc222931146"/>
       <w:r>
         <w:t>Direccionalidad del Riesgo Algorítmico (SHAP)</w:t>
       </w:r>
-      <w:bookmarkEnd w:id="63"/>
+      <w:bookmarkEnd w:id="70"/>
     </w:p>
     <w:p>
       <w:pPr>
@@ -18225,11 +18380,11 @@
       <w:pPr>
         <w:pStyle w:val="Ttulo3"/>
       </w:pPr>
-      <w:bookmarkStart w:id="64" w:name="_Toc222931147"/>
+      <w:bookmarkStart w:id="71" w:name="_Toc222931147"/>
       <w:r>
         <w:t>Auditoría Forense a Nivel de Transacción (Fuerza Local)</w:t>
       </w:r>
-      <w:bookmarkEnd w:id="64"/>
+      <w:bookmarkEnd w:id="71"/>
     </w:p>
     <w:p>
       <w:pPr>
@@ -18297,6 +18452,7 @@
     </w:p>
     <w:p>
       <w:pPr>
+        <w:spacing w:line="240" w:lineRule="auto"/>
         <w:rPr>
           <w:rFonts w:ascii="Arial" w:hAnsi="Arial"/>
           <w:lang w:eastAsia="es-ES"/>
@@ -18431,6 +18587,7 @@
     </w:p>
     <w:p>
       <w:pPr>
+        <w:spacing w:line="240" w:lineRule="auto"/>
         <w:rPr>
           <w:lang w:eastAsia="es-ES"/>
         </w:rPr>
@@ -18446,6 +18603,7 @@
     </w:p>
     <w:p>
       <w:pPr>
+        <w:spacing w:line="240" w:lineRule="auto"/>
         <w:rPr>
           <w:lang w:eastAsia="es-ES"/>
         </w:rPr>
@@ -18459,15 +18617,15 @@
     </w:p>
     <w:p>
       <w:pPr>
-        <w:rPr>
-          <w:lang w:eastAsia="es-ES"/>
-        </w:rPr>
-      </w:pPr>
-      <w:r>
-        <w:rPr>
-          <w:lang w:eastAsia="es-ES"/>
-        </w:rPr>
-        <w:lastRenderedPageBreak/>
+        <w:spacing w:line="240" w:lineRule="auto"/>
+        <w:rPr>
+          <w:lang w:eastAsia="es-ES"/>
+        </w:rPr>
+      </w:pPr>
+      <w:r>
+        <w:rPr>
+          <w:lang w:eastAsia="es-ES"/>
+        </w:rPr>
         <w:t>El experimento consistió en extirpar deliberadamente dicha característica del conjunto de datos y someter al modelo XGBoost de referencia a un reentrenamiento completo bajo el mismo rigor de aislamiento temporal.</w:t>
       </w:r>
     </w:p>
@@ -18675,6 +18833,7 @@
               <w:rPr>
                 <w:lang w:eastAsia="es-ES"/>
               </w:rPr>
+              <w:lastRenderedPageBreak/>
               <w:t>XGBoost (Ablación Top-Feature)</w:t>
             </w:r>
           </w:p>
@@ -19035,7 +19194,6 @@
           <w:rFonts w:ascii="Arial" w:hAnsi="Arial"/>
           <w:lang w:eastAsia="es-ES"/>
         </w:rPr>
-        <w:lastRenderedPageBreak/>
         <w:t>El hecho de que la métrica de viabilidad operativa (CP@100) apenas sufriera una penalización marginal de -0.0014 confirma una cualidad esencial de las arquitecturas basadas en ensamblajes de árboles (</w:t>
       </w:r>
       <w:r>
@@ -19077,6 +19235,7 @@
         <w:rPr>
           <w:rFonts w:ascii="Arial" w:hAnsi="Arial"/>
         </w:rPr>
+        <w:lastRenderedPageBreak/>
         <w:br w:type="page"/>
       </w:r>
     </w:p>
@@ -19088,7 +19247,7 @@
           <w:rFonts w:ascii="Arial" w:hAnsi="Arial"/>
         </w:rPr>
       </w:pPr>
-      <w:bookmarkStart w:id="65" w:name="_Toc222931148"/>
+      <w:bookmarkStart w:id="72" w:name="_Toc222931148"/>
       <w:r>
         <w:rPr>
           <w:rFonts w:ascii="Arial" w:hAnsi="Arial"/>
@@ -19096,7 +19255,7 @@
         <w:lastRenderedPageBreak/>
         <w:t>Conclusiones</w:t>
       </w:r>
-      <w:bookmarkEnd w:id="65"/>
+      <w:bookmarkEnd w:id="72"/>
     </w:p>
     <w:p>
       <w:pPr>
@@ -19930,17 +20089,7 @@
           <w:sz w:val="24"/>
           <w:szCs w:val="24"/>
         </w:rPr>
-        <w:t>Análisis de Sensibilidad sobre la Latencia de Etiquetado</w:t>
-      </w:r>
-      <w:r>
-        <w:rPr>
-          <w:rFonts w:ascii="Arial" w:hAnsi="Arial"/>
-          <w:b/>
-          <w:bCs/>
-          <w:sz w:val="24"/>
-          <w:szCs w:val="24"/>
-        </w:rPr>
-        <w:t>:</w:t>
+        <w:t>Análisis de Sensibilidad sobre la Latencia de Etiquetado:</w:t>
       </w:r>
     </w:p>
     <w:p>
@@ -20237,7 +20386,7 @@
           <w:rFonts w:ascii="Arial" w:hAnsi="Arial"/>
         </w:rPr>
       </w:pPr>
-      <w:bookmarkStart w:id="66" w:name="_Toc222931149"/>
+      <w:bookmarkStart w:id="73" w:name="_Toc222931149"/>
       <w:r>
         <w:rPr>
           <w:rFonts w:ascii="Arial" w:hAnsi="Arial"/>
@@ -20245,7 +20394,7 @@
         <w:lastRenderedPageBreak/>
         <w:t>Referencias</w:t>
       </w:r>
-      <w:bookmarkEnd w:id="66"/>
+      <w:bookmarkEnd w:id="73"/>
       <w:r>
         <w:rPr>
           <w:rFonts w:ascii="Arial" w:hAnsi="Arial"/>
@@ -20791,7 +20940,7 @@
           <w:szCs w:val="36"/>
         </w:rPr>
       </w:pPr>
-      <w:bookmarkStart w:id="67" w:name="_Toc222931150"/>
+      <w:bookmarkStart w:id="74" w:name="_Toc222931150"/>
       <w:r>
         <w:rPr>
           <w:rFonts w:ascii="Arial" w:hAnsi="Arial"/>
@@ -20801,7 +20950,7 @@
         <w:lastRenderedPageBreak/>
         <w:t>Anexos</w:t>
       </w:r>
-      <w:bookmarkEnd w:id="67"/>
+      <w:bookmarkEnd w:id="74"/>
     </w:p>
     <w:p>
       <w:pPr>
@@ -20861,7 +21010,7 @@
       </w:r>
     </w:p>
   </w:comment>
-  <w:comment w:id="8" w:author="Sergio Moya Marín" w:date="2026-01-22T19:49:00Z" w:initials="SM">
+  <w:comment w:id="7" w:author="Sergio Moya" w:date="2026-03-12T19:31:00Z" w:initials="SM">
     <w:p>
       <w:pPr>
         <w:pStyle w:val="Textocomentario"/>
@@ -20874,11 +21023,11 @@
         <w:annotationRef/>
       </w:r>
       <w:r>
-        <w:t>Añadir referencias</w:t>
+        <w:t>Añadir preguntas de investigación e hipótesis</w:t>
       </w:r>
     </w:p>
   </w:comment>
-  <w:comment w:id="9" w:author="Sergio Moya Marín" w:date="2026-01-22T19:50:00Z" w:initials="SM">
+  <w:comment w:id="8" w:author="Sergio Moya" w:date="2026-03-12T19:33:00Z" w:initials="SM">
     <w:p>
       <w:pPr>
         <w:pStyle w:val="Textocomentario"/>
@@ -20891,11 +21040,11 @@
         <w:annotationRef/>
       </w:r>
       <w:r>
-        <w:t>2020+, en europa, eeuu...</w:t>
+        <w:t>Posterior a los objetivos</w:t>
       </w:r>
     </w:p>
   </w:comment>
-  <w:comment w:id="14" w:author="Sergio Moya Marín" w:date="2026-01-22T20:04:00Z" w:initials="SM">
+  <w:comment w:id="9" w:author="Sergio Moya" w:date="2026-03-12T19:34:00Z" w:initials="SM">
     <w:p>
       <w:pPr>
         <w:pStyle w:val="Textocomentario"/>
@@ -20908,11 +21057,42 @@
         <w:annotationRef/>
       </w:r>
       <w:r>
-        <w:t>Del problema --&gt; estado del arte</w:t>
+        <w:rPr>
+          <w:color w:val="E3E3E3"/>
+          <w:highlight w:val="black"/>
+        </w:rPr>
+        <w:t>1º. Problema de investigación</w:t>
+      </w:r>
+      <w:r>
+        <w:rPr>
+          <w:color w:val="E3E3E3"/>
+          <w:highlight w:val="black"/>
+        </w:rPr>
+        <w:br/>
+        <w:t>2º. Preguntas de investigación</w:t>
+      </w:r>
+      <w:r>
+        <w:rPr>
+          <w:color w:val="E3E3E3"/>
+          <w:highlight w:val="black"/>
+        </w:rPr>
+        <w:br/>
+        <w:t>3º. Objetivos de investigación</w:t>
+      </w:r>
+      <w:r>
+        <w:rPr>
+          <w:color w:val="E3E3E3"/>
+          <w:highlight w:val="black"/>
+        </w:rPr>
+        <w:br/>
+        <w:t>4º. Hipótesis (si el estudio es hipotético-deductivo)</w:t>
+      </w:r>
+      <w:r>
+        <w:t xml:space="preserve"> </w:t>
       </w:r>
     </w:p>
   </w:comment>
-  <w:comment w:id="20" w:author="Sergio Moya Marín" w:date="2026-01-22T19:55:00Z" w:initials="SM">
+  <w:comment w:id="11" w:author="Sergio Moya Marín" w:date="2026-01-22T19:49:00Z" w:initials="SM">
     <w:p>
       <w:pPr>
         <w:pStyle w:val="Textocomentario"/>
@@ -20925,11 +21105,11 @@
         <w:annotationRef/>
       </w:r>
       <w:r>
-        <w:t>Como limitación del tfm</w:t>
+        <w:t>Añadir referencias</w:t>
       </w:r>
     </w:p>
   </w:comment>
-  <w:comment w:id="23" w:author="Sergio Moya Marín" w:date="2026-01-22T20:08:00Z" w:initials="SM">
+  <w:comment w:id="12" w:author="Sergio Moya Marín" w:date="2026-01-22T19:50:00Z" w:initials="SM">
     <w:p>
       <w:pPr>
         <w:pStyle w:val="Textocomentario"/>
@@ -20942,11 +21122,11 @@
         <w:annotationRef/>
       </w:r>
       <w:r>
-        <w:t>Trabajar primero</w:t>
+        <w:t>2020+, en europa, eeuu...</w:t>
       </w:r>
     </w:p>
   </w:comment>
-  <w:comment w:id="24" w:author="Sergio Moya Marín" w:date="2026-01-22T20:09:00Z" w:initials="SM">
+  <w:comment w:id="17" w:author="Sergio Moya" w:date="2026-03-12T19:32:00Z" w:initials="SM">
     <w:p>
       <w:pPr>
         <w:pStyle w:val="Textocomentario"/>
@@ -20959,11 +21139,11 @@
         <w:annotationRef/>
       </w:r>
       <w:r>
-        <w:t>Desde el baseline hasta las contribuciones</w:t>
+        <w:t>Unificar con la sección 5.3 y eliminar solo al final</w:t>
       </w:r>
     </w:p>
   </w:comment>
-  <w:comment w:id="29" w:author="Sergio Moya" w:date="2026-02-18T00:16:00Z" w:initials="SM">
+  <w:comment w:id="18" w:author="Sergio Moya Marín" w:date="2026-01-22T20:04:00Z" w:initials="SM">
     <w:p>
       <w:pPr>
         <w:pStyle w:val="Textocomentario"/>
@@ -20976,6 +21156,91 @@
         <w:annotationRef/>
       </w:r>
       <w:r>
+        <w:t>Del problema --&gt; estado del arte</w:t>
+      </w:r>
+    </w:p>
+  </w:comment>
+  <w:comment w:id="24" w:author="Sergio Moya Marín" w:date="2026-01-22T19:55:00Z" w:initials="SM">
+    <w:p>
+      <w:pPr>
+        <w:pStyle w:val="Textocomentario"/>
+        <w:jc w:val="left"/>
+      </w:pPr>
+      <w:r>
+        <w:rPr>
+          <w:rStyle w:val="Refdecomentario"/>
+        </w:rPr>
+        <w:annotationRef/>
+      </w:r>
+      <w:r>
+        <w:t>Como limitación del tfm</w:t>
+      </w:r>
+    </w:p>
+  </w:comment>
+  <w:comment w:id="27" w:author="Sergio Moya Marín" w:date="2026-01-22T20:08:00Z" w:initials="SM">
+    <w:p>
+      <w:pPr>
+        <w:pStyle w:val="Textocomentario"/>
+        <w:jc w:val="left"/>
+      </w:pPr>
+      <w:r>
+        <w:rPr>
+          <w:rStyle w:val="Refdecomentario"/>
+        </w:rPr>
+        <w:annotationRef/>
+      </w:r>
+      <w:r>
+        <w:t>Trabajar primero</w:t>
+      </w:r>
+    </w:p>
+  </w:comment>
+  <w:comment w:id="28" w:author="Sergio Moya Marín" w:date="2026-01-22T20:09:00Z" w:initials="SM">
+    <w:p>
+      <w:pPr>
+        <w:pStyle w:val="Textocomentario"/>
+        <w:jc w:val="left"/>
+      </w:pPr>
+      <w:r>
+        <w:rPr>
+          <w:rStyle w:val="Refdecomentario"/>
+        </w:rPr>
+        <w:annotationRef/>
+      </w:r>
+      <w:r>
+        <w:t>Desde el baseline hasta las contribuciones</w:t>
+      </w:r>
+    </w:p>
+  </w:comment>
+  <w:comment w:id="29" w:author="Sergio Moya" w:date="2026-03-12T19:35:00Z" w:initials="SM">
+    <w:p>
+      <w:pPr>
+        <w:pStyle w:val="Textocomentario"/>
+        <w:jc w:val="left"/>
+      </w:pPr>
+      <w:r>
+        <w:rPr>
+          <w:rStyle w:val="Refdecomentario"/>
+        </w:rPr>
+        <w:annotationRef/>
+      </w:r>
+      <w:r>
+        <w:t>Identificar si el estudio es explicativo, exploratorio, etc.</w:t>
+      </w:r>
+    </w:p>
+  </w:comment>
+  <w:comment w:id="34" w:author="Sergio Moya" w:date="2026-02-18T00:16:00Z" w:initials="SM">
+    <w:p>
+      <w:pPr>
+        <w:pStyle w:val="Textocomentario"/>
+        <w:jc w:val="left"/>
+      </w:pPr>
+      <w:r>
+        <w:rPr>
+          <w:rStyle w:val="Refdecomentario"/>
+        </w:rPr>
+        <w:annotationRef/>
+      </w:r>
+      <w:r>
         <w:t xml:space="preserve">es un neologismo técnico (una adaptación directa del inglés </w:t>
       </w:r>
       <w:r>
@@ -20990,7 +21255,41 @@
       </w:r>
     </w:p>
   </w:comment>
-  <w:comment w:id="52" w:author="Sergio Moya Marín" w:date="2026-01-22T19:56:00Z" w:initials="SM">
+  <w:comment w:id="45" w:author="Sergio Moya" w:date="2026-03-12T19:25:00Z" w:initials="SM">
+    <w:p>
+      <w:pPr>
+        <w:pStyle w:val="Textocomentario"/>
+        <w:jc w:val="left"/>
+      </w:pPr>
+      <w:r>
+        <w:rPr>
+          <w:rStyle w:val="Refdecomentario"/>
+        </w:rPr>
+        <w:annotationRef/>
+      </w:r>
+      <w:r>
+        <w:t>Defenderlo mejor como experimento</w:t>
+      </w:r>
+    </w:p>
+  </w:comment>
+  <w:comment w:id="48" w:author="Sergio Moya" w:date="2026-03-12T19:24:00Z" w:initials="SM">
+    <w:p>
+      <w:pPr>
+        <w:pStyle w:val="Textocomentario"/>
+        <w:jc w:val="left"/>
+      </w:pPr>
+      <w:r>
+        <w:rPr>
+          <w:rStyle w:val="Refdecomentario"/>
+        </w:rPr>
+        <w:annotationRef/>
+      </w:r>
+      <w:r>
+        <w:t>Especificar que es el modelo elegido para los siguientes experimentos y por que</w:t>
+      </w:r>
+    </w:p>
+  </w:comment>
+  <w:comment w:id="59" w:author="Sergio Moya Marín" w:date="2026-01-22T19:56:00Z" w:initials="SM">
     <w:p>
       <w:pPr>
         <w:pStyle w:val="Textocomentario"/>
@@ -21014,13 +21313,20 @@
 <w15:commentsEx xmlns:wpc="http://schemas.microsoft.com/office/word/2010/wordprocessingCanvas" xmlns:cx="http://schemas.microsoft.com/office/drawing/2014/chartex" xmlns:cx1="http://schemas.microsoft.com/office/drawing/2015/9/8/chartex" xmlns:cx2="http://schemas.microsoft.com/office/drawing/2015/10/21/chartex" xmlns:cx3="http://schemas.microsoft.com/office/drawing/2016/5/9/chartex" xmlns:cx4="http://schemas.microsoft.com/office/drawing/2016/5/10/chartex" xmlns:cx5="http://schemas.microsoft.com/office/drawing/2016/5/11/chartex" xmlns:cx6="http://schemas.microsoft.com/office/drawing/2016/5/12/chartex" xmlns:cx7="http://schemas.microsoft.com/office/drawing/2016/5/13/chartex" xmlns:cx8="http://schemas.microsoft.com/office/drawing/2016/5/14/chartex" xmlns:mc="http://schemas.openxmlformats.org/markup-compatibility/2006" xmlns:aink="http://schemas.microsoft.com/office/drawing/2016/ink" xmlns:am3d="http://schemas.microsoft.com/office/drawing/2017/model3d" xmlns:o="urn:schemas-microsoft-com:office:office" xmlns:oel="http://schemas.microsoft.com/office/2019/extlst" xmlns:r="http://schemas.openxmlformats.org/officeDocument/2006/relationships" xmlns:m="http://schemas.openxmlformats.org/officeDocument/2006/math" xmlns:v="urn:schemas-microsoft-com:vml" xmlns:wp14="http://schemas.microsoft.com/office/word/2010/wordprocessingDrawing" xmlns:wp="http://schemas.openxmlformats.org/drawingml/2006/wordprocessingDrawing" xmlns:w10="urn:schemas-microsoft-com:office:word" xmlns:w="http://schemas.openxmlformats.org/wordprocessingml/2006/main" xmlns:w14="http://schemas.microsoft.com/office/word/2010/wordml" xmlns:w15="http://schemas.microsoft.com/office/word/2012/wordml" xmlns:w16cex="http://schemas.microsoft.com/office/word/2018/wordml/cex" xmlns:w16cid="http://schemas.microsoft.com/office/word/2016/wordml/cid" xmlns:w16="http://schemas.microsoft.com/office/word/2018/wordml" xmlns:w16du="http://schemas.microsoft.com/office/word/2023/wordml/word16du" xmlns:w16sdtdh="http://schemas.microsoft.com/office/word/2020/wordml/sdtdatahash" xmlns:w16sdtfl="http://schemas.microsoft.com/office/word/2024/wordml/sdtformatlock" xmlns:w16se="http://schemas.microsoft.com/office/word/2015/wordml/symex" xmlns:wpg="http://schemas.microsoft.com/office/word/2010/wordprocessingGroup" xmlns:wpi="http://schemas.microsoft.com/office/word/2010/wordprocessingInk" xmlns:wne="http://schemas.microsoft.com/office/word/2006/wordml" xmlns:wps="http://schemas.microsoft.com/office/word/2010/wordprocessingShape" mc:Ignorable="w14 w15 w16se w16cid w16 w16cex w16sdtdh w16sdtfl w16du wp14">
   <w15:commentEx w15:paraId="61BF1B75" w15:done="0"/>
   <w15:commentEx w15:paraId="64A937DC" w15:paraIdParent="61BF1B75" w15:done="0"/>
+  <w15:commentEx w15:paraId="413C3AB6" w15:paraIdParent="61BF1B75" w15:done="0"/>
+  <w15:commentEx w15:paraId="11AA3655" w15:paraIdParent="61BF1B75" w15:done="0"/>
+  <w15:commentEx w15:paraId="2C0DCC49" w15:paraIdParent="61BF1B75" w15:done="0"/>
   <w15:commentEx w15:paraId="73608945" w15:done="0"/>
   <w15:commentEx w15:paraId="6CD9DCCE" w15:paraIdParent="73608945" w15:done="0"/>
+  <w15:commentEx w15:paraId="60D83303" w15:done="0"/>
   <w15:commentEx w15:paraId="71B90285" w15:done="0"/>
   <w15:commentEx w15:paraId="506143B8" w15:done="0"/>
   <w15:commentEx w15:paraId="21D45CB0" w15:done="0"/>
   <w15:commentEx w15:paraId="54D5F49B" w15:paraIdParent="21D45CB0" w15:done="0"/>
+  <w15:commentEx w15:paraId="1A4B1982" w15:paraIdParent="21D45CB0" w15:done="0"/>
   <w15:commentEx w15:paraId="5D275A1A" w15:done="0"/>
+  <w15:commentEx w15:paraId="6976824B" w15:done="0"/>
+  <w15:commentEx w15:paraId="4C56C545" w15:done="0"/>
   <w15:commentEx w15:paraId="242BA9FC" w15:done="0"/>
 </w15:commentsEx>
 </file>
@@ -21029,13 +21335,20 @@
 <w16cex:commentsExtensible xmlns:wpc="http://schemas.microsoft.com/office/word/2010/wordprocessingCanvas" xmlns:cx="http://schemas.microsoft.com/office/drawing/2014/chartex" xmlns:cx1="http://schemas.microsoft.com/office/drawing/2015/9/8/chartex" xmlns:cx2="http://schemas.microsoft.com/office/drawing/2015/10/21/chartex" xmlns:cx3="http://schemas.microsoft.com/office/drawing/2016/5/9/chartex" xmlns:cx4="http://schemas.microsoft.com/office/drawing/2016/5/10/chartex" xmlns:cx5="http://schemas.microsoft.com/office/drawing/2016/5/11/chartex" xmlns:cx6="http://schemas.microsoft.com/office/drawing/2016/5/12/chartex" xmlns:cx7="http://schemas.microsoft.com/office/drawing/2016/5/13/chartex" xmlns:cx8="http://schemas.microsoft.com/office/drawing/2016/5/14/chartex" xmlns:cr="http://schemas.microsoft.com/office/comments/2020/reactions" xmlns:mc="http://schemas.openxmlformats.org/markup-compatibility/2006" xmlns:aink="http://schemas.microsoft.com/office/drawing/2016/ink" xmlns:am3d="http://schemas.microsoft.com/office/drawing/2017/model3d" xmlns:o="urn:schemas-microsoft-com:office:office" xmlns:oel="http://schemas.microsoft.com/office/2019/extlst" xmlns:r="http://schemas.openxmlformats.org/officeDocument/2006/relationships" xmlns:m="http://schemas.openxmlformats.org/officeDocument/2006/math" xmlns:v="urn:schemas-microsoft-com:vml" xmlns:wp14="http://schemas.microsoft.com/office/word/2010/wordprocessingDrawing" xmlns:wp="http://schemas.openxmlformats.org/drawingml/2006/wordprocessingDrawing" xmlns:w10="urn:schemas-microsoft-com:office:word" xmlns:w="http://schemas.openxmlformats.org/wordprocessingml/2006/main" xmlns:w14="http://schemas.microsoft.com/office/word/2010/wordml" xmlns:w15="http://schemas.microsoft.com/office/word/2012/wordml" xmlns:w16cex="http://schemas.microsoft.com/office/word/2018/wordml/cex" xmlns:w16cid="http://schemas.microsoft.com/office/word/2016/wordml/cid" xmlns:w16="http://schemas.microsoft.com/office/word/2018/wordml" xmlns:w16du="http://schemas.microsoft.com/office/word/2023/wordml/word16du" xmlns:w16sdtdh="http://schemas.microsoft.com/office/word/2020/wordml/sdtdatahash" xmlns:w16sdtfl="http://schemas.microsoft.com/office/word/2024/wordml/sdtformatlock" xmlns:w16se="http://schemas.microsoft.com/office/word/2015/wordml/symex" xmlns:wpg="http://schemas.microsoft.com/office/word/2010/wordprocessingGroup" xmlns:wpi="http://schemas.microsoft.com/office/word/2010/wordprocessingInk" xmlns:wne="http://schemas.microsoft.com/office/word/2006/wordml" xmlns:wps="http://schemas.microsoft.com/office/word/2010/wordprocessingShape" mc:Ignorable="w14 w15 w16se w16cid w16 w16cex w16sdtdh w16sdtfl cr w16du wp14">
   <w16cex:commentExtensible w16cex:durableId="0AE74ECA" w16cex:dateUtc="2026-01-22T19:06:00Z"/>
   <w16cex:commentExtensible w16cex:durableId="0E0F74A6" w16cex:dateUtc="2026-01-22T19:06:00Z"/>
+  <w16cex:commentExtensible w16cex:durableId="599A11B8" w16cex:dateUtc="2026-03-12T18:31:00Z"/>
+  <w16cex:commentExtensible w16cex:durableId="31BE4488" w16cex:dateUtc="2026-03-12T18:33:00Z"/>
+  <w16cex:commentExtensible w16cex:durableId="33A6F31C" w16cex:dateUtc="2026-03-12T18:34:00Z"/>
   <w16cex:commentExtensible w16cex:durableId="363872F9" w16cex:dateUtc="2026-01-22T18:49:00Z"/>
   <w16cex:commentExtensible w16cex:durableId="46B2E326" w16cex:dateUtc="2026-01-22T18:50:00Z"/>
+  <w16cex:commentExtensible w16cex:durableId="6C9276DF" w16cex:dateUtc="2026-03-12T18:32:00Z"/>
   <w16cex:commentExtensible w16cex:durableId="09A3F997" w16cex:dateUtc="2026-01-22T19:04:00Z"/>
   <w16cex:commentExtensible w16cex:durableId="2CFCEC82" w16cex:dateUtc="2026-01-22T18:55:00Z"/>
   <w16cex:commentExtensible w16cex:durableId="6ED9ED52" w16cex:dateUtc="2026-01-22T19:08:00Z"/>
   <w16cex:commentExtensible w16cex:durableId="4ED41ADC" w16cex:dateUtc="2026-01-22T19:09:00Z"/>
+  <w16cex:commentExtensible w16cex:durableId="14B0F5D3" w16cex:dateUtc="2026-03-12T18:35:00Z"/>
   <w16cex:commentExtensible w16cex:durableId="0D333CEB" w16cex:dateUtc="2026-02-17T23:16:00Z"/>
+  <w16cex:commentExtensible w16cex:durableId="4C905C4F" w16cex:dateUtc="2026-03-12T18:25:00Z"/>
+  <w16cex:commentExtensible w16cex:durableId="37FA0C99" w16cex:dateUtc="2026-03-12T18:24:00Z"/>
   <w16cex:commentExtensible w16cex:durableId="3B540EDD" w16cex:dateUtc="2026-01-22T18:56:00Z"/>
 </w16cex:commentsExtensible>
 </file>
@@ -21044,13 +21357,20 @@
 <w16cid:commentsIds xmlns:wpc="http://schemas.microsoft.com/office/word/2010/wordprocessingCanvas" xmlns:cx="http://schemas.microsoft.com/office/drawing/2014/chartex" xmlns:cx1="http://schemas.microsoft.com/office/drawing/2015/9/8/chartex" xmlns:cx2="http://schemas.microsoft.com/office/drawing/2015/10/21/chartex" xmlns:cx3="http://schemas.microsoft.com/office/drawing/2016/5/9/chartex" xmlns:cx4="http://schemas.microsoft.com/office/drawing/2016/5/10/chartex" xmlns:cx5="http://schemas.microsoft.com/office/drawing/2016/5/11/chartex" xmlns:cx6="http://schemas.microsoft.com/office/drawing/2016/5/12/chartex" xmlns:cx7="http://schemas.microsoft.com/office/drawing/2016/5/13/chartex" xmlns:cx8="http://schemas.microsoft.com/office/drawing/2016/5/14/chartex" xmlns:mc="http://schemas.openxmlformats.org/markup-compatibility/2006" xmlns:aink="http://schemas.microsoft.com/office/drawing/2016/ink" xmlns:am3d="http://schemas.microsoft.com/office/drawing/2017/model3d" xmlns:o="urn:schemas-microsoft-com:office:office" xmlns:oel="http://schemas.microsoft.com/office/2019/extlst" xmlns:r="http://schemas.openxmlformats.org/officeDocument/2006/relationships" xmlns:m="http://schemas.openxmlformats.org/officeDocument/2006/math" xmlns:v="urn:schemas-microsoft-com:vml" xmlns:wp14="http://schemas.microsoft.com/office/word/2010/wordprocessingDrawing" xmlns:wp="http://schemas.openxmlformats.org/drawingml/2006/wordprocessingDrawing" xmlns:w10="urn:schemas-microsoft-com:office:word" xmlns:w="http://schemas.openxmlformats.org/wordprocessingml/2006/main" xmlns:w14="http://schemas.microsoft.com/office/word/2010/wordml" xmlns:w15="http://schemas.microsoft.com/office/word/2012/wordml" xmlns:w16cex="http://schemas.microsoft.com/office/word/2018/wordml/cex" xmlns:w16cid="http://schemas.microsoft.com/office/word/2016/wordml/cid" xmlns:w16="http://schemas.microsoft.com/office/word/2018/wordml" xmlns:w16du="http://schemas.microsoft.com/office/word/2023/wordml/word16du" xmlns:w16sdtdh="http://schemas.microsoft.com/office/word/2020/wordml/sdtdatahash" xmlns:w16sdtfl="http://schemas.microsoft.com/office/word/2024/wordml/sdtformatlock" xmlns:w16se="http://schemas.microsoft.com/office/word/2015/wordml/symex" xmlns:wpg="http://schemas.microsoft.com/office/word/2010/wordprocessingGroup" xmlns:wpi="http://schemas.microsoft.com/office/word/2010/wordprocessingInk" xmlns:wne="http://schemas.microsoft.com/office/word/2006/wordml" xmlns:wps="http://schemas.microsoft.com/office/word/2010/wordprocessingShape" mc:Ignorable="w14 w15 w16se w16cid w16 w16cex w16sdtdh w16sdtfl w16du wp14">
   <w16cid:commentId w16cid:paraId="61BF1B75" w16cid:durableId="0AE74ECA"/>
   <w16cid:commentId w16cid:paraId="64A937DC" w16cid:durableId="0E0F74A6"/>
+  <w16cid:commentId w16cid:paraId="413C3AB6" w16cid:durableId="599A11B8"/>
+  <w16cid:commentId w16cid:paraId="11AA3655" w16cid:durableId="31BE4488"/>
+  <w16cid:commentId w16cid:paraId="2C0DCC49" w16cid:durableId="33A6F31C"/>
   <w16cid:commentId w16cid:paraId="73608945" w16cid:durableId="363872F9"/>
   <w16cid:commentId w16cid:paraId="6CD9DCCE" w16cid:durableId="46B2E326"/>
+  <w16cid:commentId w16cid:paraId="60D83303" w16cid:durableId="6C9276DF"/>
   <w16cid:commentId w16cid:paraId="71B90285" w16cid:durableId="09A3F997"/>
   <w16cid:commentId w16cid:paraId="506143B8" w16cid:durableId="2CFCEC82"/>
   <w16cid:commentId w16cid:paraId="21D45CB0" w16cid:durableId="6ED9ED52"/>
   <w16cid:commentId w16cid:paraId="54D5F49B" w16cid:durableId="4ED41ADC"/>
+  <w16cid:commentId w16cid:paraId="1A4B1982" w16cid:durableId="14B0F5D3"/>
   <w16cid:commentId w16cid:paraId="5D275A1A" w16cid:durableId="0D333CEB"/>
+  <w16cid:commentId w16cid:paraId="6976824B" w16cid:durableId="4C905C4F"/>
+  <w16cid:commentId w16cid:paraId="4C56C545" w16cid:durableId="37FA0C99"/>
   <w16cid:commentId w16cid:paraId="242BA9FC" w16cid:durableId="3B540EDD"/>
 </w16cid:commentsIds>
 </file>
@@ -31142,6 +31462,7 @@
   <w:style w:type="character" w:default="1" w:styleId="Fuentedeprrafopredeter">
     <w:name w:val="Default Paragraph Font"/>
     <w:uiPriority w:val="1"/>
+    <w:semiHidden/>
     <w:unhideWhenUsed/>
   </w:style>
   <w:style w:type="table" w:default="1" w:styleId="Tablanormal">
@@ -32512,6 +32833,20 @@
       </w:tcPr>
     </w:tblStylePr>
   </w:style>
+  <w:style w:type="paragraph" w:styleId="Revisin">
+    <w:name w:val="Revision"/>
+    <w:hidden/>
+    <w:uiPriority w:val="99"/>
+    <w:semiHidden/>
+    <w:rsid w:val="00F84B54"/>
+    <w:pPr>
+      <w:suppressAutoHyphens w:val="0"/>
+    </w:pPr>
+    <w:rPr>
+      <w:rFonts w:ascii="Visuelt Pro Light" w:hAnsi="Visuelt Pro Light" w:cs="Arial"/>
+      <w:sz w:val="22"/>
+    </w:rPr>
+  </w:style>
 </w:styles>
 </file>
 
@@ -32803,12 +33138,31 @@
 </file>
 
 <file path=customXml/item2.xml><?xml version="1.0" encoding="utf-8"?>
-<?mso-contentType ?>
-<FormTemplates xmlns="http://schemas.microsoft.com/sharepoint/v3/contenttype/forms">
-  <Display>DocumentLibraryForm</Display>
-  <Edit>DocumentLibraryForm</Edit>
-  <New>DocumentLibraryForm</New>
-</FormTemplates>
+<p:properties xmlns:p="http://schemas.microsoft.com/office/2006/metadata/properties" xmlns:xsi="http://www.w3.org/2001/XMLSchema-instance" xmlns:pc="http://schemas.microsoft.com/office/infopath/2007/PartnerControls">
+  <documentManagement>
+    <GDDescripcion xmlns="ef848eef-985f-4e5f-af94-9b10d2c40a72" xsi:nil="true"/>
+    <N_x00ba_versi_x00f3_n xmlns="17bdaf06-e97e-4c95-a053-70575cfc447b">2</N_x00ba_versi_x00f3_n>
+    <Tipo_x0020_de_x0020_Servicio xmlns="ef848eef-985f-4e5f-af94-9b10d2c40a72" xsi:nil="true"/>
+    <WEB xmlns="17bdaf06-e97e-4c95-a053-70575cfc447b">false</WEB>
+    <Evaluación xmlns="ef848eef-985f-4e5f-af94-9b10d2c40a72" xsi:nil="true"/>
+    <VIGENTE0 xmlns="17bdaf06-e97e-4c95-a053-70575cfc447b">SI</VIGENTE0>
+    <Motivobaja xmlns="17bdaf06-e97e-4c95-a053-70575cfc447b">Se genera una nueva versión para no dar lugar a confusión al estudiantado si lee que hay 2 modalidades de TFT evitando así posibles incidencias.</Motivobaja>
+    <Fechabaja xmlns="17bdaf06-e97e-4c95-a053-70575cfc447b" xsi:nil="true"/>
+    <Responsable_x0020_ xmlns="ef848eef-985f-4e5f-af94-9b10d2c40a72" xsi:nil="true"/>
+    <Fechaalta xmlns="17bdaf06-e97e-4c95-a053-70575cfc447b">2025-05-28T07:00:00+00:00</Fechaalta>
+    <TIPODOC xmlns="17bdaf06-e97e-4c95-a053-70575cfc447b">Formato</TIPODOC>
+    <_x00da_ltimarevisi_x00f3_n xmlns="17bdaf06-e97e-4c95-a053-70575cfc447b" xsi:nil="true"/>
+    <N_x00ba__x0020_de_x0020_Incidencias_x0020_ xmlns="ef848eef-985f-4e5f-af94-9b10d2c40a72" xsi:nil="true"/>
+    <GDAsuntoF3 xmlns="ef848eef-985f-4e5f-af94-9b10d2c40a72" xsi:nil="true"/>
+    <Homologado_x0020_por xmlns="ef848eef-985f-4e5f-af94-9b10d2c40a72" xsi:nil="true"/>
+    <Vigente xmlns="ef848eef-985f-4e5f-af94-9b10d2c40a72">true</Vigente>
+    <PROCESO xmlns="17bdaf06-e97e-4c95-a053-70575cfc447b">P11_ DESARROLLO DOCENCIA</PROCESO>
+    <Fecha_x0020_Firma xmlns="ef848eef-985f-4e5f-af94-9b10d2c40a72" xsi:nil="true"/>
+    <GDTipoDoc xmlns="ef848eef-985f-4e5f-af94-9b10d2c40a72" xsi:nil="true"/>
+    <GDUBFisica xmlns="ef848eef-985f-4e5f-af94-9b10d2c40a72" xsi:nil="true"/>
+    <AYUDAPDI xmlns="17bdaf06-e97e-4c95-a053-70575cfc447b">false</AYUDAPDI>
+  </documentManagement>
+</p:properties>
 </file>
 
 <file path=customXml/item3.xml><?xml version="1.0" encoding="utf-8"?>
@@ -33256,31 +33610,12 @@
 </file>
 
 <file path=customXml/item4.xml><?xml version="1.0" encoding="utf-8"?>
-<p:properties xmlns:p="http://schemas.microsoft.com/office/2006/metadata/properties" xmlns:xsi="http://www.w3.org/2001/XMLSchema-instance" xmlns:pc="http://schemas.microsoft.com/office/infopath/2007/PartnerControls">
-  <documentManagement>
-    <GDDescripcion xmlns="ef848eef-985f-4e5f-af94-9b10d2c40a72" xsi:nil="true"/>
-    <N_x00ba_versi_x00f3_n xmlns="17bdaf06-e97e-4c95-a053-70575cfc447b">2</N_x00ba_versi_x00f3_n>
-    <Tipo_x0020_de_x0020_Servicio xmlns="ef848eef-985f-4e5f-af94-9b10d2c40a72" xsi:nil="true"/>
-    <WEB xmlns="17bdaf06-e97e-4c95-a053-70575cfc447b">false</WEB>
-    <Evaluación xmlns="ef848eef-985f-4e5f-af94-9b10d2c40a72" xsi:nil="true"/>
-    <VIGENTE0 xmlns="17bdaf06-e97e-4c95-a053-70575cfc447b">SI</VIGENTE0>
-    <Motivobaja xmlns="17bdaf06-e97e-4c95-a053-70575cfc447b">Se genera una nueva versión para no dar lugar a confusión al estudiantado si lee que hay 2 modalidades de TFT evitando así posibles incidencias.</Motivobaja>
-    <Fechabaja xmlns="17bdaf06-e97e-4c95-a053-70575cfc447b" xsi:nil="true"/>
-    <Responsable_x0020_ xmlns="ef848eef-985f-4e5f-af94-9b10d2c40a72" xsi:nil="true"/>
-    <Fechaalta xmlns="17bdaf06-e97e-4c95-a053-70575cfc447b">2025-05-28T07:00:00+00:00</Fechaalta>
-    <TIPODOC xmlns="17bdaf06-e97e-4c95-a053-70575cfc447b">Formato</TIPODOC>
-    <_x00da_ltimarevisi_x00f3_n xmlns="17bdaf06-e97e-4c95-a053-70575cfc447b" xsi:nil="true"/>
-    <N_x00ba__x0020_de_x0020_Incidencias_x0020_ xmlns="ef848eef-985f-4e5f-af94-9b10d2c40a72" xsi:nil="true"/>
-    <GDAsuntoF3 xmlns="ef848eef-985f-4e5f-af94-9b10d2c40a72" xsi:nil="true"/>
-    <Homologado_x0020_por xmlns="ef848eef-985f-4e5f-af94-9b10d2c40a72" xsi:nil="true"/>
-    <Vigente xmlns="ef848eef-985f-4e5f-af94-9b10d2c40a72">true</Vigente>
-    <PROCESO xmlns="17bdaf06-e97e-4c95-a053-70575cfc447b">P11_ DESARROLLO DOCENCIA</PROCESO>
-    <Fecha_x0020_Firma xmlns="ef848eef-985f-4e5f-af94-9b10d2c40a72" xsi:nil="true"/>
-    <GDTipoDoc xmlns="ef848eef-985f-4e5f-af94-9b10d2c40a72" xsi:nil="true"/>
-    <GDUBFisica xmlns="ef848eef-985f-4e5f-af94-9b10d2c40a72" xsi:nil="true"/>
-    <AYUDAPDI xmlns="17bdaf06-e97e-4c95-a053-70575cfc447b">false</AYUDAPDI>
-  </documentManagement>
-</p:properties>
+<?mso-contentType ?>
+<FormTemplates xmlns="http://schemas.microsoft.com/sharepoint/v3/contenttype/forms">
+  <Display>DocumentLibraryForm</Display>
+  <Edit>DocumentLibraryForm</Edit>
+  <New>DocumentLibraryForm</New>
+</FormTemplates>
 </file>
 
 <file path=customXml/itemProps1.xml><?xml version="1.0" encoding="utf-8"?>
@@ -33292,9 +33627,12 @@
 </file>
 
 <file path=customXml/itemProps2.xml><?xml version="1.0" encoding="utf-8"?>
-<ds:datastoreItem xmlns:ds="http://schemas.openxmlformats.org/officeDocument/2006/customXml" ds:itemID="{D2E34552-30F1-4197-AD08-9874EE871786}">
+<ds:datastoreItem xmlns:ds="http://schemas.openxmlformats.org/officeDocument/2006/customXml" ds:itemID="{07A964DA-14FF-4E77-85C4-CF3717E496CA}">
   <ds:schemaRefs>
-    <ds:schemaRef ds:uri="http://schemas.microsoft.com/sharepoint/v3/contenttype/forms"/>
+    <ds:schemaRef ds:uri="http://schemas.microsoft.com/office/2006/metadata/properties"/>
+    <ds:schemaRef ds:uri="http://schemas.microsoft.com/office/infopath/2007/PartnerControls"/>
+    <ds:schemaRef ds:uri="ef848eef-985f-4e5f-af94-9b10d2c40a72"/>
+    <ds:schemaRef ds:uri="17bdaf06-e97e-4c95-a053-70575cfc447b"/>
   </ds:schemaRefs>
 </ds:datastoreItem>
 </file>
@@ -33319,12 +33657,9 @@
 </file>
 
 <file path=customXml/itemProps4.xml><?xml version="1.0" encoding="utf-8"?>
-<ds:datastoreItem xmlns:ds="http://schemas.openxmlformats.org/officeDocument/2006/customXml" ds:itemID="{07A964DA-14FF-4E77-85C4-CF3717E496CA}">
+<ds:datastoreItem xmlns:ds="http://schemas.openxmlformats.org/officeDocument/2006/customXml" ds:itemID="{D2E34552-30F1-4197-AD08-9874EE871786}">
   <ds:schemaRefs>
-    <ds:schemaRef ds:uri="http://schemas.microsoft.com/office/2006/metadata/properties"/>
-    <ds:schemaRef ds:uri="http://schemas.microsoft.com/office/infopath/2007/PartnerControls"/>
-    <ds:schemaRef ds:uri="ef848eef-985f-4e5f-af94-9b10d2c40a72"/>
-    <ds:schemaRef ds:uri="17bdaf06-e97e-4c95-a053-70575cfc447b"/>
+    <ds:schemaRef ds:uri="http://schemas.microsoft.com/sharepoint/v3/contenttype/forms"/>
   </ds:schemaRefs>
 </ds:datastoreItem>
 </file>
</xml_diff>